<commit_message>
docs(manuals): rebuild the User Guide after merging main
Co-Authored-By: Claude Opus 5 <noreply@anthropic.com>
</commit_message>
<xml_diff>
--- a/docs/manuals/user-guide/user-guide.docx
+++ b/docs/manuals/user-guide/user-guide.docx
@@ -578,20 +578,13 @@
         <w:t xml:space="preserve">  Authorization → Authorize</w:t>
       </w:r>
       <w:r>
-        <w:t xml:space="preserve"> (or </w:t>
-      </w:r>
-      <w:r>
-        <w:rPr>
-          <w:rFonts w:ascii="Consolas" w:hAnsi="Consolas"/>
-          <w:color w:val="334455"/>
-          <w:sz w:val="19"/>
-        </w:rPr>
-        <w:t>http://127.0.0.1:8100/auth</w:t>
-      </w:r>
-      <w:r>
-        <w:t>) and sign in. This</w:t>
-        <w:br/>
-        <w:t xml:space="preserve">  creates your token file.</w:t>
+        <w:t xml:space="preserve"> and sign in. This creates your token file. The</w:t>
+        <w:br/>
+        <w:t xml:space="preserve">  button opens the proxy's login page, which is on your private Tailscale network</w:t>
+        <w:br/>
+        <w:t xml:space="preserve">  rather than the public site — so the device you click it from must be signed in</w:t>
+        <w:br/>
+        <w:t xml:space="preserve">  to Tailscale.</w:t>
       </w:r>
     </w:p>
     <w:p>

</xml_diff>

<commit_message>
docs: the Paper Ledger is capped; one cap module
Co-Authored-By: Claude Opus 5 <noreply@anthropic.com>
</commit_message>
<xml_diff>
--- a/docs/manuals/user-guide/user-guide.docx
+++ b/docs/manuals/user-guide/user-guide.docx
@@ -32,7 +32,7 @@
           <w:color w:val="5B6678"/>
           <w:sz w:val="18"/>
         </w:rPr>
-        <w:t>NeuralStrike · Generated 2026-09-14</w:t>
+        <w:t>NeuralStrike · Generated 2026-09-15</w:t>
       </w:r>
     </w:p>
     <w:p/>
@@ -9643,7 +9643,29 @@
         <w:t>Send to Paper Trade</w:t>
       </w:r>
       <w:r>
-        <w:t xml:space="preserve"> — create a paper trade from this signal.</w:t>
+        <w:t xml:space="preserve"> — create a paper trade from this signal, if it fits the</w:t>
+        <w:br/>
+        <w:t xml:space="preserve">  Paper Ledger's risk limits; a message a moment later says whether it opened</w:t>
+        <w:br/>
+        <w:t xml:space="preserve">  (see </w:t>
+      </w:r>
+      <w:r>
+        <w:rPr>
+          <w:i/>
+        </w:rPr>
+        <w:t>Risk limits on new trades</w:t>
+      </w:r>
+      <w:r>
+        <w:t xml:space="preserve"> under </w:t>
+      </w:r>
+      <w:r>
+        <w:rPr>
+          <w:b/>
+        </w:rPr>
+        <w:t>Paper Ledger</w:t>
+      </w:r>
+      <w:r>
+        <w:t>).</w:t>
       </w:r>
     </w:p>
     <w:p>
@@ -10963,6 +10985,391 @@
       </w:r>
       <w:r>
         <w:t xml:space="preserve"> button.</w:t>
+      </w:r>
+    </w:p>
+    <w:p>
+      <w:r>
+        <w:rPr>
+          <w:b/>
+        </w:rPr>
+        <w:t>Risk limits on new trades.</w:t>
+      </w:r>
+      <w:r>
+        <w:rPr/>
+        <w:t xml:space="preserve"> A trade sent with </w:t>
+      </w:r>
+      <w:r>
+        <w:rPr>
+          <w:b/>
+        </w:rPr>
+        <w:t>Send to Paper trade</w:t>
+      </w:r>
+      <w:r>
+        <w:rPr/>
+        <w:t xml:space="preserve"> (Market</w:t>
+        <w:br/>
+        <w:t xml:space="preserve">Scanner) or </w:t>
+      </w:r>
+      <w:r>
+        <w:rPr>
+          <w:b/>
+        </w:rPr>
+        <w:t>Paper</w:t>
+      </w:r>
+      <w:r>
+        <w:rPr/>
+        <w:t xml:space="preserve"> (Strategy Finder) is checked against this ledger's own open</w:t>
+        <w:br/>
+        <w:t>trades before it is written. If it would break a limit, nothing is written and a</w:t>
+        <w:br/>
+        <w:t>message says why. The limits:</w:t>
+      </w:r>
+    </w:p>
+    <w:tbl>
+      <w:tblPr>
+        <w:tblW w:type="auto" w:w="0"/>
+        <w:jc w:val="left"/>
+        <w:tblLayout w:type="autofit"/>
+        <w:tblLook w:firstColumn="1" w:firstRow="1" w:lastColumn="0" w:lastRow="0" w:noHBand="0" w:noVBand="1" w:val="04A0"/>
+        <w:tblBorders>
+          <w:top w:val="single" w:sz="4" w:space="0" w:color="D8DEE9"/>
+          <w:left w:val="single" w:sz="4" w:space="0" w:color="D8DEE9"/>
+          <w:bottom w:val="single" w:sz="4" w:space="0" w:color="D8DEE9"/>
+          <w:right w:val="single" w:sz="4" w:space="0" w:color="D8DEE9"/>
+          <w:insideH w:val="single" w:sz="4" w:space="0" w:color="D8DEE9"/>
+          <w:insideV w:val="single" w:sz="4" w:space="0" w:color="D8DEE9"/>
+        </w:tblBorders>
+      </w:tblPr>
+      <w:tblGrid>
+        <w:gridCol w:w="4320"/>
+        <w:gridCol w:w="4320"/>
+      </w:tblGrid>
+      <w:tr>
+        <w:tc>
+          <w:tcPr>
+            <w:tcW w:type="dxa" w:w="4320"/>
+            <w:shd w:val="clear" w:color="auto" w:fill="EAF2FB"/>
+          </w:tcPr>
+          <w:p>
+            <w:r>
+              <w:rPr>
+                <w:b/>
+              </w:rPr>
+            </w:r>
+            <w:r>
+              <w:rPr>
+                <w:b/>
+              </w:rPr>
+              <w:t>Limit</w:t>
+            </w:r>
+          </w:p>
+        </w:tc>
+        <w:tc>
+          <w:tcPr>
+            <w:tcW w:type="dxa" w:w="4320"/>
+            <w:shd w:val="clear" w:color="auto" w:fill="EAF2FB"/>
+          </w:tcPr>
+          <w:p>
+            <w:r>
+              <w:rPr>
+                <w:b/>
+              </w:rPr>
+            </w:r>
+            <w:r>
+              <w:rPr>
+                <w:b/>
+              </w:rPr>
+              <w:t>Level</w:t>
+            </w:r>
+          </w:p>
+        </w:tc>
+      </w:tr>
+      <w:tr>
+        <w:tc>
+          <w:tcPr>
+            <w:tcW w:type="dxa" w:w="4320"/>
+          </w:tcPr>
+          <w:p>
+            <w:r/>
+            <w:r>
+              <w:rPr/>
+              <w:t>Per trade</w:t>
+            </w:r>
+          </w:p>
+        </w:tc>
+        <w:tc>
+          <w:tcPr>
+            <w:tcW w:type="dxa" w:w="4320"/>
+          </w:tcPr>
+          <w:p>
+            <w:r/>
+            <w:r>
+              <w:rPr/>
+              <w:t xml:space="preserve">at most </w:t>
+            </w:r>
+            <w:r>
+              <w:rPr>
+                <w:b/>
+              </w:rPr>
+              <w:t>$750</w:t>
+            </w:r>
+            <w:r>
+              <w:rPr/>
+              <w:t xml:space="preserve"> of max loss</w:t>
+            </w:r>
+          </w:p>
+        </w:tc>
+      </w:tr>
+      <w:tr>
+        <w:tc>
+          <w:tcPr>
+            <w:tcW w:type="dxa" w:w="4320"/>
+            <w:shd w:val="clear" w:color="auto" w:fill="F4F6FA"/>
+          </w:tcPr>
+          <w:p>
+            <w:r/>
+            <w:r>
+              <w:rPr/>
+              <w:t>Per symbol</w:t>
+            </w:r>
+          </w:p>
+        </w:tc>
+        <w:tc>
+          <w:tcPr>
+            <w:tcW w:type="dxa" w:w="4320"/>
+            <w:shd w:val="clear" w:color="auto" w:fill="F4F6FA"/>
+          </w:tcPr>
+          <w:p>
+            <w:r/>
+            <w:r>
+              <w:rPr>
+                <w:b/>
+              </w:rPr>
+              <w:t>3</w:t>
+            </w:r>
+            <w:r>
+              <w:rPr/>
+              <w:t xml:space="preserve"> open positions and </w:t>
+            </w:r>
+            <w:r>
+              <w:rPr>
+                <w:b/>
+              </w:rPr>
+              <w:t>$750</w:t>
+            </w:r>
+            <w:r>
+              <w:rPr/>
+              <w:t xml:space="preserve"> of max loss</w:t>
+            </w:r>
+          </w:p>
+        </w:tc>
+      </w:tr>
+      <w:tr>
+        <w:tc>
+          <w:tcPr>
+            <w:tcW w:type="dxa" w:w="4320"/>
+          </w:tcPr>
+          <w:p>
+            <w:r/>
+            <w:r>
+              <w:rPr/>
+              <w:t>Per sector</w:t>
+            </w:r>
+          </w:p>
+        </w:tc>
+        <w:tc>
+          <w:tcPr>
+            <w:tcW w:type="dxa" w:w="4320"/>
+          </w:tcPr>
+          <w:p>
+            <w:r/>
+            <w:r>
+              <w:rPr>
+                <w:b/>
+              </w:rPr>
+              <w:t>5</w:t>
+            </w:r>
+            <w:r>
+              <w:rPr/>
+              <w:t xml:space="preserve"> open positions and </w:t>
+            </w:r>
+            <w:r>
+              <w:rPr>
+                <w:b/>
+              </w:rPr>
+              <w:t>$1,500</w:t>
+            </w:r>
+            <w:r>
+              <w:rPr/>
+              <w:t xml:space="preserve"> of max loss (the index products — $SPX, SPY, QQQ, $NDX, DIA, IWM — share one group)</w:t>
+            </w:r>
+          </w:p>
+        </w:tc>
+      </w:tr>
+      <w:tr>
+        <w:tc>
+          <w:tcPr>
+            <w:tcW w:type="dxa" w:w="4320"/>
+            <w:shd w:val="clear" w:color="auto" w:fill="F4F6FA"/>
+          </w:tcPr>
+          <w:p>
+            <w:r/>
+            <w:r>
+              <w:rPr/>
+              <w:t>Per expiration</w:t>
+            </w:r>
+          </w:p>
+        </w:tc>
+        <w:tc>
+          <w:tcPr>
+            <w:tcW w:type="dxa" w:w="4320"/>
+            <w:shd w:val="clear" w:color="auto" w:fill="F4F6FA"/>
+          </w:tcPr>
+          <w:p>
+            <w:r/>
+            <w:r>
+              <w:rPr>
+                <w:b/>
+              </w:rPr>
+              <w:t>5</w:t>
+            </w:r>
+            <w:r>
+              <w:rPr/>
+              <w:t xml:space="preserve"> open positions expiring the same day, across every symbol</w:t>
+            </w:r>
+          </w:p>
+        </w:tc>
+      </w:tr>
+      <w:tr>
+        <w:tc>
+          <w:tcPr>
+            <w:tcW w:type="dxa" w:w="4320"/>
+          </w:tcPr>
+          <w:p>
+            <w:r/>
+            <w:r>
+              <w:rPr/>
+              <w:t>Whole ledger</w:t>
+            </w:r>
+          </w:p>
+        </w:tc>
+        <w:tc>
+          <w:tcPr>
+            <w:tcW w:type="dxa" w:w="4320"/>
+          </w:tcPr>
+          <w:p>
+            <w:r/>
+            <w:r>
+              <w:rPr/>
+              <w:t xml:space="preserve">open max loss at most </w:t>
+            </w:r>
+            <w:r>
+              <w:rPr>
+                <w:b/>
+              </w:rPr>
+              <w:t>20%</w:t>
+            </w:r>
+            <w:r>
+              <w:rPr/>
+              <w:t xml:space="preserve"> of equity — $25,000 plus the realized P&amp;L of your closed trades</w:t>
+            </w:r>
+          </w:p>
+        </w:tc>
+      </w:tr>
+    </w:tbl>
+    <w:p/>
+    <w:p>
+      <w:r>
+        <w:rPr/>
+        <w:t xml:space="preserve">A second or so after you press </w:t>
+      </w:r>
+      <w:r>
+        <w:rPr>
+          <w:b/>
+        </w:rPr>
+        <w:t>Create</w:t>
+      </w:r>
+      <w:r>
+        <w:rPr/>
+        <w:t xml:space="preserve"> in the quantity box, a message answers the click:</w:t>
+      </w:r>
+    </w:p>
+    <w:p>
+      <w:pPr>
+        <w:pStyle w:val="ListBullet"/>
+      </w:pPr>
+      <w:r>
+        <w:rPr>
+          <w:i/>
+        </w:rPr>
+        <w:t>Paper ledger: opened 2 × SPY Credit spread — put.</w:t>
+      </w:r>
+    </w:p>
+    <w:p>
+      <w:pPr>
+        <w:pStyle w:val="ListBullet"/>
+      </w:pPr>
+      <w:r>
+        <w:rPr>
+          <w:i/>
+        </w:rPr>
+        <w:t>Paper ledger: not opened — risks $900, over the $750 per-trade limit. Up to 1</w:t>
+        <w:br/>
+        <w:t xml:space="preserve">  contract fits.</w:t>
+      </w:r>
+      <w:r>
+        <w:t xml:space="preserve"> — </w:t>
+      </w:r>
+      <w:r>
+        <w:rPr>
+          <w:b/>
+        </w:rPr>
+        <w:t>Up to N contracts fit</w:t>
+      </w:r>
+      <w:r>
+        <w:t xml:space="preserve"> is the largest quantity of the same</w:t>
+        <w:br/>
+        <w:t xml:space="preserve">  trade that would clear every limit right now; send again with that number. It is</w:t>
+        <w:br/>
+        <w:t xml:space="preserve">  left off when not even one contract fits.</w:t>
+      </w:r>
+    </w:p>
+    <w:p>
+      <w:pPr>
+        <w:pStyle w:val="ListBullet"/>
+      </w:pPr>
+      <w:r>
+        <w:rPr>
+          <w:i/>
+        </w:rPr>
+        <w:t>Paper ledger: not opened — ORCL already holds 3 of 3 positions.</w:t>
+      </w:r>
+      <w:r>
+        <w:t xml:space="preserve"> — close a</w:t>
+        <w:br/>
+        <w:t xml:space="preserve">  position in that symbol, sector or expiration first.</w:t>
+      </w:r>
+    </w:p>
+    <w:p>
+      <w:r>
+        <w:rPr/>
+        <w:t xml:space="preserve">⚠ Equity counts your closed trades' realized P&amp;L, so </w:t>
+      </w:r>
+      <w:r>
+        <w:rPr>
+          <w:b/>
+        </w:rPr>
+        <w:t>Delete all closed</w:t>
+      </w:r>
+      <w:r>
+        <w:rPr/>
+        <w:t xml:space="preserve"> also</w:t>
+        <w:br/>
+        <w:t>changes the 20% limit. A $750 trade by itself uses the whole $750 allowance for its</w:t>
+        <w:br/>
+        <w:t>symbol. The limits apply to this ledger only — the Paper Account's automatic</w:t>
+        <w:br/>
+        <w:t>engine has its own, with a $250 per-trade limit.</w:t>
       </w:r>
     </w:p>
     <w:p>
@@ -16171,19 +16578,45 @@
         <w:br/>
         <w:t>Straddles and strangles are for study only and have no button; neither do the iron</w:t>
         <w:br/>
-        <w:t>butterfly, calendars, diagonals or the share structures. The Paper Ledger has no</w:t>
-        <w:br/>
-        <w:t xml:space="preserve">earnings check, so a trade tagged </w:t>
+        <w:t>butterfly, calendars, diagonals or the share structures. A trade the button takes</w:t>
+        <w:br/>
+        <w:t>is still checked against the Paper Ledger's risk limits, and a message says if it</w:t>
+        <w:br/>
+        <w:t xml:space="preserve">was not opened and why (see </w:t>
       </w:r>
       <w:r>
         <w:rPr>
           <w:i/>
         </w:rPr>
+        <w:t>Risk limits on new trades</w:t>
+      </w:r>
+      <w:r>
+        <w:rPr/>
+        <w:t xml:space="preserve"> under </w:t>
+      </w:r>
+      <w:r>
+        <w:rPr>
+          <w:b/>
+        </w:rPr>
+        <w:t>Paper Ledger</w:t>
+      </w:r>
+      <w:r>
+        <w:rPr/>
+        <w:t>).</w:t>
+        <w:br/>
+        <w:t xml:space="preserve">The Paper Ledger has no earnings check, so a trade tagged </w:t>
+      </w:r>
+      <w:r>
+        <w:rPr>
+          <w:i/>
+        </w:rPr>
         <w:t>Earnings</w:t>
       </w:r>
       <w:r>
         <w:rPr/>
-        <w:t xml:space="preserve"> opens there like any other.</w:t>
+        <w:t xml:space="preserve"> opens there</w:t>
+        <w:br/>
+        <w:t>like any other.</w:t>
         <w:br/>
       </w:r>
       <w:r>
@@ -17720,7 +18153,7 @@
             <w:r/>
             <w:r>
               <w:rPr/>
-              <w:t>Asks for a quantity, then creates a paper trade. Stays on the current page.</w:t>
+              <w:t>Asks for a quantity, then creates a Paper Ledger trade if it fits the ledger's risk limits. A message a moment later says it opened, or why not. Stays on the current page.</w:t>
             </w:r>
           </w:p>
         </w:tc>

</xml_diff>

<commit_message>
fix(webgui): Expected Move takes a symbol-only hand-off; dossier docs
The Symbol Dossier hands Expected Move a symbol with no expiry. The page now
loads that symbol's expirations instead of also trying to draw and toasting
"Symbol + expiry required." Pinned by
test_a_symbol_only_hand_off_loads_the_chain_without_a_warning (failed before).

Manuals and page help follow the review fixes: the SCANNED chip carries the
scan time, and the walls are withheld once the collector stops. Rebuilt.

Co-Authored-By: Claude Opus 5 <noreply@anthropic.com>
</commit_message>
<xml_diff>
--- a/docs/manuals/user-guide/user-guide.docx
+++ b/docs/manuals/user-guide/user-guide.docx
@@ -4340,12 +4340,14 @@
         <w:rPr>
           <w:b/>
         </w:rPr>
-        <w:t>SCANNED</w:t>
-      </w:r>
-      <w:r>
-        <w:t xml:space="preserve"> — the app scans this name all day, so every band is filled from</w:t>
-        <w:br/>
-        <w:t xml:space="preserve">  what it already has. Nothing is fetched.</w:t>
+        <w:t>SCANNED 09:30</w:t>
+      </w:r>
+      <w:r>
+        <w:t xml:space="preserve"> — the app scans this name all day, so every band is filled</w:t>
+        <w:br/>
+        <w:t xml:space="preserve">  from what it already has, and nothing is fetched. The time is the last scan's,</w:t>
+        <w:br/>
+        <w:t xml:space="preserve">  so after the close you can see how old the Vol Rank and IV vs HV are.</w:t>
       </w:r>
     </w:p>
     <w:p>

</xml_diff>

<commit_message>
feat(webgui): open a dossier from the Opportunity Board
The board's symbol cell is now a link to /symbol?symbol=<SYM> on the private
app. The board is also published as /opportunity and /symbol is not, so the
affordance is drawn only where shell.can_navigate says the route exists, the
click goes through shell.navigate_to, and the public screen keeps the plain
cell and its old copy. The symbol is allow-listed by shared.symbols.clean_symbol
both when the row is stamped and again in the click handler.

Page help and both manuals drop "rows do not open anything". Rebuilt.

Co-Authored-By: Claude Opus 5 <noreply@anthropic.com>
</commit_message>
<xml_diff>
--- a/docs/manuals/user-guide/user-guide.docx
+++ b/docs/manuals/user-guide/user-guide.docx
@@ -6059,6 +6059,43 @@
         <w:t xml:space="preserve"> is the default sort. Click any column header to re-sort. Three tiles at the</w:t>
         <w:br/>
         <w:t>top count how many symbols are currently Buy, Neutral and Sell.</w:t>
+      </w:r>
+    </w:p>
+    <w:p>
+      <w:r>
+        <w:rPr>
+          <w:b/>
+        </w:rPr>
+        <w:t>Click a symbol</w:t>
+      </w:r>
+      <w:r>
+        <w:rPr/>
+        <w:t xml:space="preserve"> (it carries a dotted underline) to open its </w:t>
+      </w:r>
+      <w:r>
+        <w:rPr>
+          <w:color w:val="5D5294"/>
+        </w:rPr>
+        <w:t>Symbol</w:t>
+      </w:r>
+      <w:r>
+        <w:rPr/>
+        <w:br/>
+        <w:t xml:space="preserve">dossier at </w:t>
+      </w:r>
+      <w:r>
+        <w:rPr>
+          <w:rFonts w:ascii="Consolas" w:hAnsi="Consolas"/>
+          <w:color w:val="334455"/>
+          <w:sz w:val="19"/>
+        </w:rPr>
+        <w:t>/symbol?symbol=&lt;ticker&gt;</w:t>
+      </w:r>
+      <w:r>
+        <w:rPr/>
+        <w:t>. The public copy of this board on</w:t>
+        <w:br/>
+        <w:t>live.neuralstrike.co has no dossier, so there the symbol is plain text.</w:t>
       </w:r>
     </w:p>
     <w:p>

</xml_diff>

<commit_message>
feat(webgui): a dossier's Find trades opens the Strategy Finder on it
A header button beside Refresh hands the symbol to the Strategy Finder
through the existing one-shot handoff.send_to_swing stash (the Trade Plan's
path); the Finder seeds its input and runs its scan at once.

finder_allowed draws it only once the name has a real quote - scanned,
collected, or a dossier with no error and a finite spot - so a pending
look-up, an unknown ticker and an outage never send anyone to a scan that
cannot work. Re-checked at click time and gated on shell.can_navigate.
Unlike the Dealer Positioning link it starts nothing recurring: a Finder
scan is one-shot, and a chain with more than 30 expirations asks first.

Page help, User Guide, Reference Guide and webgui-routes.md updated.

Co-Authored-By: Claude Opus 5 <noreply@anthropic.com>
</commit_message>
<xml_diff>
--- a/docs/manuals/user-guide/user-guide.docx
+++ b/docs/manuals/user-guide/user-guide.docx
@@ -4467,6 +4467,71 @@
         <w:t xml:space="preserve">  answers. Pressing Refresh here would only queue a second paid look-up behind the</w:t>
         <w:br/>
         <w:t xml:space="preserve">  first.</w:t>
+      </w:r>
+    </w:p>
+    <w:p>
+      <w:r>
+        <w:rPr>
+          <w:b/>
+        </w:rPr>
+        <w:t>Finding trades on this name.</w:t>
+      </w:r>
+      <w:r>
+        <w:rPr/>
+        <w:t xml:space="preserve"> The </w:t>
+      </w:r>
+      <w:r>
+        <w:rPr>
+          <w:b/>
+        </w:rPr>
+        <w:t>Find trades</w:t>
+      </w:r>
+      <w:r>
+        <w:rPr/>
+        <w:t xml:space="preserve"> button beside Refresh opens the</w:t>
+        <w:br/>
+      </w:r>
+      <w:r>
+        <w:rPr>
+          <w:b/>
+        </w:rPr>
+        <w:t>Strategy Finder</w:t>
+      </w:r>
+      <w:r>
+        <w:rPr/>
+        <w:t xml:space="preserve"> with this symbol filled in and starts its scan at once, so you go</w:t>
+        <w:br/>
+        <w:t>from reading about a ticker to ranked, paper-tradeable candidates in one click. It</w:t>
+        <w:br/>
+        <w:t>appears only once the page has a real quote — scanned, collected, or a look-up that</w:t>
+        <w:br/>
+        <w:t xml:space="preserve">came back with a price — and stays hidden while a look-up is pending, for </w:t>
+      </w:r>
+      <w:r>
+        <w:rPr>
+          <w:b/>
+        </w:rPr>
+        <w:t>NOT</w:t>
+        <w:br/>
+        <w:t>FOUND</w:t>
+      </w:r>
+      <w:r>
+        <w:rPr/>
+        <w:t xml:space="preserve">, and for </w:t>
+      </w:r>
+      <w:r>
+        <w:rPr>
+          <w:b/>
+        </w:rPr>
+        <w:t>FETCH FAILED</w:t>
+      </w:r>
+      <w:r>
+        <w:rPr/>
+        <w:t>, since the scan could not work on any of those.</w:t>
+        <w:br/>
+        <w:t>The scan is the Finder's, with the Finder's cost: a large chain can take half a</w:t>
+        <w:br/>
+        <w:t>minute, and a chain listing more than 30 expirations asks which to load first.</w:t>
       </w:r>
     </w:p>
     <w:p>

</xml_diff>

<commit_message>
feat(finder public): Phase 3 - a shorter result, a morning warm-up, and the owner's view of public usage
- A public result keeps the best 5 of each strategy type ([display]
  rows_per_type), trimmed at write with the service's own per-type ranking;
  the rest join not_shown.
- [slots.finder_public] warm = 09:08 queues [warm] symbols (SPY, QQQ) on
  cmd:finder_public, through the same worker, window, budget and cache as a
  visitor's request.
- Settings -> General -> API usage: public scans today against the limit, and
  requests refused as not a symbol. Never which symbols were searched.
- The page says when scans resume before a visitor asks, outside the window.

Co-Authored-By: Claude Opus 5 <noreply@anthropic.com>
</commit_message>
<xml_diff>
--- a/docs/manuals/user-guide/user-guide.docx
+++ b/docs/manuals/user-guide/user-guide.docx
@@ -1285,7 +1285,11 @@
         <w:br/>
         <w:t>instead of scanning again. There is a limit of 200 public scans a day for all</w:t>
         <w:br/>
-        <w:t>visitors together and 10 an hour for each visitor. Every limit is in</w:t>
+        <w:t>visitors together and 10 an hour for each visitor. A result shows the best 5</w:t>
+        <w:br/>
+        <w:t>ideas of each strategy type. SPY and QQQ are scanned automatically at 09:08 CT</w:t>
+        <w:br/>
+        <w:t>so the page opens on a fresh result. Every limit is in</w:t>
         <w:br/>
       </w:r>
       <w:r>
@@ -1296,7 +1300,19 @@
       </w:r>
       <w:r>
         <w:rPr/>
-        <w:t xml:space="preserve">. </w:t>
+        <w:t xml:space="preserve">, and </w:t>
+      </w:r>
+      <w:r>
+        <w:rPr>
+          <w:b/>
+        </w:rPr>
+        <w:t>Settings →</w:t>
+        <w:br/>
+        <w:t>General → API usage</w:t>
+      </w:r>
+      <w:r>
+        <w:rPr/>
+        <w:t xml:space="preserve"> shows how many public scans have been used today. </w:t>
       </w:r>
       <w:r>
         <w:rPr>

</xml_diff>

<commit_message>
docs(public tools): runbook, CLAUDE.md, routes, user guide, changelog
Runbook section 2 gains steps 4e and 4f (the live user's XADD selectors for
cmd:tools_public and cmd:tools_public_math), both not yet applied, with the
4c -> 4d -> 4e -> 4f order stated. CLAUDE.md corrected in place: the Tier-1
allow-list gains shared.public_tools, twenty-four screens, three write paths
over five public writer functions, and a paragraph for the third path. The
routes doc and the user guide gain both tools; the user guide's Rescue
budgets now read as the one shared daily budget. The public Simulator's
docstring said six tiles; it draws four.

Co-Authored-By: Claude Opus 5 <noreply@anthropic.com>
</commit_message>
<xml_diff>
--- a/docs/manuals/user-guide/user-guide.docx
+++ b/docs/manuals/user-guide/user-guide.docx
@@ -1219,7 +1219,7 @@
     <w:p>
       <w:r>
         <w:rPr/>
-        <w:t xml:space="preserve">Twenty-two of the app's screens are also published </w:t>
+        <w:t xml:space="preserve">Twenty-four of the app's screens are also published </w:t>
       </w:r>
       <w:r>
         <w:rPr>
@@ -1261,9 +1261,9 @@
       </w:r>
       <w:r>
         <w:rPr/>
-        <w:t>, and the</w:t>
-        <w:br/>
-        <w:t xml:space="preserve">Rescue ad-hoc form, published as </w:t>
+        <w:t>, the</w:t>
+        <w:br/>
+        <w:t xml:space="preserve">Rescue ad-hoc form (published as </w:t>
       </w:r>
       <w:r>
         <w:rPr>
@@ -1273,6 +1273,27 @@
       </w:r>
       <w:r>
         <w:rPr/>
+        <w:t>), the</w:t>
+        <w:br/>
+      </w:r>
+      <w:r>
+        <w:rPr>
+          <w:b/>
+        </w:rPr>
+        <w:t>Calculator</w:t>
+      </w:r>
+      <w:r>
+        <w:rPr/>
+        <w:t xml:space="preserve"> and the </w:t>
+      </w:r>
+      <w:r>
+        <w:rPr>
+          <w:b/>
+        </w:rPr>
+        <w:t>Simulator</w:t>
+      </w:r>
+      <w:r>
+        <w:rPr/>
         <w:t>.</w:t>
         <w:br/>
         <w:t>Each one shows the same scrolling market-summary ticker along the bottom that</w:t>
@@ -1283,7 +1304,7 @@
     <w:p>
       <w:r>
         <w:rPr/>
-        <w:t>The public Strategy Finder is the one screen a visitor can act on: they type a</w:t>
+        <w:t>The public Strategy Finder is one of four screens a visitor can act on: they type a</w:t>
         <w:br/>
         <w:t>symbol and press Scan, and it ranks strategies for that symbol with one fixed</w:t>
         <w:br/>
@@ -1330,7 +1351,7 @@
     <w:p>
       <w:r>
         <w:rPr/>
-        <w:t>The public Rescue form is the other screen a visitor can act on. It is the</w:t>
+        <w:t>The public Rescue form is the second screen a visitor can act on. It is the</w:t>
         <w:br/>
       </w:r>
       <w:r>
@@ -1365,9 +1386,11 @@
         <w:rPr/>
         <w:t xml:space="preserve"> is on in the Public Strategy Finder settings. It runs</w:t>
         <w:br/>
-        <w:t>08:40–15:00 CT on trading days, with 200 rescues and 400 symbol loads a day for</w:t>
-        <w:br/>
-        <w:t>all visitors together and 20 rescues an hour for each visitor. The same trade</w:t>
+        <w:t>08:40–15:00 CT on trading days, within one daily budget of 600 Schwab-spending</w:t>
+        <w:br/>
+        <w:t>requests shared by all visitors of the Rescue form, the Calculator and the</w:t>
+        <w:br/>
+        <w:t>Simulator together, and 20 rescues an hour for each visitor. The same trade</w:t>
         <w:br/>
         <w:t>asked for again within 5 minutes shows the earlier answer, and the same</w:t>
         <w:br/>
@@ -1385,7 +1408,164 @@
       </w:r>
       <w:r>
         <w:rPr/>
-        <w:t>.</w:t>
+        <w:t>,</w:t>
+        <w:br/>
+        <w:t xml:space="preserve">the shared daily budget under its </w:t>
+      </w:r>
+      <w:r>
+        <w:rPr>
+          <w:b/>
+        </w:rPr>
+        <w:t>Budget</w:t>
+      </w:r>
+      <w:r>
+        <w:rPr/>
+        <w:t xml:space="preserve"> heading.</w:t>
+      </w:r>
+    </w:p>
+    <w:p>
+      <w:r>
+        <w:rPr/>
+        <w:t xml:space="preserve">The public </w:t>
+      </w:r>
+      <w:r>
+        <w:rPr>
+          <w:b/>
+        </w:rPr>
+        <w:t>Calculator</w:t>
+      </w:r>
+      <w:r>
+        <w:rPr/>
+        <w:t xml:space="preserve"> is the third. A visitor loads a symbol, picks a</w:t>
+        <w:br/>
+        <w:t>strategy and an expiration, builds the legs on that symbol's real strikes and</w:t>
+        <w:br/>
+        <w:t>types the price of each leg; the page then prices the position with the same</w:t>
+        <w:br/>
+        <w:t>six metric cards and profit-and-loss matrix your own Calculator draws, and</w:t>
+        <w:br/>
+        <w:t xml:space="preserve">estimates the implied volatility. </w:t>
+      </w:r>
+      <w:r>
+        <w:rPr>
+          <w:b/>
+        </w:rPr>
+        <w:t>Rate my trade</w:t>
+      </w:r>
+      <w:r>
+        <w:rPr/>
+        <w:t xml:space="preserve"> grades the legs with the</w:t>
+        <w:br/>
+        <w:t>Strategy Finder's scorer and checklist, without the paper-book line, since the</w:t>
+        <w:br/>
+        <w:t xml:space="preserve">visitor has no book here. While </w:t>
+      </w:r>
+      <w:r>
+        <w:rPr>
+          <w:b/>
+        </w:rPr>
+        <w:t>Show per-leg bid and ask</w:t>
+      </w:r>
+      <w:r>
+        <w:rPr/>
+        <w:t xml:space="preserve"> is off (the</w:t>
+        <w:br/>
+        <w:t>default) the page shows no chain grid, no price source (Bid / Mark / Ask), no</w:t>
+        <w:br/>
+        <w:t>delta, and the checklist's cost-to-trade line stays grey, because each of those</w:t>
+        <w:br/>
+        <w:t>would show a quote; the visitor's own typed prices drive everything, and a</w:t>
+        <w:br/>
+        <w:t xml:space="preserve">rating with an unpriced option leg is refused until they type one. </w:t>
+      </w:r>
+      <w:r>
+        <w:rPr>
+          <w:b/>
+        </w:rPr>
+        <w:t>Open in</w:t>
+        <w:br/>
+        <w:t>Simulator</w:t>
+      </w:r>
+      <w:r>
+        <w:rPr/>
+        <w:t xml:space="preserve"> carries the position across to the public Simulator in the same</w:t>
+        <w:br/>
+        <w:t>browser tab.</w:t>
+      </w:r>
+    </w:p>
+    <w:p>
+      <w:r>
+        <w:rPr/>
+        <w:t xml:space="preserve">The public </w:t>
+      </w:r>
+      <w:r>
+        <w:rPr>
+          <w:b/>
+        </w:rPr>
+        <w:t>Simulator</w:t>
+      </w:r>
+      <w:r>
+        <w:rPr/>
+        <w:t xml:space="preserve"> is the fourth, and shows the </w:t>
+      </w:r>
+      <w:r>
+        <w:rPr>
+          <w:b/>
+        </w:rPr>
+        <w:t>Price &amp; Time</w:t>
+      </w:r>
+      <w:r>
+        <w:rPr/>
+        <w:t xml:space="preserve"> view</w:t>
+        <w:br/>
+        <w:t>only: the what-if chart of how the position's value moves with the underlying</w:t>
+        <w:br/>
+        <w:t>price and the days ahead, and four position tiles — Delta and Theta are left</w:t>
+        <w:br/>
+        <w:t>out, since they would publish the position's greeks. It opens on the position</w:t>
+        <w:br/>
+        <w:t>the Calculator handed over, or a visitor can load a symbol and build one.</w:t>
+        <w:br/>
+        <w:t>Nothing is kept between visits: the hand-off lives in that browser tab only,</w:t>
+        <w:br/>
+        <w:t>for up to an hour.</w:t>
+      </w:r>
+    </w:p>
+    <w:p>
+      <w:r>
+        <w:rPr/>
+        <w:t>Both run their chain loads, extra expirations, ratings and Simulator snapshots</w:t>
+        <w:br/>
+        <w:t>08:40–15:00 CT on trading days, inside the shared daily budget above, and each</w:t>
+        <w:br/>
+        <w:t>visitor may make 60 of those an hour. Pricing a loaded position spends no</w:t>
+        <w:br/>
+        <w:t>Schwab call, runs at any time and allows 600 an hour. Their limits are in</w:t>
+        <w:br/>
+      </w:r>
+      <w:r>
+        <w:rPr>
+          <w:b/>
+        </w:rPr>
+        <w:t>Settings → Configuration → Public Calculator and Simulator</w:t>
+      </w:r>
+      <w:r>
+        <w:rPr/>
+        <w:t>; the daily</w:t>
+        <w:br/>
+        <w:t xml:space="preserve">budget is under </w:t>
+      </w:r>
+      <w:r>
+        <w:rPr>
+          <w:b/>
+        </w:rPr>
+        <w:t>Public Rescue form → Budget</w:t>
+      </w:r>
+      <w:r>
+        <w:rPr/>
+        <w:t>, because it is one allowance</w:t>
+        <w:br/>
+        <w:t>behind all three.</w:t>
       </w:r>
     </w:p>
     <w:p>
@@ -1410,7 +1590,7 @@
       </w:r>
       <w:r>
         <w:rPr/>
-        <w:t xml:space="preserve"> menu links the two screens a visitor can act on.</w:t>
+        <w:t xml:space="preserve"> menu links the four screens a visitor can act on.</w:t>
       </w:r>
     </w:p>
     <w:p>
@@ -1452,11 +1632,13 @@
       <w:r>
         <w:t xml:space="preserve"> Nothing anyone does there can reach your own</w:t>
         <w:br/>
-        <w:t xml:space="preserve">  app: it holds no login and can write only two things — a request for a public</w:t>
-        <w:br/>
-        <w:t xml:space="preserve">  Strategy Finder scan, and a request from the public Rescue form — which the</w:t>
-        <w:br/>
-        <w:t xml:space="preserve">  options service answers separately from your own work. Its</w:t>
+        <w:t xml:space="preserve">  app: it holds no login and can write only three kinds of thing — a request</w:t>
+        <w:br/>
+        <w:t xml:space="preserve">  for a public Strategy Finder scan, a request from the public Rescue form, and</w:t>
+        <w:br/>
+        <w:t xml:space="preserve">  a request from the public Calculator or Simulator — which the options service</w:t>
+        <w:br/>
+        <w:t xml:space="preserve">  answers separately from your own work. Its</w:t>
         <w:br/>
         <w:t xml:space="preserve">  health has its own card on </w:t>
       </w:r>

</xml_diff>

<commit_message>
feat(public gamma): Phase 3 - one Gamma screen instead of nine
The public Gamma page (render(public=True)) replaces the pinned $SPX/SPY/QQQ
Gamma, $SPX Charm/DEX/Vanna/Term and SPY/QQQ Premium Divergence screens.
Their routes are 308 redirects to /gamma (live_screens.RETIRED_ROUTES,
registered by live_main, no state carried - D4). Sixteen screens; one Gamma
tile on the grid. The cross-tier mirror tests now pin $SPX, the page's
default symbol, to every view the page offers. Routes doc, user guide,
CLAUDE.md and the roadmap updated.

Co-Authored-By: Claude Opus 5 <noreply@anthropic.com>
</commit_message>
<xml_diff>
--- a/docs/manuals/user-guide/user-guide.docx
+++ b/docs/manuals/user-guide/user-guide.docx
@@ -1219,7 +1219,7 @@
     <w:p>
       <w:r>
         <w:rPr/>
-        <w:t xml:space="preserve">Twenty-four of the app's screens are also published </w:t>
+        <w:t xml:space="preserve">Sixteen of the app's screens are also published </w:t>
       </w:r>
       <w:r>
         <w:rPr>
@@ -1247,23 +1247,29 @@
         <w:br/>
         <w:t>Opportunity Board, Flow Alerts, Macro Board, Sentiment, Bull / Bear Map, Sector &amp;</w:t>
         <w:br/>
-        <w:t>Industry, Sector Rotation, RRG, Momentum, Net Prem, the two Premium Divergence</w:t>
-        <w:br/>
-        <w:t>screens, and eight Dealer Positioning boards: Gamma for $SPX, SPY and QQQ, and</w:t>
-        <w:br/>
-        <w:t xml:space="preserve">Charm, DEX, Vanna and Term Structure for $SPX, the </w:t>
-      </w:r>
-      <w:r>
-        <w:rPr>
-          <w:b/>
-        </w:rPr>
-        <w:t>Strategy Finder</w:t>
-      </w:r>
-      <w:r>
-        <w:rPr/>
-        <w:t>, the</w:t>
-        <w:br/>
-        <w:t xml:space="preserve">Rescue ad-hoc form (published as </w:t>
+        <w:t xml:space="preserve">Industry, Sector Rotation, RRG, Momentum, Net Prem, </w:t>
+      </w:r>
+      <w:r>
+        <w:rPr>
+          <w:b/>
+        </w:rPr>
+        <w:t>Gamma</w:t>
+      </w:r>
+      <w:r>
+        <w:rPr/>
+        <w:t xml:space="preserve">, the </w:t>
+      </w:r>
+      <w:r>
+        <w:rPr>
+          <w:b/>
+        </w:rPr>
+        <w:t>Strategy</w:t>
+        <w:br/>
+        <w:t>Finder</w:t>
+      </w:r>
+      <w:r>
+        <w:rPr/>
+        <w:t xml:space="preserve">, the Rescue ad-hoc form (published as </w:t>
       </w:r>
       <w:r>
         <w:rPr>
@@ -1295,6 +1301,88 @@
       <w:r>
         <w:rPr/>
         <w:t>.</w:t>
+      </w:r>
+    </w:p>
+    <w:p>
+      <w:r>
+        <w:rPr/>
+        <w:t xml:space="preserve">The public </w:t>
+      </w:r>
+      <w:r>
+        <w:rPr>
+          <w:b/>
+        </w:rPr>
+        <w:t>Gamma</w:t>
+      </w:r>
+      <w:r>
+        <w:rPr/>
+        <w:t xml:space="preserve"> page is Dealer Positioning with its symbol dropdown: a</w:t>
+        <w:br/>
+        <w:t xml:space="preserve">visitor picks any symbol your collector gathers (the </w:t>
+      </w:r>
+      <w:r>
+        <w:rPr>
+          <w:rFonts w:ascii="Consolas" w:hAnsi="Consolas"/>
+          <w:color w:val="334455"/>
+          <w:sz w:val="19"/>
+        </w:rPr>
+        <w:t>symbols.toml</w:t>
+      </w:r>
+      <w:r>
+        <w:rPr/>
+        <w:t xml:space="preserve"> lists plus</w:t>
+        <w:br/>
+        <w:t>your Top 20 list) and switches between Gamma, Charm, Delta, Vanna and Flow.</w:t>
+        <w:br/>
+        <w:t>There is no Term tab and no Net Prem tab (Net Prem is its own screen). $SPX, SPY</w:t>
+        <w:br/>
+        <w:t>and QQQ are always live; any other symbol goes live when a visitor picks it and</w:t>
+        <w:br/>
+        <w:t>stays live while someone watches it, up to 8 at once (Settings → Configuration</w:t>
+        <w:br/>
+        <w:t>→ Public Gamma page). Picking a symbol costs no Schwab call: it reuses the chain</w:t>
+        <w:br/>
+        <w:t>the collector already downloads every minute. The addresses of the old pinned</w:t>
+        <w:br/>
+        <w:t>Gamma screens (</w:t>
+      </w:r>
+      <w:r>
+        <w:rPr>
+          <w:rFonts w:ascii="Consolas" w:hAnsi="Consolas"/>
+          <w:color w:val="334455"/>
+          <w:sz w:val="19"/>
+        </w:rPr>
+        <w:t>/charm</w:t>
+      </w:r>
+      <w:r>
+        <w:rPr/>
+        <w:t xml:space="preserve">, </w:t>
+      </w:r>
+      <w:r>
+        <w:rPr>
+          <w:rFonts w:ascii="Consolas" w:hAnsi="Consolas"/>
+          <w:color w:val="334455"/>
+          <w:sz w:val="19"/>
+        </w:rPr>
+        <w:t>/gamma/spy</w:t>
+      </w:r>
+      <w:r>
+        <w:rPr/>
+        <w:t xml:space="preserve">, </w:t>
+      </w:r>
+      <w:r>
+        <w:rPr>
+          <w:rFonts w:ascii="Consolas" w:hAnsi="Consolas"/>
+          <w:color w:val="334455"/>
+          <w:sz w:val="19"/>
+        </w:rPr>
+        <w:t>/premium-divergence/spy</w:t>
+      </w:r>
+      <w:r>
+        <w:rPr/>
+        <w:t xml:space="preserve"> and so on) now</w:t>
+        <w:br/>
+        <w:t>open this page.</w:t>
         <w:br/>
         <w:t>Each one shows the same scrolling market-summary ticker along the bottom that</w:t>
         <w:br/>

</xml_diff>

<commit_message>
feat(x): the Post to X page
Co-Authored-By: Claude Opus 5 <noreply@anthropic.com>
</commit_message>
<xml_diff>
--- a/docs/manuals/user-guide/user-guide.docx
+++ b/docs/manuals/user-guide/user-guide.docx
@@ -32,7 +32,7 @@
           <w:color w:val="5B6678"/>
           <w:sz w:val="18"/>
         </w:rPr>
-        <w:t>NeuralStrike · Generated 2026-09-21</w:t>
+        <w:t>NeuralStrike · Generated 2026-09-22</w:t>
       </w:r>
     </w:p>
     <w:p/>
@@ -22689,6 +22689,295 @@
         <w:t xml:space="preserve"> date. They answer different questions and will</w:t>
         <w:br/>
         <w:t>not reconcile to each other — that is correct, not a bug.</w:t>
+      </w:r>
+    </w:p>
+    <w:p>
+      <w:pPr>
+        <w:pStyle w:val="Heading2"/>
+      </w:pPr>
+      <w:r>
+        <w:rPr/>
+        <w:t>Post to X</w:t>
+      </w:r>
+    </w:p>
+    <w:p>
+      <w:r>
+        <w:rPr>
+          <w:b/>
+        </w:rPr>
+        <w:t>Route:</w:t>
+      </w:r>
+      <w:r>
+        <w:rPr/>
+        <w:t xml:space="preserve"> </w:t>
+      </w:r>
+      <w:r>
+        <w:rPr>
+          <w:rFonts w:ascii="Consolas" w:hAnsi="Consolas"/>
+          <w:color w:val="334455"/>
+          <w:sz w:val="19"/>
+        </w:rPr>
+        <w:t>/x</w:t>
+      </w:r>
+      <w:r>
+        <w:rPr/>
+        <w:t>.</w:t>
+      </w:r>
+    </w:p>
+    <w:p>
+      <w:r>
+        <w:rPr/>
+        <w:t>Write a one-off post for the app's X account, and see every post the app has</w:t>
+        <w:br/>
+        <w:t>made there.</w:t>
+      </w:r>
+    </w:p>
+    <w:p>
+      <w:pPr>
+        <w:pStyle w:val="ListBullet"/>
+      </w:pPr>
+      <w:r>
+        <w:rPr>
+          <w:b/>
+        </w:rPr>
+        <w:t>Post</w:t>
+      </w:r>
+      <w:r>
+        <w:t xml:space="preserve"> is the text of the post. </w:t>
+      </w:r>
+      <w:r>
+        <w:rPr>
+          <w:b/>
+        </w:rPr>
+        <w:t>Link</w:t>
+      </w:r>
+      <w:r>
+        <w:t xml:space="preserve"> and </w:t>
+      </w:r>
+      <w:r>
+        <w:rPr>
+          <w:b/>
+        </w:rPr>
+        <w:t>Hashtags</w:t>
+      </w:r>
+      <w:r>
+        <w:t xml:space="preserve"> go on the lines</w:t>
+        <w:br/>
+        <w:t xml:space="preserve">  under it, the way every post from the app is laid out.</w:t>
+      </w:r>
+    </w:p>
+    <w:p>
+      <w:pPr>
+        <w:pStyle w:val="ListBullet"/>
+      </w:pPr>
+      <w:r>
+        <w:t xml:space="preserve">The </w:t>
+      </w:r>
+      <w:r>
+        <w:rPr>
+          <w:b/>
+        </w:rPr>
+        <w:t>counter</w:t>
+      </w:r>
+      <w:r>
+        <w:t xml:space="preserve"> shows the length the way X counts it: a link always counts</w:t>
+        <w:br/>
+        <w:t xml:space="preserve">  as 23 characters and an emoji as 2. It turns </w:t>
+      </w:r>
+      <w:r>
+        <w:rPr>
+          <w:b/>
+        </w:rPr>
+        <w:t>red</w:t>
+      </w:r>
+      <w:r>
+        <w:t xml:space="preserve"> when the post is too long,</w:t>
+        <w:br/>
+        <w:t xml:space="preserve">  and the service will then drop hashtags from the end first and only then cut</w:t>
+        <w:br/>
+        <w:t xml:space="preserve">  the text. The </w:t>
+      </w:r>
+      <w:r>
+        <w:rPr>
+          <w:b/>
+        </w:rPr>
+        <w:t>Preview</w:t>
+      </w:r>
+      <w:r>
+        <w:t xml:space="preserve"> underneath is exactly what will be sent.</w:t>
+      </w:r>
+    </w:p>
+    <w:p>
+      <w:pPr>
+        <w:pStyle w:val="ListBullet"/>
+      </w:pPr>
+      <w:r>
+        <w:rPr>
+          <w:b/>
+        </w:rPr>
+        <w:t>Image</w:t>
+      </w:r>
+      <w:r>
+        <w:t xml:space="preserve"> attaches one PNG or JPEG of up to 5 MB; </w:t>
+      </w:r>
+      <w:r>
+        <w:rPr>
+          <w:b/>
+        </w:rPr>
+        <w:t>Remove image</w:t>
+      </w:r>
+      <w:r>
+        <w:t xml:space="preserve"> takes it off.</w:t>
+      </w:r>
+    </w:p>
+    <w:p>
+      <w:pPr>
+        <w:pStyle w:val="ListBullet"/>
+      </w:pPr>
+      <w:r>
+        <w:rPr>
+          <w:b/>
+        </w:rPr>
+        <w:t>Post</w:t>
+      </w:r>
+      <w:r>
+        <w:t xml:space="preserve"> asks you to confirm, then hands the post to the options service, which</w:t>
+        <w:br/>
+        <w:t xml:space="preserve">  sends it. The result appears in the log a moment later.</w:t>
+      </w:r>
+    </w:p>
+    <w:p>
+      <w:pPr>
+        <w:pStyle w:val="ListBullet"/>
+      </w:pPr>
+      <w:r>
+        <w:rPr>
+          <w:b/>
+        </w:rPr>
+        <w:t>Recent posts</w:t>
+      </w:r>
+      <w:r>
+        <w:t xml:space="preserve"> lists every post the app makes to X — the market reports, the</w:t>
+        <w:br/>
+        <w:t xml:space="preserve">  hourly trade ideas and posts from this page — with a link to each one that went</w:t>
+        <w:br/>
+        <w:t xml:space="preserve">  out, or the reason it did not (refused, failed, over the daily cap).</w:t>
+      </w:r>
+    </w:p>
+    <w:p>
+      <w:pPr>
+        <w:pStyle w:val="IntenseQuote"/>
+      </w:pPr>
+      <w:r>
+        <w:rPr>
+          <w:b/>
+        </w:rPr>
+        <w:t>X is off, and dry, until you set it up.</w:t>
+      </w:r>
+      <w:r>
+        <w:rPr/>
+        <w:t xml:space="preserve"> Nothing reaches X until the </w:t>
+      </w:r>
+      <w:r>
+        <w:rPr>
+          <w:rFonts w:ascii="Consolas" w:hAnsi="Consolas"/>
+          <w:color w:val="334455"/>
+          <w:sz w:val="19"/>
+        </w:rPr>
+        <w:t>x</w:t>
+      </w:r>
+      <w:r>
+        <w:rPr/>
+        <w:br/>
+        <w:t xml:space="preserve">block in </w:t>
+      </w:r>
+      <w:r>
+        <w:rPr>
+          <w:rFonts w:ascii="Consolas" w:hAnsi="Consolas"/>
+          <w:color w:val="334455"/>
+          <w:sz w:val="19"/>
+        </w:rPr>
+        <w:t>shared/notifications.json</w:t>
+      </w:r>
+      <w:r>
+        <w:rPr/>
+        <w:t xml:space="preserve"> has its keys filled in and </w:t>
+      </w:r>
+      <w:r>
+        <w:rPr>
+          <w:rFonts w:ascii="Consolas" w:hAnsi="Consolas"/>
+          <w:color w:val="334455"/>
+          <w:sz w:val="19"/>
+        </w:rPr>
+        <w:t>enabled</w:t>
+      </w:r>
+      <w:r>
+        <w:rPr/>
+        <w:t xml:space="preserve"> is on.</w:t>
+        <w:br/>
+        <w:t xml:space="preserve">While </w:t>
+      </w:r>
+      <w:r>
+        <w:rPr>
+          <w:rFonts w:ascii="Consolas" w:hAnsi="Consolas"/>
+          <w:color w:val="334455"/>
+          <w:sz w:val="19"/>
+        </w:rPr>
+        <w:t>x.dry_run</w:t>
+      </w:r>
+      <w:r>
+        <w:rPr/>
+        <w:t xml:space="preserve"> is on, every post is logged as </w:t>
+      </w:r>
+      <w:r>
+        <w:rPr>
+          <w:i/>
+        </w:rPr>
+        <w:t>Dry run</w:t>
+      </w:r>
+      <w:r>
+        <w:rPr/>
+        <w:t xml:space="preserve"> and nothing is sent.</w:t>
+        <w:br/>
+        <w:t xml:space="preserve">The default hashtags for each kind of post live in </w:t>
+      </w:r>
+      <w:r>
+        <w:rPr>
+          <w:rFonts w:ascii="Consolas" w:hAnsi="Consolas"/>
+          <w:color w:val="334455"/>
+          <w:sz w:val="19"/>
+        </w:rPr>
+        <w:t>x.hashtags</w:t>
+      </w:r>
+      <w:r>
+        <w:rPr/>
+        <w:t xml:space="preserve">, </w:t>
+      </w:r>
+      <w:r>
+        <w:rPr>
+          <w:rFonts w:ascii="Consolas" w:hAnsi="Consolas"/>
+          <w:color w:val="334455"/>
+          <w:sz w:val="19"/>
+        </w:rPr>
+        <w:t>max_tags</w:t>
+      </w:r>
+      <w:r>
+        <w:rPr/>
+        <w:t xml:space="preserve"> caps</w:t>
+        <w:br/>
+        <w:t xml:space="preserve">how many any post carries, and </w:t>
+      </w:r>
+      <w:r>
+        <w:rPr>
+          <w:rFonts w:ascii="Consolas" w:hAnsi="Consolas"/>
+          <w:color w:val="334455"/>
+          <w:sz w:val="19"/>
+        </w:rPr>
+        <w:t>daily_cap</w:t>
+      </w:r>
+      <w:r>
+        <w:rPr/>
+        <w:t xml:space="preserve"> limits how many go out in a day.</w:t>
       </w:r>
     </w:p>
     <w:p>

</xml_diff>

<commit_message>
docs(x): /x route entry, X_ENABLED, a credential-free check, preview caveats
- webgui-routes: a /x entry (view options:x_log, command x_post, the max_tags-4
  preview assumption, page-literal default link and tags, private only).
- runbook: TWITTER_ENABLED -> X_ENABLED; the dev suppression check prints the
  enabled flags only, never the config that holds every channel's secrets.
- user guide + page help: the preview is exact unless x.max_tags differs from
  4; the page's default tags are its own and x.hashtags.marketing is not read.
  User guide rebuilt.

Co-Authored-By: Claude Opus 5 <noreply@anthropic.com>
</commit_message>
<xml_diff>
--- a/docs/manuals/user-guide/user-guide.docx
+++ b/docs/manuals/user-guide/user-guide.docx
@@ -22804,79 +22804,9 @@
         <w:t>Preview</w:t>
       </w:r>
       <w:r>
-        <w:t xml:space="preserve"> underneath is exactly what will be sent.</w:t>
-      </w:r>
-    </w:p>
-    <w:p>
-      <w:pPr>
-        <w:pStyle w:val="ListBullet"/>
-      </w:pPr>
-      <w:r>
-        <w:rPr>
-          <w:b/>
-        </w:rPr>
-        <w:t>Image</w:t>
-      </w:r>
-      <w:r>
-        <w:t xml:space="preserve"> attaches one PNG or JPEG of up to 5 MB; </w:t>
-      </w:r>
-      <w:r>
-        <w:rPr>
-          <w:b/>
-        </w:rPr>
-        <w:t>Remove image</w:t>
-      </w:r>
-      <w:r>
-        <w:t xml:space="preserve"> takes it off.</w:t>
-      </w:r>
-    </w:p>
-    <w:p>
-      <w:pPr>
-        <w:pStyle w:val="ListBullet"/>
-      </w:pPr>
-      <w:r>
-        <w:rPr>
-          <w:b/>
-        </w:rPr>
-        <w:t>Post</w:t>
-      </w:r>
-      <w:r>
-        <w:t xml:space="preserve"> asks you to confirm, then hands the post to the options service, which</w:t>
-        <w:br/>
-        <w:t xml:space="preserve">  sends it. The result appears in the log a moment later.</w:t>
-      </w:r>
-    </w:p>
-    <w:p>
-      <w:pPr>
-        <w:pStyle w:val="ListBullet"/>
-      </w:pPr>
-      <w:r>
-        <w:rPr>
-          <w:b/>
-        </w:rPr>
-        <w:t>Recent posts</w:t>
-      </w:r>
-      <w:r>
-        <w:t xml:space="preserve"> lists every post the app makes to X — the market reports, the</w:t>
-        <w:br/>
-        <w:t xml:space="preserve">  hourly trade ideas and posts from this page — with a link to each one that went</w:t>
-        <w:br/>
-        <w:t xml:space="preserve">  out, or the reason it did not (refused, failed, over the daily cap).</w:t>
-      </w:r>
-    </w:p>
-    <w:p>
-      <w:pPr>
-        <w:pStyle w:val="IntenseQuote"/>
-      </w:pPr>
-      <w:r>
-        <w:rPr>
-          <w:b/>
-        </w:rPr>
-        <w:t>X is off, and dry, until you set it up.</w:t>
-      </w:r>
-      <w:r>
-        <w:rPr/>
-        <w:t xml:space="preserve"> Nothing reaches X until the </w:t>
+        <w:t xml:space="preserve"> underneath is exactly what will be sent — unless</w:t>
+        <w:br/>
+        <w:t xml:space="preserve">  </w:t>
       </w:r>
       <w:r>
         <w:rPr>
@@ -22884,12 +22814,84 @@
           <w:color w:val="334455"/>
           <w:sz w:val="19"/>
         </w:rPr>
-        <w:t>x</w:t>
-      </w:r>
-      <w:r>
-        <w:rPr/>
-        <w:br/>
-        <w:t xml:space="preserve">block in </w:t>
+        <w:t>x.max_tags</w:t>
+      </w:r>
+      <w:r>
+        <w:t xml:space="preserve"> is set to something other than 4, since the page previews four</w:t>
+        <w:br/>
+        <w:t xml:space="preserve">  hashtags at most.</w:t>
+      </w:r>
+    </w:p>
+    <w:p>
+      <w:pPr>
+        <w:pStyle w:val="ListBullet"/>
+      </w:pPr>
+      <w:r>
+        <w:rPr>
+          <w:b/>
+        </w:rPr>
+        <w:t>Image</w:t>
+      </w:r>
+      <w:r>
+        <w:t xml:space="preserve"> attaches one PNG or JPEG of up to 5 MB; </w:t>
+      </w:r>
+      <w:r>
+        <w:rPr>
+          <w:b/>
+        </w:rPr>
+        <w:t>Remove image</w:t>
+      </w:r>
+      <w:r>
+        <w:t xml:space="preserve"> takes it off.</w:t>
+      </w:r>
+    </w:p>
+    <w:p>
+      <w:pPr>
+        <w:pStyle w:val="ListBullet"/>
+      </w:pPr>
+      <w:r>
+        <w:rPr>
+          <w:b/>
+        </w:rPr>
+        <w:t>Post</w:t>
+      </w:r>
+      <w:r>
+        <w:t xml:space="preserve"> asks you to confirm, then hands the post to the options service, which</w:t>
+        <w:br/>
+        <w:t xml:space="preserve">  sends it. The result appears in the log a moment later.</w:t>
+      </w:r>
+    </w:p>
+    <w:p>
+      <w:pPr>
+        <w:pStyle w:val="ListBullet"/>
+      </w:pPr>
+      <w:r>
+        <w:rPr>
+          <w:b/>
+        </w:rPr>
+        <w:t>Recent posts</w:t>
+      </w:r>
+      <w:r>
+        <w:t xml:space="preserve"> lists every post the app makes to X — the market reports, the</w:t>
+        <w:br/>
+        <w:t xml:space="preserve">  hourly trade ideas and posts from this page — with a link to each one that went</w:t>
+        <w:br/>
+        <w:t xml:space="preserve">  out, or the reason it did not (refused, failed, over the daily cap).</w:t>
+      </w:r>
+    </w:p>
+    <w:p>
+      <w:pPr>
+        <w:pStyle w:val="IntenseQuote"/>
+      </w:pPr>
+      <w:r>
+        <w:rPr>
+          <w:b/>
+        </w:rPr>
+        <w:t>X is off, and dry, until you set it up.</w:t>
+      </w:r>
+      <w:r>
+        <w:rPr/>
+        <w:t xml:space="preserve"> Nothing reaches X until the </w:t>
       </w:r>
       <w:r>
         <w:rPr>
@@ -22897,11 +22899,12 @@
           <w:color w:val="334455"/>
           <w:sz w:val="19"/>
         </w:rPr>
-        <w:t>shared/notifications.json</w:t>
-      </w:r>
-      <w:r>
-        <w:rPr/>
-        <w:t xml:space="preserve"> has its keys filled in and </w:t>
+        <w:t>x</w:t>
+      </w:r>
+      <w:r>
+        <w:rPr/>
+        <w:br/>
+        <w:t xml:space="preserve">block in </w:t>
       </w:r>
       <w:r>
         <w:rPr>
@@ -22909,13 +22912,11 @@
           <w:color w:val="334455"/>
           <w:sz w:val="19"/>
         </w:rPr>
-        <w:t>enabled</w:t>
-      </w:r>
-      <w:r>
-        <w:rPr/>
-        <w:t xml:space="preserve"> is on.</w:t>
-        <w:br/>
-        <w:t xml:space="preserve">While </w:t>
+        <w:t>shared/notifications.json</w:t>
+      </w:r>
+      <w:r>
+        <w:rPr/>
+        <w:t xml:space="preserve"> has its keys filled in and </w:t>
       </w:r>
       <w:r>
         <w:rPr>
@@ -22923,23 +22924,13 @@
           <w:color w:val="334455"/>
           <w:sz w:val="19"/>
         </w:rPr>
-        <w:t>x.dry_run</w:t>
-      </w:r>
-      <w:r>
-        <w:rPr/>
-        <w:t xml:space="preserve"> is on, every post is logged as </w:t>
-      </w:r>
-      <w:r>
-        <w:rPr>
-          <w:i/>
-        </w:rPr>
-        <w:t>Dry run</w:t>
-      </w:r>
-      <w:r>
-        <w:rPr/>
-        <w:t xml:space="preserve"> and nothing is sent.</w:t>
-        <w:br/>
-        <w:t xml:space="preserve">The default hashtags for each kind of post live in </w:t>
+        <w:t>enabled</w:t>
+      </w:r>
+      <w:r>
+        <w:rPr/>
+        <w:t xml:space="preserve"> is on.</w:t>
+        <w:br/>
+        <w:t xml:space="preserve">While </w:t>
       </w:r>
       <w:r>
         <w:rPr>
@@ -22947,11 +22938,24 @@
           <w:color w:val="334455"/>
           <w:sz w:val="19"/>
         </w:rPr>
-        <w:t>x.hashtags</w:t>
-      </w:r>
-      <w:r>
-        <w:rPr/>
-        <w:t xml:space="preserve">, </w:t>
+        <w:t>x.dry_run</w:t>
+      </w:r>
+      <w:r>
+        <w:rPr/>
+        <w:t xml:space="preserve"> is on, every post is logged as </w:t>
+      </w:r>
+      <w:r>
+        <w:rPr>
+          <w:i/>
+        </w:rPr>
+        <w:t>Dry run</w:t>
+      </w:r>
+      <w:r>
+        <w:rPr/>
+        <w:t xml:space="preserve"> and nothing is sent.</w:t>
+        <w:br/>
+        <w:t>The default hashtags for the market reports and the trade ideas live in</w:t>
+        <w:br/>
       </w:r>
       <w:r>
         <w:rPr>
@@ -22959,13 +22963,11 @@
           <w:color w:val="334455"/>
           <w:sz w:val="19"/>
         </w:rPr>
-        <w:t>max_tags</w:t>
-      </w:r>
-      <w:r>
-        <w:rPr/>
-        <w:t xml:space="preserve"> caps</w:t>
-        <w:br/>
-        <w:t xml:space="preserve">how many any post carries, and </w:t>
+        <w:t>x.hashtags</w:t>
+      </w:r>
+      <w:r>
+        <w:rPr/>
+        <w:t>; this page's own defaults (</w:t>
       </w:r>
       <w:r>
         <w:rPr>
@@ -22973,11 +22975,51 @@
           <w:color w:val="334455"/>
           <w:sz w:val="19"/>
         </w:rPr>
+        <w:t>#options #trading</w:t>
+      </w:r>
+      <w:r>
+        <w:rPr/>
+        <w:t xml:space="preserve"> and the</w:t>
+        <w:br/>
+        <w:t>neuralstrike.co link) are built into the page, and it does not read</w:t>
+        <w:br/>
+      </w:r>
+      <w:r>
+        <w:rPr>
+          <w:rFonts w:ascii="Consolas" w:hAnsi="Consolas"/>
+          <w:color w:val="334455"/>
+          <w:sz w:val="19"/>
+        </w:rPr>
+        <w:t>x.hashtags.marketing</w:t>
+      </w:r>
+      <w:r>
+        <w:rPr/>
+        <w:t xml:space="preserve">. </w:t>
+      </w:r>
+      <w:r>
+        <w:rPr>
+          <w:rFonts w:ascii="Consolas" w:hAnsi="Consolas"/>
+          <w:color w:val="334455"/>
+          <w:sz w:val="19"/>
+        </w:rPr>
+        <w:t>max_tags</w:t>
+      </w:r>
+      <w:r>
+        <w:rPr/>
+        <w:t xml:space="preserve"> caps how many hashtags any post carries, and</w:t>
+        <w:br/>
+      </w:r>
+      <w:r>
+        <w:rPr>
+          <w:rFonts w:ascii="Consolas" w:hAnsi="Consolas"/>
+          <w:color w:val="334455"/>
+          <w:sz w:val="19"/>
+        </w:rPr>
         <w:t>daily_cap</w:t>
       </w:r>
       <w:r>
         <w:rPr/>
-        <w:t xml:space="preserve"> limits how many go out in a day.</w:t>
+        <w:t xml:space="preserve"> limits how many posts go out in a day.</w:t>
       </w:r>
     </w:p>
     <w:p>

</xml_diff>

<commit_message>
docs: $750 per-trade caps, the Finder's credit-spread line, edge-floor replay
Corrects the $250 statements in CLAUDE.md and the manuals in place, documents
the new line in the User Guide, Reference Guide and page help, and records the
measurement: across 917 closed PCS/CCS signals mean R rises with the
credit-over-delta margin, so EDGE_MARGIN stays 0.02.

Co-Authored-By: Claude Opus 5.5 <noreply@anthropic.com>
</commit_message>
<xml_diff>
--- a/docs/manuals/user-guide/user-guide.docx
+++ b/docs/manuals/user-guide/user-guide.docx
@@ -14947,7 +14947,7 @@
         <w:br/>
         <w:t>symbol. The limits apply to this ledger only — the Paper Account's automatic</w:t>
         <w:br/>
-        <w:t>engine has its own, with a $250 per-trade limit.</w:t>
+        <w:t>engine has its own, also with a $750 per-trade limit.</w:t>
       </w:r>
     </w:p>
     <w:p>
@@ -18070,7 +18070,37 @@
         <w:t>Scan failed</w:t>
       </w:r>
       <w:r>
-        <w:t>.</w:t>
+        <w:t>;</w:t>
+      </w:r>
+    </w:p>
+    <w:p>
+      <w:pPr>
+        <w:pStyle w:val="ListBullet"/>
+      </w:pPr>
+      <w:r>
+        <w:t xml:space="preserve">when the list holds </w:t>
+      </w:r>
+      <w:r>
+        <w:rPr>
+          <w:b/>
+        </w:rPr>
+        <w:t>no credit spreads</w:t>
+      </w:r>
+      <w:r>
+        <w:t>, a line under the count saying why —</w:t>
+        <w:br/>
+        <w:t xml:space="preserve">  for example </w:t>
+      </w:r>
+      <w:r>
+        <w:rPr>
+          <w:i/>
+        </w:rPr>
+        <w:t>Credit spreads: none of 209 short strikes in the delta band made a spread — 82 credit below the minimum, 63 credit too small for the short strike's delta, 49 outside the expected-move window.</w:t>
+      </w:r>
+      <w:r>
+        <w:t xml:space="preserve"> Those spreads are turned down before scoring, so</w:t>
+        <w:br/>
+        <w:t xml:space="preserve">  the counts above cannot show them.</w:t>
       </w:r>
     </w:p>
     <w:p>

</xml_diff>

<commit_message>
docs(news): EDGAR tags any filer; news_svc in the test lists
Co-Authored-By: Claude Opus 5.5 <noreply@anthropic.com>
Claude-Session: https://claude.ai/code/session_014N2du2DmXUxAruBTFwyyAD
</commit_message>
<xml_diff>
--- a/docs/manuals/user-guide/user-guide.docx
+++ b/docs/manuals/user-guide/user-guide.docx
@@ -7375,7 +7375,7 @@
         <w:t>$NVDA</w:t>
       </w:r>
       <w:r>
-        <w:t xml:space="preserve">, a bracket like </w:t>
+        <w:t xml:space="preserve"> or a bracket like </w:t>
       </w:r>
       <w:r>
         <w:rPr>
@@ -7386,11 +7386,22 @@
         <w:t>(NASDAQ: NVDA)</w:t>
       </w:r>
       <w:r>
-        <w:t>, or the company's own filing — or when</w:t>
-        <w:br/>
-        <w:t xml:space="preserve">  it came from Yahoo Finance's page for that ticker — and only for tickers the</w:t>
-        <w:br/>
-        <w:t xml:space="preserve">  app follows (the Watchlist only set). A company name alone never tags, so a</w:t>
+        <w:t xml:space="preserve"> — or when it came from Yahoo Finance's</w:t>
+        <w:br/>
+        <w:t xml:space="preserve">  page for that ticker, and only for tickers the app follows (the Watchlist only</w:t>
+        <w:br/>
+        <w:t xml:space="preserve">  set). An </w:t>
+      </w:r>
+      <w:r>
+        <w:rPr>
+          <w:b/>
+        </w:rPr>
+        <w:t>SEC filing</w:t>
+      </w:r>
+      <w:r>
+        <w:t xml:space="preserve"> is the exception: it carries the filing company's own</w:t>
+        <w:br/>
+        <w:t xml:space="preserve">  ticker whether or not the app follows it. A company name alone never tags, so a</w:t>
         <w:br/>
         <w:t xml:space="preserve">  ticker filter can miss a story about that company.</w:t>
       </w:r>

</xml_diff>

<commit_message>
fix(news): released tile label, neutral stale wording, dividend retry in config
- A released economic-data indicator now carries a status line,
  "Released 7:30 AM CT" (weekday and date added when the release fell on
  an earlier Central day); awaiting keeps "Awaiting the release".
- The impact pill's stale reason no longer claims a duration:
  "older news, so shown one level lower".
- trade_svc's failed-dividend-pull backoff moves from a module literal to
  [calendar.dividends] retry_min (15, an int 1..1440), validated in
  news_config.dividends_config() and catalogued in Settings ->
  Configuration (restart trade_svc).

Co-Authored-By: Claude Opus 5.5 <noreply@anthropic.com>
Claude-Session: https://claude.ai/code/session_014N2du2DmXUxAruBTFwyyAD
</commit_message>
<xml_diff>
--- a/docs/manuals/user-guide/user-guide.docx
+++ b/docs/manuals/user-guide/user-guide.docx
@@ -7960,18 +7960,7 @@
       <w:r>
         <w:t xml:space="preserve"> release is due.</w:t>
         <w:br/>
-        <w:t xml:space="preserve">    For a day after a release the tile is either </w:t>
-      </w:r>
-      <w:r>
-        <w:rPr>
-          <w:b/>
-        </w:rPr>
-        <w:t>released</w:t>
-      </w:r>
-      <w:r>
-        <w:t xml:space="preserve"> — the new number has</w:t>
-        <w:br/>
-        <w:t xml:space="preserve">    arrived and is the Actual — or reads </w:t>
+        <w:t xml:space="preserve">    For a day after a release the tile reads either </w:t>
       </w:r>
       <w:r>
         <w:rPr>
@@ -7980,9 +7969,32 @@
         <w:t>Awaiting the release</w:t>
       </w:r>
       <w:r>
-        <w:t xml:space="preserve"> (Actual —) while</w:t>
-        <w:br/>
-        <w:t xml:space="preserve">    the service checks for it every 2 minutes for up to an hour. A tile with no</w:t>
+        <w:br/>
+        <w:t xml:space="preserve">    (Actual —) while the service checks for the new number every 2 minutes for up</w:t>
+        <w:br/>
+        <w:t xml:space="preserve">    to an hour, or </w:t>
+      </w:r>
+      <w:r>
+        <w:rPr>
+          <w:b/>
+        </w:rPr>
+        <w:t>Released</w:t>
+      </w:r>
+      <w:r>
+        <w:t xml:space="preserve"> with the release time in Central — </w:t>
+      </w:r>
+      <w:r>
+        <w:rPr>
+          <w:i/>
+        </w:rPr>
+        <w:t>Released 7:30</w:t>
+        <w:br/>
+        <w:t xml:space="preserve">    AM CT</w:t>
+      </w:r>
+      <w:r>
+        <w:t>, with the day added once it is no longer today — once the new number has</w:t>
+        <w:br/>
+        <w:t xml:space="preserve">    arrived and is the Actual. A tile with no</w:t>
         <w:br/>
         <w:t xml:space="preserve">    future date reads </w:t>
       </w:r>

</xml_diff>

<commit_message>
docs(news): describe the redesigned Market News page
The /news route entry, the page's help guide, the User and Reference
Guides (rebuilt) and a CHANGELOG entry.

Co-Authored-By: Claude Opus 5.5 <noreply@anthropic.com>
Claude-Session: https://claude.ai/code/session_014N2du2DmXUxAruBTFwyyAD
</commit_message>
<xml_diff>
--- a/docs/manuals/user-guide/user-guide.docx
+++ b/docs/manuals/user-guide/user-guide.docx
@@ -1703,7 +1703,7 @@
         <w:rPr/>
         <w:t xml:space="preserve"> page is your Market News page — headlines, the SEC</w:t>
         <w:br/>
-        <w:t>panel and the calendar — with every control that belongs to you taken out: no</w:t>
+        <w:t>filings and the calendar, laid out the same way — with every control that belongs to you taken out: no</w:t>
         <w:br/>
         <w:t>Refresh, no Watchlist only, and a ticker is a filter chip rather than a link to a</w:t>
         <w:br/>
@@ -7324,7 +7324,7 @@
     <w:p>
       <w:r>
         <w:rPr/>
-        <w:t xml:space="preserve">Three panels: the </w:t>
+        <w:t xml:space="preserve">Two columns: the </w:t>
       </w:r>
       <w:r>
         <w:rPr>
@@ -7334,31 +7334,42 @@
       </w:r>
       <w:r>
         <w:rPr/>
-        <w:t xml:space="preserve"> on the left, the </w:t>
-      </w:r>
-      <w:r>
-        <w:rPr>
-          <w:b/>
-        </w:rPr>
-        <w:t>SEC / EDGAR</w:t>
-      </w:r>
-      <w:r>
-        <w:rPr/>
-        <w:t xml:space="preserve"> panel (filings and</w:t>
-        <w:br/>
-        <w:t xml:space="preserve">insider buys) top right, and the </w:t>
-      </w:r>
-      <w:r>
-        <w:rPr>
-          <w:b/>
-        </w:rPr>
-        <w:t>economic calendar</w:t>
-      </w:r>
-      <w:r>
-        <w:rPr/>
-        <w:t xml:space="preserve"> below it. On a phone they</w:t>
-        <w:br/>
-        <w:t>stack in that order. Every time is Central.</w:t>
+        <w:t xml:space="preserve"> and their filters on the left (two thirds of the</w:t>
+        <w:br/>
+        <w:t xml:space="preserve">width); on the right, </w:t>
+      </w:r>
+      <w:r>
+        <w:rPr>
+          <w:b/>
+        </w:rPr>
+        <w:t>Next on the calendar</w:t>
+      </w:r>
+      <w:r>
+        <w:rPr/>
+        <w:t xml:space="preserve">, the </w:t>
+      </w:r>
+      <w:r>
+        <w:rPr>
+          <w:b/>
+        </w:rPr>
+        <w:t>SEC filings</w:t>
+      </w:r>
+      <w:r>
+        <w:rPr/>
+        <w:t xml:space="preserve"> and the</w:t>
+        <w:br/>
+      </w:r>
+      <w:r>
+        <w:rPr>
+          <w:b/>
+        </w:rPr>
+        <w:t>Economic calendar</w:t>
+      </w:r>
+      <w:r>
+        <w:rPr/>
+        <w:t>. On a phone they stack in that order. Every time is Central, on</w:t>
+        <w:br/>
+        <w:t>a 24-hour clock.</w:t>
       </w:r>
     </w:p>
     <w:p>
@@ -7369,323 +7380,52 @@
         <w:rPr>
           <w:b/>
         </w:rPr>
-        <w:t>Each headline is one line</w:t>
-      </w:r>
-      <w:r>
-        <w:t>, in columns under a header that stays at the top</w:t>
-        <w:br/>
-        <w:t xml:space="preserve">  of the list as it scrolls: </w:t>
-      </w:r>
-      <w:r>
-        <w:rPr>
-          <w:b/>
-        </w:rPr>
-        <w:t>Time</w:t>
-      </w:r>
-      <w:r>
-        <w:t xml:space="preserve"> (when it was published; an older item shows</w:t>
-        <w:br/>
-        <w:t xml:space="preserve">  its date), </w:t>
-      </w:r>
-      <w:r>
-        <w:rPr>
-          <w:b/>
-        </w:rPr>
-        <w:t>Imp.</w:t>
-      </w:r>
-      <w:r>
-        <w:t xml:space="preserve"> (the impact letter), </w:t>
-      </w:r>
-      <w:r>
-        <w:rPr>
-          <w:b/>
-        </w:rPr>
-        <w:t>Symbol</w:t>
-      </w:r>
-      <w:r>
-        <w:t xml:space="preserve"> (up to two tickers; a </w:t>
-      </w:r>
-      <w:r>
-        <w:rPr>
-          <w:b/>
-        </w:rPr>
-        <w:t>+N</w:t>
-      </w:r>
-      <w:r>
-        <w:br/>
-        <w:t xml:space="preserve">  chip holds the rest — hover it for the list), the </w:t>
-      </w:r>
-      <w:r>
-        <w:rPr>
-          <w:b/>
-        </w:rPr>
-        <w:t>Headline</w:t>
-      </w:r>
-      <w:r>
-        <w:t xml:space="preserve">, and </w:t>
-      </w:r>
-      <w:r>
-        <w:rPr>
-          <w:b/>
-        </w:rPr>
-        <w:t>Source</w:t>
+        <w:t>The filter card</w:t>
+      </w:r>
+      <w:r>
+        <w:t xml:space="preserve"> at the top: a search box (</w:t>
+      </w:r>
+      <w:r>
+        <w:rPr>
+          <w:i/>
+        </w:rPr>
+        <w:t>Filter by ticker or keyword</w:t>
       </w:r>
       <w:r>
         <w:t xml:space="preserve"> —</w:t>
         <w:br/>
-        <w:t xml:space="preserve">  the feed that ran it, with </w:t>
-      </w:r>
-      <w:r>
-        <w:rPr>
-          <w:b/>
-        </w:rPr>
-        <w:t>+N</w:t>
-      </w:r>
-      <w:r>
-        <w:t xml:space="preserve"> when more feeds carried the same story (hover</w:t>
-        <w:br/>
-        <w:t xml:space="preserve">  it for every feed). On a narrow screen the Symbol and Source columns are dropped</w:t>
-        <w:br/>
-        <w:t xml:space="preserve">  so the headline keeps its room.</w:t>
-      </w:r>
-    </w:p>
-    <w:p>
-      <w:pPr>
-        <w:pStyle w:val="ListBullet"/>
-      </w:pPr>
-      <w:r>
-        <w:rPr>
-          <w:b/>
-        </w:rPr>
-        <w:t>Impact (H / M / L)</w:t>
-      </w:r>
-      <w:r>
-        <w:t xml:space="preserve"> is a rules-based rank the service gives every item: keyword</w:t>
-        <w:br/>
-        <w:t xml:space="preserve">  tiers (</w:t>
+        <w:t xml:space="preserve">  matches any word in a headline, or part of a ticker, in any case), the </w:t>
+      </w:r>
+      <w:r>
+        <w:rPr>
+          <w:b/>
+        </w:rPr>
+        <w:t>All · High</w:t>
+        <w:br/>
+        <w:t xml:space="preserve">  · Med · Low</w:t>
+      </w:r>
+      <w:r>
+        <w:t xml:space="preserve"> picker (a band shows </w:t>
       </w:r>
       <w:r>
         <w:rPr>
           <w:i/>
         </w:rPr>
-        <w:t>FOMC</w:t>
-      </w:r>
-      <w:r>
-        <w:t xml:space="preserve">, </w:t>
-      </w:r>
-      <w:r>
-        <w:rPr>
-          <w:i/>
-        </w:rPr>
-        <w:t>CPI</w:t>
-      </w:r>
-      <w:r>
-        <w:t xml:space="preserve">, </w:t>
-      </w:r>
-      <w:r>
-        <w:rPr>
-          <w:i/>
-        </w:rPr>
-        <w:t>merger</w:t>
-      </w:r>
-      <w:r>
-        <w:t xml:space="preserve">, </w:t>
-      </w:r>
-      <w:r>
-        <w:rPr>
-          <w:i/>
-        </w:rPr>
-        <w:t>bankruptcy</w:t>
-      </w:r>
-      <w:r>
-        <w:t xml:space="preserve"> … count most; </w:t>
-      </w:r>
-      <w:r>
-        <w:rPr>
-          <w:i/>
-        </w:rPr>
-        <w:t>downgrade</w:t>
-      </w:r>
-      <w:r>
-        <w:t>,</w:t>
+        <w:t>only</w:t>
+      </w:r>
+      <w:r>
+        <w:t xml:space="preserve"> that band; All shows everything), a</w:t>
         <w:br/>
         <w:t xml:space="preserve">  </w:t>
       </w:r>
       <w:r>
         <w:rPr>
-          <w:i/>
-        </w:rPr>
-        <w:t>earnings</w:t>
-      </w:r>
-      <w:r>
-        <w:t xml:space="preserve">, </w:t>
-      </w:r>
-      <w:r>
-        <w:rPr>
-          <w:i/>
-        </w:rPr>
-        <w:t>tariff</w:t>
-      </w:r>
-      <w:r>
-        <w:t xml:space="preserve"> … less; </w:t>
-      </w:r>
-      <w:r>
-        <w:rPr>
-          <w:i/>
-        </w:rPr>
-        <w:t>outlook</w:t>
-      </w:r>
-      <w:r>
-        <w:t xml:space="preserve">, </w:t>
-      </w:r>
-      <w:r>
-        <w:rPr>
-          <w:i/>
-        </w:rPr>
-        <w:t>analyst</w:t>
-      </w:r>
-      <w:r>
-        <w:t xml:space="preserve"> … least — each tier counts</w:t>
-        <w:br/>
-        <w:t xml:space="preserve">  once), points for the feed (the Federal Reserve most), a bonus when two or more</w:t>
-        <w:br/>
-        <w:t xml:space="preserve">  feeds ran the story or when it is tagged with a ticker you follow, the size of an</w:t>
-        <w:br/>
-        <w:t xml:space="preserve">  insider buy (more for an officer or director), and the type of an offering filing.</w:t>
-        <w:br/>
-        <w:t xml:space="preserve">  A score of </w:t>
-      </w:r>
-      <w:r>
-        <w:rPr>
-          <w:b/>
-        </w:rPr>
-        <w:t>6</w:t>
-      </w:r>
-      <w:r>
-        <w:t xml:space="preserve"> or more is High, </w:t>
-      </w:r>
-      <w:r>
-        <w:rPr>
-          <w:b/>
-        </w:rPr>
-        <w:t>3</w:t>
-      </w:r>
-      <w:r>
-        <w:t xml:space="preserve"> or more Med, anything lower Low. A High</w:t>
-        <w:br/>
-        <w:t xml:space="preserve">  older than </w:t>
-      </w:r>
-      <w:r>
-        <w:rPr>
-          <w:b/>
-        </w:rPr>
-        <w:t>24 hours</w:t>
-      </w:r>
-      <w:r>
-        <w:t xml:space="preserve"> shows as </w:t>
-      </w:r>
-      <w:r>
-        <w:rPr>
-          <w:b/>
-        </w:rPr>
-        <w:t>Med</w:t>
-      </w:r>
-      <w:r>
-        <w:t>. Hover the letter to read the rules that</w:t>
-        <w:br/>
-        <w:t xml:space="preserve">  scored it. Every threshold, keyword and point value is in </w:t>
-      </w:r>
-      <w:r>
-        <w:rPr>
-          <w:b/>
-        </w:rPr>
-        <w:t>Settings →</w:t>
-        <w:br/>
-        <w:t xml:space="preserve">  Configuration → Market news → Impact</w:t>
-      </w:r>
-      <w:r>
-        <w:t xml:space="preserve"> (and the </w:t>
-      </w:r>
-      <w:r>
-        <w:rPr>
-          <w:i/>
-        </w:rPr>
-        <w:t>Impact keywords</w:t>
-      </w:r>
-      <w:r>
-        <w:t xml:space="preserve">, </w:t>
-      </w:r>
-      <w:r>
-        <w:rPr>
-          <w:i/>
-        </w:rPr>
-        <w:t>by feed</w:t>
-      </w:r>
-      <w:r>
-        <w:t>,</w:t>
-        <w:br/>
-        <w:t xml:space="preserve">  </w:t>
-      </w:r>
-      <w:r>
-        <w:rPr>
-          <w:i/>
-        </w:rPr>
-        <w:t>insider buys</w:t>
-      </w:r>
-      <w:r>
-        <w:t xml:space="preserve"> and </w:t>
-      </w:r>
-      <w:r>
-        <w:rPr>
-          <w:i/>
-        </w:rPr>
-        <w:t>SEC filings</w:t>
-      </w:r>
-      <w:r>
-        <w:t xml:space="preserve"> sections below it).</w:t>
-      </w:r>
-    </w:p>
-    <w:p>
-      <w:pPr>
-        <w:pStyle w:val="ListBullet"/>
-      </w:pPr>
-      <w:r>
-        <w:rPr>
-          <w:b/>
-        </w:rPr>
-        <w:t>Sources</w:t>
-      </w:r>
-      <w:r>
-        <w:t xml:space="preserve"> are public news feeds (MarketWatch, CNBC, Yahoo Finance, the</w:t>
-        <w:br/>
-        <w:t xml:space="preserve">  press-release wires and others). A story several feeds carried names the first in</w:t>
-        <w:br/>
-        <w:t xml:space="preserve">  its Source column and counts the rest as </w:t>
-      </w:r>
-      <w:r>
-        <w:rPr>
-          <w:b/>
-        </w:rPr>
-        <w:t>+N</w:t>
-      </w:r>
-      <w:r>
-        <w:t>.</w:t>
-      </w:r>
-    </w:p>
-    <w:p>
-      <w:pPr>
-        <w:pStyle w:val="ListBullet"/>
-      </w:pPr>
-      <w:r>
-        <w:rPr>
-          <w:b/>
-        </w:rPr>
-        <w:t>A ticker is tagged only when the headline names it explicitly</w:t>
-      </w:r>
-      <w:r>
-        <w:t xml:space="preserve"> — a cashtag</w:t>
-        <w:br/>
-        <w:t xml:space="preserve">  like </w:t>
+          <w:b/>
+        </w:rPr>
+        <w:t>Watchlist only</w:t>
+      </w:r>
+      <w:r>
+        <w:t xml:space="preserve"> chip (the symbols the app collects gamma for, plus </w:t>
       </w:r>
       <w:r>
         <w:rPr>
@@ -7693,10 +7433,43 @@
           <w:color w:val="334455"/>
           <w:sz w:val="19"/>
         </w:rPr>
-        <w:t>$NVDA</w:t>
-      </w:r>
-      <w:r>
-        <w:t xml:space="preserve"> or a bracket like </w:t>
+        <w:t>[tickers]</w:t>
+        <w:br/>
+        <w:t xml:space="preserve">  extras</w:t>
+      </w:r>
+      <w:r>
+        <w:t xml:space="preserve">), and a </w:t>
+      </w:r>
+      <w:r>
+        <w:rPr>
+          <w:b/>
+        </w:rPr>
+        <w:t>SOURCES</w:t>
+      </w:r>
+      <w:r>
+        <w:t xml:space="preserve"> row — one chip per feed in the current list with the</w:t>
+        <w:br/>
+        <w:t xml:space="preserve">  number of its stories. Click a source to see only its stories; click several to</w:t>
+        <w:br/>
+        <w:t xml:space="preserve">  combine them; click again to drop one; none means every source. The filters apply to</w:t>
+        <w:br/>
+        <w:t xml:space="preserve">  the headlines only.</w:t>
+      </w:r>
+    </w:p>
+    <w:p>
+      <w:pPr>
+        <w:pStyle w:val="ListBullet"/>
+      </w:pPr>
+      <w:r>
+        <w:rPr>
+          <w:b/>
+        </w:rPr>
+        <w:t>Most mentioned</w:t>
+      </w:r>
+      <w:r>
+        <w:t xml:space="preserve"> — the tickers named in headlines from the general feeds over the</w:t>
+        <w:br/>
+        <w:t xml:space="preserve">  last 6 hours (</w:t>
       </w:r>
       <w:r>
         <w:rPr>
@@ -7704,57 +7477,10 @@
           <w:color w:val="334455"/>
           <w:sz w:val="19"/>
         </w:rPr>
-        <w:t>(NASDAQ: NVDA)</w:t>
-      </w:r>
-      <w:r>
-        <w:t xml:space="preserve"> — or when it came from Yahoo</w:t>
-        <w:br/>
-        <w:t xml:space="preserve">  Finance's page for that ticker, and only for tickers the app follows (the</w:t>
-        <w:br/>
-        <w:t xml:space="preserve">  Watchlist only set). A company name alone never tags, so a ticker filter can miss</w:t>
-        <w:br/>
-        <w:t xml:space="preserve">  a story about that company.</w:t>
-      </w:r>
-    </w:p>
-    <w:p>
-      <w:pPr>
-        <w:pStyle w:val="ListBullet"/>
-      </w:pPr>
-      <w:r>
-        <w:rPr>
-          <w:b/>
-        </w:rPr>
-        <w:t>Click a ticker</w:t>
-      </w:r>
-      <w:r>
-        <w:t xml:space="preserve"> to open its Symbol page. </w:t>
-      </w:r>
-      <w:r>
-        <w:rPr>
-          <w:b/>
-        </w:rPr>
-        <w:t>Click a headline</w:t>
-      </w:r>
-      <w:r>
-        <w:t xml:space="preserve"> to read it on the</w:t>
-        <w:br/>
-        <w:t xml:space="preserve">  publisher's site, in a new tab.</w:t>
-      </w:r>
-    </w:p>
-    <w:p>
-      <w:pPr>
-        <w:pStyle w:val="ListBullet"/>
-      </w:pPr>
-      <w:r>
-        <w:rPr>
-          <w:b/>
-        </w:rPr>
-        <w:t>Trending</w:t>
-      </w:r>
-      <w:r>
-        <w:t xml:space="preserve"> chips count the tickers named in headlines from the general feeds</w:t>
-        <w:br/>
-        <w:t xml:space="preserve">  over the last 6 hours (</w:t>
+        <w:t>[trending] window_h</w:t>
+      </w:r>
+      <w:r>
+        <w:t xml:space="preserve"> in </w:t>
       </w:r>
       <w:r>
         <w:rPr>
@@ -7762,10 +7488,50 @@
           <w:color w:val="334455"/>
           <w:sz w:val="19"/>
         </w:rPr>
-        <w:t>[trending] window_h</w:t>
-      </w:r>
-      <w:r>
-        <w:t xml:space="preserve"> in </w:t>
+        <w:t>config/news.toml</w:t>
+      </w:r>
+      <w:r>
+        <w:t>), with their counts. Yahoo</w:t>
+        <w:br/>
+        <w:t xml:space="preserve">  Finance's per-ticker stories are left out, because they carry the ticker they were</w:t>
+        <w:br/>
+        <w:t xml:space="preserve">  fetched for rather than one the headline named. Click one to show only its news;</w:t>
+        <w:br/>
+        <w:t xml:space="preserve">  click it again to clear. At the right: </w:t>
+      </w:r>
+      <w:r>
+        <w:rPr>
+          <w:b/>
+        </w:rPr>
+        <w:t>N of M stories</w:t>
+      </w:r>
+      <w:r>
+        <w:t xml:space="preserve"> — how many pass the</w:t>
+        <w:br/>
+        <w:t xml:space="preserve">  filters, out of the whole list.</w:t>
+      </w:r>
+    </w:p>
+    <w:p>
+      <w:pPr>
+        <w:pStyle w:val="ListBullet"/>
+      </w:pPr>
+      <w:r>
+        <w:rPr>
+          <w:b/>
+        </w:rPr>
+        <w:t>Each headline is one line</w:t>
+      </w:r>
+      <w:r>
+        <w:t xml:space="preserve">, with no header row: the </w:t>
+      </w:r>
+      <w:r>
+        <w:rPr>
+          <w:b/>
+        </w:rPr>
+        <w:t>time</w:t>
+      </w:r>
+      <w:r>
+        <w:t xml:space="preserve"> (today's as </w:t>
       </w:r>
       <w:r>
         <w:rPr>
@@ -7773,53 +7539,12 @@
           <w:color w:val="334455"/>
           <w:sz w:val="19"/>
         </w:rPr>
-        <w:t>config/news.toml</w:t>
-      </w:r>
-      <w:r>
-        <w:t>). Yahoo</w:t>
-        <w:br/>
-        <w:t xml:space="preserve">  Finance's per-ticker stories are left out, because they carry the ticker they</w:t>
-        <w:br/>
-        <w:t xml:space="preserve">  were fetched for rather than one the headline named. Click one to show only its</w:t>
-        <w:br/>
-        <w:t xml:space="preserve">  news; click it again to clear.</w:t>
-      </w:r>
-    </w:p>
-    <w:p>
-      <w:pPr>
-        <w:pStyle w:val="ListBullet"/>
-      </w:pPr>
-      <w:r>
-        <w:t xml:space="preserve">Filter by </w:t>
-      </w:r>
-      <w:r>
-        <w:rPr>
-          <w:b/>
-        </w:rPr>
-        <w:t>Sources</w:t>
-      </w:r>
-      <w:r>
-        <w:t xml:space="preserve">, </w:t>
-      </w:r>
-      <w:r>
-        <w:rPr>
-          <w:b/>
-        </w:rPr>
-        <w:t>Ticker</w:t>
-      </w:r>
-      <w:r>
-        <w:t xml:space="preserve">, </w:t>
-      </w:r>
-      <w:r>
-        <w:rPr>
-          <w:b/>
-        </w:rPr>
-        <w:t>Watchlist only</w:t>
-      </w:r>
-      <w:r>
-        <w:t xml:space="preserve"> (the symbols the app</w:t>
-        <w:br/>
-        <w:t xml:space="preserve">  collects gamma for, plus </w:t>
+        <w:t>9:41</w:t>
+      </w:r>
+      <w:r>
+        <w:t>,</w:t>
+        <w:br/>
+        <w:t xml:space="preserve">  this week's as </w:t>
       </w:r>
       <w:r>
         <w:rPr>
@@ -7827,23 +7552,82 @@
           <w:color w:val="334455"/>
           <w:sz w:val="19"/>
         </w:rPr>
-        <w:t>[tickers] extras</w:t>
-      </w:r>
-      <w:r>
-        <w:t xml:space="preserve">) or </w:t>
-      </w:r>
-      <w:r>
-        <w:rPr>
-          <w:b/>
-        </w:rPr>
-        <w:t>Impact</w:t>
-      </w:r>
-      <w:r>
-        <w:t xml:space="preserve"> (All · High · High +</w:t>
-        <w:br/>
-        <w:t xml:space="preserve">  Med); choosing no source means every source. The filters apply to the headlines</w:t>
-        <w:br/>
-        <w:t xml:space="preserve">  only. </w:t>
+        <w:t>Fri 16:22</w:t>
+      </w:r>
+      <w:r>
+        <w:t xml:space="preserve">, older as a date), </w:t>
+      </w:r>
+      <w:r>
+        <w:rPr>
+          <w:b/>
+        </w:rPr>
+        <w:t>HIGH / MED / LOW</w:t>
+      </w:r>
+      <w:r>
+        <w:t xml:space="preserve">, the </w:t>
+      </w:r>
+      <w:r>
+        <w:rPr>
+          <w:b/>
+        </w:rPr>
+        <w:t>headline</w:t>
+      </w:r>
+      <w:r>
+        <w:br/>
+        <w:t xml:space="preserve">  (click it to read it on the publisher's site, in a new tab), up to two </w:t>
+      </w:r>
+      <w:r>
+        <w:rPr>
+          <w:b/>
+        </w:rPr>
+        <w:t>tickers</w:t>
+      </w:r>
+      <w:r>
+        <w:t xml:space="preserve"> (a</w:t>
+        <w:br/>
+        <w:t xml:space="preserve">  </w:t>
+      </w:r>
+      <w:r>
+        <w:rPr>
+          <w:b/>
+        </w:rPr>
+        <w:t>+N</w:t>
+      </w:r>
+      <w:r>
+        <w:t xml:space="preserve"> chip holds the rest — hover it for the list) and the </w:t>
+      </w:r>
+      <w:r>
+        <w:rPr>
+          <w:b/>
+        </w:rPr>
+        <w:t>feed</w:t>
+      </w:r>
+      <w:r>
+        <w:t xml:space="preserve"> that ran it, in</w:t>
+        <w:br/>
+        <w:t xml:space="preserve">  blue (hover it for every feed when several carried the story). A </w:t>
+      </w:r>
+      <w:r>
+        <w:rPr>
+          <w:b/>
+        </w:rPr>
+        <w:t>HIGH</w:t>
+      </w:r>
+      <w:r>
+        <w:t xml:space="preserve"> story has a</w:t>
+        <w:br/>
+        <w:t xml:space="preserve">  red left edge and a faint red wash, a </w:t>
+      </w:r>
+      <w:r>
+        <w:rPr>
+          <w:b/>
+        </w:rPr>
+        <w:t>MED</w:t>
+      </w:r>
+      <w:r>
+        <w:t xml:space="preserve"> story an amber edge. On a narrow screen</w:t>
+        <w:br/>
+        <w:t xml:space="preserve">  the tickers and the feed are dropped so the headline keeps its room. </w:t>
       </w:r>
       <w:r>
         <w:rPr>
@@ -7852,7 +7636,8 @@
         <w:t>Show more</w:t>
       </w:r>
       <w:r>
-        <w:t xml:space="preserve"> pages further down the list.</w:t>
+        <w:br/>
+        <w:t xml:space="preserve">  pages further down the list.</w:t>
       </w:r>
     </w:p>
     <w:p>
@@ -7863,10 +7648,320 @@
         <w:rPr>
           <w:b/>
         </w:rPr>
-        <w:t>The SEC / EDGAR panel</w:t>
-      </w:r>
-      <w:r>
-        <w:t xml:space="preserve"> lists insider </w:t>
+        <w:t>Impact (HIGH / MED / LOW)</w:t>
+      </w:r>
+      <w:r>
+        <w:t xml:space="preserve"> is a rules-based rank the service gives every item: keyword</w:t>
+        <w:br/>
+        <w:t xml:space="preserve">  tiers (</w:t>
+      </w:r>
+      <w:r>
+        <w:rPr>
+          <w:i/>
+        </w:rPr>
+        <w:t>FOMC</w:t>
+      </w:r>
+      <w:r>
+        <w:t xml:space="preserve">, </w:t>
+      </w:r>
+      <w:r>
+        <w:rPr>
+          <w:i/>
+        </w:rPr>
+        <w:t>CPI</w:t>
+      </w:r>
+      <w:r>
+        <w:t xml:space="preserve">, </w:t>
+      </w:r>
+      <w:r>
+        <w:rPr>
+          <w:i/>
+        </w:rPr>
+        <w:t>merger</w:t>
+      </w:r>
+      <w:r>
+        <w:t xml:space="preserve">, </w:t>
+      </w:r>
+      <w:r>
+        <w:rPr>
+          <w:i/>
+        </w:rPr>
+        <w:t>bankruptcy</w:t>
+      </w:r>
+      <w:r>
+        <w:t xml:space="preserve"> … count most; </w:t>
+      </w:r>
+      <w:r>
+        <w:rPr>
+          <w:i/>
+        </w:rPr>
+        <w:t>downgrade</w:t>
+      </w:r>
+      <w:r>
+        <w:t>,</w:t>
+        <w:br/>
+        <w:t xml:space="preserve">  </w:t>
+      </w:r>
+      <w:r>
+        <w:rPr>
+          <w:i/>
+        </w:rPr>
+        <w:t>earnings</w:t>
+      </w:r>
+      <w:r>
+        <w:t xml:space="preserve">, </w:t>
+      </w:r>
+      <w:r>
+        <w:rPr>
+          <w:i/>
+        </w:rPr>
+        <w:t>tariff</w:t>
+      </w:r>
+      <w:r>
+        <w:t xml:space="preserve"> … less; </w:t>
+      </w:r>
+      <w:r>
+        <w:rPr>
+          <w:i/>
+        </w:rPr>
+        <w:t>outlook</w:t>
+      </w:r>
+      <w:r>
+        <w:t xml:space="preserve">, </w:t>
+      </w:r>
+      <w:r>
+        <w:rPr>
+          <w:i/>
+        </w:rPr>
+        <w:t>analyst</w:t>
+      </w:r>
+      <w:r>
+        <w:t xml:space="preserve"> … least — each tier counts</w:t>
+        <w:br/>
+        <w:t xml:space="preserve">  once), points for the feed (the Federal Reserve most), a bonus when two or more</w:t>
+        <w:br/>
+        <w:t xml:space="preserve">  feeds ran the story or when it is tagged with a ticker you follow, the size of an</w:t>
+        <w:br/>
+        <w:t xml:space="preserve">  insider buy (more for an officer or director), and the type of an offering filing.</w:t>
+        <w:br/>
+        <w:t xml:space="preserve">  A score of </w:t>
+      </w:r>
+      <w:r>
+        <w:rPr>
+          <w:b/>
+        </w:rPr>
+        <w:t>6</w:t>
+      </w:r>
+      <w:r>
+        <w:t xml:space="preserve"> or more is High, </w:t>
+      </w:r>
+      <w:r>
+        <w:rPr>
+          <w:b/>
+        </w:rPr>
+        <w:t>3</w:t>
+      </w:r>
+      <w:r>
+        <w:t xml:space="preserve"> or more Med, anything lower Low. A High</w:t>
+        <w:br/>
+        <w:t xml:space="preserve">  older than </w:t>
+      </w:r>
+      <w:r>
+        <w:rPr>
+          <w:b/>
+        </w:rPr>
+        <w:t>24 hours</w:t>
+      </w:r>
+      <w:r>
+        <w:t xml:space="preserve"> shows as </w:t>
+      </w:r>
+      <w:r>
+        <w:rPr>
+          <w:b/>
+        </w:rPr>
+        <w:t>Med</w:t>
+      </w:r>
+      <w:r>
+        <w:t>. Hover the word to read the rules that</w:t>
+        <w:br/>
+        <w:t xml:space="preserve">  scored it. Every threshold, keyword and point value is in </w:t>
+      </w:r>
+      <w:r>
+        <w:rPr>
+          <w:b/>
+        </w:rPr>
+        <w:t>Settings →</w:t>
+        <w:br/>
+        <w:t xml:space="preserve">  Configuration → Market news → Impact</w:t>
+      </w:r>
+      <w:r>
+        <w:t xml:space="preserve"> (and the </w:t>
+      </w:r>
+      <w:r>
+        <w:rPr>
+          <w:i/>
+        </w:rPr>
+        <w:t>Impact keywords</w:t>
+      </w:r>
+      <w:r>
+        <w:t xml:space="preserve">, </w:t>
+      </w:r>
+      <w:r>
+        <w:rPr>
+          <w:i/>
+        </w:rPr>
+        <w:t>by feed</w:t>
+      </w:r>
+      <w:r>
+        <w:t>,</w:t>
+        <w:br/>
+        <w:t xml:space="preserve">  </w:t>
+      </w:r>
+      <w:r>
+        <w:rPr>
+          <w:i/>
+        </w:rPr>
+        <w:t>insider buys</w:t>
+      </w:r>
+      <w:r>
+        <w:t xml:space="preserve"> and </w:t>
+      </w:r>
+      <w:r>
+        <w:rPr>
+          <w:i/>
+        </w:rPr>
+        <w:t>SEC filings</w:t>
+      </w:r>
+      <w:r>
+        <w:t xml:space="preserve"> sections below it).</w:t>
+      </w:r>
+    </w:p>
+    <w:p>
+      <w:pPr>
+        <w:pStyle w:val="ListBullet"/>
+      </w:pPr>
+      <w:r>
+        <w:rPr>
+          <w:b/>
+        </w:rPr>
+        <w:t>A ticker is tagged only when the headline names it explicitly</w:t>
+      </w:r>
+      <w:r>
+        <w:t xml:space="preserve"> — a cashtag</w:t>
+        <w:br/>
+        <w:t xml:space="preserve">  like </w:t>
+      </w:r>
+      <w:r>
+        <w:rPr>
+          <w:rFonts w:ascii="Consolas" w:hAnsi="Consolas"/>
+          <w:color w:val="334455"/>
+          <w:sz w:val="19"/>
+        </w:rPr>
+        <w:t>$NVDA</w:t>
+      </w:r>
+      <w:r>
+        <w:t xml:space="preserve"> or a bracket like </w:t>
+      </w:r>
+      <w:r>
+        <w:rPr>
+          <w:rFonts w:ascii="Consolas" w:hAnsi="Consolas"/>
+          <w:color w:val="334455"/>
+          <w:sz w:val="19"/>
+        </w:rPr>
+        <w:t>(NASDAQ: NVDA)</w:t>
+      </w:r>
+      <w:r>
+        <w:t xml:space="preserve"> — or when it came from Yahoo</w:t>
+        <w:br/>
+        <w:t xml:space="preserve">  Finance's page for that ticker, and only for tickers the app follows (the</w:t>
+        <w:br/>
+        <w:t xml:space="preserve">  Watchlist only set). A company name alone never tags, so a ticker filter can miss</w:t>
+        <w:br/>
+        <w:t xml:space="preserve">  a story about that company.</w:t>
+      </w:r>
+    </w:p>
+    <w:p>
+      <w:pPr>
+        <w:pStyle w:val="ListBullet"/>
+      </w:pPr>
+      <w:r>
+        <w:rPr>
+          <w:b/>
+        </w:rPr>
+        <w:t>Click a ticker</w:t>
+      </w:r>
+      <w:r>
+        <w:t xml:space="preserve"> to open its Symbol page.</w:t>
+      </w:r>
+    </w:p>
+    <w:p>
+      <w:pPr>
+        <w:pStyle w:val="ListBullet"/>
+      </w:pPr>
+      <w:r>
+        <w:rPr>
+          <w:b/>
+        </w:rPr>
+        <w:t>Next on the calendar</w:t>
+      </w:r>
+      <w:r>
+        <w:t xml:space="preserve"> (top right) — the next event or data release that has a</w:t>
+        <w:br/>
+        <w:t xml:space="preserve">  time, with a countdown (</w:t>
+      </w:r>
+      <w:r>
+        <w:rPr>
+          <w:i/>
+        </w:rPr>
+        <w:t>in 1d 19h</w:t>
+      </w:r>
+      <w:r>
+        <w:t xml:space="preserve">, </w:t>
+      </w:r>
+      <w:r>
+        <w:rPr>
+          <w:i/>
+        </w:rPr>
+        <w:t>in 45m</w:t>
+      </w:r>
+      <w:r>
+        <w:t xml:space="preserve">, </w:t>
+      </w:r>
+      <w:r>
+        <w:rPr>
+          <w:i/>
+        </w:rPr>
+        <w:t>now</w:t>
+      </w:r>
+      <w:r>
+        <w:t>), its title (a Fed speaker as</w:t>
+        <w:br/>
+        <w:t xml:space="preserve">  </w:t>
+      </w:r>
+      <w:r>
+        <w:rPr>
+          <w:i/>
+        </w:rPr>
+        <w:t>Vice Chair for Supervision Michelle W. Bowman — discussion</w:t>
+      </w:r>
+      <w:r>
+        <w:t>) and its date and time.</w:t>
+        <w:br/>
+        <w:t xml:space="preserve">  An item with only a date is not counted down to.</w:t>
+      </w:r>
+    </w:p>
+    <w:p>
+      <w:pPr>
+        <w:pStyle w:val="ListBullet"/>
+      </w:pPr>
+      <w:r>
+        <w:rPr>
+          <w:b/>
+        </w:rPr>
+        <w:t>SEC filings</w:t>
+      </w:r>
+      <w:r>
+        <w:t xml:space="preserve"> — insider </w:t>
       </w:r>
       <w:r>
         <w:rPr>
@@ -7875,15 +7970,91 @@
         <w:t>purchases</w:t>
       </w:r>
       <w:r>
-        <w:t xml:space="preserve"> filed on Form 4 and new share</w:t>
-        <w:br/>
-        <w:t xml:space="preserve">  offerings (S-1, S-3, 424B5, S-3ASR) in three columns: </w:t>
-      </w:r>
-      <w:r>
-        <w:rPr>
-          <w:b/>
-        </w:rPr>
-        <w:t>Date/Time</w:t>
+        <w:t xml:space="preserve"> filed on Form 4 and new share offerings and</w:t>
+        <w:br/>
+        <w:t xml:space="preserve">  registrations (424B5, S-1, S-3, S-3ASR), newest first. The chips </w:t>
+      </w:r>
+      <w:r>
+        <w:rPr>
+          <w:b/>
+        </w:rPr>
+        <w:t>All · Insider buys</w:t>
+        <w:br/>
+        <w:t xml:space="preserve">  · Offerings · Registrations</w:t>
+      </w:r>
+      <w:r>
+        <w:t xml:space="preserve"> show one kind at a time. Each row: a dot for its impact,</w:t>
+        <w:br/>
+        <w:t xml:space="preserve">  the </w:t>
+      </w:r>
+      <w:r>
+        <w:rPr>
+          <w:b/>
+        </w:rPr>
+        <w:t>form</w:t>
+      </w:r>
+      <w:r>
+        <w:t xml:space="preserve"> (FORM 4 green, 424B5 red, S-1 amber, S-3 grey), the symbol (the filer's</w:t>
+        <w:br/>
+        <w:t xml:space="preserve">  own ticker whether or not the app follows it), who filed — the insider, or the</w:t>
+        <w:br/>
+        <w:t xml:space="preserve">  company and what it filed (hover for the full title) — an insider buy's dollar total</w:t>
+        <w:br/>
+        <w:t xml:space="preserve">  in green, and the time. A name opens the filing on </w:t>
+      </w:r>
+      <w:r>
+        <w:rPr>
+          <w:b/>
+        </w:rPr>
+        <w:t>sec.gov</w:t>
+      </w:r>
+      <w:r>
+        <w:t xml:space="preserve"> and nowhere else.</w:t>
+      </w:r>
+    </w:p>
+    <w:p>
+      <w:pPr>
+        <w:pStyle w:val="ListBullet"/>
+      </w:pPr>
+      <w:r>
+        <w:rPr>
+          <w:b/>
+        </w:rPr>
+        <w:t>Economic calendar</w:t>
+      </w:r>
+      <w:r>
+        <w:t xml:space="preserve"> — one list, grouped by day (</w:t>
+      </w:r>
+      <w:r>
+        <w:rPr>
+          <w:i/>
+        </w:rPr>
+        <w:t>MON · SEP 28</w:t>
+      </w:r>
+      <w:r>
+        <w:t>), each row a time,</w:t>
+        <w:br/>
+        <w:t xml:space="preserve">  a </w:t>
+      </w:r>
+      <w:r>
+        <w:rPr>
+          <w:b/>
+        </w:rPr>
+        <w:t>badge</w:t>
+      </w:r>
+      <w:r>
+        <w:t>, a title and a grey subtitle. The badge tells the kinds apart:</w:t>
+      </w:r>
+    </w:p>
+    <w:p>
+      <w:pPr>
+        <w:pStyle w:val="ListBullet"/>
+      </w:pPr>
+      <w:r>
+        <w:rPr>
+          <w:b/>
+        </w:rPr>
+        <w:t>FOMC</w:t>
       </w:r>
       <w:r>
         <w:t xml:space="preserve">, </w:t>
@@ -7892,312 +8063,261 @@
         <w:rPr>
           <w:b/>
         </w:rPr>
+        <w:t>SPEECH</w:t>
+      </w:r>
+      <w:r>
+        <w:t xml:space="preserve">, </w:t>
+      </w:r>
+      <w:r>
+        <w:rPr>
+          <w:b/>
+        </w:rPr>
+        <w:t>TESTIMONY</w:t>
+      </w:r>
+      <w:r>
+        <w:t xml:space="preserve"> or </w:t>
+      </w:r>
+      <w:r>
+        <w:rPr>
+          <w:b/>
+        </w:rPr>
+        <w:t>EVENT</w:t>
+      </w:r>
+      <w:r>
+        <w:t xml:space="preserve"> — the Federal Reserve's calendar</w:t>
+        <w:br/>
+        <w:t xml:space="preserve">    (FOMC meetings, the Beige Book, Board speeches and testimony) plus a few other</w:t>
+        <w:br/>
+        <w:t xml:space="preserve">    scheduled releases (JOLTS, the Employment Cost Index). A speech shows the</w:t>
+        <w:br/>
+        <w:t xml:space="preserve">    speaker's name, then their role.</w:t>
+      </w:r>
+    </w:p>
+    <w:p>
+      <w:pPr>
+        <w:pStyle w:val="ListBullet"/>
+      </w:pPr>
+      <w:r>
+        <w:rPr>
+          <w:b/>
+        </w:rPr>
+        <w:t>DIVIDEND</w:t>
+      </w:r>
+      <w:r>
+        <w:t xml:space="preserve"> and </w:t>
+      </w:r>
+      <w:r>
+        <w:rPr>
+          <w:b/>
+        </w:rPr>
+        <w:t>IPO</w:t>
+      </w:r>
+      <w:r>
+        <w:t xml:space="preserve"> — the ex-dividend date, amount and pay date for the tickers</w:t>
+        <w:br/>
+        <w:t xml:space="preserve">    you follow (the next 30 days, and the last 3), and IPOs of $100 million or more</w:t>
+        <w:br/>
+        <w:t xml:space="preserve">    from Nasdaq's calendar — upcoming with their price range, priced ones for a week</w:t>
+        <w:br/>
+        <w:t xml:space="preserve">    with their price. A dividend's subtitle is its amount and</w:t>
+        <w:br/>
+        <w:t xml:space="preserve">    pay date; an IPO's its price or range and the offer size.</w:t>
+      </w:r>
+    </w:p>
+    <w:p>
+      <w:pPr>
+        <w:pStyle w:val="ListBullet"/>
+      </w:pPr>
+      <w:r>
+        <w:rPr>
+          <w:b/>
+        </w:rPr>
+        <w:t>DATA</w:t>
+      </w:r>
+      <w:r>
+        <w:t xml:space="preserve"> — one row per report: CPI, PPI, Jobs (payrolls and unemployment), PCE,</w:t>
+        <w:br/>
+        <w:t xml:space="preserve">    GDP, Retail sales and Jobless claims, at its next release, with the </w:t>
+      </w:r>
+      <w:r>
+        <w:rPr>
+          <w:b/>
+        </w:rPr>
+        <w:t>Prior</w:t>
+      </w:r>
+      <w:r>
+        <w:br/>
+        <w:t xml:space="preserve">    value. For a day after a release the row sits at the release and reads either</w:t>
+        <w:br/>
+        <w:t xml:space="preserve">    </w:t>
+      </w:r>
+      <w:r>
+        <w:rPr>
+          <w:b/>
+        </w:rPr>
+        <w:t>Awaiting the release</w:t>
+      </w:r>
+      <w:r>
+        <w:t xml:space="preserve"> while the service checks for the new number every 2</w:t>
+        <w:br/>
+        <w:t xml:space="preserve">    minutes for up to an hour, or </w:t>
+      </w:r>
+      <w:r>
+        <w:rPr>
+          <w:b/>
+        </w:rPr>
+        <w:t>Actual … · Prior … · Released 7:30 AM CT</w:t>
+      </w:r>
+      <w:r>
+        <w:t xml:space="preserve"> once the</w:t>
+        <w:br/>
+        <w:t xml:space="preserve">    new number has arrived (the day is added once it is no longer today). A report</w:t>
+        <w:br/>
+        <w:t xml:space="preserve">    with two figures (CPI and Core CPI) shows a line for each. A report with no future</w:t>
+        <w:br/>
+        <w:t xml:space="preserve">    date is listed at the end under </w:t>
+      </w:r>
+      <w:r>
+        <w:rPr>
+          <w:i/>
+        </w:rPr>
+        <w:t>Date not yet published</w:t>
+      </w:r>
+      <w:r>
+        <w:t>.</w:t>
+        <w:br/>
+        <w:t xml:space="preserve">  A muted note at the top of the card means a source could not be reached and the last</w:t>
+        <w:br/>
+        <w:t xml:space="preserve">  good reading is shown; a kind with nothing ahead says so at the foot.</w:t>
+        <w:br/>
+        <w:t xml:space="preserve">  </w:t>
+      </w:r>
+      <w:r>
+        <w:rPr>
+          <w:b/>
+        </w:rPr>
+        <w:t>Highlighted rows</w:t>
+      </w:r>
+      <w:r>
+        <w:t xml:space="preserve"> — an amber left edge, a faint amber wash and a </w:t>
+      </w:r>
+      <w:r>
+        <w:rPr>
+          <w:b/>
+        </w:rPr>
+        <w:t>HIGH</w:t>
+      </w:r>
+      <w:r>
+        <w:t xml:space="preserve"> tag — are the releases that</w:t>
+        <w:br/>
+        <w:t xml:space="preserve">  most often move the market: the FOMC statement and its press conference, the Fed</w:t>
+        <w:br/>
+        <w:t xml:space="preserve">  Chair's own speeches and testimony, and the CPI, PPI, Jobs, PCE, GDP and Retail</w:t>
+        <w:br/>
+        <w:t xml:space="preserve">  sales reports (Jobless claims is not). The service decides: an event is high when</w:t>
+        <w:br/>
+        <w:t xml:space="preserve">  its title contains one of the phrases in </w:t>
+      </w:r>
+      <w:r>
+        <w:rPr>
+          <w:b/>
+        </w:rPr>
+        <w:t>Settings → Configuration → Market news</w:t>
+        <w:br/>
+        <w:t xml:space="preserve">  → Other releases → Highlight events whose title contains</w:t>
+      </w:r>
+      <w:r>
+        <w:t>, and a report when its</w:t>
+        <w:br/>
+        <w:t xml:space="preserve">  indicator's </w:t>
+      </w:r>
+      <w:r>
+        <w:rPr>
+          <w:b/>
+        </w:rPr>
+        <w:t>High impact</w:t>
+      </w:r>
+      <w:r>
+        <w:t xml:space="preserve"> switch is on.</w:t>
+      </w:r>
+    </w:p>
+    <w:p>
+      <w:pPr>
+        <w:pStyle w:val="ListBullet"/>
+      </w:pPr>
+      <w:r>
+        <w:rPr>
+          <w:b/>
+        </w:rPr>
+        <w:t>Refresh</w:t>
+      </w:r>
+      <w:r>
+        <w:t xml:space="preserve"> checks every feed now instead of waiting for the next scheduled poll</w:t>
+        <w:br/>
+        <w:t xml:space="preserve">  (every 5 minutes in market hours, 15 off-hours, 60 at weekends and holidays), and</w:t>
+        <w:br/>
+        <w:t xml:space="preserve">  re-checks the calendar — though each calendar source still keeps its own schedule.</w:t>
+      </w:r>
+    </w:p>
+    <w:p>
+      <w:pPr>
+        <w:pStyle w:val="ListBullet"/>
+      </w:pPr>
+      <w:r>
+        <w:t xml:space="preserve">The </w:t>
+      </w:r>
+      <w:r>
+        <w:rPr>
+          <w:b/>
+        </w:rPr>
+        <w:t>Desk</w:t>
+      </w:r>
+      <w:r>
+        <w:t xml:space="preserve"> shows the five newest headlines and each </w:t>
+      </w:r>
+      <w:r>
+        <w:rPr>
+          <w:b/>
+        </w:rPr>
         <w:t>Symbol</w:t>
       </w:r>
       <w:r>
-        <w:br/>
-        <w:t xml:space="preserve">  and </w:t>
-      </w:r>
-      <w:r>
-        <w:rPr>
-          <w:b/>
-        </w:rPr>
-        <w:t>Headline/Details</w:t>
-      </w:r>
-      <w:r>
-        <w:t xml:space="preserve"> — the impact letter, the title, then for an insider buy</w:t>
-        <w:br/>
-        <w:t xml:space="preserve">  how many purchases, their total and the date, or for a filing its form. A filing</w:t>
-        <w:br/>
-        <w:t xml:space="preserve">  carries the filer's own ticker whether or not the app follows it. Titles open the</w:t>
-        <w:br/>
-        <w:t xml:space="preserve">  filing on </w:t>
-      </w:r>
-      <w:r>
-        <w:rPr>
-          <w:b/>
-        </w:rPr>
-        <w:t>sec.gov</w:t>
-      </w:r>
-      <w:r>
-        <w:t xml:space="preserve"> and nowhere else.</w:t>
-      </w:r>
-    </w:p>
-    <w:p>
-      <w:pPr>
-        <w:pStyle w:val="ListBullet"/>
-      </w:pPr>
-      <w:r>
-        <w:rPr>
-          <w:b/>
-        </w:rPr>
-        <w:t>The calendar</w:t>
-      </w:r>
-      <w:r>
-        <w:t xml:space="preserve"> is three groups of tiles:</w:t>
-      </w:r>
-    </w:p>
-    <w:p>
-      <w:pPr>
-        <w:pStyle w:val="ListBullet"/>
-      </w:pPr>
-      <w:r>
-        <w:rPr>
-          <w:b/>
-        </w:rPr>
-        <w:t>Economic news/Calendar</w:t>
-      </w:r>
-      <w:r>
-        <w:t xml:space="preserve"> — FOMC meetings, the Beige Book, Board speeches and</w:t>
-        <w:br/>
-        <w:t xml:space="preserve">    testimony from the Federal Reserve's own calendar, plus a few other scheduled</w:t>
-        <w:br/>
-        <w:t xml:space="preserve">    releases (JOLTS, the Employment Cost Index).</w:t>
-      </w:r>
-    </w:p>
-    <w:p>
-      <w:pPr>
-        <w:pStyle w:val="ListBullet"/>
-      </w:pPr>
-      <w:r>
-        <w:rPr>
-          <w:b/>
-        </w:rPr>
-        <w:t>Dividend / IPO</w:t>
-      </w:r>
-      <w:r>
-        <w:t xml:space="preserve"> — the ex-dividend date, amount and pay date for the tickers</w:t>
-        <w:br/>
-        <w:t xml:space="preserve">    you follow (the next 30 days, and the last 3), and IPOs of $100 million or more</w:t>
-        <w:br/>
-        <w:t xml:space="preserve">    from Nasdaq's calendar — upcoming with their price range, priced ones for a week</w:t>
-        <w:br/>
-        <w:t xml:space="preserve">    with their price.</w:t>
-      </w:r>
-    </w:p>
-    <w:p>
-      <w:pPr>
-        <w:pStyle w:val="ListBullet"/>
-      </w:pPr>
-      <w:r>
-        <w:rPr>
-          <w:b/>
-        </w:rPr>
-        <w:t>Economic data (CPI, PPI etc)</w:t>
-      </w:r>
-      <w:r>
-        <w:t xml:space="preserve"> — one tile per report: CPI, PPI, Jobs (payrolls</w:t>
-        <w:br/>
-        <w:t xml:space="preserve">    and unemployment), PCE, GDP, Retail sales and Jobless claims. Each line shows</w:t>
-        <w:br/>
-        <w:t xml:space="preserve">    </w:t>
-      </w:r>
-      <w:r>
-        <w:rPr>
-          <w:b/>
-        </w:rPr>
-        <w:t>Actual</w:t>
-      </w:r>
-      <w:r>
-        <w:t xml:space="preserve"> and </w:t>
-      </w:r>
-      <w:r>
-        <w:rPr>
-          <w:b/>
-        </w:rPr>
-        <w:t>Prior</w:t>
-      </w:r>
-      <w:r>
-        <w:t xml:space="preserve">, and the tile shows when the </w:t>
-      </w:r>
-      <w:r>
-        <w:rPr>
-          <w:b/>
-        </w:rPr>
-        <w:t>Next</w:t>
-      </w:r>
-      <w:r>
-        <w:t xml:space="preserve"> release is due.</w:t>
-        <w:br/>
-        <w:t xml:space="preserve">    For a day after a release the tile reads either </w:t>
-      </w:r>
-      <w:r>
-        <w:rPr>
-          <w:b/>
-        </w:rPr>
-        <w:t>Awaiting the release</w:t>
-      </w:r>
-      <w:r>
-        <w:br/>
-        <w:t xml:space="preserve">    (Actual —) while the service checks for the new number every 2 minutes for up</w:t>
-        <w:br/>
-        <w:t xml:space="preserve">    to an hour, or </w:t>
-      </w:r>
-      <w:r>
-        <w:rPr>
-          <w:b/>
-        </w:rPr>
-        <w:t>Released</w:t>
-      </w:r>
-      <w:r>
-        <w:t xml:space="preserve"> with the release time in Central — </w:t>
+        <w:t xml:space="preserve"> page an</w:t>
+        <w:br/>
+        <w:t xml:space="preserve">  </w:t>
       </w:r>
       <w:r>
         <w:rPr>
           <w:i/>
         </w:rPr>
-        <w:t>Released 7:30</w:t>
-        <w:br/>
-        <w:t xml:space="preserve">    AM CT</w:t>
-      </w:r>
-      <w:r>
-        <w:t>, with the day added once it is no longer today — once the new number has</w:t>
-        <w:br/>
-        <w:t xml:space="preserve">    arrived and is the Actual. A tile with no</w:t>
-        <w:br/>
-        <w:t xml:space="preserve">    future date reads </w:t>
+        <w:t>In the news</w:t>
+      </w:r>
+      <w:r>
+        <w:t xml:space="preserve"> band (headlines and SEC items); the public site has its own copy of</w:t>
+        <w:br/>
+        <w:t xml:space="preserve">  this page (see </w:t>
       </w:r>
       <w:r>
         <w:rPr>
           <w:i/>
         </w:rPr>
-        <w:t>Next date not yet published</w:t>
+        <w:t>The public live screens</w:t>
+      </w:r>
+      <w:r>
+        <w:t>). Every feed, its on/off switch, whether</w:t>
+        <w:br/>
+        <w:t xml:space="preserve">  the public site may show it, the poll intervals, the impact rules and the</w:t>
+        <w:br/>
+        <w:t xml:space="preserve">  calendar's sources are in </w:t>
+      </w:r>
+      <w:r>
+        <w:rPr>
+          <w:b/>
+        </w:rPr>
+        <w:t>Settings → Configuration → Market news</w:t>
       </w:r>
       <w:r>
         <w:t>.</w:t>
-        <w:br/>
-        <w:t xml:space="preserve">  A muted note under a group means its sources could not be reached; it is showing</w:t>
-        <w:br/>
-        <w:t xml:space="preserve">  the last good reading.</w:t>
-        <w:br/>
-        <w:t xml:space="preserve">  </w:t>
-      </w:r>
-      <w:r>
-        <w:rPr>
-          <w:b/>
-        </w:rPr>
-        <w:t>Highlighted tiles</w:t>
-      </w:r>
-      <w:r>
-        <w:t xml:space="preserve"> — an amber border and a </w:t>
-      </w:r>
-      <w:r>
-        <w:rPr>
-          <w:b/>
-        </w:rPr>
-        <w:t>HIGH</w:t>
-      </w:r>
-      <w:r>
-        <w:t xml:space="preserve"> tag — are the releases that</w:t>
-        <w:br/>
-        <w:t xml:space="preserve">  most often move the market: the FOMC statement and its press conference, the Fed</w:t>
-        <w:br/>
-        <w:t xml:space="preserve">  Chair's own speeches and testimony, and the CPI, PPI, Jobs, PCE, GDP and Retail</w:t>
-        <w:br/>
-        <w:t xml:space="preserve">  sales reports (Jobless claims is not). The service decides: an event is high when</w:t>
-        <w:br/>
-        <w:t xml:space="preserve">  its title contains one of the phrases in </w:t>
-      </w:r>
-      <w:r>
-        <w:rPr>
-          <w:b/>
-        </w:rPr>
-        <w:t>Settings → Configuration → Market news</w:t>
-        <w:br/>
-        <w:t xml:space="preserve">  → Other releases → Highlight events whose title contains</w:t>
-      </w:r>
-      <w:r>
-        <w:t>, and a report when its</w:t>
-        <w:br/>
-        <w:t xml:space="preserve">  indicator's </w:t>
-      </w:r>
-      <w:r>
-        <w:rPr>
-          <w:b/>
-        </w:rPr>
-        <w:t>High impact</w:t>
-      </w:r>
-      <w:r>
-        <w:t xml:space="preserve"> switch is on.</w:t>
-      </w:r>
-    </w:p>
-    <w:p>
-      <w:pPr>
-        <w:pStyle w:val="ListBullet"/>
-      </w:pPr>
-      <w:r>
-        <w:rPr>
-          <w:b/>
-        </w:rPr>
-        <w:t>Refresh</w:t>
-      </w:r>
-      <w:r>
-        <w:t xml:space="preserve"> checks every feed now instead of waiting for the next scheduled poll</w:t>
-        <w:br/>
-        <w:t xml:space="preserve">  (every 5 minutes in market hours, 15 off-hours, 60 at weekends and holidays), and</w:t>
-        <w:br/>
-        <w:t xml:space="preserve">  re-checks the calendar — though each calendar source still keeps its own schedule.</w:t>
-      </w:r>
-    </w:p>
-    <w:p>
-      <w:pPr>
-        <w:pStyle w:val="ListBullet"/>
-      </w:pPr>
-      <w:r>
-        <w:t xml:space="preserve">The </w:t>
-      </w:r>
-      <w:r>
-        <w:rPr>
-          <w:b/>
-        </w:rPr>
-        <w:t>Desk</w:t>
-      </w:r>
-      <w:r>
-        <w:t xml:space="preserve"> shows the five newest headlines and each </w:t>
-      </w:r>
-      <w:r>
-        <w:rPr>
-          <w:b/>
-        </w:rPr>
-        <w:t>Symbol</w:t>
-      </w:r>
-      <w:r>
-        <w:t xml:space="preserve"> page an</w:t>
-        <w:br/>
-        <w:t xml:space="preserve">  </w:t>
-      </w:r>
-      <w:r>
-        <w:rPr>
-          <w:i/>
-        </w:rPr>
-        <w:t>In the news</w:t>
-      </w:r>
-      <w:r>
-        <w:t xml:space="preserve"> band (headlines and SEC items); the public site has its own copy of</w:t>
-        <w:br/>
-        <w:t xml:space="preserve">  this page (see </w:t>
-      </w:r>
-      <w:r>
-        <w:rPr>
-          <w:i/>
-        </w:rPr>
-        <w:t>The public live screens</w:t>
-      </w:r>
-      <w:r>
-        <w:t>). Every feed, its on/off switch, whether</w:t>
-        <w:br/>
-        <w:t xml:space="preserve">  the public site may show it, the poll intervals, the impact rules and the</w:t>
-        <w:br/>
-        <w:t xml:space="preserve">  calendar's sources are in </w:t>
-      </w:r>
-      <w:r>
-        <w:rPr>
-          <w:b/>
-        </w:rPr>
-        <w:t>Settings → Configuration → Market news</w:t>
-      </w:r>
-      <w:r>
-        <w:t>.</w:t>
       </w:r>
     </w:p>
     <w:p>
@@ -8206,7 +8326,7 @@
       </w:pPr>
       <w:r>
         <w:rPr/>
-        <w:t>A headline is not a verified fact, the impact letter is a rule count and not a</w:t>
+        <w:t>A headline is not a verified fact, the impact word is a rule count and not a</w:t>
         <w:br/>
         <w:t>judgement, and nothing here is a trade recommendation.</w:t>
       </w:r>

</xml_diff>

<commit_message>
fix(notify): trade-idea calendar event starts 5 minutes after the post, not 1
Measured on prod 2026-09-28: at a 1-minute lead no popup reached the phone
or the browser - the device had not synced the event before its reminder was
due. At 4 minutes both popped up. 5 keeps a minute of margin.

Co-Authored-By: Claude Opus 5.5 <noreply@anthropic.com>
</commit_message>
<xml_diff>
--- a/docs/manuals/user-guide/user-guide.docx
+++ b/docs/manuals/user-guide/user-guide.docx
@@ -25516,7 +25516,7 @@
         <w:rPr/>
         <w:t xml:space="preserve"> row, every trade idea the app</w:t>
         <w:br/>
-        <w:t>posts also creates a short event (five minutes, starting a minute after the post)</w:t>
+        <w:t>posts also creates a short event (five minutes, starting five minutes after the post)</w:t>
         <w:br/>
         <w:t xml:space="preserve">titled with the trade, for example </w:t>
       </w:r>
@@ -25795,6 +25795,28 @@
       </w:r>
       <w:r>
         <w:t>.</w:t>
+      </w:r>
+    </w:p>
+    <w:p>
+      <w:r>
+        <w:rPr/>
+        <w:t>The popup arrives when the event starts, so about five minutes after the Discord</w:t>
+        <w:br/>
+        <w:t>and Telegram post. That gap is deliberate: with a one-minute gap your phone and</w:t>
+        <w:br/>
+        <w:t>browser had not synced the event before its reminder was due, and no popup came.</w:t>
+        <w:br/>
+        <w:t xml:space="preserve">It is </w:t>
+      </w:r>
+      <w:r>
+        <w:rPr>
+          <w:b/>
+        </w:rPr>
+        <w:t>Event starts after the post</w:t>
+      </w:r>
+      <w:r>
+        <w:rPr/>
+        <w:t xml:space="preserve"> under Configuration → Push notifications.</w:t>
       </w:r>
     </w:p>
     <w:p>

</xml_diff>

<commit_message>
feat(site): the home page strip states the trade ideas' record
Co-Authored-By: Claude Opus 5.5 <noreply@anthropic.com>
</commit_message>
<xml_diff>
--- a/docs/manuals/user-guide/user-guide.docx
+++ b/docs/manuals/user-guide/user-guide.docx
@@ -32,7 +32,7 @@
           <w:color w:val="5B6678"/>
           <w:sz w:val="18"/>
         </w:rPr>
-        <w:t>NeuralStrike · Generated 2026-09-29</w:t>
+        <w:t>NeuralStrike · Generated 2026-09-30</w:t>
       </w:r>
     </w:p>
     <w:p/>
@@ -782,6 +782,12 @@
       </w:r>
       <w:r>
         <w:t>.</w:t>
+        <w:br/>
+        <w:t xml:space="preserve">  Under the home page heading, one line gives the record for those days — how many</w:t>
+        <w:br/>
+        <w:t xml:space="preserve">  hit their target, were stopped out or are still open, and the dollar result of the</w:t>
+        <w:br/>
+        <w:t xml:space="preserve">  ones that have closed.</w:t>
         <w:br/>
         <w:t xml:space="preserve">  Settings → Configuration → Push notifications → </w:t>
       </w:r>

</xml_diff>

<commit_message>
docs(manuals): rebuild the User Guide and Reference Guide for the Flow Alerts filter
Co-Authored-By: Claude Opus 5.5 <noreply@anthropic.com>
</commit_message>
<xml_diff>
--- a/docs/manuals/user-guide/user-guide.docx
+++ b/docs/manuals/user-guide/user-guide.docx
@@ -32,7 +32,7 @@
           <w:color w:val="5B6678"/>
           <w:sz w:val="18"/>
         </w:rPr>
-        <w:t>NeuralStrike · Generated 2026-10-01</w:t>
+        <w:t>NeuralStrike · Generated 2026-10-02</w:t>
       </w:r>
     </w:p>
     <w:p/>
@@ -7625,19 +7625,40 @@
         <w:rPr/>
         <w:t>. Filter by</w:t>
         <w:br/>
-        <w:t xml:space="preserve">type or symbol — filtering is instant. </w:t>
-      </w:r>
-      <w:r>
-        <w:rPr>
-          <w:b/>
-        </w:rPr>
-        <w:t>Click any row</w:t>
-      </w:r>
-      <w:r>
-        <w:rPr/>
-        <w:t xml:space="preserve"> to open Dealer Positioning</w:t>
-        <w:br/>
-        <w:t>for that symbol.</w:t>
+        <w:t xml:space="preserve">symbol, or click the </w:t>
+      </w:r>
+      <w:r>
+        <w:rPr>
+          <w:b/>
+        </w:rPr>
+        <w:t>Alert type</w:t>
+      </w:r>
+      <w:r>
+        <w:rPr/>
+        <w:t xml:space="preserve"> chips to switch a type off or on (</w:t>
+      </w:r>
+      <w:r>
+        <w:rPr>
+          <w:b/>
+        </w:rPr>
+        <w:t>All</w:t>
+      </w:r>
+      <w:r>
+        <w:rPr/>
+        <w:t xml:space="preserve"> shows</w:t>
+        <w:br/>
+        <w:t>every type) — filtering is instant, and the types you switch off are remembered.</w:t>
+        <w:br/>
+      </w:r>
+      <w:r>
+        <w:rPr>
+          <w:b/>
+        </w:rPr>
+        <w:t>Click a symbol</w:t>
+      </w:r>
+      <w:r>
+        <w:rPr/>
+        <w:t xml:space="preserve"> (the dotted underline) to open Dealer Positioning for it.</w:t>
       </w:r>
     </w:p>
     <w:p>

</xml_diff>

<commit_message>
feat(eod): archive as a Month dropdown with Summary/Detail per day
The EOD page listed every saved report as one ever-growing row of date
links. It is now a Month dropdown (newest first, with report counts); the
chosen month's days sit in an even grid, each with Summary and Detail
links. The Detail link is new: an archived summary's own relative
detail.html link resolves to a route that does not exist.

Co-Authored-By: Claude Opus 5.5 <noreply@anthropic.com>
</commit_message>
<xml_diff>
--- a/docs/manuals/user-guide/user-guide.docx
+++ b/docs/manuals/user-guide/user-guide.docx
@@ -24282,7 +24282,31 @@
         <w:t>Archive</w:t>
       </w:r>
       <w:r>
-        <w:t xml:space="preserve"> list reopens any past date.</w:t>
+        <w:t xml:space="preserve"> dropdown reopens any past report, one month at a time: pick a</w:t>
+        <w:br/>
+        <w:t xml:space="preserve">  month (each shows how many reports it holds, newest month first) and that</w:t>
+        <w:br/>
+        <w:t xml:space="preserve">  month's days appear below it, each with a </w:t>
+      </w:r>
+      <w:r>
+        <w:rPr>
+          <w:b/>
+        </w:rPr>
+        <w:t>Summary</w:t>
+      </w:r>
+      <w:r>
+        <w:t xml:space="preserve"> and a </w:t>
+      </w:r>
+      <w:r>
+        <w:rPr>
+          <w:b/>
+        </w:rPr>
+        <w:t>Detail</w:t>
+      </w:r>
+      <w:r>
+        <w:t xml:space="preserve"> link</w:t>
+        <w:br/>
+        <w:t xml:space="preserve">  that open in a new tab.</w:t>
       </w:r>
     </w:p>
     <w:p>

</xml_diff>

<commit_message>
docs: two-decimal display - changelog, dev notes, manuals, the CLAUDE.md rule
Co-Authored-By: Claude Opus 5.5 <noreply@anthropic.com>
</commit_message>
<xml_diff>
--- a/docs/manuals/user-guide/user-guide.docx
+++ b/docs/manuals/user-guide/user-guide.docx
@@ -20649,7 +20649,7 @@
           <w:color w:val="334455"/>
           <w:sz w:val="19"/>
         </w:rPr>
-        <w:t>$195 debit</w:t>
+        <w:t>$195.00 debit</w:t>
       </w:r>
       <w:r>
         <w:t xml:space="preserve">, </w:t>
@@ -20660,7 +20660,7 @@
           <w:color w:val="334455"/>
           <w:sz w:val="19"/>
         </w:rPr>
-        <w:t>$804 credit</w:t>
+        <w:t>$804.00 credit</w:t>
       </w:r>
       <w:r>
         <w:t xml:space="preserve">, or </w:t>
@@ -20671,7 +20671,7 @@
           <w:color w:val="334455"/>
           <w:sz w:val="19"/>
         </w:rPr>
-        <w:t>$54,058 debit for 100 shares</w:t>
+        <w:t>$54,058.00 debit for 100 shares</w:t>
       </w:r>
       <w:r>
         <w:br/>

</xml_diff>

<commit_message>
feat(flow): the bought / sold estimate is a bar
The estimate was two lines of text. It is now one bar per figure, split
in proportion: green Buy, red Sell, grey Unknown, with the share inside
each segment. A sliver's share is printed after the bar, so the share
nobody could label is still always shown; hovering gives the old
sentence. The column sorts by the bought share.

On the Flow Alerts table, the Previous session panel, and the Desk's
flow panel, where the estimate stays one line and leaves off whole what
does not fit. One builder (flow.sides_bar) draws all three.

Help, User Guide, Reference Guide, routes and changelog describe the
bar; design and plan in docs/plans/2026-10-06-flow-sides-bar-*.

Co-Authored-By: Claude Opus 5.5 <noreply@anthropic.com>
</commit_message>
<xml_diff>
--- a/docs/manuals/user-guide/user-guide.docx
+++ b/docs/manuals/user-guide/user-guide.docx
@@ -4050,7 +4050,7 @@
             <w:r/>
             <w:r>
               <w:rPr/>
-              <w:t>The newest unusual-options events. A row that names one contract can carry a second line: the estimated share of its volume that was bought, sold, or could not be told</w:t>
+              <w:t>The newest unusual-options events. A row that names one contract can carry a bar under it: the estimated share of its volume that was bought (green), sold (red), or could not be told (grey)</w:t>
             </w:r>
           </w:p>
         </w:tc>
@@ -8503,7 +8503,39 @@
       </w:r>
       <w:r>
         <w:rPr/>
-        <w:t xml:space="preserve"> A cell reads, for example:</w:t>
+        <w:t xml:space="preserve"> A cell holds one or two bars, each split in proportion into three</w:t>
+        <w:br/>
+        <w:t xml:space="preserve">colours. </w:t>
+      </w:r>
+      <w:r>
+        <w:rPr>
+          <w:b/>
+        </w:rPr>
+        <w:t>Green</w:t>
+      </w:r>
+      <w:r>
+        <w:rPr/>
+        <w:t xml:space="preserve"> is bought, </w:t>
+      </w:r>
+      <w:r>
+        <w:rPr>
+          <w:b/>
+        </w:rPr>
+        <w:t>red</w:t>
+      </w:r>
+      <w:r>
+        <w:rPr/>
+        <w:t xml:space="preserve"> is sold, </w:t>
+      </w:r>
+      <w:r>
+        <w:rPr>
+          <w:b/>
+        </w:rPr>
+        <w:t>grey</w:t>
+      </w:r>
+      <w:r>
+        <w:rPr/>
+        <w:t xml:space="preserve"> is unknown. For example:</w:t>
       </w:r>
     </w:p>
     <w:p>
@@ -8512,9 +8544,70 @@
       </w:pPr>
       <w:r>
         <w:rPr/>
-        <w:t>≈ bought 56.67% · sold 29.95% · unlabelled 13.38%</w:t>
-        <w:br/>
-        <w:t>since the alert: bought 71.05% · sold 20.00% · unlabelled 8.95% of 12,400</w:t>
+        <w:t xml:space="preserve">≈ Session — </w:t>
+      </w:r>
+      <w:r>
+        <w:rPr>
+          <w:b/>
+        </w:rPr>
+        <w:t>Buy 56.67%</w:t>
+      </w:r>
+      <w:r>
+        <w:rPr/>
+        <w:t xml:space="preserve"> (green) · </w:t>
+      </w:r>
+      <w:r>
+        <w:rPr>
+          <w:b/>
+        </w:rPr>
+        <w:t>Sell 29.95%</w:t>
+      </w:r>
+      <w:r>
+        <w:rPr/>
+        <w:t xml:space="preserve"> (red) · </w:t>
+      </w:r>
+      <w:r>
+        <w:rPr>
+          <w:b/>
+        </w:rPr>
+        <w:t>13.38%</w:t>
+      </w:r>
+      <w:r>
+        <w:rPr/>
+        <w:t xml:space="preserve"> (grey)</w:t>
+        <w:br/>
+        <w:t xml:space="preserve">≈ Since alert — </w:t>
+      </w:r>
+      <w:r>
+        <w:rPr>
+          <w:b/>
+        </w:rPr>
+        <w:t>Buy 71.05%</w:t>
+      </w:r>
+      <w:r>
+        <w:rPr/>
+        <w:t xml:space="preserve"> (green) · </w:t>
+      </w:r>
+      <w:r>
+        <w:rPr>
+          <w:b/>
+        </w:rPr>
+        <w:t>20.00%</w:t>
+      </w:r>
+      <w:r>
+        <w:rPr/>
+        <w:t xml:space="preserve"> (red) · a grey sliver, then</w:t>
+        <w:br/>
+      </w:r>
+      <w:r>
+        <w:rPr>
+          <w:i/>
+        </w:rPr>
+        <w:t>Unknown 8.95% · of 12,400</w:t>
+      </w:r>
+      <w:r>
+        <w:rPr/>
+        <w:t xml:space="preserve"> printed after the bar</w:t>
       </w:r>
     </w:p>
     <w:p>
@@ -8522,18 +8615,57 @@
         <w:pStyle w:val="ListBullet"/>
       </w:pPr>
       <w:r>
+        <w:t>A segment wide enough prints its word and its share; a narrower one prints only the</w:t>
+        <w:br/>
+        <w:t xml:space="preserve">  share, and its colour says which it is; a sliver prints nothing inside, and its</w:t>
+        <w:br/>
+        <w:t xml:space="preserve">  share is written just after the bar. No share that traded is ever left off. Hover a</w:t>
+        <w:br/>
+        <w:t xml:space="preserve">  bar to read all three shares in words.</w:t>
+      </w:r>
+    </w:p>
+    <w:p>
+      <w:pPr>
+        <w:pStyle w:val="ListBullet"/>
+      </w:pPr>
+      <w:r>
+        <w:rPr>
+          <w:b/>
+        </w:rPr>
+        <w:t>Green and red mean bought and sold, not bullish and bearish.</w:t>
+      </w:r>
+      <w:r>
+        <w:t xml:space="preserve"> A put that was</w:t>
+        <w:br/>
+        <w:t xml:space="preserve">  mostly bought shows a red </w:t>
+      </w:r>
+      <w:r>
+        <w:rPr>
+          <w:b/>
+        </w:rPr>
+        <w:t>Put</w:t>
+      </w:r>
+      <w:r>
+        <w:t xml:space="preserve"> in the Side column beside a mostly green bar.</w:t>
+      </w:r>
+    </w:p>
+    <w:p>
+      <w:pPr>
+        <w:pStyle w:val="ListBullet"/>
+      </w:pPr>
+      <w:r>
         <w:t xml:space="preserve">The </w:t>
       </w:r>
       <w:r>
         <w:rPr>
           <w:b/>
         </w:rPr>
-        <w:t>first line</w:t>
-      </w:r>
-      <w:r>
-        <w:t xml:space="preserve"> covers the contract's whole day. Once a minute the app takes the</w:t>
-        <w:br/>
-        <w:t xml:space="preserve">  contract's new volume and looks at where its latest trade printed: at the ask is</w:t>
+        <w:t>≈ Session</w:t>
+      </w:r>
+      <w:r>
+        <w:t xml:space="preserve"> bar covers the contract's whole day. Once a minute the app takes</w:t>
+        <w:br/>
+        <w:t xml:space="preserve">  the contract's new volume and looks at where its latest trade printed: at the ask is</w:t>
         <w:br/>
         <w:t xml:space="preserve">  </w:t>
       </w:r>
@@ -8566,14 +8698,25 @@
         <w:rPr>
           <w:b/>
         </w:rPr>
-        <w:t>Unlabelled</w:t>
-      </w:r>
-      <w:r>
-        <w:t xml:space="preserve"> is volume the app could not tell: a trade at the exact midpoint, a</w:t>
-        <w:br/>
-        <w:t xml:space="preserve">  quote it could not read, or volume that printed while the app was not watching (a</w:t>
-        <w:br/>
-        <w:t xml:space="preserve">  restart, a missed minute). When this share is large, the estimate is thin.</w:t>
+        <w:t>Unknown</w:t>
+      </w:r>
+      <w:r>
+        <w:t xml:space="preserve"> is volume the app could not tell (the technical manuals call it</w:t>
+        <w:br/>
+        <w:t xml:space="preserve">  </w:t>
+      </w:r>
+      <w:r>
+        <w:rPr>
+          <w:i/>
+        </w:rPr>
+        <w:t>unlabelled</w:t>
+      </w:r>
+      <w:r>
+        <w:t>): a trade at the exact midpoint, a quote it could not read, or volume</w:t>
+        <w:br/>
+        <w:t xml:space="preserve">  that printed while the app was not watching (a restart, a missed minute). When the</w:t>
+        <w:br/>
+        <w:t xml:space="preserve">  grey share is large, the estimate is thin.</w:t>
       </w:r>
     </w:p>
     <w:p>
@@ -8587,18 +8730,47 @@
         <w:rPr>
           <w:b/>
         </w:rPr>
-        <w:t>second line</w:t>
-      </w:r>
-      <w:r>
-        <w:t xml:space="preserve"> appears once the contract has traded after its alert. From the</w:t>
-        <w:br/>
-        <w:t xml:space="preserve">  moment a contract is flagged the app follows it tick by tick, which is finer than</w:t>
+        <w:t>≈ Since alert</w:t>
+      </w:r>
+      <w:r>
+        <w:t xml:space="preserve"> bar appears once the contract has traded after its alert. From</w:t>
+        <w:br/>
+        <w:t xml:space="preserve">  the moment a contract is flagged the app follows it tick by tick, which is finer than</w:t>
         <w:br/>
         <w:t xml:space="preserve">  once a minute. It is shown apart from the day's share because it is a different</w:t>
         <w:br/>
         <w:t xml:space="preserve">  sample of a different stretch of the day; "of 12,400" is the number of contracts</w:t>
         <w:br/>
         <w:t xml:space="preserve">  it covers.</w:t>
+      </w:r>
+    </w:p>
+    <w:p>
+      <w:pPr>
+        <w:pStyle w:val="ListBullet"/>
+      </w:pPr>
+      <w:r>
+        <w:t>Click the column heading to sort the table by the bought share.</w:t>
+      </w:r>
+    </w:p>
+    <w:p>
+      <w:pPr>
+        <w:pStyle w:val="ListBullet"/>
+      </w:pPr>
+      <w:r>
+        <w:t xml:space="preserve">On the </w:t>
+      </w:r>
+      <w:r>
+        <w:rPr>
+          <w:b/>
+        </w:rPr>
+        <w:t>Desk</w:t>
+      </w:r>
+      <w:r>
+        <w:t>, the same bar sits under the alert's detail line, a little shorter.</w:t>
+        <w:br/>
+        <w:t xml:space="preserve">  The Desk keeps each row to two lines, so the text after a bar and the since-alert</w:t>
+        <w:br/>
+        <w:t xml:space="preserve">  bar are drawn only where the panel is wide enough; hovering shows every figure.</w:t>
       </w:r>
     </w:p>
     <w:p>

</xml_diff>

<commit_message>
docs: the site blog - changelog, routes, reference, manuals, runbook
What was built on 2026-10-06 (the blog and the upload), and what is parked
(the connector). A new docs/reference/blog.md holds the detail; the manuals,
the routes file, the runbook and the reference files that count the
services now say seven and port 8217. docs/reference/testing.md records
that the root conftest guards sqlite3.connect only.

Co-Authored-By: Claude Opus 5.5 <noreply@anthropic.com>
</commit_message>
<xml_diff>
--- a/docs/manuals/user-guide/user-guide.docx
+++ b/docs/manuals/user-guide/user-guide.docx
@@ -915,27 +915,17 @@
       </w:r>
       <w:r>
         <w:rPr/>
-        <w:t xml:space="preserve">, </w:t>
-      </w:r>
-      <w:r>
-        <w:rPr>
-          <w:b/>
-        </w:rPr>
-        <w:t>8215</w:t>
-      </w:r>
-      <w:r>
-        <w:rPr/>
         <w:t xml:space="preserve"> and </w:t>
       </w:r>
       <w:r>
         <w:rPr>
           <w:b/>
         </w:rPr>
-        <w:t>8216</w:t>
-      </w:r>
-      <w:r>
-        <w:rPr/>
-        <w:t xml:space="preserve"> (the six services),</w:t>
+        <w:t>8215–8217</w:t>
+      </w:r>
+      <w:r>
+        <w:rPr/>
+        <w:t xml:space="preserve"> (the seven services),</w:t>
         <w:br/>
       </w:r>
       <w:r>
@@ -1076,7 +1066,7 @@
             <w:r/>
             <w:r>
               <w:rPr/>
-              <w:t>Starts the gateway, the six domain services, the web app and the public live screens.</w:t>
+              <w:t>Starts the gateway, the seven services, the web app and the public live screens.</w:t>
             </w:r>
           </w:p>
         </w:tc>
@@ -2043,12 +2033,12 @@
         <w:rPr>
           <w:b/>
         </w:rPr>
-        <w:t>Six domain services</w:t>
-      </w:r>
-      <w:r>
-        <w:t xml:space="preserve"> — Sentiment, Options, Portfolio, Trade, Market and</w:t>
-        <w:br/>
-        <w:t xml:space="preserve">  News. Each one powers its matching page(s).</w:t>
+        <w:t>Seven services</w:t>
+      </w:r>
+      <w:r>
+        <w:t xml:space="preserve"> — Sentiment, Options, Portfolio, Trade, Market, News and</w:t>
+        <w:br/>
+        <w:t xml:space="preserve">  Blog. Each one powers its matching page(s).</w:t>
       </w:r>
     </w:p>
     <w:p>
@@ -2219,7 +2209,7 @@
         <w:rPr/>
         <w:t>. This stops the</w:t>
         <w:br/>
-        <w:t xml:space="preserve">gateway, the six services, the web app </w:t>
+        <w:t xml:space="preserve">gateway, the seven services, the web app </w:t>
       </w:r>
       <w:r>
         <w:rPr>
@@ -3198,7 +3188,7 @@
             <w:r/>
             <w:r>
               <w:rPr/>
-              <w:t>EOD Report · User Manuals</w:t>
+              <w:t>EOD Report · Post to X · Blog · User Manuals</w:t>
             </w:r>
           </w:p>
         </w:tc>
@@ -26313,7 +26303,7 @@
       </w:pPr>
       <w:r>
         <w:rPr/>
-        <w:t>User Manuals</w:t>
+        <w:t>Blog</w:t>
       </w:r>
     </w:p>
     <w:p>
@@ -26333,7 +26323,7 @@
           <w:color w:val="334455"/>
           <w:sz w:val="19"/>
         </w:rPr>
-        <w:t>/manuals</w:t>
+        <w:t>/blog</w:t>
       </w:r>
       <w:r>
         <w:rPr/>
@@ -26347,95 +26337,15 @@
       </w:r>
       <w:r>
         <w:rPr/>
-        <w:t xml:space="preserve"> group, alongside EOD Report. (It used</w:t>
-        <w:br/>
-        <w:t>to be nested under Settings; it is now a peer tab.)</w:t>
-      </w:r>
-    </w:p>
-    <w:p>
-      <w:r>
-        <w:rPr/>
-        <w:t>A simple index that links the five manuals — each opens in a new browser tab:</w:t>
-      </w:r>
-    </w:p>
-    <w:p>
-      <w:pPr>
-        <w:pStyle w:val="ListBullet"/>
-      </w:pPr>
-      <w:r>
-        <w:rPr>
-          <w:b/>
-        </w:rPr>
-        <w:t>User Guide</w:t>
-      </w:r>
-      <w:r>
-        <w:t xml:space="preserve"> — how to use the app (this document).</w:t>
-      </w:r>
-    </w:p>
-    <w:p>
-      <w:pPr>
-        <w:pStyle w:val="ListBullet"/>
-      </w:pPr>
-      <w:r>
-        <w:rPr>
-          <w:b/>
-        </w:rPr>
-        <w:t>Reference Guide</w:t>
-      </w:r>
-      <w:r>
-        <w:t xml:space="preserve"> — what each tab and sub-tab is for, why it matters and when to</w:t>
-        <w:br/>
-        <w:t xml:space="preserve">  open it, starting from a one-page summary of the whole app.</w:t>
-      </w:r>
-    </w:p>
-    <w:p>
-      <w:pPr>
-        <w:pStyle w:val="ListBullet"/>
-      </w:pPr>
-      <w:r>
-        <w:rPr>
-          <w:b/>
-        </w:rPr>
-        <w:t>Technical Reference</w:t>
-      </w:r>
-      <w:r>
-        <w:t xml:space="preserve"> — the math behind every number.</w:t>
-      </w:r>
-    </w:p>
-    <w:p>
-      <w:pPr>
-        <w:pStyle w:val="ListBullet"/>
-      </w:pPr>
-      <w:r>
-        <w:rPr>
-          <w:b/>
-        </w:rPr>
-        <w:t>API / Developer Reference</w:t>
-      </w:r>
-      <w:r>
-        <w:t xml:space="preserve"> — the integration surface for developers.</w:t>
-      </w:r>
-    </w:p>
-    <w:p>
-      <w:pPr>
-        <w:pStyle w:val="ListBullet"/>
-      </w:pPr>
-      <w:r>
-        <w:rPr>
-          <w:b/>
-        </w:rPr>
-        <w:t>Options Glossary</w:t>
-      </w:r>
-      <w:r>
-        <w:t xml:space="preserve"> — plain-English definitions of every term the app puts on</w:t>
-        <w:br/>
-        <w:t xml:space="preserve">  screen, from what a contract is to what dealer gamma means.</w:t>
-      </w:r>
-    </w:p>
-    <w:p>
-      <w:r>
-        <w:rPr/>
-        <w:t>The Word (</w:t>
+        <w:t xml:space="preserve"> group, after Post to X.</w:t>
+      </w:r>
+    </w:p>
+    <w:p>
+      <w:r>
+        <w:rPr/>
+        <w:t>Put an entry on the public site's Blog, and take one off. The Blog's list of</w:t>
+        <w:br/>
+        <w:t xml:space="preserve">entries is at </w:t>
       </w:r>
       <w:r>
         <w:rPr>
@@ -26443,11 +26353,23 @@
           <w:color w:val="334455"/>
           <w:sz w:val="19"/>
         </w:rPr>
-        <w:t>.docx</w:t>
-      </w:r>
-      <w:r>
-        <w:rPr/>
-        <w:t xml:space="preserve">) copies live alongside the HTML under </w:t>
+        <w:t>neuralstrike.co/blog.html</w:t>
+      </w:r>
+      <w:r>
+        <w:rPr/>
+        <w:t xml:space="preserve">, reached from </w:t>
+      </w:r>
+      <w:r>
+        <w:rPr>
+          <w:b/>
+        </w:rPr>
+        <w:t>Blog</w:t>
+      </w:r>
+      <w:r>
+        <w:rPr/>
+        <w:t xml:space="preserve"> in the site's</w:t>
+        <w:br/>
+        <w:t xml:space="preserve">menu; each entry has a page of its own at </w:t>
       </w:r>
       <w:r>
         <w:rPr>
@@ -26455,54 +26377,229 @@
           <w:color w:val="334455"/>
           <w:sz w:val="19"/>
         </w:rPr>
-        <w:t>docs/manuals/</w:t>
+        <w:t>neuralstrike.co/blog/&lt;address&gt;/</w:t>
       </w:r>
       <w:r>
         <w:rPr/>
         <w:t>.</w:t>
-      </w:r>
-    </w:p>
-    <w:p>
-      <w:r>
-        <w:br/>
-      </w:r>
-    </w:p>
-    <w:p>
-      <w:pPr>
-        <w:pStyle w:val="Heading1"/>
-      </w:pPr>
-      <w:r>
-        <w:rPr/>
-        <w:t>SYSTEM</w:t>
-      </w:r>
-    </w:p>
-    <w:p>
-      <w:r>
-        <w:rPr/>
-        <w:t>The machine-level controls pinned to the foot of the rail. None of them is a step</w:t>
-        <w:br/>
-        <w:t>in a trading workflow, which is why they sit apart.</w:t>
-      </w:r>
-    </w:p>
-    <w:p>
-      <w:pPr>
-        <w:pStyle w:val="Heading2"/>
-      </w:pPr>
-      <w:r>
-        <w:rPr/>
-        <w:t>System Status</w:t>
-      </w:r>
-    </w:p>
-    <w:p>
-      <w:r>
-        <w:rPr>
-          <w:b/>
-        </w:rPr>
-        <w:t>Route:</w:t>
-      </w:r>
-      <w:r>
-        <w:rPr/>
-        <w:t xml:space="preserve"> </w:t>
+        <w:br/>
+        <w:t>An entry is one self-contained HTML document: a file that carries its own</w:t>
+        <w:br/>
+        <w:t>styles and needs nothing else to display.</w:t>
+      </w:r>
+    </w:p>
+    <w:p>
+      <w:pPr>
+        <w:pStyle w:val="IntenseQuote"/>
+      </w:pPr>
+      <w:r>
+        <w:rPr>
+          <w:b/>
+        </w:rPr>
+        <w:t>Nothing is public until you press Publish.</w:t>
+      </w:r>
+      <w:r>
+        <w:rPr/>
+        <w:t xml:space="preserve"> Uploading a file only makes a</w:t>
+        <w:br/>
+      </w:r>
+      <w:r>
+        <w:rPr>
+          <w:i/>
+        </w:rPr>
+        <w:t>draft</w:t>
+      </w:r>
+      <w:r>
+        <w:rPr/>
+        <w:t>: a cleaned copy that waits on this page, where only you can see it.</w:t>
+      </w:r>
+    </w:p>
+    <w:p>
+      <w:r>
+        <w:rPr>
+          <w:b/>
+        </w:rPr>
+        <w:t>To add an entry:</w:t>
+      </w:r>
+    </w:p>
+    <w:p>
+      <w:pPr>
+        <w:pStyle w:val="ListNumber"/>
+      </w:pPr>
+      <w:r>
+        <w:t xml:space="preserve">Under </w:t>
+      </w:r>
+      <w:r>
+        <w:rPr>
+          <w:b/>
+        </w:rPr>
+        <w:t>Add a draft</w:t>
+      </w:r>
+      <w:r>
+        <w:t>, choose the HTML file. It must be UTF-8 text and no</w:t>
+        <w:br/>
+        <w:t xml:space="preserve">   larger than the size printed under the upload box.</w:t>
+      </w:r>
+    </w:p>
+    <w:p>
+      <w:pPr>
+        <w:pStyle w:val="ListNumber"/>
+      </w:pPr>
+      <w:r>
+        <w:t>Wait a moment. The blog service cleans the document and it appears under</w:t>
+        <w:br/>
+        <w:t xml:space="preserve">   </w:t>
+      </w:r>
+      <w:r>
+        <w:rPr>
+          <w:b/>
+        </w:rPr>
+        <w:t>Drafts waiting</w:t>
+      </w:r>
+      <w:r>
+        <w:t>. The draft says what cleaning removed.</w:t>
+      </w:r>
+    </w:p>
+    <w:p>
+      <w:pPr>
+        <w:pStyle w:val="ListNumber"/>
+      </w:pPr>
+      <w:r>
+        <w:t xml:space="preserve">Press </w:t>
+      </w:r>
+      <w:r>
+        <w:rPr>
+          <w:b/>
+        </w:rPr>
+        <w:t>Preview</w:t>
+      </w:r>
+      <w:r>
+        <w:t xml:space="preserve"> and read it. Cleaning can change how a page looks, and the</w:t>
+        <w:br/>
+        <w:t xml:space="preserve">   preview is exactly what a visitor would see.</w:t>
+      </w:r>
+    </w:p>
+    <w:p>
+      <w:pPr>
+        <w:pStyle w:val="ListNumber"/>
+      </w:pPr>
+      <w:r>
+        <w:t xml:space="preserve">Check the </w:t>
+      </w:r>
+      <w:r>
+        <w:rPr>
+          <w:b/>
+        </w:rPr>
+        <w:t>Title</w:t>
+      </w:r>
+      <w:r>
+        <w:t xml:space="preserve">, </w:t>
+      </w:r>
+      <w:r>
+        <w:rPr>
+          <w:b/>
+        </w:rPr>
+        <w:t>Summary</w:t>
+      </w:r>
+      <w:r>
+        <w:t xml:space="preserve"> and </w:t>
+      </w:r>
+      <w:r>
+        <w:rPr>
+          <w:b/>
+        </w:rPr>
+        <w:t>Tags</w:t>
+      </w:r>
+      <w:r>
+        <w:t xml:space="preserve"> — the Blog's list of entries</w:t>
+        <w:br/>
+        <w:t xml:space="preserve">   shows them — and the </w:t>
+      </w:r>
+      <w:r>
+        <w:rPr>
+          <w:b/>
+        </w:rPr>
+        <w:t>Address</w:t>
+      </w:r>
+      <w:r>
+        <w:t>, which is the last part of the entry's web</w:t>
+        <w:br/>
+        <w:t xml:space="preserve">   address. The full public address is printed under the box.</w:t>
+      </w:r>
+    </w:p>
+    <w:p>
+      <w:pPr>
+        <w:pStyle w:val="ListNumber"/>
+      </w:pPr>
+      <w:r>
+        <w:t xml:space="preserve">Press </w:t>
+      </w:r>
+      <w:r>
+        <w:rPr>
+          <w:b/>
+        </w:rPr>
+        <w:t>Publish</w:t>
+      </w:r>
+      <w:r>
+        <w:t xml:space="preserve"> and confirm. The entry is on the public site at once.</w:t>
+      </w:r>
+    </w:p>
+    <w:p>
+      <w:pPr>
+        <w:pStyle w:val="ListBullet"/>
+      </w:pPr>
+      <w:r>
+        <w:rPr>
+          <w:b/>
+        </w:rPr>
+        <w:t>What cleaning removes:</w:t>
+      </w:r>
+      <w:r>
+        <w:t xml:space="preserve"> scripts, forms, event handlers, embedded frames,</w:t>
+        <w:br/>
+        <w:t xml:space="preserve">  images, and links out to other sites' stylesheets. The typefaces the document</w:t>
+        <w:br/>
+        <w:t xml:space="preserve">  asks Google Fonts for are copied onto this server instead, and the draft says</w:t>
+        <w:br/>
+        <w:t xml:space="preserve">  so when one could not be. Scripts never run, in the preview or on the site.</w:t>
+      </w:r>
+    </w:p>
+    <w:p>
+      <w:pPr>
+        <w:pStyle w:val="ListBullet"/>
+      </w:pPr>
+      <w:r>
+        <w:rPr>
+          <w:b/>
+        </w:rPr>
+        <w:t>A draft may also carry a note about its typefaces</w:t>
+      </w:r>
+      <w:r>
+        <w:t xml:space="preserve"> when some or all of</w:t>
+        <w:br/>
+        <w:t xml:space="preserve">  them could not be copied. The entry is then shown in the fallback fonts its</w:t>
+        <w:br/>
+        <w:t xml:space="preserve">  own stylesheet names. Preview shows exactly that.</w:t>
+      </w:r>
+    </w:p>
+    <w:p>
+      <w:pPr>
+        <w:pStyle w:val="ListBullet"/>
+      </w:pPr>
+      <w:r>
+        <w:rPr>
+          <w:b/>
+        </w:rPr>
+        <w:t>Publish is greyed out</w:t>
+      </w:r>
+      <w:r>
+        <w:t xml:space="preserve"> while the title is empty or the address cannot be</w:t>
+        <w:br/>
+        <w:t xml:space="preserve">  used. When it is the address, the reason is shown in red under it: use</w:t>
+        <w:br/>
+        <w:t xml:space="preserve">  letters, digits and single hyphens, at most 80 characters as shipped. A few</w:t>
+        <w:br/>
+        <w:t xml:space="preserve">  addresses are reserved by the site, </w:t>
       </w:r>
       <w:r>
         <w:rPr>
@@ -26510,6 +26607,341 @@
           <w:color w:val="334455"/>
           <w:sz w:val="19"/>
         </w:rPr>
+        <w:t>fonts</w:t>
+      </w:r>
+      <w:r>
+        <w:t xml:space="preserve"> among them.</w:t>
+      </w:r>
+    </w:p>
+    <w:p>
+      <w:pPr>
+        <w:pStyle w:val="ListBullet"/>
+      </w:pPr>
+      <w:r>
+        <w:rPr>
+          <w:b/>
+        </w:rPr>
+        <w:t>Discard</w:t>
+      </w:r>
+      <w:r>
+        <w:t xml:space="preserve"> deletes a draft. Nothing public changes.</w:t>
+      </w:r>
+    </w:p>
+    <w:p>
+      <w:pPr>
+        <w:pStyle w:val="ListBullet"/>
+      </w:pPr>
+      <w:r>
+        <w:rPr>
+          <w:b/>
+        </w:rPr>
+        <w:t>Twenty drafts can wait at once</w:t>
+      </w:r>
+      <w:r>
+        <w:t xml:space="preserve"> as shipped (the limit is under Settings →</w:t>
+        <w:br/>
+        <w:t xml:space="preserve">  Configuration → Site blog). Past that an upload is refused until you publish</w:t>
+        <w:br/>
+        <w:t xml:space="preserve">  or discard one.</w:t>
+      </w:r>
+    </w:p>
+    <w:p>
+      <w:pPr>
+        <w:pStyle w:val="ListBullet"/>
+      </w:pPr>
+      <w:r>
+        <w:rPr>
+          <w:b/>
+        </w:rPr>
+        <w:t>To replace an entry</w:t>
+      </w:r>
+      <w:r>
+        <w:t xml:space="preserve">, pick it under </w:t>
+      </w:r>
+      <w:r>
+        <w:rPr>
+          <w:b/>
+        </w:rPr>
+        <w:t>Replace an existing entry</w:t>
+      </w:r>
+      <w:r>
+        <w:rPr>
+          <w:i/>
+        </w:rPr>
+        <w:t>before</w:t>
+      </w:r>
+      <w:r>
+        <w:br/>
+        <w:t xml:space="preserve">  you choose the file. The draft then says which entry it replaces and keeps that</w:t>
+        <w:br/>
+        <w:t xml:space="preserve">  entry's address, which cannot be edited. The old version stays public until you</w:t>
+        <w:br/>
+        <w:t xml:space="preserve">  publish the new one.</w:t>
+      </w:r>
+    </w:p>
+    <w:p>
+      <w:pPr>
+        <w:pStyle w:val="ListBullet"/>
+      </w:pPr>
+      <w:r>
+        <w:rPr>
+          <w:b/>
+        </w:rPr>
+        <w:t>Published</w:t>
+      </w:r>
+      <w:r>
+        <w:t xml:space="preserve"> lists what is on the site, newest first. </w:t>
+      </w:r>
+      <w:r>
+        <w:rPr>
+          <w:b/>
+        </w:rPr>
+        <w:t>Open on the site</w:t>
+      </w:r>
+      <w:r>
+        <w:br/>
+        <w:t xml:space="preserve">  opens the entry in a new tab. </w:t>
+      </w:r>
+      <w:r>
+        <w:rPr>
+          <w:b/>
+        </w:rPr>
+        <w:t>Unpublish</w:t>
+      </w:r>
+      <w:r>
+        <w:t xml:space="preserve"> asks first, then removes the page</w:t>
+        <w:br/>
+        <w:t xml:space="preserve">  from the public site; its address stops working. To bring an entry back,</w:t>
+        <w:br/>
+        <w:t xml:space="preserve">  upload its file again.</w:t>
+      </w:r>
+    </w:p>
+    <w:p>
+      <w:pPr>
+        <w:pStyle w:val="ListBullet"/>
+      </w:pPr>
+      <w:r>
+        <w:t>After an upload, Publish, Discard or Unpublish the control you pressed waits</w:t>
+        <w:br/>
+        <w:t xml:space="preserve">  for the blog service, and a message at the bottom of the screen says how it</w:t>
+        <w:br/>
+        <w:t xml:space="preserve">  went. If the blog service is stopped nothing happens: the control waits, then</w:t>
+        <w:br/>
+        <w:t xml:space="preserve">  comes back. </w:t>
+      </w:r>
+      <w:r>
+        <w:rPr>
+          <w:b/>
+        </w:rPr>
+        <w:t>System Status</w:t>
+      </w:r>
+      <w:r>
+        <w:t xml:space="preserve"> shows whether the service is running.</w:t>
+      </w:r>
+    </w:p>
+    <w:p>
+      <w:pPr>
+        <w:pStyle w:val="Heading2"/>
+      </w:pPr>
+      <w:r>
+        <w:rPr/>
+        <w:t>User Manuals</w:t>
+      </w:r>
+    </w:p>
+    <w:p>
+      <w:r>
+        <w:rPr>
+          <w:b/>
+        </w:rPr>
+        <w:t>Route:</w:t>
+      </w:r>
+      <w:r>
+        <w:rPr/>
+        <w:t xml:space="preserve"> </w:t>
+      </w:r>
+      <w:r>
+        <w:rPr>
+          <w:rFonts w:ascii="Consolas" w:hAnsi="Consolas"/>
+          <w:color w:val="334455"/>
+          <w:sz w:val="19"/>
+        </w:rPr>
+        <w:t>/manuals</w:t>
+      </w:r>
+      <w:r>
+        <w:rPr/>
+        <w:t xml:space="preserve"> — a tab in the </w:t>
+      </w:r>
+      <w:r>
+        <w:rPr>
+          <w:b/>
+        </w:rPr>
+        <w:t>More</w:t>
+      </w:r>
+      <w:r>
+        <w:rPr/>
+        <w:t xml:space="preserve"> group, alongside EOD Report. (It used</w:t>
+        <w:br/>
+        <w:t>to be nested under Settings; it is now a peer tab.)</w:t>
+      </w:r>
+    </w:p>
+    <w:p>
+      <w:r>
+        <w:rPr/>
+        <w:t>A simple index that links the five manuals — each opens in a new browser tab:</w:t>
+      </w:r>
+    </w:p>
+    <w:p>
+      <w:pPr>
+        <w:pStyle w:val="ListBullet"/>
+      </w:pPr>
+      <w:r>
+        <w:rPr>
+          <w:b/>
+        </w:rPr>
+        <w:t>User Guide</w:t>
+      </w:r>
+      <w:r>
+        <w:t xml:space="preserve"> — how to use the app (this document).</w:t>
+      </w:r>
+    </w:p>
+    <w:p>
+      <w:pPr>
+        <w:pStyle w:val="ListBullet"/>
+      </w:pPr>
+      <w:r>
+        <w:rPr>
+          <w:b/>
+        </w:rPr>
+        <w:t>Reference Guide</w:t>
+      </w:r>
+      <w:r>
+        <w:t xml:space="preserve"> — what each tab and sub-tab is for, why it matters and when to</w:t>
+        <w:br/>
+        <w:t xml:space="preserve">  open it, starting from a one-page summary of the whole app.</w:t>
+      </w:r>
+    </w:p>
+    <w:p>
+      <w:pPr>
+        <w:pStyle w:val="ListBullet"/>
+      </w:pPr>
+      <w:r>
+        <w:rPr>
+          <w:b/>
+        </w:rPr>
+        <w:t>Technical Reference</w:t>
+      </w:r>
+      <w:r>
+        <w:t xml:space="preserve"> — the math behind every number.</w:t>
+      </w:r>
+    </w:p>
+    <w:p>
+      <w:pPr>
+        <w:pStyle w:val="ListBullet"/>
+      </w:pPr>
+      <w:r>
+        <w:rPr>
+          <w:b/>
+        </w:rPr>
+        <w:t>API / Developer Reference</w:t>
+      </w:r>
+      <w:r>
+        <w:t xml:space="preserve"> — the integration surface for developers.</w:t>
+      </w:r>
+    </w:p>
+    <w:p>
+      <w:pPr>
+        <w:pStyle w:val="ListBullet"/>
+      </w:pPr>
+      <w:r>
+        <w:rPr>
+          <w:b/>
+        </w:rPr>
+        <w:t>Options Glossary</w:t>
+      </w:r>
+      <w:r>
+        <w:t xml:space="preserve"> — plain-English definitions of every term the app puts on</w:t>
+        <w:br/>
+        <w:t xml:space="preserve">  screen, from what a contract is to what dealer gamma means.</w:t>
+      </w:r>
+    </w:p>
+    <w:p>
+      <w:r>
+        <w:rPr/>
+        <w:t>The Word (</w:t>
+      </w:r>
+      <w:r>
+        <w:rPr>
+          <w:rFonts w:ascii="Consolas" w:hAnsi="Consolas"/>
+          <w:color w:val="334455"/>
+          <w:sz w:val="19"/>
+        </w:rPr>
+        <w:t>.docx</w:t>
+      </w:r>
+      <w:r>
+        <w:rPr/>
+        <w:t xml:space="preserve">) copies live alongside the HTML under </w:t>
+      </w:r>
+      <w:r>
+        <w:rPr>
+          <w:rFonts w:ascii="Consolas" w:hAnsi="Consolas"/>
+          <w:color w:val="334455"/>
+          <w:sz w:val="19"/>
+        </w:rPr>
+        <w:t>docs/manuals/</w:t>
+      </w:r>
+      <w:r>
+        <w:rPr/>
+        <w:t>.</w:t>
+      </w:r>
+    </w:p>
+    <w:p>
+      <w:r>
+        <w:br/>
+      </w:r>
+    </w:p>
+    <w:p>
+      <w:pPr>
+        <w:pStyle w:val="Heading1"/>
+      </w:pPr>
+      <w:r>
+        <w:rPr/>
+        <w:t>SYSTEM</w:t>
+      </w:r>
+    </w:p>
+    <w:p>
+      <w:r>
+        <w:rPr/>
+        <w:t>The machine-level controls pinned to the foot of the rail. None of them is a step</w:t>
+        <w:br/>
+        <w:t>in a trading workflow, which is why they sit apart.</w:t>
+      </w:r>
+    </w:p>
+    <w:p>
+      <w:pPr>
+        <w:pStyle w:val="Heading2"/>
+      </w:pPr>
+      <w:r>
+        <w:rPr/>
+        <w:t>System Status</w:t>
+      </w:r>
+    </w:p>
+    <w:p>
+      <w:r>
+        <w:rPr>
+          <w:b/>
+        </w:rPr>
+        <w:t>Route:</w:t>
+      </w:r>
+      <w:r>
+        <w:rPr/>
+        <w:t xml:space="preserve"> </w:t>
+      </w:r>
+      <w:r>
+        <w:rPr>
+          <w:rFonts w:ascii="Consolas" w:hAnsi="Consolas"/>
+          <w:color w:val="334455"/>
+          <w:sz w:val="19"/>
+        </w:rPr>
         <w:t>/status</w:t>
       </w:r>
       <w:r>
@@ -26566,7 +26998,7 @@
         <w:t>component grid</w:t>
       </w:r>
       <w:r>
-        <w:t xml:space="preserve"> — Redis, the Schwab gateway, the six services, the web app</w:t>
+        <w:t xml:space="preserve"> — Redis, the Schwab gateway, the seven services, the web app</w:t>
         <w:br/>
         <w:t xml:space="preserve">  itself, and the public live screens beside it, each with Online/Offline and its</w:t>
         <w:br/>
@@ -28855,7 +29287,7 @@
         <w:rPr/>
         <w:t xml:space="preserve"> inside it, which is where the decision is actually made.</w:t>
         <w:br/>
-        <w:t xml:space="preserve">Confirming stops the gateway, the six services, the web app </w:t>
+        <w:t xml:space="preserve">Confirming stops the gateway, the seven services, the web app </w:t>
       </w:r>
       <w:r>
         <w:rPr>

</xml_diff>

<commit_message>
docs: the public Option Signals screen
Co-Authored-By: Claude Opus 5.5 <noreply@anthropic.com>
</commit_message>
<xml_diff>
--- a/docs/manuals/user-guide/user-guide.docx
+++ b/docs/manuals/user-guide/user-guide.docx
@@ -1315,7 +1315,7 @@
     <w:p>
       <w:r>
         <w:rPr/>
-        <w:t xml:space="preserve">Seventeen of the app's screens are also published </w:t>
+        <w:t xml:space="preserve">Eighteen of the app's screens are also published </w:t>
       </w:r>
       <w:r>
         <w:rPr>
@@ -1353,30 +1353,144 @@
       </w:r>
       <w:r>
         <w:rPr/>
+        <w:t>, the Market Scanner</w:t>
+        <w:br/>
+        <w:t xml:space="preserve">(published as </w:t>
+      </w:r>
+      <w:r>
+        <w:rPr>
+          <w:b/>
+        </w:rPr>
+        <w:t>Option Signals</w:t>
+      </w:r>
+      <w:r>
+        <w:rPr/>
+        <w:t xml:space="preserve">), the </w:t>
+      </w:r>
+      <w:r>
+        <w:rPr>
+          <w:b/>
+        </w:rPr>
+        <w:t>Strategy Finder</w:t>
+      </w:r>
+      <w:r>
+        <w:rPr/>
+        <w:t>, the Rescue ad-hoc</w:t>
+        <w:br/>
+        <w:t xml:space="preserve">form (published as </w:t>
+      </w:r>
+      <w:r>
+        <w:rPr>
+          <w:b/>
+        </w:rPr>
+        <w:t>Rescue my Sh*tty trade</w:t>
+      </w:r>
+      <w:r>
+        <w:rPr/>
+        <w:t xml:space="preserve">), the </w:t>
+      </w:r>
+      <w:r>
+        <w:rPr>
+          <w:b/>
+        </w:rPr>
+        <w:t>Calculator</w:t>
+      </w:r>
+      <w:r>
+        <w:rPr/>
+        <w:t>, the</w:t>
+        <w:br/>
+      </w:r>
+      <w:r>
+        <w:rPr>
+          <w:b/>
+        </w:rPr>
+        <w:t>Simulator</w:t>
+      </w:r>
+      <w:r>
+        <w:rPr/>
+        <w:t xml:space="preserve"> and </w:t>
+      </w:r>
+      <w:r>
+        <w:rPr>
+          <w:b/>
+        </w:rPr>
+        <w:t>Market News</w:t>
+      </w:r>
+      <w:r>
+        <w:rPr/>
+        <w:t>.</w:t>
+      </w:r>
+    </w:p>
+    <w:p>
+      <w:r>
+        <w:rPr>
+          <w:b/>
+        </w:rPr>
+        <w:t>Option Signals</w:t>
+      </w:r>
+      <w:r>
+        <w:rPr/>
+        <w:t xml:space="preserve"> (</w:t>
+      </w:r>
+      <w:r>
+        <w:rPr>
+          <w:rFonts w:ascii="Consolas" w:hAnsi="Consolas"/>
+          <w:color w:val="334455"/>
+          <w:sz w:val="19"/>
+        </w:rPr>
+        <w:t>/signals</w:t>
+      </w:r>
+      <w:r>
+        <w:rPr/>
+        <w:t>, first in the site's Tools menu) is your Market</w:t>
+        <w:br/>
+        <w:t>Scanner with nothing of yours on it. A visitor sees the 0-DTE, Swing and</w:t>
+        <w:br/>
+        <w:t>Directional tabs, the Credit spreads / Other structures switch, the Checks</w:t>
+        <w:br/>
+        <w:t xml:space="preserve">column, </w:t>
+      </w:r>
+      <w:r>
+        <w:rPr>
+          <w:b/>
+        </w:rPr>
+        <w:t>Only clear</w:t>
+      </w:r>
+      <w:r>
+        <w:rPr/>
+        <w:t xml:space="preserve">, </w:t>
+      </w:r>
+      <w:r>
+        <w:rPr>
+          <w:b/>
+        </w:rPr>
+        <w:t>Why no trade?</w:t>
+      </w:r>
+      <w:r>
+        <w:rPr/>
+        <w:t xml:space="preserve"> and the Trade detail panel. They do</w:t>
+        <w:br/>
+        <w:t xml:space="preserve">not get </w:t>
+      </w:r>
+      <w:r>
+        <w:rPr>
+          <w:b/>
+        </w:rPr>
+        <w:t>Run scan</w:t>
+      </w:r>
+      <w:r>
+        <w:rPr/>
         <w:t xml:space="preserve">, the </w:t>
       </w:r>
       <w:r>
         <w:rPr>
           <w:b/>
         </w:rPr>
-        <w:t>Strategy</w:t>
-        <w:br/>
-        <w:t>Finder</w:t>
-      </w:r>
-      <w:r>
-        <w:rPr/>
-        <w:t xml:space="preserve">, the Rescue ad-hoc form (published as </w:t>
-      </w:r>
-      <w:r>
-        <w:rPr>
-          <w:b/>
-        </w:rPr>
-        <w:t>Rescue my Sh*tty trade</w:t>
-      </w:r>
-      <w:r>
-        <w:rPr/>
-        <w:t>), the</w:t>
-        <w:br/>
+        <w:t>Paper trade</w:t>
+      </w:r>
+      <w:r>
+        <w:rPr/>
+        <w:t xml:space="preserve">, </w:t>
       </w:r>
       <w:r>
         <w:rPr>
@@ -1386,27 +1500,75 @@
       </w:r>
       <w:r>
         <w:rPr/>
-        <w:t xml:space="preserve">, the </w:t>
-      </w:r>
-      <w:r>
-        <w:rPr>
-          <w:b/>
-        </w:rPr>
-        <w:t>Simulator</w:t>
-      </w:r>
-      <w:r>
-        <w:rPr/>
-        <w:t xml:space="preserve"> and </w:t>
-      </w:r>
-      <w:r>
-        <w:rPr>
-          <w:b/>
-        </w:rPr>
-        <w:t>Market News</w:t>
-      </w:r>
-      <w:r>
-        <w:rPr/>
-        <w:t>.</w:t>
+        <w:t xml:space="preserve"> or </w:t>
+      </w:r>
+      <w:r>
+        <w:rPr>
+          <w:b/>
+        </w:rPr>
+        <w:t>Expected Move</w:t>
+      </w:r>
+      <w:r>
+        <w:rPr/>
+        <w:br/>
+        <w:t xml:space="preserve">buttons, the "new" badges, the checklist's </w:t>
+      </w:r>
+      <w:r>
+        <w:rPr>
+          <w:b/>
+        </w:rPr>
+        <w:t>Paper book</w:t>
+      </w:r>
+      <w:r>
+        <w:rPr/>
+        <w:t xml:space="preserve"> line, the panel's</w:t>
+        <w:br/>
+      </w:r>
+      <w:r>
+        <w:rPr>
+          <w:b/>
+        </w:rPr>
+        <w:t>Max contracts</w:t>
+      </w:r>
+      <w:r>
+        <w:rPr/>
+        <w:t xml:space="preserve"> row, or the dollar figure of your per-trade risk cap. While</w:t>
+        <w:br/>
+      </w:r>
+      <w:r>
+        <w:rPr>
+          <w:b/>
+        </w:rPr>
+        <w:t>Show per-leg bid and ask</w:t>
+      </w:r>
+      <w:r>
+        <w:rPr/>
+        <w:t xml:space="preserve"> is off (Settings → Configuration → Public Strategy</w:t>
+        <w:br/>
+        <w:t>Finder) the panel also leaves out its Greeks section and the checklist's</w:t>
+        <w:br/>
+      </w:r>
+      <w:r>
+        <w:rPr>
+          <w:b/>
+        </w:rPr>
+        <w:t>Cost to trade</w:t>
+      </w:r>
+      <w:r>
+        <w:rPr/>
+        <w:t xml:space="preserve"> line reads </w:t>
+      </w:r>
+      <w:r>
+        <w:rPr>
+          <w:i/>
+        </w:rPr>
+        <w:t>Bid-ask not measured</w:t>
+      </w:r>
+      <w:r>
+        <w:rPr/>
+        <w:t>. The page spends no Schwab</w:t>
+        <w:br/>
+        <w:t>call: it shows the scans your stack already runs every 15 minutes.</w:t>
       </w:r>
     </w:p>
     <w:p>

</xml_diff>

<commit_message>
feat(live): a single option's price is withheld on Option Signals while the quotes switch is off
A one-leg row's debit, max loss and breakeven are that option's price.
While show_leg_quotes is off the public build swaps every single-option
candidate for a copy with no price on it before any row, panel or check
reads it. PoP and a multi-leg row's net stay, as on the public Finder.
The owner's decision after the code review.

Co-Authored-By: Claude Opus 5.5 <noreply@anthropic.com>
</commit_message>
<xml_diff>
--- a/docs/manuals/user-guide/user-guide.docx
+++ b/docs/manuals/user-guide/user-guide.docx
@@ -1545,7 +1545,7 @@
         <w:rPr/>
         <w:t xml:space="preserve"> is off (Settings → Configuration → Public Strategy</w:t>
         <w:br/>
-        <w:t>Finder) the panel also leaves out its Greeks section and the checklist's</w:t>
+        <w:t>Finder) the panel also leaves out its Greeks section, the checklist's</w:t>
         <w:br/>
       </w:r>
       <w:r>
@@ -1566,7 +1566,13 @@
       </w:r>
       <w:r>
         <w:rPr/>
-        <w:t>. The page spends no Schwab</w:t>
+        <w:t>, and a trade made of one</w:t>
+        <w:br/>
+        <w:t>option (a long call or put, a naked short) shows no debit, credit, max profit,</w:t>
+        <w:br/>
+        <w:t>max loss, reward to risk or breakeven: those are that option's price. Its</w:t>
+        <w:br/>
+        <w:t>probability and score still show. The page spends no Schwab</w:t>
         <w:br/>
         <w:t>call: it shows the scans your stack already runs every 15 minutes.</w:t>
       </w:r>

</xml_diff>

<commit_message>
docs(scanner): one table per tab in the help, the manuals, the route notes and the changelog
Co-Authored-By: Claude Opus 5.5 <noreply@anthropic.com>
</commit_message>
<xml_diff>
--- a/docs/manuals/user-guide/user-guide.docx
+++ b/docs/manuals/user-guide/user-guide.docx
@@ -723,7 +723,40 @@
         <w:br/>
         <w:t xml:space="preserve">  on the Market Scanner, drawn as an image with its legs, grade, risk, profit,</w:t>
         <w:br/>
-        <w:t xml:space="preserve">  probability of profit and payoff chart. It skips an hour rather than post a weak,</w:t>
+        <w:t xml:space="preserve">  probability of profit and payoff chart. It picks from every Scanner table: the</w:t>
+        <w:br/>
+        <w:t xml:space="preserve">  credit spreads, the Directional tab's single options, and the </w:t>
+      </w:r>
+      <w:r>
+        <w:rPr>
+          <w:b/>
+        </w:rPr>
+        <w:t>Other structures</w:t>
+      </w:r>
+      <w:r>
+        <w:br/>
+        <w:t xml:space="preserve">  (debit spreads, butterflies and condors, long straddles and strangles,</w:t>
+        <w:br/>
+        <w:t xml:space="preserve">  backspreads). Three kinds never post: a calendar or diagonal (two expirations,</w:t>
+        <w:br/>
+        <w:t xml:space="preserve">  so no single payoff to draw), a short straddle or strangle (no limit on the</w:t>
+        <w:br/>
+        <w:t xml:space="preserve">  loss), and anything that would be open through an earnings report. To go back to</w:t>
+        <w:br/>
+        <w:t xml:space="preserve">  credit spreads and single options only, set </w:t>
+      </w:r>
+      <w:r>
+        <w:rPr>
+          <w:rFonts w:ascii="Consolas" w:hAnsi="Consolas"/>
+          <w:color w:val="334455"/>
+          <w:sz w:val="19"/>
+        </w:rPr>
+        <w:t>"other_structures": false</w:t>
+      </w:r>
+      <w:r>
+        <w:t xml:space="preserve"> in the</w:t>
+        <w:br/>
+        <w:t xml:space="preserve">  same block. It skips an hour rather than post a weak,</w:t>
         <w:br/>
         <w:t xml:space="preserve">  stale or same-day trade. Turn it off with </w:t>
       </w:r>
@@ -1446,7 +1479,7 @@
         <w:br/>
         <w:t>Scanner with nothing of yours on it. A visitor sees the 0-DTE, Swing and</w:t>
         <w:br/>
-        <w:t>Directional tabs, the Credit spreads / Other structures switch, the Checks</w:t>
+        <w:t>Directional tabs, the family tick boxes on 0-DTE and Swing, the Checks</w:t>
         <w:br/>
         <w:t xml:space="preserve">column, </w:t>
       </w:r>
@@ -15143,26 +15176,20 @@
         <w:t>Swing</w:t>
       </w:r>
       <w:r>
-        <w:t xml:space="preserve">, a switch at the top of the tab: </w:t>
-      </w:r>
-      <w:r>
-        <w:rPr>
-          <w:b/>
-        </w:rPr>
-        <w:t>Credit spreads</w:t>
-      </w:r>
-      <w:r>
-        <w:br/>
-        <w:t xml:space="preserve">  and </w:t>
-      </w:r>
-      <w:r>
-        <w:rPr>
-          <w:b/>
-        </w:rPr>
-        <w:t>Other structures</w:t>
-      </w:r>
-      <w:r>
-        <w:t xml:space="preserve">. Each is its own table (see </w:t>
+        <w:t>, one table holding the credit spreads and the</w:t>
+        <w:br/>
+        <w:t xml:space="preserve">  </w:t>
+      </w:r>
+      <w:r>
+        <w:rPr>
+          <w:b/>
+        </w:rPr>
+        <w:t>other structures</w:t>
+      </w:r>
+      <w:r>
+        <w:t xml:space="preserve"> together, with a tick box per family above it (see</w:t>
+        <w:br/>
+        <w:t xml:space="preserve">  </w:t>
       </w:r>
       <w:r>
         <w:rPr>
@@ -16322,19 +16349,9 @@
     <w:p>
       <w:r>
         <w:rPr/>
-        <w:t xml:space="preserve">The 0-DTE and Swing scans build more than credit spreads. Click </w:t>
-      </w:r>
-      <w:r>
-        <w:rPr>
-          <w:b/>
-        </w:rPr>
-        <w:t>Other</w:t>
-        <w:br/>
-        <w:t>structures</w:t>
-      </w:r>
-      <w:r>
-        <w:rPr/>
-        <w:t xml:space="preserve"> at the top of either tab to see the rest:</w:t>
+        <w:t>The 0-DTE and Swing scans build more than credit spreads. Each tab lists the</w:t>
+        <w:br/>
+        <w:t>rest in the same table as its credit spreads:</w:t>
       </w:r>
     </w:p>
     <w:tbl>
@@ -16629,18 +16646,27 @@
         <w:pStyle w:val="ListNumber"/>
       </w:pPr>
       <w:r>
-        <w:t xml:space="preserve">Click </w:t>
-      </w:r>
-      <w:r>
-        <w:rPr>
-          <w:b/>
-        </w:rPr>
-        <w:t>Other structures</w:t>
-      </w:r>
-      <w:r>
-        <w:t>. The number beside each side of the switch is how</w:t>
-        <w:br/>
-        <w:t xml:space="preserve">   many rows it holds, and the tab's own count adds both.</w:t>
+        <w:t xml:space="preserve">Open </w:t>
+      </w:r>
+      <w:r>
+        <w:rPr>
+          <w:b/>
+        </w:rPr>
+        <w:t>0-DTE</w:t>
+      </w:r>
+      <w:r>
+        <w:t xml:space="preserve"> or </w:t>
+      </w:r>
+      <w:r>
+        <w:rPr>
+          <w:b/>
+        </w:rPr>
+        <w:t>Swing</w:t>
+      </w:r>
+      <w:r>
+        <w:t>. The table lists every kind together, best score</w:t>
+        <w:br/>
+        <w:t xml:space="preserve">   first, and the tab's count is the number of rows on show.</w:t>
       </w:r>
     </w:p>
     <w:p>
@@ -16650,7 +16676,20 @@
       <w:r>
         <w:t>Untick a family box above the table to hide that kind; tick it to bring it</w:t>
         <w:br/>
-        <w:t xml:space="preserve">   back. A family with nothing today is not listed.</w:t>
+        <w:t xml:space="preserve">   back. The number beside each box is how many rows it holds, and a family</w:t>
+        <w:br/>
+        <w:t xml:space="preserve">   with nothing today is not listed. </w:t>
+      </w:r>
+      <w:r>
+        <w:rPr>
+          <w:b/>
+        </w:rPr>
+        <w:t>Credit spreads</w:t>
+      </w:r>
+      <w:r>
+        <w:t xml:space="preserve"> is the first box:</w:t>
+        <w:br/>
+        <w:t xml:space="preserve">   untick it to see the other structures alone.</w:t>
       </w:r>
     </w:p>
     <w:p>
@@ -16713,9 +16752,13 @@
         <w:br/>
         <w:t xml:space="preserve">  market's direction and volatility and how sound they are. The two are on</w:t>
         <w:br/>
-        <w:t xml:space="preserve">  different scales, so they are in different tables, and a 75 in one is not a 75</w:t>
-        <w:br/>
-        <w:t xml:space="preserve">  in the other.</w:t>
+        <w:t xml:space="preserve">  different scales, and a 75 on one is not a 75 on the other. They share one</w:t>
+        <w:br/>
+        <w:t xml:space="preserve">  table and one ranking all the same, so do not read a higher score as the</w:t>
+        <w:br/>
+        <w:t xml:space="preserve">  better trade when one row is a credit spread and the other is not. Hover a</w:t>
+        <w:br/>
+        <w:t xml:space="preserve">  score to see which scale it is on.</w:t>
       </w:r>
     </w:p>
     <w:p>

</xml_diff>

<commit_message>
docs(gamma): the heatmap's Value picker, Balanced line and legend
The page guide, the User Guide, the Reference Guide and the Technical
Reference (rebuilt), the route notes, the config reference and the
changelog. Verified on the local page harness with a synthetic session,
the substitute for a dev environment; not yet seen on prod data.

Co-Authored-By: Claude Opus 5.5 <noreply@anthropic.com>
</commit_message>
<xml_diff>
--- a/docs/manuals/user-guide/user-guide.docx
+++ b/docs/manuals/user-guide/user-guide.docx
@@ -32,7 +32,7 @@
           <w:color w:val="5B6678"/>
           <w:sz w:val="18"/>
         </w:rPr>
-        <w:t>NeuralStrike · Generated 2026-10-07</w:t>
+        <w:t>NeuralStrike · Generated 2026-10-09</w:t>
       </w:r>
     </w:p>
     <w:p/>
@@ -7667,6 +7667,361 @@
         <w:t xml:space="preserve"> the left mouse button to read a cell — plain hovering</w:t>
         <w:br/>
         <w:t xml:space="preserve">  shows nothing.</w:t>
+      </w:r>
+    </w:p>
+    <w:p>
+      <w:r>
+        <w:rPr>
+          <w:b/>
+        </w:rPr>
+        <w:t>Value</w:t>
+      </w:r>
+      <w:r>
+        <w:rPr/>
+        <w:t xml:space="preserve"> (a picker beside Spot, on the Gamma, Charm, Delta and Vanna views) chooses</w:t>
+        <w:br/>
+        <w:t>what both panels draw:</w:t>
+      </w:r>
+    </w:p>
+    <w:tbl>
+      <w:tblPr>
+        <w:tblW w:type="auto" w:w="0"/>
+        <w:jc w:val="left"/>
+        <w:tblLayout w:type="autofit"/>
+        <w:tblLook w:firstColumn="1" w:firstRow="1" w:lastColumn="0" w:lastRow="0" w:noHBand="0" w:noVBand="1" w:val="04A0"/>
+        <w:tblBorders>
+          <w:top w:val="single" w:sz="4" w:space="0" w:color="D8DEE9"/>
+          <w:left w:val="single" w:sz="4" w:space="0" w:color="D8DEE9"/>
+          <w:bottom w:val="single" w:sz="4" w:space="0" w:color="D8DEE9"/>
+          <w:right w:val="single" w:sz="4" w:space="0" w:color="D8DEE9"/>
+          <w:insideH w:val="single" w:sz="4" w:space="0" w:color="D8DEE9"/>
+          <w:insideV w:val="single" w:sz="4" w:space="0" w:color="D8DEE9"/>
+        </w:tblBorders>
+      </w:tblPr>
+      <w:tblGrid>
+        <w:gridCol w:w="2880"/>
+        <w:gridCol w:w="2880"/>
+        <w:gridCol w:w="2880"/>
+      </w:tblGrid>
+      <w:tr>
+        <w:tc>
+          <w:tcPr>
+            <w:tcW w:type="dxa" w:w="2880"/>
+            <w:shd w:val="clear" w:color="auto" w:fill="EAF2FB"/>
+          </w:tcPr>
+          <w:p>
+            <w:r>
+              <w:rPr>
+                <w:b/>
+              </w:rPr>
+            </w:r>
+            <w:r>
+              <w:rPr>
+                <w:b/>
+              </w:rPr>
+              <w:t>Value</w:t>
+            </w:r>
+          </w:p>
+        </w:tc>
+        <w:tc>
+          <w:tcPr>
+            <w:tcW w:type="dxa" w:w="2880"/>
+            <w:shd w:val="clear" w:color="auto" w:fill="EAF2FB"/>
+          </w:tcPr>
+          <w:p>
+            <w:r>
+              <w:rPr>
+                <w:b/>
+              </w:rPr>
+            </w:r>
+            <w:r>
+              <w:rPr>
+                <w:b/>
+              </w:rPr>
+              <w:t>Each bar and cell holds</w:t>
+            </w:r>
+          </w:p>
+        </w:tc>
+        <w:tc>
+          <w:tcPr>
+            <w:tcW w:type="dxa" w:w="2880"/>
+            <w:shd w:val="clear" w:color="auto" w:fill="EAF2FB"/>
+          </w:tcPr>
+          <w:p>
+            <w:r>
+              <w:rPr>
+                <w:b/>
+              </w:rPr>
+            </w:r>
+            <w:r>
+              <w:rPr>
+                <w:b/>
+              </w:rPr>
+              <w:t>Use it to</w:t>
+            </w:r>
+          </w:p>
+        </w:tc>
+      </w:tr>
+      <w:tr>
+        <w:tc>
+          <w:tcPr>
+            <w:tcW w:type="dxa" w:w="2880"/>
+          </w:tcPr>
+          <w:p>
+            <w:r/>
+            <w:r>
+              <w:rPr>
+                <w:b/>
+              </w:rPr>
+              <w:t>Net</w:t>
+            </w:r>
+          </w:p>
+        </w:tc>
+        <w:tc>
+          <w:tcPr>
+            <w:tcW w:type="dxa" w:w="2880"/>
+          </w:tcPr>
+          <w:p>
+            <w:r/>
+            <w:r>
+              <w:rPr/>
+              <w:t>Calls minus puts. The default.</w:t>
+            </w:r>
+          </w:p>
+        </w:tc>
+        <w:tc>
+          <w:tcPr>
+            <w:tcW w:type="dxa" w:w="2880"/>
+          </w:tcPr>
+          <w:p>
+            <w:r/>
+            <w:r>
+              <w:rPr/>
+              <w:t>Read which side dominates a strike.</w:t>
+            </w:r>
+          </w:p>
+        </w:tc>
+      </w:tr>
+      <w:tr>
+        <w:tc>
+          <w:tcPr>
+            <w:tcW w:type="dxa" w:w="2880"/>
+            <w:shd w:val="clear" w:color="auto" w:fill="F4F6FA"/>
+          </w:tcPr>
+          <w:p>
+            <w:r/>
+            <w:r>
+              <w:rPr>
+                <w:b/>
+              </w:rPr>
+              <w:t>Calls</w:t>
+            </w:r>
+          </w:p>
+        </w:tc>
+        <w:tc>
+          <w:tcPr>
+            <w:tcW w:type="dxa" w:w="2880"/>
+            <w:shd w:val="clear" w:color="auto" w:fill="F4F6FA"/>
+          </w:tcPr>
+          <w:p>
+            <w:r/>
+            <w:r>
+              <w:rPr/>
+              <w:t>The call side alone.</w:t>
+            </w:r>
+          </w:p>
+        </w:tc>
+        <w:tc>
+          <w:tcPr>
+            <w:tcW w:type="dxa" w:w="2880"/>
+            <w:shd w:val="clear" w:color="auto" w:fill="F4F6FA"/>
+          </w:tcPr>
+          <w:p>
+            <w:r/>
+            <w:r>
+              <w:rPr/>
+              <w:t>See call positioning without the puts netted off.</w:t>
+            </w:r>
+          </w:p>
+        </w:tc>
+      </w:tr>
+      <w:tr>
+        <w:tc>
+          <w:tcPr>
+            <w:tcW w:type="dxa" w:w="2880"/>
+          </w:tcPr>
+          <w:p>
+            <w:r/>
+            <w:r>
+              <w:rPr>
+                <w:b/>
+              </w:rPr>
+              <w:t>Puts</w:t>
+            </w:r>
+          </w:p>
+        </w:tc>
+        <w:tc>
+          <w:tcPr>
+            <w:tcW w:type="dxa" w:w="2880"/>
+          </w:tcPr>
+          <w:p>
+            <w:r/>
+            <w:r>
+              <w:rPr/>
+              <w:t>The put side alone.</w:t>
+            </w:r>
+          </w:p>
+        </w:tc>
+        <w:tc>
+          <w:tcPr>
+            <w:tcW w:type="dxa" w:w="2880"/>
+          </w:tcPr>
+          <w:p>
+            <w:r/>
+            <w:r>
+              <w:rPr/>
+              <w:t>The same, for puts.</w:t>
+            </w:r>
+          </w:p>
+        </w:tc>
+      </w:tr>
+      <w:tr>
+        <w:tc>
+          <w:tcPr>
+            <w:tcW w:type="dxa" w:w="2880"/>
+            <w:shd w:val="clear" w:color="auto" w:fill="F4F6FA"/>
+          </w:tcPr>
+          <w:p>
+            <w:r/>
+            <w:r>
+              <w:rPr>
+                <w:b/>
+              </w:rPr>
+              <w:t>Size</w:t>
+            </w:r>
+          </w:p>
+        </w:tc>
+        <w:tc>
+          <w:tcPr>
+            <w:tcW w:type="dxa" w:w="2880"/>
+            <w:shd w:val="clear" w:color="auto" w:fill="F4F6FA"/>
+          </w:tcPr>
+          <w:p>
+            <w:r/>
+            <w:r>
+              <w:rPr/>
+              <w:t xml:space="preserve">Calls </w:t>
+            </w:r>
+            <w:r>
+              <w:rPr>
+                <w:b/>
+              </w:rPr>
+              <w:t>plus</w:t>
+            </w:r>
+            <w:r>
+              <w:rPr/>
+              <w:t xml:space="preserve"> puts, coloured by which way the strike leans. The bars split into a call bar and a put bar per strike.</w:t>
+            </w:r>
+          </w:p>
+        </w:tc>
+        <w:tc>
+          <w:tcPr>
+            <w:tcW w:type="dxa" w:w="2880"/>
+            <w:shd w:val="clear" w:color="auto" w:fill="F4F6FA"/>
+          </w:tcPr>
+          <w:p>
+            <w:r/>
+            <w:r>
+              <w:rPr/>
+              <w:t xml:space="preserve">See </w:t>
+            </w:r>
+            <w:r>
+              <w:rPr>
+                <w:b/>
+              </w:rPr>
+              <w:t>how much</w:t>
+            </w:r>
+            <w:r>
+              <w:rPr/>
+              <w:t xml:space="preserve"> sits at a strike.</w:t>
+            </w:r>
+          </w:p>
+        </w:tc>
+      </w:tr>
+    </w:tbl>
+    <w:p/>
+    <w:p>
+      <w:r>
+        <w:rPr>
+          <w:b/>
+        </w:rPr>
+        <w:t>To find a strike that Net is hiding, pick Size.</w:t>
+      </w:r>
+      <w:r>
+        <w:rPr/>
+        <w:t xml:space="preserve"> A strike holding large calls and</w:t>
+        <w:br/>
+        <w:t>equally large puts is nearly empty in Net, because the two cancel. In Size it is one</w:t>
+        <w:br/>
+        <w:t>of the brightest rows, and its two bars are the same length.</w:t>
+      </w:r>
+    </w:p>
+    <w:p>
+      <w:r>
+        <w:rPr/>
+        <w:t xml:space="preserve">A grey dotted </w:t>
+      </w:r>
+      <w:r>
+        <w:rPr>
+          <w:b/>
+        </w:rPr>
+        <w:t>Balanced</w:t>
+      </w:r>
+      <w:r>
+        <w:rPr/>
+        <w:t xml:space="preserve"> line across both panels marks such a strike in every</w:t>
+        <w:br/>
+        <w:t>Value: one of the largest on screen whose calls and puts nearly cancel. At most three</w:t>
+        <w:br/>
+        <w:t>are marked.</w:t>
+      </w:r>
+    </w:p>
+    <w:p>
+      <w:r>
+        <w:rPr>
+          <w:b/>
+        </w:rPr>
+        <w:t>The colour strip</w:t>
+      </w:r>
+      <w:r>
+        <w:rPr/>
+        <w:t xml:space="preserve"> at the right of the controls row gives the two ends of the heat</w:t>
+        <w:br/>
+        <w:t>map's colours as numbers, with the unit: dollars of gamma per 1% move on Gamma,</w:t>
+        <w:br/>
+        <w:t>dollars of delta on Delta, a plain figure on Charm and Vanna. The colours stretch</w:t>
+        <w:br/>
+        <w:t>over whatever is on screen, so the same shade is a different amount on another symbol</w:t>
+        <w:br/>
+        <w:t>or later in the day. Read the strip before comparing two charts.</w:t>
+      </w:r>
+    </w:p>
+    <w:p>
+      <w:r>
+        <w:rPr/>
+        <w:t xml:space="preserve">The forward projection band on the Gamma heat map is drawn in </w:t>
+      </w:r>
+      <w:r>
+        <w:rPr>
+          <w:b/>
+        </w:rPr>
+        <w:t>Net</w:t>
+      </w:r>
+      <w:r>
+        <w:rPr/>
+        <w:t xml:space="preserve"> only. It is a</w:t>
+        <w:br/>
+        <w:t>net figure, so the other three values leave it out.</w:t>
       </w:r>
     </w:p>
     <w:p>

</xml_diff>

<commit_message>
docs(gamma): the heatmap's locked scale, and Phase 2 as built
The page guide, the three manuals (rebuilt), the route notes, the config
reference and the changelog. The design is corrected in place: the bars
take the lock as a soft extent, the forward band is dropped on a share
scale, and no lock after its time reads as adaptive. The plan records what
Phase 3 starts from.

Verified on the local page harness (no dev environment), read from the
page's DOM; not yet seen on prod data.

Co-Authored-By: Claude Opus 5.5 <noreply@anthropic.com>
</commit_message>
<xml_diff>
--- a/docs/manuals/user-guide/user-guide.docx
+++ b/docs/manuals/user-guide/user-guide.docx
@@ -7991,6 +7991,285 @@
         <w:rPr>
           <w:b/>
         </w:rPr>
+        <w:t>Scale</w:t>
+      </w:r>
+      <w:r>
+        <w:rPr/>
+        <w:t xml:space="preserve"> (a picker beside Value) chooses what a colour means:</w:t>
+      </w:r>
+    </w:p>
+    <w:tbl>
+      <w:tblPr>
+        <w:tblW w:type="auto" w:w="0"/>
+        <w:jc w:val="left"/>
+        <w:tblLayout w:type="autofit"/>
+        <w:tblLook w:firstColumn="1" w:firstRow="1" w:lastColumn="0" w:lastRow="0" w:noHBand="0" w:noVBand="1" w:val="04A0"/>
+        <w:tblBorders>
+          <w:top w:val="single" w:sz="4" w:space="0" w:color="D8DEE9"/>
+          <w:left w:val="single" w:sz="4" w:space="0" w:color="D8DEE9"/>
+          <w:bottom w:val="single" w:sz="4" w:space="0" w:color="D8DEE9"/>
+          <w:right w:val="single" w:sz="4" w:space="0" w:color="D8DEE9"/>
+          <w:insideH w:val="single" w:sz="4" w:space="0" w:color="D8DEE9"/>
+          <w:insideV w:val="single" w:sz="4" w:space="0" w:color="D8DEE9"/>
+        </w:tblBorders>
+      </w:tblPr>
+      <w:tblGrid>
+        <w:gridCol w:w="2880"/>
+        <w:gridCol w:w="2880"/>
+        <w:gridCol w:w="2880"/>
+      </w:tblGrid>
+      <w:tr>
+        <w:tc>
+          <w:tcPr>
+            <w:tcW w:type="dxa" w:w="2880"/>
+            <w:shd w:val="clear" w:color="auto" w:fill="EAF2FB"/>
+          </w:tcPr>
+          <w:p>
+            <w:r>
+              <w:rPr>
+                <w:b/>
+              </w:rPr>
+            </w:r>
+            <w:r>
+              <w:rPr>
+                <w:b/>
+              </w:rPr>
+              <w:t>Scale</w:t>
+            </w:r>
+          </w:p>
+        </w:tc>
+        <w:tc>
+          <w:tcPr>
+            <w:tcW w:type="dxa" w:w="2880"/>
+            <w:shd w:val="clear" w:color="auto" w:fill="EAF2FB"/>
+          </w:tcPr>
+          <w:p>
+            <w:r>
+              <w:rPr>
+                <w:b/>
+              </w:rPr>
+            </w:r>
+            <w:r>
+              <w:rPr>
+                <w:b/>
+              </w:rPr>
+              <w:t>A colour is</w:t>
+            </w:r>
+          </w:p>
+        </w:tc>
+        <w:tc>
+          <w:tcPr>
+            <w:tcW w:type="dxa" w:w="2880"/>
+            <w:shd w:val="clear" w:color="auto" w:fill="EAF2FB"/>
+          </w:tcPr>
+          <w:p>
+            <w:r>
+              <w:rPr>
+                <w:b/>
+              </w:rPr>
+            </w:r>
+            <w:r>
+              <w:rPr>
+                <w:b/>
+              </w:rPr>
+              <w:t>Use it to</w:t>
+            </w:r>
+          </w:p>
+        </w:tc>
+      </w:tr>
+      <w:tr>
+        <w:tc>
+          <w:tcPr>
+            <w:tcW w:type="dxa" w:w="2880"/>
+          </w:tcPr>
+          <w:p>
+            <w:r/>
+            <w:r>
+              <w:rPr>
+                <w:b/>
+              </w:rPr>
+              <w:t>Locked</w:t>
+            </w:r>
+          </w:p>
+        </w:tc>
+        <w:tc>
+          <w:tcPr>
+            <w:tcW w:type="dxa" w:w="2880"/>
+          </w:tcPr>
+          <w:p>
+            <w:r/>
+            <w:r>
+              <w:rPr/>
+              <w:t>One fixed amount for the whole session. The default.</w:t>
+            </w:r>
+          </w:p>
+        </w:tc>
+        <w:tc>
+          <w:tcPr>
+            <w:tcW w:type="dxa" w:w="2880"/>
+          </w:tcPr>
+          <w:p>
+            <w:r/>
+            <w:r>
+              <w:rPr/>
+              <w:t xml:space="preserve">Read </w:t>
+            </w:r>
+            <w:r>
+              <w:rPr>
+                <w:b/>
+              </w:rPr>
+              <w:t>size</w:t>
+            </w:r>
+            <w:r>
+              <w:rPr/>
+              <w:t>, and see a level grow or fade through the day.</w:t>
+            </w:r>
+          </w:p>
+        </w:tc>
+      </w:tr>
+      <w:tr>
+        <w:tc>
+          <w:tcPr>
+            <w:tcW w:type="dxa" w:w="2880"/>
+            <w:shd w:val="clear" w:color="auto" w:fill="F4F6FA"/>
+          </w:tcPr>
+          <w:p>
+            <w:r/>
+            <w:r>
+              <w:rPr>
+                <w:b/>
+              </w:rPr>
+              <w:t>Adaptive</w:t>
+            </w:r>
+          </w:p>
+        </w:tc>
+        <w:tc>
+          <w:tcPr>
+            <w:tcW w:type="dxa" w:w="2880"/>
+            <w:shd w:val="clear" w:color="auto" w:fill="F4F6FA"/>
+          </w:tcPr>
+          <w:p>
+            <w:r/>
+            <w:r>
+              <w:rPr/>
+              <w:t>A share of the largest values on screen right now.</w:t>
+            </w:r>
+          </w:p>
+        </w:tc>
+        <w:tc>
+          <w:tcPr>
+            <w:tcW w:type="dxa" w:w="2880"/>
+            <w:shd w:val="clear" w:color="auto" w:fill="F4F6FA"/>
+          </w:tcPr>
+          <w:p>
+            <w:r/>
+            <w:r>
+              <w:rPr/>
+              <w:t>See detail on a quiet chart. The same shade is a different amount later in the day.</w:t>
+            </w:r>
+          </w:p>
+        </w:tc>
+      </w:tr>
+      <w:tr>
+        <w:tc>
+          <w:tcPr>
+            <w:tcW w:type="dxa" w:w="2880"/>
+          </w:tcPr>
+          <w:p>
+            <w:r/>
+            <w:r>
+              <w:rPr>
+                <w:b/>
+              </w:rPr>
+              <w:t>Share of column</w:t>
+            </w:r>
+          </w:p>
+        </w:tc>
+        <w:tc>
+          <w:tcPr>
+            <w:tcW w:type="dxa" w:w="2880"/>
+          </w:tcPr>
+          <w:p>
+            <w:r/>
+            <w:r>
+              <w:rPr/>
+              <w:t>That strike's percentage of the minute's total.</w:t>
+            </w:r>
+          </w:p>
+        </w:tc>
+        <w:tc>
+          <w:tcPr>
+            <w:tcW w:type="dxa" w:w="2880"/>
+          </w:tcPr>
+          <w:p>
+            <w:r/>
+            <w:r>
+              <w:rPr/>
+              <w:t xml:space="preserve">Compare the </w:t>
+            </w:r>
+            <w:r>
+              <w:rPr>
+                <w:b/>
+              </w:rPr>
+              <w:t>shape</w:t>
+            </w:r>
+            <w:r>
+              <w:rPr/>
+              <w:t xml:space="preserve"> of positioning between two times or two symbols.</w:t>
+            </w:r>
+          </w:p>
+        </w:tc>
+      </w:tr>
+    </w:tbl>
+    <w:p/>
+    <w:p>
+      <w:r>
+        <w:rPr/>
+        <w:t xml:space="preserve">The Locked scale is set from the session's </w:t>
+      </w:r>
+      <w:r>
+        <w:rPr>
+          <w:b/>
+        </w:rPr>
+        <w:t>first hour</w:t>
+      </w:r>
+      <w:r>
+        <w:rPr/>
+        <w:t xml:space="preserve"> and then held. Until that</w:t>
+        <w:br/>
+        <w:t>hour is up the chart draws on the adaptive scale and the colour strip says</w:t>
+        <w:br/>
+      </w:r>
+      <w:r>
+        <w:rPr>
+          <w:b/>
+        </w:rPr>
+        <w:t>settling until 09:30</w:t>
+      </w:r>
+      <w:r>
+        <w:rPr/>
+        <w:t xml:space="preserve">; after it, </w:t>
+      </w:r>
+      <w:r>
+        <w:rPr>
+          <w:b/>
+        </w:rPr>
+        <w:t>held since 09:30</w:t>
+      </w:r>
+      <w:r>
+        <w:rPr/>
+        <w:t>. In Locked the bars keep the</w:t>
+        <w:br/>
+        <w:t>same extent as well, and only widen when a bar is larger than the lock, so nothing is</w:t>
+        <w:br/>
+        <w:t>ever cut off.</w:t>
+      </w:r>
+    </w:p>
+    <w:p>
+      <w:r>
+        <w:rPr>
+          <w:b/>
+        </w:rPr>
         <w:t>The colour strip</w:t>
       </w:r>
       <w:r>
@@ -7999,11 +8278,11 @@
         <w:br/>
         <w:t>map's colours as numbers, with the unit: dollars of gamma per 1% move on Gamma,</w:t>
         <w:br/>
-        <w:t>dollars of delta on Delta, a plain figure on Charm and Vanna. The colours stretch</w:t>
-        <w:br/>
-        <w:t>over whatever is on screen, so the same shade is a different amount on another symbol</w:t>
-        <w:br/>
-        <w:t>or later in the day. Read the strip before comparing two charts.</w:t>
+        <w:t>dollars of delta on Delta, a plain figure on Charm and Vanna, percentages in Share of</w:t>
+        <w:br/>
+        <w:t>column. It also says what the scale is tied to. Read the strip before comparing two</w:t>
+        <w:br/>
+        <w:t>charts: in Adaptive, two charts with the same colours can differ tenfold in size.</w:t>
       </w:r>
     </w:p>
     <w:p>
@@ -8019,9 +8298,11 @@
       </w:r>
       <w:r>
         <w:rPr/>
-        <w:t xml:space="preserve"> only. It is a</w:t>
-        <w:br/>
-        <w:t>net figure, so the other three values leave it out.</w:t>
+        <w:t xml:space="preserve"> only, and not</w:t>
+        <w:br/>
+        <w:t>in Share of column. It is a net figure in dollars, so the other values and the</w:t>
+        <w:br/>
+        <w:t>percentage scale leave it out.</w:t>
       </w:r>
     </w:p>
     <w:p>

</xml_diff>

<commit_message>
docs(gamma): the heatmap's From spot frame, and Phase 3 as built
The page guide, the three manuals (rebuilt), the route notes, the config
reference and the changelog. The design's spot-frame section is corrected
in place with what was measured: its cost estimate was wrong, the frame is
10 strikes tall, and that height is one config key for both tiers.

Verified on the local page harness (no dev environment), read from the
page's DOM; not yet seen on prod data.

Co-Authored-By: Claude Opus 5.5 <noreply@anthropic.com>
</commit_message>
<xml_diff>
--- a/docs/manuals/user-guide/user-guide.docx
+++ b/docs/manuals/user-guide/user-guide.docx
@@ -8263,6 +8263,261 @@
         <w:t>same extent as well, and only widen when a bar is larger than the lock, so nothing is</w:t>
         <w:br/>
         <w:t>ever cut off.</w:t>
+      </w:r>
+    </w:p>
+    <w:p>
+      <w:r>
+        <w:rPr>
+          <w:b/>
+        </w:rPr>
+        <w:t>Frame</w:t>
+      </w:r>
+      <w:r>
+        <w:rPr/>
+        <w:t xml:space="preserve"> (a picker beside Scale) chooses what the vertical axis measures:</w:t>
+      </w:r>
+    </w:p>
+    <w:tbl>
+      <w:tblPr>
+        <w:tblW w:type="auto" w:w="0"/>
+        <w:jc w:val="left"/>
+        <w:tblLayout w:type="autofit"/>
+        <w:tblLook w:firstColumn="1" w:firstRow="1" w:lastColumn="0" w:lastRow="0" w:noHBand="0" w:noVBand="1" w:val="04A0"/>
+        <w:tblBorders>
+          <w:top w:val="single" w:sz="4" w:space="0" w:color="D8DEE9"/>
+          <w:left w:val="single" w:sz="4" w:space="0" w:color="D8DEE9"/>
+          <w:bottom w:val="single" w:sz="4" w:space="0" w:color="D8DEE9"/>
+          <w:right w:val="single" w:sz="4" w:space="0" w:color="D8DEE9"/>
+          <w:insideH w:val="single" w:sz="4" w:space="0" w:color="D8DEE9"/>
+          <w:insideV w:val="single" w:sz="4" w:space="0" w:color="D8DEE9"/>
+        </w:tblBorders>
+      </w:tblPr>
+      <w:tblGrid>
+        <w:gridCol w:w="2880"/>
+        <w:gridCol w:w="2880"/>
+        <w:gridCol w:w="2880"/>
+      </w:tblGrid>
+      <w:tr>
+        <w:tc>
+          <w:tcPr>
+            <w:tcW w:type="dxa" w:w="2880"/>
+            <w:shd w:val="clear" w:color="auto" w:fill="EAF2FB"/>
+          </w:tcPr>
+          <w:p>
+            <w:r>
+              <w:rPr>
+                <w:b/>
+              </w:rPr>
+            </w:r>
+            <w:r>
+              <w:rPr>
+                <w:b/>
+              </w:rPr>
+              <w:t>Frame</w:t>
+            </w:r>
+          </w:p>
+        </w:tc>
+        <w:tc>
+          <w:tcPr>
+            <w:tcW w:type="dxa" w:w="2880"/>
+            <w:shd w:val="clear" w:color="auto" w:fill="EAF2FB"/>
+          </w:tcPr>
+          <w:p>
+            <w:r>
+              <w:rPr>
+                <w:b/>
+              </w:rPr>
+            </w:r>
+            <w:r>
+              <w:rPr>
+                <w:b/>
+              </w:rPr>
+              <w:t>The vertical axis is</w:t>
+            </w:r>
+          </w:p>
+        </w:tc>
+        <w:tc>
+          <w:tcPr>
+            <w:tcW w:type="dxa" w:w="2880"/>
+            <w:shd w:val="clear" w:color="auto" w:fill="EAF2FB"/>
+          </w:tcPr>
+          <w:p>
+            <w:r>
+              <w:rPr>
+                <w:b/>
+              </w:rPr>
+            </w:r>
+            <w:r>
+              <w:rPr>
+                <w:b/>
+              </w:rPr>
+              <w:t>Use it to</w:t>
+            </w:r>
+          </w:p>
+        </w:tc>
+      </w:tr>
+      <w:tr>
+        <w:tc>
+          <w:tcPr>
+            <w:tcW w:type="dxa" w:w="2880"/>
+          </w:tcPr>
+          <w:p>
+            <w:r/>
+            <w:r>
+              <w:rPr>
+                <w:b/>
+              </w:rPr>
+              <w:t>Strike</w:t>
+            </w:r>
+          </w:p>
+        </w:tc>
+        <w:tc>
+          <w:tcPr>
+            <w:tcW w:type="dxa" w:w="2880"/>
+          </w:tcPr>
+          <w:p>
+            <w:r/>
+            <w:r>
+              <w:rPr/>
+              <w:t>The strike price. Price moves; the levels stand still. The default.</w:t>
+            </w:r>
+          </w:p>
+        </w:tc>
+        <w:tc>
+          <w:tcPr>
+            <w:tcW w:type="dxa" w:w="2880"/>
+          </w:tcPr>
+          <w:p>
+            <w:r/>
+            <w:r>
+              <w:rPr/>
+              <w:t>Read where the levels are.</w:t>
+            </w:r>
+          </w:p>
+        </w:tc>
+      </w:tr>
+      <w:tr>
+        <w:tc>
+          <w:tcPr>
+            <w:tcW w:type="dxa" w:w="2880"/>
+            <w:shd w:val="clear" w:color="auto" w:fill="F4F6FA"/>
+          </w:tcPr>
+          <w:p>
+            <w:r/>
+            <w:r>
+              <w:rPr>
+                <w:b/>
+              </w:rPr>
+              <w:t>From spot</w:t>
+            </w:r>
+          </w:p>
+        </w:tc>
+        <w:tc>
+          <w:tcPr>
+            <w:tcW w:type="dxa" w:w="2880"/>
+            <w:shd w:val="clear" w:color="auto" w:fill="F4F6FA"/>
+          </w:tcPr>
+          <w:p>
+            <w:r/>
+            <w:r>
+              <w:rPr/>
+              <w:t>The distance from the current price. Price is a flat line through the middle; the flip and the walls move.</w:t>
+            </w:r>
+          </w:p>
+        </w:tc>
+        <w:tc>
+          <w:tcPr>
+            <w:tcW w:type="dxa" w:w="2880"/>
+            <w:shd w:val="clear" w:color="auto" w:fill="F4F6FA"/>
+          </w:tcPr>
+          <w:p>
+            <w:r/>
+            <w:r>
+              <w:rPr/>
+              <w:t xml:space="preserve">See what is </w:t>
+            </w:r>
+            <w:r>
+              <w:rPr>
+                <w:b/>
+              </w:rPr>
+              <w:t>near price now</w:t>
+            </w:r>
+            <w:r>
+              <w:rPr/>
+              <w:t>, and whether it is getting nearer.</w:t>
+            </w:r>
+          </w:p>
+        </w:tc>
+      </w:tr>
+    </w:tbl>
+    <w:p/>
+    <w:p>
+      <w:r>
+        <w:rPr>
+          <w:b/>
+        </w:rPr>
+        <w:t>To see whether price is closing on a wall, pick From spot.</w:t>
+      </w:r>
+      <w:r>
+        <w:rPr/>
+        <w:t xml:space="preserve"> A wall that price is</w:t>
+        <w:br/>
+        <w:t>approaching slides toward the middle line, and the steeper the slide, the faster the</w:t>
+        <w:br/>
+        <w:t>approach. A wall that runs level is keeping its distance.</w:t>
+      </w:r>
+    </w:p>
+    <w:p>
+      <w:r>
+        <w:rPr/>
+        <w:t xml:space="preserve">From spot shows </w:t>
+      </w:r>
+      <w:r>
+        <w:rPr>
+          <w:b/>
+        </w:rPr>
+        <w:t>10 strikes each side of price</w:t>
+      </w:r>
+      <w:r>
+        <w:rPr/>
+        <w:t>, in both panels, so the bars still</w:t>
+        <w:br/>
+        <w:t>line up with the heat map. Three controls hide in this frame because they would do</w:t>
+        <w:br/>
+        <w:t xml:space="preserve">nothing: </w:t>
+      </w:r>
+      <w:r>
+        <w:rPr>
+          <w:b/>
+        </w:rPr>
+        <w:t>Spot</w:t>
+      </w:r>
+      <w:r>
+        <w:rPr/>
+        <w:t xml:space="preserve"> and </w:t>
+      </w:r>
+      <w:r>
+        <w:rPr>
+          <w:b/>
+        </w:rPr>
+        <w:t>Bar</w:t>
+      </w:r>
+      <w:r>
+        <w:rPr/>
+        <w:t xml:space="preserve"> (price is always the flat line) and </w:t>
+      </w:r>
+      <w:r>
+        <w:rPr>
+          <w:b/>
+        </w:rPr>
+        <w:t>Level movement</w:t>
+      </w:r>
+      <w:r>
+        <w:rPr/>
+        <w:br/>
+        <w:t>(the level lines are always drawn). The forward projection band is not drawn either.</w:t>
+        <w:br/>
+        <w:t>Each level line keeps its own price in its label; only its position moves.</w:t>
       </w:r>
     </w:p>
     <w:p>

</xml_diff>

<commit_message>
docs(gamma): the heatmap's Show picker, and Phase 4 as built
The page guide, the three manuals (rebuilt), the route notes, the config
reference and the changelog. Each says what a change is not: open interest
is published once a day, so this is repricing, not new trades. The design
gains the paragraph on the bars following, which the plan did not have.

Verified on the local page harness (no dev environment), read from the
page's DOM; not yet seen on prod data.

Co-Authored-By: Claude Opus 5.5 <noreply@anthropic.com>
</commit_message>
<xml_diff>
--- a/docs/manuals/user-guide/user-guide.docx
+++ b/docs/manuals/user-guide/user-guide.docx
@@ -7991,11 +7991,295 @@
         <w:rPr>
           <w:b/>
         </w:rPr>
+        <w:t>Show</w:t>
+      </w:r>
+      <w:r>
+        <w:rPr/>
+        <w:t xml:space="preserve"> (a picker beside Value) chooses between the level and how it has moved:</w:t>
+      </w:r>
+    </w:p>
+    <w:tbl>
+      <w:tblPr>
+        <w:tblW w:type="auto" w:w="0"/>
+        <w:jc w:val="left"/>
+        <w:tblLayout w:type="autofit"/>
+        <w:tblLook w:firstColumn="1" w:firstRow="1" w:lastColumn="0" w:lastRow="0" w:noHBand="0" w:noVBand="1" w:val="04A0"/>
+        <w:tblBorders>
+          <w:top w:val="single" w:sz="4" w:space="0" w:color="D8DEE9"/>
+          <w:left w:val="single" w:sz="4" w:space="0" w:color="D8DEE9"/>
+          <w:bottom w:val="single" w:sz="4" w:space="0" w:color="D8DEE9"/>
+          <w:right w:val="single" w:sz="4" w:space="0" w:color="D8DEE9"/>
+          <w:insideH w:val="single" w:sz="4" w:space="0" w:color="D8DEE9"/>
+          <w:insideV w:val="single" w:sz="4" w:space="0" w:color="D8DEE9"/>
+        </w:tblBorders>
+      </w:tblPr>
+      <w:tblGrid>
+        <w:gridCol w:w="2880"/>
+        <w:gridCol w:w="2880"/>
+        <w:gridCol w:w="2880"/>
+      </w:tblGrid>
+      <w:tr>
+        <w:tc>
+          <w:tcPr>
+            <w:tcW w:type="dxa" w:w="2880"/>
+            <w:shd w:val="clear" w:color="auto" w:fill="EAF2FB"/>
+          </w:tcPr>
+          <w:p>
+            <w:r>
+              <w:rPr>
+                <w:b/>
+              </w:rPr>
+            </w:r>
+            <w:r>
+              <w:rPr>
+                <w:b/>
+              </w:rPr>
+              <w:t>Show</w:t>
+            </w:r>
+          </w:p>
+        </w:tc>
+        <w:tc>
+          <w:tcPr>
+            <w:tcW w:type="dxa" w:w="2880"/>
+            <w:shd w:val="clear" w:color="auto" w:fill="EAF2FB"/>
+          </w:tcPr>
+          <w:p>
+            <w:r>
+              <w:rPr>
+                <w:b/>
+              </w:rPr>
+            </w:r>
+            <w:r>
+              <w:rPr>
+                <w:b/>
+              </w:rPr>
+              <w:t>Each bar and cell is</w:t>
+            </w:r>
+          </w:p>
+        </w:tc>
+        <w:tc>
+          <w:tcPr>
+            <w:tcW w:type="dxa" w:w="2880"/>
+            <w:shd w:val="clear" w:color="auto" w:fill="EAF2FB"/>
+          </w:tcPr>
+          <w:p>
+            <w:r>
+              <w:rPr>
+                <w:b/>
+              </w:rPr>
+            </w:r>
+            <w:r>
+              <w:rPr>
+                <w:b/>
+              </w:rPr>
+              <w:t>Use it to</w:t>
+            </w:r>
+          </w:p>
+        </w:tc>
+      </w:tr>
+      <w:tr>
+        <w:tc>
+          <w:tcPr>
+            <w:tcW w:type="dxa" w:w="2880"/>
+          </w:tcPr>
+          <w:p>
+            <w:r/>
+            <w:r>
+              <w:rPr>
+                <w:b/>
+              </w:rPr>
+              <w:t>Level</w:t>
+            </w:r>
+          </w:p>
+        </w:tc>
+        <w:tc>
+          <w:tcPr>
+            <w:tcW w:type="dxa" w:w="2880"/>
+          </w:tcPr>
+          <w:p>
+            <w:r/>
+            <w:r>
+              <w:rPr/>
+              <w:t>The value itself. The default.</w:t>
+            </w:r>
+          </w:p>
+        </w:tc>
+        <w:tc>
+          <w:tcPr>
+            <w:tcW w:type="dxa" w:w="2880"/>
+          </w:tcPr>
+          <w:p>
+            <w:r/>
+            <w:r>
+              <w:rPr/>
+              <w:t>Read where the exposure is.</w:t>
+            </w:r>
+          </w:p>
+        </w:tc>
+      </w:tr>
+      <w:tr>
+        <w:tc>
+          <w:tcPr>
+            <w:tcW w:type="dxa" w:w="2880"/>
+            <w:shd w:val="clear" w:color="auto" w:fill="F4F6FA"/>
+          </w:tcPr>
+          <w:p>
+            <w:r/>
+            <w:r>
+              <w:rPr>
+                <w:b/>
+              </w:rPr>
+              <w:t>Change since open</w:t>
+            </w:r>
+          </w:p>
+        </w:tc>
+        <w:tc>
+          <w:tcPr>
+            <w:tcW w:type="dxa" w:w="2880"/>
+            <w:shd w:val="clear" w:color="auto" w:fill="F4F6FA"/>
+          </w:tcPr>
+          <w:p>
+            <w:r/>
+            <w:r>
+              <w:rPr/>
+              <w:t>The value now, less the same strike's value at the open.</w:t>
+            </w:r>
+          </w:p>
+        </w:tc>
+        <w:tc>
+          <w:tcPr>
+            <w:tcW w:type="dxa" w:w="2880"/>
+            <w:shd w:val="clear" w:color="auto" w:fill="F4F6FA"/>
+          </w:tcPr>
+          <w:p>
+            <w:r/>
+            <w:r>
+              <w:rPr/>
+              <w:t>See what has built or drained over the session.</w:t>
+            </w:r>
+          </w:p>
+        </w:tc>
+      </w:tr>
+      <w:tr>
+        <w:tc>
+          <w:tcPr>
+            <w:tcW w:type="dxa" w:w="2880"/>
+          </w:tcPr>
+          <w:p>
+            <w:r/>
+            <w:r>
+              <w:rPr>
+                <w:b/>
+              </w:rPr>
+              <w:t>Change over 30 min</w:t>
+            </w:r>
+          </w:p>
+        </w:tc>
+        <w:tc>
+          <w:tcPr>
+            <w:tcW w:type="dxa" w:w="2880"/>
+          </w:tcPr>
+          <w:p>
+            <w:r/>
+            <w:r>
+              <w:rPr/>
+              <w:t>The value now, less the same strike's value 30 minutes earlier.</w:t>
+            </w:r>
+          </w:p>
+        </w:tc>
+        <w:tc>
+          <w:tcPr>
+            <w:tcW w:type="dxa" w:w="2880"/>
+          </w:tcPr>
+          <w:p>
+            <w:r/>
+            <w:r>
+              <w:rPr/>
+              <w:t>See what is moving right now.</w:t>
+            </w:r>
+          </w:p>
+        </w:tc>
+      </w:tr>
+    </w:tbl>
+    <w:p/>
+    <w:p>
+      <w:r>
+        <w:rPr>
+          <w:b/>
+        </w:rPr>
+        <w:t>To see where exposure is building, pick a Change.</w:t>
+      </w:r>
+      <w:r>
+        <w:rPr/>
+        <w:t xml:space="preserve"> The standing bands that sit</w:t>
+        <w:br/>
+        <w:t>still all day go dark, and only what has moved is left. Both panels switch together.</w:t>
+      </w:r>
+    </w:p>
+    <w:p>
+      <w:pPr>
+        <w:pStyle w:val="IntenseQuote"/>
+      </w:pPr>
+      <w:r>
+        <w:rPr>
+          <w:b/>
+        </w:rPr>
+        <w:t>A change is not new trades.</w:t>
+      </w:r>
+      <w:r>
+        <w:rPr/>
+        <w:t xml:space="preserve"> Open interest updates once a day, so through the</w:t>
+        <w:br/>
+        <w:t>session these numbers move only because price, time and volatility reprice the</w:t>
+        <w:br/>
+      </w:r>
+      <w:r>
+        <w:rPr>
+          <w:b/>
+        </w:rPr>
+        <w:t>same</w:t>
+      </w:r>
+      <w:r>
+        <w:rPr/>
+        <w:t xml:space="preserve"> positions. A strike that brightens in a Change view is one where existing</w:t>
+        <w:br/>
+        <w:t>positions have become more sensitive, typically because price has moved toward it</w:t>
+        <w:br/>
+        <w:t>or its options are close to expiring. It does not mean anyone bought or sold there.</w:t>
+      </w:r>
+    </w:p>
+    <w:p>
+      <w:r>
+        <w:rPr/>
+        <w:t xml:space="preserve">In the first half hour of a session </w:t>
+      </w:r>
+      <w:r>
+        <w:rPr>
+          <w:b/>
+        </w:rPr>
+        <w:t>Change over 30 min</w:t>
+      </w:r>
+      <w:r>
+        <w:rPr/>
+        <w:t xml:space="preserve"> is empty, because nothing</w:t>
+        <w:br/>
+        <w:t>is yet 30 minutes old. A strike that was not in the chain at the start of the window</w:t>
+        <w:br/>
+        <w:t>is left blank, never drawn as a change from zero. The forward projection band is not</w:t>
+        <w:br/>
+        <w:t>drawn in a Change view.</w:t>
+      </w:r>
+    </w:p>
+    <w:p>
+      <w:r>
+        <w:rPr>
+          <w:b/>
+        </w:rPr>
         <w:t>Scale</w:t>
       </w:r>
       <w:r>
         <w:rPr/>
-        <w:t xml:space="preserve"> (a picker beside Value) chooses what a colour means:</w:t>
+        <w:t xml:space="preserve"> (a picker beside Show) chooses what a colour means:</w:t>
       </w:r>
     </w:p>
     <w:tbl>

</xml_diff>

<commit_message>
docs(flow): the Flow and Net Prem premium is volume at the current mark, and say so
The page guide, two manuals and the code called the premium behind the Flow
ribbon, Net Prem and the Premium-shift alert cumulative traded dollars. It
is the day's volume re-priced every minute. tools/measure_flow_remark.py
measures what that does on stored sessions: each ribbon line falls in 34%
to 49% of minutes on the indexes, the net steps with price in about nine
minutes of ten, and 138 of 527 crossover alerts needed a side to fall to
fire. The Matrix's flow acceleration reads the same figure's slope and
mostly echoes price.

Wording, docstrings and comments only. What the pages draw, what the alert
fires on and the Matrix's signal are unchanged; the measurements and the
options are in the traded-premium design under Phase B.

Co-Authored-By: Claude Opus 5.5 <noreply@anthropic.com>
</commit_message>
<xml_diff>
--- a/docs/manuals/user-guide/user-guide.docx
+++ b/docs/manuals/user-guide/user-guide.docx
@@ -7551,7 +7551,7 @@
         <w:rPr>
           <w:b/>
         </w:rPr>
-        <w:t>traded dollars through calls versus puts</w:t>
+        <w:t>dollars through calls versus puts</w:t>
       </w:r>
       <w:r>
         <w:rPr/>
@@ -7569,6 +7569,45 @@
         <w:t xml:space="preserve"> net buying. A big call number is equally consistent with someone buying</w:t>
         <w:br/>
         <w:t>calls and someone selling covered calls.</w:t>
+      </w:r>
+    </w:p>
+    <w:p>
+      <w:pPr>
+        <w:pStyle w:val="IntenseQuote"/>
+      </w:pPr>
+      <w:r>
+        <w:rPr>
+          <w:b/>
+        </w:rPr>
+        <w:t>Premium is also re-priced every minute.</w:t>
+      </w:r>
+      <w:r>
+        <w:rPr/>
+        <w:t xml:space="preserve"> The figure is today's volume so far</w:t>
+        <w:br/>
+        <w:t xml:space="preserve">valued at the </w:t>
+      </w:r>
+      <w:r>
+        <w:rPr>
+          <w:i/>
+        </w:rPr>
+        <w:t>current</w:t>
+      </w:r>
+      <w:r>
+        <w:rPr/>
+        <w:t xml:space="preserve"> option prices, not a running total of what traded. So a</w:t>
+        <w:br/>
+        <w:t>line can fall with no trade behind it, and it usually ends the day below its</w:t>
+        <w:br/>
+        <w:t>peak as same-day options decay. Calls gain and puts lose value as a stock rises,</w:t>
+        <w:br/>
+        <w:t>so the two lines, and the gap between them, follow the stock's own price closely.</w:t>
+        <w:br/>
+        <w:t>On stored sessions the net line stepped the same way as price in about nine</w:t>
+        <w:br/>
+        <w:t>minutes out of ten on the indexes. Read a crossover with that in mind: it can</w:t>
+        <w:br/>
+        <w:t>come from a price move alone.</w:t>
       </w:r>
     </w:p>
     <w:p>
@@ -9527,7 +9566,7 @@
             <w:r/>
             <w:r>
               <w:rPr/>
-              <w:t>Call premium overtook put premium on a symbol, or the reverse.</w:t>
+              <w:t>Call premium overtook put premium on a symbol, or the reverse. Premium is today's volume at current option prices, so a move in the stock can cause this with no new trading.</w:t>
             </w:r>
           </w:p>
         </w:tc>

</xml_diff>

<commit_message>
fix(gamma): From spot honours the Level movement switch
Picking the From spot frame hid the Level movement switch and drew the
three level tracks whatever it was set to. The user found lines that could
not be turned off a distraction. The switch now stays visible and decides
in both frames; only the Spot and Bar pickers hide in From spot.

The always-on tracks were a design choice of mine, not a request. Two tests
that pinned the old behaviour are rewritten to state the new one and a
third covers the off case.

Co-Authored-By: Claude Opus 5.5 <noreply@anthropic.com>
</commit_message>
<xml_diff>
--- a/docs/manuals/user-guide/user-guide.docx
+++ b/docs/manuals/user-guide/user-guide.docx
@@ -8779,15 +8779,19 @@
         <w:rPr>
           <w:b/>
         </w:rPr>
-        <w:t>To see whether price is closing on a wall, pick From spot.</w:t>
-      </w:r>
-      <w:r>
-        <w:rPr/>
-        <w:t xml:space="preserve"> A wall that price is</w:t>
-        <w:br/>
-        <w:t>approaching slides toward the middle line, and the steeper the slide, the faster the</w:t>
-        <w:br/>
-        <w:t>approach. A wall that runs level is keeping its distance.</w:t>
+        <w:t>To see whether price is closing on a wall, pick From spot and switch Level movement</w:t>
+        <w:br/>
+        <w:t>on.</w:t>
+      </w:r>
+      <w:r>
+        <w:rPr/>
+        <w:t xml:space="preserve"> A wall that price is approaching slides toward the middle line, and the steeper</w:t>
+        <w:br/>
+        <w:t>the slide, the faster the approach. A wall that runs level is keeping its distance.</w:t>
+        <w:br/>
+        <w:t>With Level movement off, each level is a single line at its distance from price right</w:t>
+        <w:br/>
+        <w:t>now, and the heat map is left clear.</w:t>
       </w:r>
     </w:p>
     <w:p>
@@ -8805,7 +8809,7 @@
         <w:rPr/>
         <w:t>, in both panels, so the bars still</w:t>
         <w:br/>
-        <w:t>line up with the heat map. Three controls hide in this frame because they would do</w:t>
+        <w:t>line up with the heat map. Two controls hide in this frame because they would do</w:t>
         <w:br/>
         <w:t xml:space="preserve">nothing: </w:t>
       </w:r>
@@ -8827,20 +8831,11 @@
       </w:r>
       <w:r>
         <w:rPr/>
-        <w:t xml:space="preserve"> (price is always the flat line) and </w:t>
-      </w:r>
-      <w:r>
-        <w:rPr>
-          <w:b/>
-        </w:rPr>
-        <w:t>Level movement</w:t>
-      </w:r>
-      <w:r>
-        <w:rPr/>
-        <w:br/>
-        <w:t>(the level lines are always drawn). The forward projection band is not drawn either.</w:t>
-        <w:br/>
-        <w:t>Each level line keeps its own price in its label; only its position moves.</w:t>
+        <w:t xml:space="preserve"> (price is always the flat line). The forward projection</w:t>
+        <w:br/>
+        <w:t>band is not drawn either. Each level line keeps its own price in its label; only its</w:t>
+        <w:br/>
+        <w:t>position moves.</w:t>
       </w:r>
     </w:p>
     <w:p>

</xml_diff>

<commit_message>
docs(gamma): contour lines and the gravity well
The page guide, the User Guide, the Reference Guide and the Technical
Reference describe the two new switches and say what the well is not. The
route notes and the config reference follow, and a short design note
records why each is built as it is: no zero contour, a square-root height,
shading to the zero line only, and both off until asked for.

Co-Authored-By: Claude Opus 5.5 <noreply@anthropic.com>
</commit_message>
<xml_diff>
--- a/docs/manuals/user-guide/user-guide.docx
+++ b/docs/manuals/user-guide/user-guide.docx
@@ -32,7 +32,7 @@
           <w:color w:val="5B6678"/>
           <w:sz w:val="18"/>
         </w:rPr>
-        <w:t>NeuralStrike · Generated 2026-10-09</w:t>
+        <w:t>NeuralStrike · Generated 2026-10-10</w:t>
       </w:r>
     </w:p>
     <w:p/>
@@ -8836,6 +8836,92 @@
         <w:t>band is not drawn either. Each level line keeps its own price in its label; only its</w:t>
         <w:br/>
         <w:t>position moves.</w:t>
+      </w:r>
+    </w:p>
+    <w:p>
+      <w:r>
+        <w:rPr>
+          <w:b/>
+        </w:rPr>
+        <w:t>To see where the positioning changes fast, switch Contours on.</w:t>
+      </w:r>
+      <w:r>
+        <w:rPr/>
+        <w:t xml:space="preserve"> It draws lines of</w:t>
+        <w:br/>
+        <w:t>equal value over the heat map: at the top of the colour scale, at half of it and at a</w:t>
+        <w:br/>
+        <w:t>quarter, above and below zero. Where the lines bunch together, the exposure changes a</w:t>
+        <w:br/>
+        <w:t>lot across a few strikes. Where one line runs alone, it marks how far a band reaches.</w:t>
+        <w:br/>
+        <w:t>The lines follow the Value, Show, Scale and Frame you have chosen, and the switch is</w:t>
+        <w:br/>
+        <w:t>off until you turn it on.</w:t>
+      </w:r>
+    </w:p>
+    <w:p>
+      <w:r>
+        <w:rPr>
+          <w:b/>
+        </w:rPr>
+        <w:t>To see the gamma profile as a landscape, switch Gravity well on</w:t>
+      </w:r>
+      <w:r>
+        <w:rPr/>
+        <w:t xml:space="preserve"> (Gamma view only).</w:t>
+        <w:br/>
+        <w:t>A panel appears under the two charts. Strikes with positive gamma, where dealer hedging</w:t>
+        <w:br/>
+        <w:t xml:space="preserve">damps moves, are drawn as </w:t>
+      </w:r>
+      <w:r>
+        <w:rPr>
+          <w:b/>
+        </w:rPr>
+        <w:t>valleys</w:t>
+      </w:r>
+      <w:r>
+        <w:rPr/>
+        <w:t>. Strikes with negative gamma, where it amplifies</w:t>
+        <w:br/>
+        <w:t xml:space="preserve">them, are drawn as </w:t>
+      </w:r>
+      <w:r>
+        <w:rPr>
+          <w:b/>
+        </w:rPr>
+        <w:t>hills</w:t>
+      </w:r>
+      <w:r>
+        <w:rPr/>
+        <w:t>. The white ball is the price, the arrow beside it points</w:t>
+        <w:br/>
+        <w:t>downhill, and the small diamond marks the low point that slope leads to. One sentence</w:t>
+        <w:br/>
+        <w:t>under the panel says where price sits and how far the low point is.</w:t>
+      </w:r>
+    </w:p>
+    <w:p>
+      <w:r>
+        <w:rPr/>
+        <w:t xml:space="preserve">Read it as a picture of the positioning right now. It is </w:t>
+      </w:r>
+      <w:r>
+        <w:rPr>
+          <w:b/>
+        </w:rPr>
+        <w:t>not a forecast</w:t>
+      </w:r>
+      <w:r>
+        <w:rPr/>
+        <w:t>: it knows</w:t>
+        <w:br/>
+        <w:t>nothing about order flow, time or volatility. The height is on a square-root scale so</w:t>
+        <w:br/>
+        <w:t>that one very large strike does not flatten everything else, which means two valleys'</w:t>
+        <w:br/>
+        <w:t>depths are not in proportion to their dollars. Hover a strike for its real net gamma.</w:t>
       </w:r>
     </w:p>
     <w:p>

</xml_diff>

<commit_message>
docs(gamma): the ridge plot
The design note (written as built), the page guide, the User, Reference and
Technical manuals, the route notes, the config reference and the changelog.

Co-Authored-By: Claude Opus 5.5 <noreply@anthropic.com>
</commit_message>
<xml_diff>
--- a/docs/manuals/user-guide/user-guide.docx
+++ b/docs/manuals/user-guide/user-guide.docx
@@ -8922,6 +8922,54 @@
         <w:t>that one very large strike does not flatten everything else, which means two valleys'</w:t>
         <w:br/>
         <w:t>depths are not in proportion to their dollars. Hover a strike for its real net gamma.</w:t>
+      </w:r>
+    </w:p>
+    <w:p>
+      <w:r>
+        <w:rPr>
+          <w:b/>
+        </w:rPr>
+        <w:t>To see how the profile has changed through the session, switch Ridge plot on</w:t>
+      </w:r>
+      <w:r>
+        <w:rPr/>
+        <w:br/>
+        <w:t>(Gamma, Charm, Delta and Vanna). A panel appears under the charts with one profile</w:t>
+        <w:br/>
+        <w:t>every half hour, stacked front to back: the earliest at the top and the latest in</w:t>
+        <w:br/>
+        <w:t>front, each labelled with its time. Follow one strike down the stack. If its ridge</w:t>
+        <w:br/>
+        <w:t>gets taller, positioning has been building there; if it shrinks, it has been</w:t>
+        <w:br/>
+        <w:t>leaving. The white dot on each row is where price was at that time, so the dots</w:t>
+        <w:br/>
+        <w:t>trace the path price took across the profile.</w:t>
+      </w:r>
+    </w:p>
+    <w:p>
+      <w:r>
+        <w:rPr/>
+        <w:t>A ridge's height is the size of the value and its colour the sign, so a strike with</w:t>
+        <w:br/>
+        <w:t>negative exposure is a hill too, in the negative colour. The panel follows the</w:t>
+        <w:br/>
+      </w:r>
+      <w:r>
+        <w:rPr>
+          <w:b/>
+        </w:rPr>
+        <w:t>Value</w:t>
+      </w:r>
+      <w:r>
+        <w:rPr/>
+        <w:t xml:space="preserve"> picker: choose Puts and every ridge is redrawn in puts. All the ridges</w:t>
+        <w:br/>
+        <w:t>share one scale, set by the typical one. A reading far larger than the rest, such</w:t>
+        <w:br/>
+        <w:t>as an expiry close pinned on one strike, stands as a tower in front and can run off</w:t>
+        <w:br/>
+        <w:t>the top of the panel; hover it for the real figure.</w:t>
       </w:r>
     </w:p>
     <w:p>

</xml_diff>

<commit_message>
feat(gamma): the gravity well and the ridge plot share one strike axis
Asked for by the user on seeing the two panels together: a price sat at a
different horizontal place in each. The well's axis was rounded out to a tick
and started at the panel's left edge; the ridge plot's stopped at its last
strike and started 56 px in, after its time labels.

Both now take _strike_axis: the same left and right margins, and an x-axis that
is the bars' strike window exactly, with no rounding out and no padding. The
ridge figure takes the window from its panel, because a ridge can stop short of
the window's edge.

Co-Authored-By: Claude Opus 5.5 <noreply@anthropic.com>
</commit_message>
<xml_diff>
--- a/docs/manuals/user-guide/user-guide.docx
+++ b/docs/manuals/user-guide/user-guide.docx
@@ -8970,6 +8970,16 @@
         <w:t>as an expiry close pinned on one strike, stands as a tower in front and can run off</w:t>
         <w:br/>
         <w:t>the top of the panel; hover it for the real figure.</w:t>
+      </w:r>
+    </w:p>
+    <w:p>
+      <w:r>
+        <w:rPr/>
+        <w:t>With the Gravity well and the Ridge plot both on, the two panels share one strike</w:t>
+        <w:br/>
+        <w:t>axis: a price is at the same place across both, so you can read straight down from</w:t>
+        <w:br/>
+        <w:t>the ball in the well to that strike's ridges.</w:t>
       </w:r>
     </w:p>
     <w:p>

</xml_diff>

<commit_message>
docs(gamma): choosing the Dealer Positioning colours
The design note (written as built), the page guide, the User and Reference
manuals, the route notes, the config reference, the changelog and one line in
CLAUDE.md: a new colour on that page comes from gamma.palette, never a literal.

Co-Authored-By: Claude Opus 5.5 <noreply@anthropic.com>
</commit_message>
<xml_diff>
--- a/docs/manuals/user-guide/user-guide.docx
+++ b/docs/manuals/user-guide/user-guide.docx
@@ -32,7 +32,7 @@
           <w:color w:val="5B6678"/>
           <w:sz w:val="18"/>
         </w:rPr>
-        <w:t>NeuralStrike · Generated 2026-10-10</w:t>
+        <w:t>NeuralStrike · Generated 2026-10-11</w:t>
       </w:r>
     </w:p>
     <w:p/>
@@ -7692,7 +7692,20 @@
         <w:br/>
         <w:t xml:space="preserve">  strikes run deep blue → cyan; put-heavy (negative) run aubergine → magenta; near</w:t>
         <w:br/>
-        <w:t xml:space="preserve">  zero fades to transparent so quiet strikes read as empty. The spot price is</w:t>
+        <w:t xml:space="preserve">  zero fades to transparent so quiet strikes read as empty. Those are the shipped</w:t>
+        <w:br/>
+        <w:t xml:space="preserve">  colours: you can choose your own in </w:t>
+      </w:r>
+      <w:r>
+        <w:rPr>
+          <w:b/>
+        </w:rPr>
+        <w:t>Settings → Appearance → Dealer</w:t>
+        <w:br/>
+        <w:t xml:space="preserve">  Positioning</w:t>
+      </w:r>
+      <w:r>
+        <w:t>. The spot price is</w:t>
         <w:br/>
         <w:t xml:space="preserve">  overlaid. </w:t>
       </w:r>
@@ -31657,6 +31670,99 @@
       </w:r>
       <w:r>
         <w:t xml:space="preserve"> (confirm-gated) goes back.</w:t>
+      </w:r>
+    </w:p>
+    <w:p>
+      <w:pPr>
+        <w:pStyle w:val="ListBullet"/>
+      </w:pPr>
+      <w:r>
+        <w:rPr>
+          <w:b/>
+        </w:rPr>
+        <w:t>To choose the Dealer Positioning colours</w:t>
+      </w:r>
+      <w:r>
+        <w:t xml:space="preserve">, open </w:t>
+      </w:r>
+      <w:r>
+        <w:rPr>
+          <w:b/>
+        </w:rPr>
+        <w:t>Settings → Appearance</w:t>
+      </w:r>
+      <w:r>
+        <w:t xml:space="preserve"> and</w:t>
+        <w:br/>
+        <w:t xml:space="preserve">  find the </w:t>
+      </w:r>
+      <w:r>
+        <w:rPr>
+          <w:b/>
+        </w:rPr>
+        <w:t>Dealer Positioning</w:t>
+      </w:r>
+      <w:r>
+        <w:t xml:space="preserve"> group. The top row is the put side and the</w:t>
+        <w:br/>
+        <w:t xml:space="preserve">  bottom row the call side. </w:t>
+      </w:r>
+      <w:r>
+        <w:rPr>
+          <w:b/>
+        </w:rPr>
+        <w:t>Put</w:t>
+      </w:r>
+      <w:r>
+        <w:t xml:space="preserve"> and </w:t>
+      </w:r>
+      <w:r>
+        <w:rPr>
+          <w:b/>
+        </w:rPr>
+        <w:t>Call</w:t>
+      </w:r>
+      <w:r>
+        <w:t xml:space="preserve"> are the two main colours: the</w:t>
+        <w:br/>
+        <w:t xml:space="preserve">  bars, the walls, the gravity well, the ridge plot and the contour lines use</w:t>
+        <w:br/>
+        <w:t xml:space="preserve">  them. </w:t>
+      </w:r>
+      <w:r>
+        <w:rPr>
+          <w:b/>
+        </w:rPr>
+        <w:t>Peak</w:t>
+      </w:r>
+      <w:r>
+        <w:t xml:space="preserve">, </w:t>
+      </w:r>
+      <w:r>
+        <w:rPr>
+          <w:b/>
+        </w:rPr>
+        <w:t>Mid</w:t>
+      </w:r>
+      <w:r>
+        <w:t xml:space="preserve"> and </w:t>
+      </w:r>
+      <w:r>
+        <w:rPr>
+          <w:b/>
+        </w:rPr>
+        <w:t>Low</w:t>
+      </w:r>
+      <w:r>
+        <w:t xml:space="preserve"> are the grading: the shade the heat map</w:t>
+        <w:br/>
+        <w:t xml:space="preserve">  shows for the largest, middling and smallest values on that side. Click a</w:t>
+        <w:br/>
+        <w:t xml:space="preserve">  tile to pick a colour; the strip in the preview shows the whole scale, largest</w:t>
+        <w:br/>
+        <w:t xml:space="preserve">  put on the left to largest call on the right, before you save. The Flow and</w:t>
+        <w:br/>
+        <w:t xml:space="preserve">  Net Prem tabs keep their own colours.</w:t>
       </w:r>
     </w:p>
     <w:p>

</xml_diff>

<commit_message>
feat(gamma): the Flow and Net Prem tabs follow the chosen call and put colours
Asked for by the user after the Dealer Positioning colours became choosable in
Settings -> Appearance: those two tabs had been left out and kept cyan and
magenta beside a heat map in new colours.

Five [flow] keys take the chosen [gamma] colour (theme.FLOW_FOLLOWS: call, put,
call_deep <- call_mid, put_deep <- put_mid, ice <- call_peak), only where that
colour is not the shipped one, so a [flow] value set by hand keeps its say
until the matching colour is chosen. About twenty literal tints of the call,
put and ice colours in flow_panels.py are one function, _tone(key, alpha); the
five the scrub script needs travel in its payload.

At the shipped colours every derived string is the literal it replaced, pinned
by a test. A second test reads the module's source and fails on a call, put or
ice colour written into it again.

Co-Authored-By: Claude Opus 5.5 <noreply@anthropic.com>
</commit_message>
<xml_diff>
--- a/docs/manuals/user-guide/user-guide.docx
+++ b/docs/manuals/user-guide/user-guide.docx
@@ -31762,7 +31762,9 @@
         <w:br/>
         <w:t xml:space="preserve">  put on the left to largest call on the right, before you save. The Flow and</w:t>
         <w:br/>
-        <w:t xml:space="preserve">  Net Prem tabs keep their own colours.</w:t>
+        <w:t xml:space="preserve">  Net Prem tabs follow the same colours: their call and put lines, the strike</w:t>
+        <w:br/>
+        <w:t xml:space="preserve">  ladder and the frame around them.</w:t>
       </w:r>
     </w:p>
     <w:p>

</xml_diff>

<commit_message>
docs(gamma): real smoothing for the heat map
The design note (written as built), the page guide, the User, Reference and
Technical manuals, the route notes, the config reference and the changelog.

Co-Authored-By: Claude Opus 5.5 <noreply@anthropic.com>
</commit_message>
<xml_diff>
--- a/docs/manuals/user-guide/user-guide.docx
+++ b/docs/manuals/user-guide/user-guide.docx
@@ -8849,6 +8849,42 @@
         <w:t>band is not drawn either. Each level line keeps its own price in its label; only its</w:t>
         <w:br/>
         <w:t>position moves.</w:t>
+      </w:r>
+    </w:p>
+    <w:p>
+      <w:r>
+        <w:rPr>
+          <w:b/>
+        </w:rPr>
+        <w:t>The heat map is smoothed, and the Smooth picker sets how much</w:t>
+      </w:r>
+      <w:r>
+        <w:rPr/>
+        <w:t xml:space="preserve"> (Light, Medium or</w:t>
+        <w:br/>
+        <w:t>Strong; it starts at Medium, and Off is the map as collected). Each cell is averaged with the minutes</w:t>
+        <w:br/>
+        <w:t>and strikes around it before it is coloured, so a strike that flickers from one</w:t>
+        <w:br/>
+        <w:t>minute to the next stops drawing as stripes and the bands of positioning read as</w:t>
+        <w:br/>
+        <w:t>bands. Use Light to calm the noise and keep each strike distinct, Medium for the</w:t>
+        <w:br/>
+        <w:t>overall shape, Strong for the broad picture only.</w:t>
+      </w:r>
+    </w:p>
+    <w:p>
+      <w:r>
+        <w:rPr/>
+        <w:t>Smoothing costs detail, in three ways worth knowing. A smoothed wall is a little</w:t>
+        <w:br/>
+        <w:t>lower and wider than the real one. The newest few minutes show late, because the</w:t>
+        <w:br/>
+        <w:t>last column can only be averaged with what came before it. And the number you get</w:t>
+        <w:br/>
+        <w:t>by pressing and holding a cell is the smoothed one; the tooltip says "(smoothed)".</w:t>
+        <w:br/>
+        <w:t>For an exact reading use the bars, which are never smoothed, or set Smooth to Off.</w:t>
       </w:r>
     </w:p>
     <w:p>

</xml_diff>

<commit_message>
feat(trade-idea): pick by new symbol, then score, then grade, then structure
The hourly trade idea now prefers, in order: a symbol not posted today, the
higher score, the better grade, and a structure different from the last post.
It was symbol, grade, structure, score.

A debit row is Strong only when excellent on every quality gate, so a Good can
outscore a Strong; and with variety ahead of score the old order handed the
slot to the best trade of the other structure (the type changed in 33 of 35
consecutive posts, 2026-10-07 to 10-14). On prod's 13:47 scan the old order
picked XOM Bull Call (77.1), the new one HOOD Bear Put (78.8).

Co-Authored-By: Claude Opus 5.5 <noreply@anthropic.com>
</commit_message>
<xml_diff>
--- a/docs/manuals/user-guide/user-guide.docx
+++ b/docs/manuals/user-guide/user-guide.docx
@@ -32,7 +32,7 @@
           <w:color w:val="5B6678"/>
           <w:sz w:val="18"/>
         </w:rPr>
-        <w:t>NeuralStrike · Generated 2026-10-13</w:t>
+        <w:t>NeuralStrike · Generated 2026-10-14</w:t>
       </w:r>
     </w:p>
     <w:p/>
@@ -758,7 +758,11 @@
       <w:r>
         <w:t xml:space="preserve"> in the</w:t>
         <w:br/>
-        <w:t xml:space="preserve">  same block. It skips an hour rather than post a weak,</w:t>
+        <w:t xml:space="preserve">  same block. Among the eligible trades it prefers, in order: a symbol it has</w:t>
+        <w:br/>
+        <w:t xml:space="preserve">  not posted today, the higher score, the better grade, and only then a</w:t>
+        <w:br/>
+        <w:t xml:space="preserve">  different kind of trade from the last post. It skips an hour rather than post a weak,</w:t>
         <w:br/>
         <w:t xml:space="preserve">  stale or same-day trade. Turn it off with </w:t>
       </w:r>

</xml_diff>

<commit_message>
feat(gamma): one address per Dealer Positioning subtab
/options/gamma?tab=flow (gamma, charm, delta, vanna, flow, net-prem, term)
opens the private page on that subtab, and clicking a subtab rewrites ?tab=
with history.replaceState, so a bookmark or copied link reopens the subtab
on screen. Kept apart from ?view=, which pins one view for the gallery and
the public screens; a pin outranks a tab, and the public /gamma route takes
no tab. view_for_tab is total, so an unknown value opens the default.

The logic lives in module-level helpers (first_view, wire_view_tabs, ...),
so gamma.render stays within its size ceiling.

Co-Authored-By: Claude Opus 5.5 <noreply@anthropic.com>
</commit_message>
<xml_diff>
--- a/docs/manuals/user-guide/user-guide.docx
+++ b/docs/manuals/user-guide/user-guide.docx
@@ -32,7 +32,7 @@
           <w:color w:val="5B6678"/>
           <w:sz w:val="18"/>
         </w:rPr>
-        <w:t>NeuralStrike · Generated 2026-10-14</w:t>
+        <w:t>NeuralStrike · Generated 2026-10-15</w:t>
       </w:r>
     </w:p>
     <w:p/>
@@ -7262,6 +7262,165 @@
       </w:tr>
     </w:tbl>
     <w:p/>
+    <w:p>
+      <w:r>
+        <w:rPr>
+          <w:b/>
+        </w:rPr>
+        <w:t>Each view has its own address.</w:t>
+      </w:r>
+      <w:r>
+        <w:rPr/>
+        <w:t xml:space="preserve"> The address bar follows the sub-tab you are on —</w:t>
+        <w:br/>
+      </w:r>
+      <w:r>
+        <w:rPr>
+          <w:rFonts w:ascii="Consolas" w:hAnsi="Consolas"/>
+          <w:color w:val="334455"/>
+          <w:sz w:val="19"/>
+        </w:rPr>
+        <w:t>/options/gamma?tab=flow</w:t>
+      </w:r>
+      <w:r>
+        <w:rPr/>
+        <w:t xml:space="preserve">, </w:t>
+      </w:r>
+      <w:r>
+        <w:rPr>
+          <w:rFonts w:ascii="Consolas" w:hAnsi="Consolas"/>
+          <w:color w:val="334455"/>
+          <w:sz w:val="19"/>
+        </w:rPr>
+        <w:t>?tab=net-prem</w:t>
+      </w:r>
+      <w:r>
+        <w:rPr/>
+        <w:t xml:space="preserve">, </w:t>
+      </w:r>
+      <w:r>
+        <w:rPr>
+          <w:rFonts w:ascii="Consolas" w:hAnsi="Consolas"/>
+          <w:color w:val="334455"/>
+          <w:sz w:val="19"/>
+        </w:rPr>
+        <w:t>?tab=term</w:t>
+      </w:r>
+      <w:r>
+        <w:rPr/>
+        <w:t xml:space="preserve"> and so on (</w:t>
+      </w:r>
+      <w:r>
+        <w:rPr>
+          <w:rFonts w:ascii="Consolas" w:hAnsi="Consolas"/>
+          <w:color w:val="334455"/>
+          <w:sz w:val="19"/>
+        </w:rPr>
+        <w:t>gamma</w:t>
+      </w:r>
+      <w:r>
+        <w:rPr/>
+        <w:t>,</w:t>
+        <w:br/>
+      </w:r>
+      <w:r>
+        <w:rPr>
+          <w:rFonts w:ascii="Consolas" w:hAnsi="Consolas"/>
+          <w:color w:val="334455"/>
+          <w:sz w:val="19"/>
+        </w:rPr>
+        <w:t>charm</w:t>
+      </w:r>
+      <w:r>
+        <w:rPr/>
+        <w:t xml:space="preserve">, </w:t>
+      </w:r>
+      <w:r>
+        <w:rPr>
+          <w:rFonts w:ascii="Consolas" w:hAnsi="Consolas"/>
+          <w:color w:val="334455"/>
+          <w:sz w:val="19"/>
+        </w:rPr>
+        <w:t>delta</w:t>
+      </w:r>
+      <w:r>
+        <w:rPr/>
+        <w:t xml:space="preserve">, </w:t>
+      </w:r>
+      <w:r>
+        <w:rPr>
+          <w:rFonts w:ascii="Consolas" w:hAnsi="Consolas"/>
+          <w:color w:val="334455"/>
+          <w:sz w:val="19"/>
+        </w:rPr>
+        <w:t>vanna</w:t>
+      </w:r>
+      <w:r>
+        <w:rPr/>
+        <w:t xml:space="preserve">, </w:t>
+      </w:r>
+      <w:r>
+        <w:rPr>
+          <w:rFonts w:ascii="Consolas" w:hAnsi="Consolas"/>
+          <w:color w:val="334455"/>
+          <w:sz w:val="19"/>
+        </w:rPr>
+        <w:t>flow</w:t>
+      </w:r>
+      <w:r>
+        <w:rPr/>
+        <w:t xml:space="preserve">, </w:t>
+      </w:r>
+      <w:r>
+        <w:rPr>
+          <w:rFonts w:ascii="Consolas" w:hAnsi="Consolas"/>
+          <w:color w:val="334455"/>
+          <w:sz w:val="19"/>
+        </w:rPr>
+        <w:t>net-prem</w:t>
+      </w:r>
+      <w:r>
+        <w:rPr/>
+        <w:t xml:space="preserve">, </w:t>
+      </w:r>
+      <w:r>
+        <w:rPr>
+          <w:rFonts w:ascii="Consolas" w:hAnsi="Consolas"/>
+          <w:color w:val="334455"/>
+          <w:sz w:val="19"/>
+        </w:rPr>
+        <w:t>term</w:t>
+      </w:r>
+      <w:r>
+        <w:rPr/>
+        <w:t>) — so a bookmark or a copied</w:t>
+        <w:br/>
+        <w:t xml:space="preserve">link reopens the page on that view. Opening the bare </w:t>
+      </w:r>
+      <w:r>
+        <w:rPr>
+          <w:rFonts w:ascii="Consolas" w:hAnsi="Consolas"/>
+          <w:color w:val="334455"/>
+          <w:sz w:val="19"/>
+        </w:rPr>
+        <w:t>/options/gamma</w:t>
+      </w:r>
+      <w:r>
+        <w:rPr/>
+        <w:t xml:space="preserve"> starts on</w:t>
+        <w:br/>
+      </w:r>
+      <w:r>
+        <w:rPr>
+          <w:b/>
+        </w:rPr>
+        <w:t>Gamma</w:t>
+      </w:r>
+      <w:r>
+        <w:rPr/>
+        <w:t>, as it always has, and an address naming no known view does the same.</w:t>
+      </w:r>
+    </w:p>
     <w:p>
       <w:r>
         <w:rPr>

</xml_diff>

<commit_message>
feat(regime): an arrow on the direction words, "mixed" on a bare Trending
The Market Regime word now carries a mark: ▲ beside Rallying and Firming,
▼ beside Retreating and Softening, and "mixed" beside a bare Trending, the
word the service prints when its two direction reads do not agree. Bare
Trending never gets an arrow: one would pick a side the service refused to.

Display only, in the webgui. The service's word is unchanged, so the hover,
the Trade filter's reasons and the pushed snapshot are untouched. The dial
draws the mark on its own line above the word (RETREATING already uses the
clear width inside the arc); the Desk tile puts the arrow before the word
and "mixed" after it at smaller sizes, with a width test for RETREATING;
/symbol prints the one-line form. The arrows and the mixed word are pinned
to the service's tables by test_cross_tier_mirrors.

Co-Authored-By: Claude Opus 5.5 <noreply@anthropic.com>
</commit_message>
<xml_diff>
--- a/docs/manuals/user-guide/user-guide.docx
+++ b/docs/manuals/user-guide/user-guide.docx
@@ -12887,7 +12887,29 @@
         <w:t>Breakdown</w:t>
       </w:r>
       <w:r>
-        <w:t xml:space="preserve"> and so on). </w:t>
+        <w:t xml:space="preserve"> and so on); the four Trending words show an arrow</w:t>
+        <w:br/>
+        <w:t xml:space="preserve">  (▲ up, ▼ down), and a plain </w:t>
+      </w:r>
+      <w:r>
+        <w:rPr>
+          <w:i/>
+        </w:rPr>
+        <w:t>Trending</w:t>
+      </w:r>
+      <w:r>
+        <w:t xml:space="preserve"> says </w:t>
+      </w:r>
+      <w:r>
+        <w:rPr>
+          <w:i/>
+        </w:rPr>
+        <w:t>mixed</w:t>
+      </w:r>
+      <w:r>
+        <w:t xml:space="preserve"> when the two direction</w:t>
+        <w:br/>
+        <w:t xml:space="preserve">  reads disagree. </w:t>
       </w:r>
       <w:r>
         <w:rPr>

</xml_diff>

<commit_message>
feat(status): renew the Schwab sign-in from a phone
- Paste and sign in reads the copied address in the browser and signs in
  at once; a refused clipboard says to paste into the box by hand, and a
  whole address pasted there signs in without pressing Authorize.
- /status?signin=1 opens the sign-in dialog as the page loads. The dialog
  keeps that address in the bar while open, so a phone that drops the
  page while you are at Schwab reloads back into it.
- The daily sign-in warning ends with that link.
- Docs: page help, User Guide, Reference Guide, CHANGELOG.

Co-Authored-By: Claude Opus 5.5 <noreply@anthropic.com>
</commit_message>
<xml_diff>
--- a/docs/manuals/user-guide/user-guide.docx
+++ b/docs/manuals/user-guide/user-guide.docx
@@ -32,7 +32,7 @@
           <w:color w:val="5B6678"/>
           <w:sz w:val="18"/>
         </w:rPr>
-        <w:t>NeuralStrike · Generated 2026-10-16</w:t>
+        <w:t>NeuralStrike · Generated 2026-10-17</w:t>
       </w:r>
     </w:p>
     <w:p/>
@@ -30394,9 +30394,28 @@
         <w:br/>
         <w:t xml:space="preserve">  2. After you log in, Schwab sends that tab to a page that will not load. That</w:t>
         <w:br/>
-        <w:t xml:space="preserve">     is expected. Copy the whole address from the address bar.</w:t>
-        <w:br/>
-        <w:t xml:space="preserve">  3. Paste it into the dialog and press </w:t>
+        <w:t xml:space="preserve">     is expected. Copy the whole address from the address bar (on a phone, tap</w:t>
+        <w:br/>
+        <w:t xml:space="preserve">     the address bar, then its copy button).</w:t>
+        <w:br/>
+        <w:t xml:space="preserve">  3. Come back to the app's tab and press </w:t>
+      </w:r>
+      <w:r>
+        <w:rPr>
+          <w:b/>
+        </w:rPr>
+        <w:t>Paste and sign in</w:t>
+      </w:r>
+      <w:r>
+        <w:t>. Do it straight</w:t>
+        <w:br/>
+        <w:t xml:space="preserve">     away: the code in the address lasts about 30 seconds and works once. If</w:t>
+        <w:br/>
+        <w:t xml:space="preserve">     the browser will not let the app read what you copied, press and hold the</w:t>
+        <w:br/>
+        <w:t xml:space="preserve">     box under the button and choose Paste: a whole address pasted there signs</w:t>
+        <w:br/>
+        <w:t xml:space="preserve">     in at once, without pressing </w:t>
       </w:r>
       <w:r>
         <w:rPr>
@@ -30405,15 +30424,44 @@
         <w:t>Authorize</w:t>
       </w:r>
       <w:r>
-        <w:t>. Do it straight away: the</w:t>
-        <w:br/>
-        <w:t xml:space="preserve">     code in the address lasts about 30 seconds and works once.</w:t>
+        <w:t>.</w:t>
         <w:br/>
         <w:t xml:space="preserve">  If Schwab refuses it, the dialog stays open and says why; log in again and</w:t>
         <w:br/>
         <w:t xml:space="preserve">  paste the new address. Nothing here needs Tailscale. The dialog's small link</w:t>
         <w:br/>
         <w:t xml:space="preserve">  to the proxy's own sign-in page does, and is only a second way in.</w:t>
+      </w:r>
+    </w:p>
+    <w:p>
+      <w:pPr>
+        <w:pStyle w:val="ListBullet"/>
+      </w:pPr>
+      <w:r>
+        <w:rPr>
+          <w:b/>
+        </w:rPr>
+        <w:t>On a phone</w:t>
+      </w:r>
+      <w:r>
+        <w:t xml:space="preserve">, the address </w:t>
+      </w:r>
+      <w:r>
+        <w:rPr>
+          <w:rFonts w:ascii="Consolas" w:hAnsi="Consolas"/>
+          <w:color w:val="334455"/>
+          <w:sz w:val="19"/>
+        </w:rPr>
+        <w:t>/status?signin=1</w:t>
+      </w:r>
+      <w:r>
+        <w:t xml:space="preserve"> opens the page with the dialog</w:t>
+        <w:br/>
+        <w:t xml:space="preserve">  already open, and the sign-in warning push carries that link. While the</w:t>
+        <w:br/>
+        <w:t xml:space="preserve">  dialog is open the address bar holds it too, so if the phone drops the page</w:t>
+        <w:br/>
+        <w:t xml:space="preserve">  while you are away at Schwab, it comes back with the dialog open.</w:t>
       </w:r>
     </w:p>
     <w:p>
@@ -30833,7 +30881,11 @@
         <w:rPr/>
         <w:t xml:space="preserve"> on</w:t>
         <w:br/>
-        <w:t>the gateway card). When it lapses all market data stops, so the warning repeats</w:t>
+        <w:t>the gateway card). The warning ends with a link that opens the sign-in dialog,</w:t>
+        <w:br/>
+        <w:t>so you can renew from the phone the push arrives on. When it lapses all market</w:t>
+        <w:br/>
+        <w:t>data stops, so the warning repeats</w:t>
         <w:br/>
         <w:t>each morning until you sign in again. A part that stays down is reported again</w:t>
         <w:br/>

</xml_diff>

<commit_message>
feat(auth): "keep me signed in" lasts 30 days
Ticking the box at sign-in now keeps the browser signed in for 30 days
from that sign-in, with no password and no code. Unticked, a sign-in still
lasts 12 hours.

- A new session kind, auth.KIND_TRUSTED_SESSION, rides in the session
  cookie; auth.SESSION_KINDS pairs each kind with its lifetime and the gate
  checks each against its own. The remember cookie is still never admitted
  by the gate, and an epoch bump ends a trusted session like any other.
- The box reads "Keep me signed in on this device for 30 days".
- Docs: Sign out help, User Guide (and its wrong loopback claim), Reference
  Guide, CHANGELOG.

Co-Authored-By: Claude Opus 5.5 <noreply@anthropic.com>
</commit_message>
<xml_diff>
--- a/docs/manuals/user-guide/user-guide.docx
+++ b/docs/manuals/user-guide/user-guide.docx
@@ -1264,19 +1264,35 @@
         <w:rPr/>
         <w:t>: your password, then the current 6-digit code</w:t>
         <w:br/>
-        <w:t xml:space="preserve">from your authenticator app. Tick </w:t>
-      </w:r>
-      <w:r>
-        <w:rPr>
-          <w:b/>
-        </w:rPr>
-        <w:t>Remember this device</w:t>
-      </w:r>
-      <w:r>
-        <w:rPr/>
-        <w:t xml:space="preserve"> and that browser will</w:t>
-        <w:br/>
-        <w:t>not ask again for a while; a new browser, or a private window, always will.</w:t>
+        <w:t>from your authenticator app. Without anything ticked, a sign-in lasts 12 hours.</w:t>
+        <w:br/>
+        <w:t xml:space="preserve">Tick </w:t>
+      </w:r>
+      <w:r>
+        <w:rPr>
+          <w:b/>
+        </w:rPr>
+        <w:t>Keep me signed in on this device for 30 days</w:t>
+      </w:r>
+      <w:r>
+        <w:rPr/>
+        <w:t xml:space="preserve"> and that browser stays</w:t>
+        <w:br/>
+        <w:t>signed in for 30 days from that sign-in, with no password and no code; using the</w:t>
+        <w:br/>
+        <w:t>app does not extend it, so once a month it asks again. A new browser, or a</w:t>
+        <w:br/>
+        <w:t xml:space="preserve">private window, always asks. </w:t>
+      </w:r>
+      <w:r>
+        <w:rPr>
+          <w:b/>
+        </w:rPr>
+        <w:t>Sign out</w:t>
+      </w:r>
+      <w:r>
+        <w:rPr/>
+        <w:t xml:space="preserve"> on that browser ends it at once.</w:t>
       </w:r>
     </w:p>
     <w:p>
@@ -1337,9 +1353,9 @@
       </w:r>
       <w:r>
         <w:rPr/>
-        <w:t xml:space="preserve"> still works there and</w:t>
-        <w:br/>
-        <w:t>skips the sign-in, which is what the wall display uses.</w:t>
+        <w:t xml:space="preserve"> asks for the same</w:t>
+        <w:br/>
+        <w:t>sign-in; there is no exception for the machine's own browser.</w:t>
       </w:r>
     </w:p>
     <w:p>

</xml_diff>

<commit_message>
docs(login): approving a sign-in from the phone
Co-Authored-By: Claude Opus 5.5 <noreply@anthropic.com>
</commit_message>
<xml_diff>
--- a/docs/manuals/user-guide/user-guide.docx
+++ b/docs/manuals/user-guide/user-guide.docx
@@ -1293,6 +1293,194 @@
       <w:r>
         <w:rPr/>
         <w:t xml:space="preserve"> on that browser ends it at once.</w:t>
+      </w:r>
+    </w:p>
+    <w:p>
+      <w:r>
+        <w:rPr>
+          <w:b/>
+        </w:rPr>
+        <w:t>Approving from your phone instead of typing the code.</w:t>
+      </w:r>
+      <w:r>
+        <w:rPr/>
+        <w:t xml:space="preserve"> Once it is set up,</w:t>
+        <w:br/>
+        <w:t>leave the code box empty and press Sign in. The page shows a two-digit number</w:t>
+        <w:br/>
+        <w:t>and your phone gets an ntfy notification with three numbers. Tap the one the</w:t>
+        <w:br/>
+        <w:t>page shows; the app opens on your phone asking "Approve the one showing 47?";</w:t>
+        <w:br/>
+        <w:t xml:space="preserve">press </w:t>
+      </w:r>
+      <w:r>
+        <w:rPr>
+          <w:b/>
+        </w:rPr>
+        <w:t>Approve</w:t>
+      </w:r>
+      <w:r>
+        <w:rPr/>
+        <w:t xml:space="preserve"> and the waiting page signs itself in within a few seconds.</w:t>
+        <w:br/>
+      </w:r>
+      <w:r>
+        <w:rPr>
+          <w:b/>
+        </w:rPr>
+        <w:t>Not me</w:t>
+      </w:r>
+      <w:r>
+        <w:rPr/>
+        <w:t>, a wrong number, or two minutes with no answer stop that sign-in.</w:t>
+        <w:br/>
+        <w:t>The page's "Type the authenticator code instead" link always works, so a phone</w:t>
+        <w:br/>
+        <w:t>out of reach never locks you out.</w:t>
+      </w:r>
+    </w:p>
+    <w:p>
+      <w:r>
+        <w:rPr/>
+        <w:t>The approval happens inside the app on your phone, which must itself be signed</w:t>
+        <w:br/>
+        <w:t xml:space="preserve">in (tick </w:t>
+      </w:r>
+      <w:r>
+        <w:rPr>
+          <w:b/>
+        </w:rPr>
+        <w:t>Keep me signed in</w:t>
+      </w:r>
+      <w:r>
+        <w:rPr/>
+        <w:t xml:space="preserve"> there once). That is deliberate: anyone who</w:t>
+        <w:br/>
+        <w:t>learns the ntfy channel name can read the notifications, so tapping a number</w:t>
+        <w:br/>
+        <w:t>in the notification approves nothing by itself.</w:t>
+      </w:r>
+    </w:p>
+    <w:p>
+      <w:r>
+        <w:rPr/>
+        <w:t>Setting it up, once:</w:t>
+      </w:r>
+    </w:p>
+    <w:p>
+      <w:pPr>
+        <w:pStyle w:val="ListNumber"/>
+      </w:pPr>
+      <w:r>
+        <w:t>Make a channel name nobody can guess. On the server:</w:t>
+        <w:br/>
+        <w:t xml:space="preserve">   </w:t>
+      </w:r>
+      <w:r>
+        <w:rPr>
+          <w:rFonts w:ascii="Consolas" w:hAnsi="Consolas"/>
+          <w:color w:val="334455"/>
+          <w:sz w:val="19"/>
+        </w:rPr>
+        <w:t>python -c "import secrets; print(secrets.token_urlsafe(24))"</w:t>
+      </w:r>
+    </w:p>
+    <w:p>
+      <w:pPr>
+        <w:pStyle w:val="ListNumber"/>
+      </w:pPr>
+      <w:r>
+        <w:t xml:space="preserve">Add </w:t>
+      </w:r>
+      <w:r>
+        <w:rPr>
+          <w:rFonts w:ascii="Consolas" w:hAnsi="Consolas"/>
+          <w:color w:val="334455"/>
+          <w:sz w:val="19"/>
+        </w:rPr>
+        <w:t>NTFY_TOPIC=&lt;that name&gt;</w:t>
+      </w:r>
+      <w:r>
+        <w:t xml:space="preserve"> to the server's </w:t>
+      </w:r>
+      <w:r>
+        <w:rPr>
+          <w:rFonts w:ascii="Consolas" w:hAnsi="Consolas"/>
+          <w:color w:val="334455"/>
+          <w:sz w:val="19"/>
+        </w:rPr>
+        <w:t>.env</w:t>
+      </w:r>
+      <w:r>
+        <w:t xml:space="preserve"> and restart the web app.</w:t>
+      </w:r>
+    </w:p>
+    <w:p>
+      <w:pPr>
+        <w:pStyle w:val="ListNumber"/>
+      </w:pPr>
+      <w:r>
+        <w:t xml:space="preserve">In the ntfy app on each phone: </w:t>
+      </w:r>
+      <w:r>
+        <w:rPr>
+          <w:b/>
+        </w:rPr>
+        <w:t>Subscribe to topic</w:t>
+      </w:r>
+      <w:r>
+        <w:t>, enter the name, server</w:t>
+        <w:br/>
+        <w:t xml:space="preserve">   </w:t>
+      </w:r>
+      <w:r>
+        <w:rPr>
+          <w:rFonts w:ascii="Consolas" w:hAnsi="Consolas"/>
+          <w:color w:val="334455"/>
+          <w:sz w:val="19"/>
+        </w:rPr>
+        <w:t>ntfy.sh</w:t>
+      </w:r>
+      <w:r>
+        <w:t>.</w:t>
+      </w:r>
+    </w:p>
+    <w:p>
+      <w:pPr>
+        <w:pStyle w:val="ListNumber"/>
+      </w:pPr>
+      <w:r>
+        <w:t xml:space="preserve">On each phone, sign in to the app once in its browser with </w:t>
+      </w:r>
+      <w:r>
+        <w:rPr>
+          <w:b/>
+        </w:rPr>
+        <w:t>Keep me signed</w:t>
+        <w:br/>
+        <w:t xml:space="preserve">   in</w:t>
+      </w:r>
+      <w:r>
+        <w:t xml:space="preserve"> ticked.</w:t>
+      </w:r>
+    </w:p>
+    <w:p>
+      <w:r>
+        <w:rPr/>
+        <w:t>The settings (how long an approval waits, the ntfy server, the notification's</w:t>
+        <w:br/>
+        <w:t xml:space="preserve">priority) are under Settings → Configuration → </w:t>
+      </w:r>
+      <w:r>
+        <w:rPr>
+          <w:i/>
+        </w:rPr>
+        <w:t>Sign-in from the phone</w:t>
+      </w:r>
+      <w:r>
+        <w:rPr/>
+        <w:t>.</w:t>
       </w:r>
     </w:p>
     <w:p>

</xml_diff>

<commit_message>
fix(scalp): the page knows what day it is
The page decided "today" from the view, which the service refreshes only when
the 08:36 slot runs, so Friday's call read "Today's call" on Monday morning with
no next-call line. It now reads the Central clock: a call is "Today's" only when
its day is today's date, and a non-trading day or a morning before 08:36 shows
the next-call line itself. The clock is injected for tests (Monday 07:00,
Saturday, Friday 10:00, a holiday, the DST week).

Docs: Refresh does not retry a failed chain fetch; the Underlying move also
uses the chain's volatility; page_help column name; CHANGELOG corrections
(d8b5e11 is unrelated; a promote still stops the GEX collector). Manuals rebuilt.

Co-Authored-By: Claude Opus 5.5 <noreply@anthropic.com>
</commit_message>
<xml_diff>
--- a/docs/manuals/user-guide/user-guide.docx
+++ b/docs/manuals/user-guide/user-guide.docx
@@ -11720,7 +11720,18 @@
         <w:t>modelled</w:t>
       </w:r>
       <w:r>
-        <w:t xml:space="preserve"> where it did not.</w:t>
+        <w:t xml:space="preserve"> where it did not, and the </w:t>
+      </w:r>
+      <w:r>
+        <w:rPr>
+          <w:b/>
+        </w:rPr>
+        <w:t>Underlying move</w:t>
+      </w:r>
+      <w:r>
+        <w:t xml:space="preserve"> distances use the chain's</w:t>
+        <w:br/>
+        <w:t xml:space="preserve">  volatility when there is one.</w:t>
       </w:r>
     </w:p>
     <w:p>

</xml_diff>

<commit_message>
feat(scalp): Opening Scalp moves to Strategy, under the Options group
The rail entry leaves MARKETS for STRATEGY, directly below the Options
group and above Strategy Finder (the operator's call). The User Guide and
Reference Guide sections move to the same place, since a test holds the
manuals to the rail order.

Co-Authored-By: Claude Opus 5.5 <noreply@anthropic.com>
</commit_message>
<xml_diff>
--- a/docs/manuals/user-guide/user-guide.docx
+++ b/docs/manuals/user-guide/user-guide.docx
@@ -11507,541 +11507,6 @@
       </w:pPr>
       <w:r>
         <w:rPr/>
-        <w:t>Opening Scalp</w:t>
-      </w:r>
-    </w:p>
-    <w:p>
-      <w:r>
-        <w:rPr>
-          <w:b/>
-        </w:rPr>
-        <w:t>Route:</w:t>
-      </w:r>
-      <w:r>
-        <w:rPr/>
-        <w:t xml:space="preserve"> </w:t>
-      </w:r>
-      <w:r>
-        <w:rPr>
-          <w:rFonts w:ascii="Consolas" w:hAnsi="Consolas"/>
-          <w:color w:val="334455"/>
-          <w:sz w:val="19"/>
-        </w:rPr>
-        <w:t>/options/scalp</w:t>
-      </w:r>
-      <w:r>
-        <w:rPr/>
-        <w:t xml:space="preserve">. A rail item under </w:t>
-      </w:r>
-      <w:r>
-        <w:rPr>
-          <w:b/>
-        </w:rPr>
-        <w:t>MARKETS</w:t>
-      </w:r>
-      <w:r>
-        <w:rPr/>
-        <w:t>, after Flow Alerts.</w:t>
-      </w:r>
-    </w:p>
-    <w:p>
-      <w:r>
-        <w:rPr/>
-        <w:t xml:space="preserve">A morning read for </w:t>
-      </w:r>
-      <w:r>
-        <w:rPr>
-          <w:rFonts w:ascii="Consolas" w:hAnsi="Consolas"/>
-          <w:color w:val="334455"/>
-          <w:sz w:val="19"/>
-        </w:rPr>
-        <w:t>$SPX</w:t>
-      </w:r>
-      <w:r>
-        <w:rPr/>
-        <w:t xml:space="preserve">, SPY and QQQ, published at </w:t>
-      </w:r>
-      <w:r>
-        <w:rPr>
-          <w:b/>
-        </w:rPr>
-        <w:t>08:36 CT</w:t>
-      </w:r>
-      <w:r>
-        <w:rPr/>
-        <w:t xml:space="preserve"> once the first</w:t>
-        <w:br/>
-        <w:t>five minutes are in. For each symbol it shows which way the market opened, how many of</w:t>
-        <w:br/>
-        <w:t>your premarket inputs agree, and how often four same-day (0DTE) scalps have worked on</w:t>
-        <w:br/>
-        <w:t xml:space="preserve">past mornings that looked like this one. </w:t>
-      </w:r>
-      <w:r>
-        <w:rPr>
-          <w:b/>
-        </w:rPr>
-        <w:t>It does not place trades</w:t>
-      </w:r>
-      <w:r>
-        <w:rPr/>
-        <w:t xml:space="preserve"> — you decide.</w:t>
-      </w:r>
-    </w:p>
-    <w:p>
-      <w:pPr>
-        <w:pStyle w:val="ListBullet"/>
-      </w:pPr>
-      <w:r>
-        <w:rPr>
-          <w:b/>
-        </w:rPr>
-        <w:t>Most mornings the answer is "No measured edge".</w:t>
-      </w:r>
-      <w:r>
-        <w:t xml:space="preserve"> That is normal, not an error: the</w:t>
-        <w:br/>
-        <w:t xml:space="preserve">  page then shows each trade's </w:t>
-      </w:r>
-      <w:r>
-        <w:rPr>
-          <w:b/>
-        </w:rPr>
-        <w:t>usual win rate</w:t>
-      </w:r>
-      <w:r>
-        <w:t xml:space="preserve"> and nothing more. Treat it as "nothing</w:t>
-        <w:br/>
-        <w:t xml:space="preserve">  here beats chance today".</w:t>
-      </w:r>
-    </w:p>
-    <w:p>
-      <w:pPr>
-        <w:pStyle w:val="ListBullet"/>
-      </w:pPr>
-      <w:r>
-        <w:t xml:space="preserve">The four trades are named by that morning's contract (an up open: </w:t>
-      </w:r>
-      <w:r>
-        <w:rPr>
-          <w:b/>
-        </w:rPr>
-        <w:t>Long call</w:t>
-      </w:r>
-      <w:r>
-        <w:t xml:space="preserve">, </w:t>
-      </w:r>
-      <w:r>
-        <w:rPr>
-          <w:b/>
-        </w:rPr>
-        <w:t>Long</w:t>
-        <w:br/>
-        <w:t xml:space="preserve">  put</w:t>
-      </w:r>
-      <w:r>
-        <w:t xml:space="preserve">, </w:t>
-      </w:r>
-      <w:r>
-        <w:rPr>
-          <w:b/>
-        </w:rPr>
-        <w:t>Put credit spread</w:t>
-      </w:r>
-      <w:r>
-        <w:t xml:space="preserve">, </w:t>
-      </w:r>
-      <w:r>
-        <w:rPr>
-          <w:b/>
-        </w:rPr>
-        <w:t>Call credit spread</w:t>
-      </w:r>
-      <w:r>
-        <w:t>; a down open mirrors it), each</w:t>
-        <w:br/>
-        <w:t xml:space="preserve">  marked as </w:t>
-      </w:r>
-      <w:r>
-        <w:rPr>
-          <w:i/>
-        </w:rPr>
-        <w:t>with</w:t>
-      </w:r>
-      <w:r>
-        <w:t xml:space="preserve"> or </w:t>
-      </w:r>
-      <w:r>
-        <w:rPr>
-          <w:i/>
-        </w:rPr>
-        <w:t>against</w:t>
-      </w:r>
-      <w:r>
-        <w:t xml:space="preserve"> the opening move. A </w:t>
-      </w:r>
-      <w:r>
-        <w:rPr>
-          <w:b/>
-        </w:rPr>
-        <w:t>win</w:t>
-      </w:r>
-      <w:r>
-        <w:t xml:space="preserve"> means +50% before −50% within</w:t>
-        <w:br/>
-        <w:t xml:space="preserve">  60 minutes. The win rates are always </w:t>
-      </w:r>
-      <w:r>
-        <w:rPr>
-          <w:b/>
-        </w:rPr>
-        <w:t>modelled</w:t>
-      </w:r>
-      <w:r>
-        <w:t xml:space="preserve"> (priced from the volatility index);</w:t>
-        <w:br/>
-        <w:t xml:space="preserve">  the </w:t>
-      </w:r>
-      <w:r>
-        <w:rPr>
-          <w:b/>
-        </w:rPr>
-        <w:t>Entry</w:t>
-      </w:r>
-      <w:r>
-        <w:t xml:space="preserve"> column shows the live 08:36 quote where the chain had the strike and says</w:t>
-        <w:br/>
-        <w:t xml:space="preserve">  </w:t>
-      </w:r>
-      <w:r>
-        <w:rPr>
-          <w:b/>
-        </w:rPr>
-        <w:t>modelled</w:t>
-      </w:r>
-      <w:r>
-        <w:t xml:space="preserve"> where it did not, and the </w:t>
-      </w:r>
-      <w:r>
-        <w:rPr>
-          <w:b/>
-        </w:rPr>
-        <w:t>Underlying move</w:t>
-      </w:r>
-      <w:r>
-        <w:t xml:space="preserve"> distances use the chain's</w:t>
-        <w:br/>
-        <w:t xml:space="preserve">  volatility when there is one.</w:t>
-      </w:r>
-    </w:p>
-    <w:p>
-      <w:pPr>
-        <w:pStyle w:val="ListBullet"/>
-      </w:pPr>
-      <w:r>
-        <w:rPr>
-          <w:b/>
-        </w:rPr>
-        <w:t>Measured edge</w:t>
-      </w:r>
-      <w:r>
-        <w:t xml:space="preserve"> marks the single trade whose bucket rate is reliably better than</w:t>
-        <w:br/>
-        <w:t xml:space="preserve">  usual (rare). </w:t>
-      </w:r>
-      <w:r>
-        <w:rPr>
-          <w:b/>
-        </w:rPr>
-        <w:t>Caution: measured to lose more often than usual</w:t>
-      </w:r>
-      <w:r>
-        <w:t xml:space="preserve"> marks a bucket that</w:t>
-        <w:br/>
-        <w:t xml:space="preserve">  is reliably worse — a reason to stay out, not to take the other side.</w:t>
-      </w:r>
-    </w:p>
-    <w:p>
-      <w:pPr>
-        <w:pStyle w:val="ListBullet"/>
-      </w:pPr>
-      <w:r>
-        <w:rPr>
-          <w:b/>
-        </w:rPr>
-        <w:t>Morning inputs</w:t>
-      </w:r>
-      <w:r>
-        <w:t xml:space="preserve"> lists each premarket reading and whether it </w:t>
-      </w:r>
-      <w:r>
-        <w:rPr>
-          <w:b/>
-        </w:rPr>
-        <w:t>agrees</w:t>
-      </w:r>
-      <w:r>
-        <w:t>,</w:t>
-        <w:br/>
-        <w:t xml:space="preserve">  </w:t>
-      </w:r>
-      <w:r>
-        <w:rPr>
-          <w:b/>
-        </w:rPr>
-        <w:t>disagrees</w:t>
-      </w:r>
-      <w:r>
-        <w:t xml:space="preserve">, sits in the </w:t>
-      </w:r>
-      <w:r>
-        <w:rPr>
-          <w:b/>
-        </w:rPr>
-        <w:t>dead zone</w:t>
-      </w:r>
-      <w:r>
-        <w:t xml:space="preserve">, or is </w:t>
-      </w:r>
-      <w:r>
-        <w:rPr>
-          <w:b/>
-        </w:rPr>
-        <w:t>absent</w:t>
-      </w:r>
-      <w:r>
-        <w:t>. An absent input is never a</w:t>
-        <w:br/>
-        <w:t xml:space="preserve">  disagreement.</w:t>
-      </w:r>
-    </w:p>
-    <w:p>
-      <w:pPr>
-        <w:pStyle w:val="ListBullet"/>
-      </w:pPr>
-      <w:r>
-        <w:rPr>
-          <w:b/>
-        </w:rPr>
-        <w:t>Refresh</w:t>
-      </w:r>
-      <w:r>
-        <w:t xml:space="preserve"> asks the service to rebuild the call. A call already shown today stays as</w:t>
-        <w:br/>
-        <w:t xml:space="preserve">  published; Refresh only fills in a symbol that has none yet, and no new call is built</w:t>
-        <w:br/>
-        <w:t xml:space="preserve">  after </w:t>
-      </w:r>
-      <w:r>
-        <w:rPr>
-          <w:b/>
-        </w:rPr>
-        <w:t>09:35 CT</w:t>
-      </w:r>
-      <w:r>
-        <w:t>, an hour after the 08:35 entry, because the trade it would describe</w:t>
-        <w:br/>
-        <w:t xml:space="preserve">  is over by then. A symbol whose morning had a direction but was never called reads</w:t>
-        <w:br/>
-        <w:t xml:space="preserve">  </w:t>
-      </w:r>
-      <w:r>
-        <w:rPr>
-          <w:b/>
-        </w:rPr>
-        <w:t>missed the call window</w:t>
-      </w:r>
-      <w:r>
-        <w:t>; one that opened flat or had no opening bar still says so,</w:t>
-        <w:br/>
-        <w:t xml:space="preserve">  with its inputs.</w:t>
-      </w:r>
-    </w:p>
-    <w:p>
-      <w:pPr>
-        <w:pStyle w:val="ListBullet"/>
-      </w:pPr>
-      <w:r>
-        <w:t>Before 08:36 (a Refresh pressed at 08:35 waits for the 08:36 call too), on a closed</w:t>
-        <w:br/>
-        <w:t xml:space="preserve">  day, or after a failed refresh the page shows the </w:t>
-      </w:r>
-      <w:r>
-        <w:rPr>
-          <w:b/>
-        </w:rPr>
-        <w:t>last call</w:t>
-      </w:r>
-      <w:r>
-        <w:t>, labelled with its</w:t>
-        <w:br/>
-        <w:t xml:space="preserve">  day, under a line saying when the next call is due.</w:t>
-      </w:r>
-    </w:p>
-    <w:p>
-      <w:pPr>
-        <w:pStyle w:val="ListBullet"/>
-      </w:pPr>
-      <w:r>
-        <w:rPr>
-          <w:b/>
-        </w:rPr>
-        <w:t>Not in the probability</w:t>
-      </w:r>
-      <w:r>
-        <w:t xml:space="preserve"> (the report link, headlines, flow alerts) is context only.</w:t>
-      </w:r>
-    </w:p>
-    <w:p>
-      <w:pPr>
-        <w:pStyle w:val="ListBullet"/>
-      </w:pPr>
-      <w:r>
-        <w:rPr>
-          <w:b/>
-        </w:rPr>
-        <w:t>Scorecard</w:t>
-      </w:r>
-      <w:r>
-        <w:t xml:space="preserve"> (the last card) is the record of how the published calls actually did.</w:t>
-        <w:br/>
-        <w:t xml:space="preserve">  Each evening, once the day's bars are in, the app </w:t>
-      </w:r>
-      <w:r>
-        <w:rPr>
-          <w:b/>
-        </w:rPr>
-        <w:t>grades</w:t>
-      </w:r>
-      <w:r>
-        <w:t xml:space="preserve"> every trade it showed that</w:t>
-        <w:br/>
-        <w:t xml:space="preserve">  morning, from the call as published (never from a later rebuild), under the target,</w:t>
-        <w:br/>
-        <w:t xml:space="preserve">  stop and time stop that call was made with (a setting changed later does not regrade</w:t>
-        <w:br/>
-        <w:t xml:space="preserve">  it), and the scorecard shows that evening's grades straight away. Per symbol, over the</w:t>
-        <w:br/>
-        <w:t xml:space="preserve">  last 20 graded days, it shows: </w:t>
-      </w:r>
-      <w:r>
-        <w:rPr>
-          <w:b/>
-        </w:rPr>
-        <w:t>Edge calls</w:t>
-      </w:r>
-      <w:r>
-        <w:t>, how often the one highlighted trade won</w:t>
-        <w:br/>
-        <w:t xml:space="preserve">  beside the rate it usually wins (most symbols have none, and the line says so);</w:t>
-        <w:br/>
-        <w:t xml:space="preserve">  </w:t>
-      </w:r>
-      <w:r>
-        <w:rPr>
-          <w:b/>
-        </w:rPr>
-        <w:t>Cautions</w:t>
-      </w:r>
-      <w:r>
-        <w:t>, how often a trade marked to avoid still won, beside its usual rate (the</w:t>
-        <w:br/>
-        <w:t xml:space="preserve">  caution is working when that is the lower number); and a table of all four trades with</w:t>
-        <w:br/>
-        <w:t xml:space="preserve">  their won / lost / timed-out counts and win rate. Two win rates sit side by side: the</w:t>
-        <w:br/>
-        <w:t xml:space="preserve">  </w:t>
-      </w:r>
-      <w:r>
-        <w:rPr>
-          <w:b/>
-        </w:rPr>
-        <w:t>model's</w:t>
-      </w:r>
-      <w:r>
-        <w:t xml:space="preserve"> (priced from the volatility index, the one the study uses) and the</w:t>
-        <w:br/>
-        <w:t xml:space="preserve">  </w:t>
-      </w:r>
-      <w:r>
-        <w:rPr>
-          <w:b/>
-        </w:rPr>
-        <w:t>live chain's</w:t>
-      </w:r>
-      <w:r>
-        <w:t xml:space="preserve"> (the same walk at the volatility the 08:36 chain implied; a dash when</w:t>
-        <w:br/>
-        <w:t xml:space="preserve">  no chain was captured that morning). A day whose bars are not all in yet is graded the</w:t>
-        <w:br/>
-        <w:t xml:space="preserve">  next evening. A call made on a shortened session (a half day) is not graded, because the</w:t>
-        <w:br/>
-        <w:t xml:space="preserve">  model's settlement time would be wrong. A grade is written once and never recomputed. A</w:t>
-        <w:br/>
-        <w:t xml:space="preserve">  handful of days says very little; read it as a record, not a verdict.</w:t>
-      </w:r>
-    </w:p>
-    <w:p>
-      <w:pPr>
-        <w:pStyle w:val="IntenseQuote"/>
-      </w:pPr>
-      <w:r>
-        <w:rPr/>
-        <w:t xml:space="preserve">The win rates are counted over </w:t>
-      </w:r>
-      <w:r>
-        <w:rPr>
-          <w:b/>
-        </w:rPr>
-        <w:t>every</w:t>
-      </w:r>
-      <w:r>
-        <w:rPr/>
-        <w:t xml:space="preserve"> stored morning, and the premiums are</w:t>
-        <w:br/>
-        <w:t>modelled, so read them as how often a method like this has worked, not as a promise</w:t>
-        <w:br/>
-        <w:t xml:space="preserve">of fills. What is </w:t>
-      </w:r>
-      <w:r>
-        <w:rPr>
-          <w:b/>
-        </w:rPr>
-        <w:t>walk-forward tested</w:t>
-      </w:r>
-      <w:r>
-        <w:rPr/>
-        <w:t xml:space="preserve"> is whether a bucket beats its usual rate:</w:t>
-        <w:br/>
-        <w:t xml:space="preserve">that test is what marks a </w:t>
-      </w:r>
-      <w:r>
-        <w:rPr>
-          <w:b/>
-        </w:rPr>
-        <w:t>Measured edge</w:t>
-      </w:r>
-      <w:r>
-        <w:rPr/>
-        <w:t xml:space="preserve"> or a </w:t>
-      </w:r>
-      <w:r>
-        <w:rPr>
-          <w:b/>
-        </w:rPr>
-        <w:t>Caution</w:t>
-      </w:r>
-      <w:r>
-        <w:rPr/>
-        <w:t>.</w:t>
-      </w:r>
-    </w:p>
-    <w:p>
-      <w:pPr>
-        <w:pStyle w:val="Heading2"/>
-      </w:pPr>
-      <w:r>
-        <w:rPr/>
         <w:t>Market News</w:t>
       </w:r>
     </w:p>
@@ -23876,6 +23341,541 @@
       <w:r>
         <w:rPr/>
         <w:t xml:space="preserve"> add to the Rescue nav badge (that counts paper positions).</w:t>
+      </w:r>
+    </w:p>
+    <w:p>
+      <w:pPr>
+        <w:pStyle w:val="Heading2"/>
+      </w:pPr>
+      <w:r>
+        <w:rPr/>
+        <w:t>Opening Scalp</w:t>
+      </w:r>
+    </w:p>
+    <w:p>
+      <w:r>
+        <w:rPr>
+          <w:b/>
+        </w:rPr>
+        <w:t>Route:</w:t>
+      </w:r>
+      <w:r>
+        <w:rPr/>
+        <w:t xml:space="preserve"> </w:t>
+      </w:r>
+      <w:r>
+        <w:rPr>
+          <w:rFonts w:ascii="Consolas" w:hAnsi="Consolas"/>
+          <w:color w:val="334455"/>
+          <w:sz w:val="19"/>
+        </w:rPr>
+        <w:t>/options/scalp</w:t>
+      </w:r>
+      <w:r>
+        <w:rPr/>
+        <w:t xml:space="preserve">. A rail item under </w:t>
+      </w:r>
+      <w:r>
+        <w:rPr>
+          <w:b/>
+        </w:rPr>
+        <w:t>STRATEGY</w:t>
+      </w:r>
+      <w:r>
+        <w:rPr/>
+        <w:t>, directly below the Options group.</w:t>
+      </w:r>
+    </w:p>
+    <w:p>
+      <w:r>
+        <w:rPr/>
+        <w:t xml:space="preserve">A morning read for </w:t>
+      </w:r>
+      <w:r>
+        <w:rPr>
+          <w:rFonts w:ascii="Consolas" w:hAnsi="Consolas"/>
+          <w:color w:val="334455"/>
+          <w:sz w:val="19"/>
+        </w:rPr>
+        <w:t>$SPX</w:t>
+      </w:r>
+      <w:r>
+        <w:rPr/>
+        <w:t xml:space="preserve">, SPY and QQQ, published at </w:t>
+      </w:r>
+      <w:r>
+        <w:rPr>
+          <w:b/>
+        </w:rPr>
+        <w:t>08:36 CT</w:t>
+      </w:r>
+      <w:r>
+        <w:rPr/>
+        <w:t xml:space="preserve"> once the first</w:t>
+        <w:br/>
+        <w:t>five minutes are in. For each symbol it shows which way the market opened, how many of</w:t>
+        <w:br/>
+        <w:t>your premarket inputs agree, and how often four same-day (0DTE) scalps have worked on</w:t>
+        <w:br/>
+        <w:t xml:space="preserve">past mornings that looked like this one. </w:t>
+      </w:r>
+      <w:r>
+        <w:rPr>
+          <w:b/>
+        </w:rPr>
+        <w:t>It does not place trades</w:t>
+      </w:r>
+      <w:r>
+        <w:rPr/>
+        <w:t xml:space="preserve"> — you decide.</w:t>
+      </w:r>
+    </w:p>
+    <w:p>
+      <w:pPr>
+        <w:pStyle w:val="ListBullet"/>
+      </w:pPr>
+      <w:r>
+        <w:rPr>
+          <w:b/>
+        </w:rPr>
+        <w:t>Most mornings the answer is "No measured edge".</w:t>
+      </w:r>
+      <w:r>
+        <w:t xml:space="preserve"> That is normal, not an error: the</w:t>
+        <w:br/>
+        <w:t xml:space="preserve">  page then shows each trade's </w:t>
+      </w:r>
+      <w:r>
+        <w:rPr>
+          <w:b/>
+        </w:rPr>
+        <w:t>usual win rate</w:t>
+      </w:r>
+      <w:r>
+        <w:t xml:space="preserve"> and nothing more. Treat it as "nothing</w:t>
+        <w:br/>
+        <w:t xml:space="preserve">  here beats chance today".</w:t>
+      </w:r>
+    </w:p>
+    <w:p>
+      <w:pPr>
+        <w:pStyle w:val="ListBullet"/>
+      </w:pPr>
+      <w:r>
+        <w:t xml:space="preserve">The four trades are named by that morning's contract (an up open: </w:t>
+      </w:r>
+      <w:r>
+        <w:rPr>
+          <w:b/>
+        </w:rPr>
+        <w:t>Long call</w:t>
+      </w:r>
+      <w:r>
+        <w:t xml:space="preserve">, </w:t>
+      </w:r>
+      <w:r>
+        <w:rPr>
+          <w:b/>
+        </w:rPr>
+        <w:t>Long</w:t>
+        <w:br/>
+        <w:t xml:space="preserve">  put</w:t>
+      </w:r>
+      <w:r>
+        <w:t xml:space="preserve">, </w:t>
+      </w:r>
+      <w:r>
+        <w:rPr>
+          <w:b/>
+        </w:rPr>
+        <w:t>Put credit spread</w:t>
+      </w:r>
+      <w:r>
+        <w:t xml:space="preserve">, </w:t>
+      </w:r>
+      <w:r>
+        <w:rPr>
+          <w:b/>
+        </w:rPr>
+        <w:t>Call credit spread</w:t>
+      </w:r>
+      <w:r>
+        <w:t>; a down open mirrors it), each</w:t>
+        <w:br/>
+        <w:t xml:space="preserve">  marked as </w:t>
+      </w:r>
+      <w:r>
+        <w:rPr>
+          <w:i/>
+        </w:rPr>
+        <w:t>with</w:t>
+      </w:r>
+      <w:r>
+        <w:t xml:space="preserve"> or </w:t>
+      </w:r>
+      <w:r>
+        <w:rPr>
+          <w:i/>
+        </w:rPr>
+        <w:t>against</w:t>
+      </w:r>
+      <w:r>
+        <w:t xml:space="preserve"> the opening move. A </w:t>
+      </w:r>
+      <w:r>
+        <w:rPr>
+          <w:b/>
+        </w:rPr>
+        <w:t>win</w:t>
+      </w:r>
+      <w:r>
+        <w:t xml:space="preserve"> means +50% before −50% within</w:t>
+        <w:br/>
+        <w:t xml:space="preserve">  60 minutes. The win rates are always </w:t>
+      </w:r>
+      <w:r>
+        <w:rPr>
+          <w:b/>
+        </w:rPr>
+        <w:t>modelled</w:t>
+      </w:r>
+      <w:r>
+        <w:t xml:space="preserve"> (priced from the volatility index);</w:t>
+        <w:br/>
+        <w:t xml:space="preserve">  the </w:t>
+      </w:r>
+      <w:r>
+        <w:rPr>
+          <w:b/>
+        </w:rPr>
+        <w:t>Entry</w:t>
+      </w:r>
+      <w:r>
+        <w:t xml:space="preserve"> column shows the live 08:36 quote where the chain had the strike and says</w:t>
+        <w:br/>
+        <w:t xml:space="preserve">  </w:t>
+      </w:r>
+      <w:r>
+        <w:rPr>
+          <w:b/>
+        </w:rPr>
+        <w:t>modelled</w:t>
+      </w:r>
+      <w:r>
+        <w:t xml:space="preserve"> where it did not, and the </w:t>
+      </w:r>
+      <w:r>
+        <w:rPr>
+          <w:b/>
+        </w:rPr>
+        <w:t>Underlying move</w:t>
+      </w:r>
+      <w:r>
+        <w:t xml:space="preserve"> distances use the chain's</w:t>
+        <w:br/>
+        <w:t xml:space="preserve">  volatility when there is one.</w:t>
+      </w:r>
+    </w:p>
+    <w:p>
+      <w:pPr>
+        <w:pStyle w:val="ListBullet"/>
+      </w:pPr>
+      <w:r>
+        <w:rPr>
+          <w:b/>
+        </w:rPr>
+        <w:t>Measured edge</w:t>
+      </w:r>
+      <w:r>
+        <w:t xml:space="preserve"> marks the single trade whose bucket rate is reliably better than</w:t>
+        <w:br/>
+        <w:t xml:space="preserve">  usual (rare). </w:t>
+      </w:r>
+      <w:r>
+        <w:rPr>
+          <w:b/>
+        </w:rPr>
+        <w:t>Caution: measured to lose more often than usual</w:t>
+      </w:r>
+      <w:r>
+        <w:t xml:space="preserve"> marks a bucket that</w:t>
+        <w:br/>
+        <w:t xml:space="preserve">  is reliably worse — a reason to stay out, not to take the other side.</w:t>
+      </w:r>
+    </w:p>
+    <w:p>
+      <w:pPr>
+        <w:pStyle w:val="ListBullet"/>
+      </w:pPr>
+      <w:r>
+        <w:rPr>
+          <w:b/>
+        </w:rPr>
+        <w:t>Morning inputs</w:t>
+      </w:r>
+      <w:r>
+        <w:t xml:space="preserve"> lists each premarket reading and whether it </w:t>
+      </w:r>
+      <w:r>
+        <w:rPr>
+          <w:b/>
+        </w:rPr>
+        <w:t>agrees</w:t>
+      </w:r>
+      <w:r>
+        <w:t>,</w:t>
+        <w:br/>
+        <w:t xml:space="preserve">  </w:t>
+      </w:r>
+      <w:r>
+        <w:rPr>
+          <w:b/>
+        </w:rPr>
+        <w:t>disagrees</w:t>
+      </w:r>
+      <w:r>
+        <w:t xml:space="preserve">, sits in the </w:t>
+      </w:r>
+      <w:r>
+        <w:rPr>
+          <w:b/>
+        </w:rPr>
+        <w:t>dead zone</w:t>
+      </w:r>
+      <w:r>
+        <w:t xml:space="preserve">, or is </w:t>
+      </w:r>
+      <w:r>
+        <w:rPr>
+          <w:b/>
+        </w:rPr>
+        <w:t>absent</w:t>
+      </w:r>
+      <w:r>
+        <w:t>. An absent input is never a</w:t>
+        <w:br/>
+        <w:t xml:space="preserve">  disagreement.</w:t>
+      </w:r>
+    </w:p>
+    <w:p>
+      <w:pPr>
+        <w:pStyle w:val="ListBullet"/>
+      </w:pPr>
+      <w:r>
+        <w:rPr>
+          <w:b/>
+        </w:rPr>
+        <w:t>Refresh</w:t>
+      </w:r>
+      <w:r>
+        <w:t xml:space="preserve"> asks the service to rebuild the call. A call already shown today stays as</w:t>
+        <w:br/>
+        <w:t xml:space="preserve">  published; Refresh only fills in a symbol that has none yet, and no new call is built</w:t>
+        <w:br/>
+        <w:t xml:space="preserve">  after </w:t>
+      </w:r>
+      <w:r>
+        <w:rPr>
+          <w:b/>
+        </w:rPr>
+        <w:t>09:35 CT</w:t>
+      </w:r>
+      <w:r>
+        <w:t>, an hour after the 08:35 entry, because the trade it would describe</w:t>
+        <w:br/>
+        <w:t xml:space="preserve">  is over by then. A symbol whose morning had a direction but was never called reads</w:t>
+        <w:br/>
+        <w:t xml:space="preserve">  </w:t>
+      </w:r>
+      <w:r>
+        <w:rPr>
+          <w:b/>
+        </w:rPr>
+        <w:t>missed the call window</w:t>
+      </w:r>
+      <w:r>
+        <w:t>; one that opened flat or had no opening bar still says so,</w:t>
+        <w:br/>
+        <w:t xml:space="preserve">  with its inputs.</w:t>
+      </w:r>
+    </w:p>
+    <w:p>
+      <w:pPr>
+        <w:pStyle w:val="ListBullet"/>
+      </w:pPr>
+      <w:r>
+        <w:t>Before 08:36 (a Refresh pressed at 08:35 waits for the 08:36 call too), on a closed</w:t>
+        <w:br/>
+        <w:t xml:space="preserve">  day, or after a failed refresh the page shows the </w:t>
+      </w:r>
+      <w:r>
+        <w:rPr>
+          <w:b/>
+        </w:rPr>
+        <w:t>last call</w:t>
+      </w:r>
+      <w:r>
+        <w:t>, labelled with its</w:t>
+        <w:br/>
+        <w:t xml:space="preserve">  day, under a line saying when the next call is due.</w:t>
+      </w:r>
+    </w:p>
+    <w:p>
+      <w:pPr>
+        <w:pStyle w:val="ListBullet"/>
+      </w:pPr>
+      <w:r>
+        <w:rPr>
+          <w:b/>
+        </w:rPr>
+        <w:t>Not in the probability</w:t>
+      </w:r>
+      <w:r>
+        <w:t xml:space="preserve"> (the report link, headlines, flow alerts) is context only.</w:t>
+      </w:r>
+    </w:p>
+    <w:p>
+      <w:pPr>
+        <w:pStyle w:val="ListBullet"/>
+      </w:pPr>
+      <w:r>
+        <w:rPr>
+          <w:b/>
+        </w:rPr>
+        <w:t>Scorecard</w:t>
+      </w:r>
+      <w:r>
+        <w:t xml:space="preserve"> (the last card) is the record of how the published calls actually did.</w:t>
+        <w:br/>
+        <w:t xml:space="preserve">  Each evening, once the day's bars are in, the app </w:t>
+      </w:r>
+      <w:r>
+        <w:rPr>
+          <w:b/>
+        </w:rPr>
+        <w:t>grades</w:t>
+      </w:r>
+      <w:r>
+        <w:t xml:space="preserve"> every trade it showed that</w:t>
+        <w:br/>
+        <w:t xml:space="preserve">  morning, from the call as published (never from a later rebuild), under the target,</w:t>
+        <w:br/>
+        <w:t xml:space="preserve">  stop and time stop that call was made with (a setting changed later does not regrade</w:t>
+        <w:br/>
+        <w:t xml:space="preserve">  it), and the scorecard shows that evening's grades straight away. Per symbol, over the</w:t>
+        <w:br/>
+        <w:t xml:space="preserve">  last 20 graded days, it shows: </w:t>
+      </w:r>
+      <w:r>
+        <w:rPr>
+          <w:b/>
+        </w:rPr>
+        <w:t>Edge calls</w:t>
+      </w:r>
+      <w:r>
+        <w:t>, how often the one highlighted trade won</w:t>
+        <w:br/>
+        <w:t xml:space="preserve">  beside the rate it usually wins (most symbols have none, and the line says so);</w:t>
+        <w:br/>
+        <w:t xml:space="preserve">  </w:t>
+      </w:r>
+      <w:r>
+        <w:rPr>
+          <w:b/>
+        </w:rPr>
+        <w:t>Cautions</w:t>
+      </w:r>
+      <w:r>
+        <w:t>, how often a trade marked to avoid still won, beside its usual rate (the</w:t>
+        <w:br/>
+        <w:t xml:space="preserve">  caution is working when that is the lower number); and a table of all four trades with</w:t>
+        <w:br/>
+        <w:t xml:space="preserve">  their won / lost / timed-out counts and win rate. Two win rates sit side by side: the</w:t>
+        <w:br/>
+        <w:t xml:space="preserve">  </w:t>
+      </w:r>
+      <w:r>
+        <w:rPr>
+          <w:b/>
+        </w:rPr>
+        <w:t>model's</w:t>
+      </w:r>
+      <w:r>
+        <w:t xml:space="preserve"> (priced from the volatility index, the one the study uses) and the</w:t>
+        <w:br/>
+        <w:t xml:space="preserve">  </w:t>
+      </w:r>
+      <w:r>
+        <w:rPr>
+          <w:b/>
+        </w:rPr>
+        <w:t>live chain's</w:t>
+      </w:r>
+      <w:r>
+        <w:t xml:space="preserve"> (the same walk at the volatility the 08:36 chain implied; a dash when</w:t>
+        <w:br/>
+        <w:t xml:space="preserve">  no chain was captured that morning). A day whose bars are not all in yet is graded the</w:t>
+        <w:br/>
+        <w:t xml:space="preserve">  next evening. A call made on a shortened session (a half day) is not graded, because the</w:t>
+        <w:br/>
+        <w:t xml:space="preserve">  model's settlement time would be wrong. A grade is written once and never recomputed. A</w:t>
+        <w:br/>
+        <w:t xml:space="preserve">  handful of days says very little; read it as a record, not a verdict.</w:t>
+      </w:r>
+    </w:p>
+    <w:p>
+      <w:pPr>
+        <w:pStyle w:val="IntenseQuote"/>
+      </w:pPr>
+      <w:r>
+        <w:rPr/>
+        <w:t xml:space="preserve">The win rates are counted over </w:t>
+      </w:r>
+      <w:r>
+        <w:rPr>
+          <w:b/>
+        </w:rPr>
+        <w:t>every</w:t>
+      </w:r>
+      <w:r>
+        <w:rPr/>
+        <w:t xml:space="preserve"> stored morning, and the premiums are</w:t>
+        <w:br/>
+        <w:t>modelled, so read them as how often a method like this has worked, not as a promise</w:t>
+        <w:br/>
+        <w:t xml:space="preserve">of fills. What is </w:t>
+      </w:r>
+      <w:r>
+        <w:rPr>
+          <w:b/>
+        </w:rPr>
+        <w:t>walk-forward tested</w:t>
+      </w:r>
+      <w:r>
+        <w:rPr/>
+        <w:t xml:space="preserve"> is whether a bucket beats its usual rate:</w:t>
+        <w:br/>
+        <w:t xml:space="preserve">that test is what marks a </w:t>
+      </w:r>
+      <w:r>
+        <w:rPr>
+          <w:b/>
+        </w:rPr>
+        <w:t>Measured edge</w:t>
+      </w:r>
+      <w:r>
+        <w:rPr/>
+        <w:t xml:space="preserve"> or a </w:t>
+      </w:r>
+      <w:r>
+        <w:rPr>
+          <w:b/>
+        </w:rPr>
+        <w:t>Caution</w:t>
+      </w:r>
+      <w:r>
+        <w:rPr/>
+        <w:t>.</w:t>
       </w:r>
     </w:p>
     <w:p>

</xml_diff>

<commit_message>
feat(scalp): lead with one table of all three symbols, fold the detail below
The Opening Scalp page ran to about seven screens, with one symbol's facts in
three places. It now opens with a glance: one line (the call shown, a countdown
to the next, whether any symbol has a measured edge) and one row per symbol
(direction now, confirmation word, the trade with the call and its usual win
rate, room to the wall, the 08:36 direction). Below it, closed sections: one
per symbol (its 15-minute call, confirmation and 08:36 call), the day's calls,
the context and the scorecard. Open sections survive repaints; the clock tick
refreshes the countdown alone. Page only: no service, view or config change.

Co-Authored-By: Claude Opus 5.5 <noreply@anthropic.com>
</commit_message>
<xml_diff>
--- a/docs/manuals/user-guide/user-guide.docx
+++ b/docs/manuals/user-guide/user-guide.docx
@@ -32,7 +32,7 @@
           <w:color w:val="5B6678"/>
           <w:sz w:val="18"/>
         </w:rPr>
-        <w:t>NeuralStrike · Generated 2026-10-20</w:t>
+        <w:t>NeuralStrike · Generated 2026-10-21</w:t>
       </w:r>
     </w:p>
     <w:p/>
@@ -23431,6 +23431,142 @@
       </w:r>
     </w:p>
     <w:p>
+      <w:r>
+        <w:rPr>
+          <w:b/>
+        </w:rPr>
+        <w:t>The top of the page is one table, a row per symbol.</w:t>
+      </w:r>
+      <w:r>
+        <w:rPr/>
+        <w:t xml:space="preserve"> Above it a line names the call</w:t>
+        <w:br/>
+        <w:t>it shows ("Latest call at 09:21 · next at 09:36"), counts down to the next one ("next</w:t>
+        <w:br/>
+        <w:t>call in 4 min") and says whether any symbol has a measured edge. Each row shows the</w:t>
+        <w:br/>
+        <w:t xml:space="preserve">symbol and its price, </w:t>
+      </w:r>
+      <w:r>
+        <w:rPr>
+          <w:b/>
+        </w:rPr>
+        <w:t>Now</w:t>
+      </w:r>
+      <w:r>
+        <w:rPr/>
+        <w:t xml:space="preserve"> (↑ Up, ↓ Down or no direction, and which call that is),</w:t>
+        <w:br/>
+        <w:t xml:space="preserve">the </w:t>
+      </w:r>
+      <w:r>
+        <w:rPr>
+          <w:b/>
+        </w:rPr>
+        <w:t>Confirmation</w:t>
+      </w:r>
+      <w:r>
+        <w:rPr/>
+        <w:t xml:space="preserve"> word, the </w:t>
+      </w:r>
+      <w:r>
+        <w:rPr>
+          <w:b/>
+        </w:rPr>
+        <w:t>trade with the call</w:t>
+      </w:r>
+      <w:r>
+        <w:rPr/>
+        <w:t xml:space="preserve"> (the trade with a measured edge</w:t>
+        <w:br/>
+        <w:t xml:space="preserve">instead, when there is one), how often it </w:t>
+      </w:r>
+      <w:r>
+        <w:rPr>
+          <w:b/>
+        </w:rPr>
+        <w:t>usually wins</w:t>
+      </w:r>
+      <w:r>
+        <w:rPr/>
+        <w:t xml:space="preserve">, the </w:t>
+      </w:r>
+      <w:r>
+        <w:rPr>
+          <w:b/>
+        </w:rPr>
+        <w:t>room to the wall</w:t>
+      </w:r>
+      <w:r>
+        <w:rPr/>
+        <w:t>,</w:t>
+        <w:br/>
+        <w:t xml:space="preserve">and the </w:t>
+      </w:r>
+      <w:r>
+        <w:rPr>
+          <w:b/>
+        </w:rPr>
+        <w:t>08:36 call</w:t>
+      </w:r>
+      <w:r>
+        <w:rPr/>
+        <w:t>'s direction. The row reads the latest 15-minute call once the</w:t>
+        <w:br/>
+        <w:t>first one is out (08:51) and the 08:36 call before that. A call that is no longer</w:t>
+        <w:br/>
+        <w:t>current keeps its words and loses its colour.</w:t>
+      </w:r>
+    </w:p>
+    <w:p>
+      <w:r>
+        <w:rPr>
+          <w:b/>
+        </w:rPr>
+        <w:t>Everything else is below it, in closed sections:</w:t>
+      </w:r>
+      <w:r>
+        <w:rPr/>
+        <w:t xml:space="preserve"> one per symbol (its 15-minute</w:t>
+        <w:br/>
+        <w:t xml:space="preserve">call, its confirmation and its 08:36 call), then </w:t>
+      </w:r>
+      <w:r>
+        <w:rPr>
+          <w:b/>
+        </w:rPr>
+        <w:t>Today's calls</w:t>
+      </w:r>
+      <w:r>
+        <w:rPr/>
+        <w:t xml:space="preserve">, </w:t>
+      </w:r>
+      <w:r>
+        <w:rPr>
+          <w:b/>
+        </w:rPr>
+        <w:t>Not in the</w:t>
+        <w:br/>
+        <w:t>probability</w:t>
+      </w:r>
+      <w:r>
+        <w:rPr/>
+        <w:t xml:space="preserve"> and the </w:t>
+      </w:r>
+      <w:r>
+        <w:rPr>
+          <w:b/>
+        </w:rPr>
+        <w:t>Scorecard</w:t>
+      </w:r>
+      <w:r>
+        <w:rPr/>
+        <w:t>. Click a heading to open it; a section you opened</w:t>
+        <w:br/>
+        <w:t>stays open when a new call arrives.</w:t>
+      </w:r>
+    </w:p>
+    <w:p>
       <w:pPr>
         <w:pStyle w:val="ListBullet"/>
       </w:pPr>
@@ -23745,7 +23881,7 @@
         <w:t>Scorecard</w:t>
       </w:r>
       <w:r>
-        <w:t xml:space="preserve"> (the last card) is the record of how the published calls actually did.</w:t>
+        <w:t xml:space="preserve"> (the last section) is the record of how the published calls actually did.</w:t>
         <w:br/>
         <w:t xml:space="preserve">  Each evening, once the day's bars are in, the app </w:t>
       </w:r>
@@ -23835,7 +23971,7 @@
     <w:p>
       <w:r>
         <w:rPr/>
-        <w:t xml:space="preserve">Under the 08:36 cards the page makes </w:t>
+        <w:t xml:space="preserve">After the 08:36 call the page makes </w:t>
       </w:r>
       <w:r>
         <w:rPr>
@@ -23877,7 +24013,16 @@
         <w:t>Latest call.</w:t>
       </w:r>
       <w:r>
-        <w:t xml:space="preserve"> One card per symbol. It says which way the symbol moved over the</w:t>
+        <w:t xml:space="preserve"> The </w:t>
+      </w:r>
+      <w:r>
+        <w:rPr>
+          <w:b/>
+        </w:rPr>
+        <w:t>15-minute call</w:t>
+      </w:r>
+      <w:r>
+        <w:t xml:space="preserve"> card in each symbol's section. It says which way the symbol moved over the</w:t>
         <w:br/>
         <w:t xml:space="preserve">  </w:t>
       </w:r>

</xml_diff>

<commit_message>
docs(scalp): the chance reads its own flow count; sentiment history is live-only
The Context text said the flow alerts were in neither the rates nor the
chance; the chance's flow factor is its own windowed count, so say that
and keep only the headlines and the report link out of both. Sentiment is
never extracted by the backfill: its history is the live records from the
first recorded call, not prob_sources. Manuals rebuilt.

Co-Authored-By: Claude Sonnet 5.5 <noreply@anthropic.com>
</commit_message>
<xml_diff>
--- a/docs/manuals/user-guide/user-guide.docx
+++ b/docs/manuals/user-guide/user-guide.docx
@@ -24303,9 +24303,13 @@
         <w:t>Context: headlines, flow alerts and the report</w:t>
       </w:r>
       <w:r>
-        <w:t xml:space="preserve"> is context only: none of it was</w:t>
-        <w:br/>
-        <w:t xml:space="preserve">  measured, and none of it is in the usual win rates or the chance of target.</w:t>
+        <w:t xml:space="preserve"> is context only. The flow-alert</w:t>
+        <w:br/>
+        <w:t xml:space="preserve">  list is shown, not fed in: the chance of target reads its own count of bullish and</w:t>
+        <w:br/>
+        <w:t xml:space="preserve">  bearish flow in the window before the call. The headlines and the report link are in</w:t>
+        <w:br/>
+        <w:t xml:space="preserve">  neither the usual win rates nor the chance.</w:t>
       </w:r>
     </w:p>
     <w:p>

</xml_diff>

<commit_message>
docs(scalp): "assumed" is the learned share, not a day count
Corrected in place in the five manuals, page_help, the page's CHANCE_NOTE,
webgui-routes and the CHANGELOG entry: a weight is assumed while it still
rests mostly on the starting assumption (less than half of it learned from
data), by its stored data_share against [prob] assumed_share. The page help
drops the hard-coded "fewer than 5 days" and the first-person "my guess".
The CHANGELOG rollout says load may run per file. Manuals rebuilt.

Co-Authored-By: Claude Opus 5.5 <noreply@anthropic.com>
</commit_message>
<xml_diff>
--- a/docs/manuals/user-guide/user-guide.docx
+++ b/docs/manuals/user-guide/user-guide.docx
@@ -25164,9 +25164,13 @@
         <w:t>assumed</w:t>
       </w:r>
       <w:r>
-        <w:t xml:space="preserve"> where those days are fewer than 5</w:t>
-        <w:br/>
-        <w:t xml:space="preserve">  (the weight is still the starting guess, not a measurement). Read a big push on an</w:t>
+        <w:t xml:space="preserve"> where its weight still rests</w:t>
+        <w:br/>
+        <w:t xml:space="preserve">  mostly on the starting assumption (less than half of it learned from data): the push is</w:t>
+        <w:br/>
+        <w:t xml:space="preserve">  still the starting guess, not a measurement. Flow, sentiment, net premium and the dealer</w:t>
+        <w:br/>
+        <w:t xml:space="preserve">  read are held close to their assumption, so they can stay assumed after many days. Read a big push on an</w:t>
         <w:br/>
         <w:t xml:space="preserve">  </w:t>
       </w:r>
@@ -33993,7 +33997,17 @@
             <w:r/>
             <w:r>
               <w:rPr/>
-              <w:t xml:space="preserve">The symbols it calls and the bars it keeps, strike steps and spread widths, the target, stop and time stop, the volatility multipliers the study tries (a list of numbers), the cut points between low, mid and high agreement, and the scorecard window; for the 15-minute calls, their first and last time (not before 08:45, and the last call's hour must end by 15:00), the gap, how late one may still fire, the flat band, the day's three blocks, the margin an edge must clear, the early-close days and time, and the confirmation's look-back, margins, cut points, the sources it needs for a word and the weight of each source; for the chance of target, whether it is shown at all, the moving-average and RSI lengths, the bar sizes, each factor's assumed starting weight and how tightly it is held, the weeks of history before the honesty test, the margin the chance must beat the usual rate by, the days under which a weight reads </w:t>
+              <w:t xml:space="preserve">The symbols it calls and the bars it keeps, strike steps and spread widths, the target, stop and time stop, the volatility multipliers the study tries (a list of numbers), the cut points between low, mid and high agreement, and the scorecard window; for the 15-minute calls, their first and last time (not before 08:45, and the last call's hour must end by 15:00), the gap, how late one may still fire, the flat band, the day's three blocks, the margin an edge must clear, the early-close days and time, and the confirmation's look-back, margins, cut points, the sources it needs for a word and the weight of each source; for the chance of target, whether it is shown at all, the moving-average and RSI lengths, the bar sizes, each factor's assumed starting weight and how tightly it is held, the weeks of history before the honesty test, the margin the chance must beat the usual rate by for its </w:t>
+            </w:r>
+            <w:r>
+              <w:rPr>
+                <w:i/>
+              </w:rPr>
+              <w:t>beats the usual rate</w:t>
+            </w:r>
+            <w:r>
+              <w:rPr/>
+              <w:t xml:space="preserve"> line to read yes (the chance is shown either way), the share of a weight that must be learned from data before it stops reading </w:t>
             </w:r>
             <w:r>
               <w:rPr>

</xml_diff>

<commit_message>
docs(gamma): changelog, rebuilt manuals; projected contours dash longer
ShortDash's 3-on 1-off read as solid on a 1px contour in the browser, so the
projected part is drawn with Dash. The CHANGELOG records what shipped, the
measurements and the harness check.

Co-Authored-By: Claude Opus 5.5 <noreply@anthropic.com>
</commit_message>
<xml_diff>
--- a/docs/manuals/user-guide/user-guide.docx
+++ b/docs/manuals/user-guide/user-guide.docx
@@ -32,7 +32,7 @@
           <w:color w:val="5B6678"/>
           <w:sz w:val="18"/>
         </w:rPr>
-        <w:t>NeuralStrike · Generated 2026-10-22</w:t>
+        <w:t>NeuralStrike · Generated 2026-10-23</w:t>
       </w:r>
     </w:p>
     <w:p/>
@@ -8659,9 +8659,11 @@
         <w:br/>
         <w:t>is yet 30 minutes old. A strike that was not in the chain at the start of the window</w:t>
         <w:br/>
-        <w:t>is left blank, never drawn as a change from zero. The forward projection band is not</w:t>
-        <w:br/>
-        <w:t>drawn in a Change view.</w:t>
+        <w:t>is left blank, never drawn as a change from zero. The projected afternoon is measured</w:t>
+        <w:br/>
+        <w:t>the same way: a projected cell is compared with the column 30 minutes (or the open)</w:t>
+        <w:br/>
+        <w:t>before it, whether that column was collected or projected.</w:t>
       </w:r>
     </w:p>
     <w:p>
@@ -9186,11 +9188,11 @@
       </w:r>
       <w:r>
         <w:rPr/>
-        <w:t xml:space="preserve"> (price is always the flat line). The forward projection</w:t>
-        <w:br/>
-        <w:t>band is not drawn either. Each level line keeps its own price in its label; only its</w:t>
-        <w:br/>
-        <w:t>position moves.</w:t>
+        <w:t xml:space="preserve"> (price is always the flat line). The projected afternoon</w:t>
+        <w:br/>
+        <w:t>is drawn here too, measured from the price held where it is now. Each level line</w:t>
+        <w:br/>
+        <w:t>keeps its own price in its label; only its position moves.</w:t>
       </w:r>
     </w:p>
     <w:p>
@@ -9227,6 +9229,20 @@
         <w:t>by pressing and holding a cell is the smoothed one; the tooltip says "(smoothed)".</w:t>
         <w:br/>
         <w:t>For an exact reading use the bars, which are never smoothed, or set Smooth to Off.</w:t>
+        <w:br/>
+        <w:t xml:space="preserve">Smoothing runs across the </w:t>
+      </w:r>
+      <w:r>
+        <w:rPr>
+          <w:b/>
+        </w:rPr>
+        <w:t>now</w:t>
+      </w:r>
+      <w:r>
+        <w:rPr/>
+        <w:t xml:space="preserve"> line as well, so neither the colours nor the</w:t>
+        <w:br/>
+        <w:t>contour lines step where the collected minutes meet the projected ones.</w:t>
       </w:r>
     </w:p>
     <w:p>
@@ -9248,7 +9264,30 @@
         <w:br/>
         <w:t>The lines follow the Value, Show, Scale and Frame you have chosen, and the switch is</w:t>
         <w:br/>
-        <w:t>off until you turn it on.</w:t>
+        <w:t xml:space="preserve">off until you turn it on. They carry on through the projected afternoon, </w:t>
+      </w:r>
+      <w:r>
+        <w:rPr>
+          <w:b/>
+        </w:rPr>
+        <w:t>dashed</w:t>
+      </w:r>
+      <w:r>
+        <w:rPr/>
+        <w:br/>
+        <w:t xml:space="preserve">past the </w:t>
+      </w:r>
+      <w:r>
+        <w:rPr>
+          <w:b/>
+        </w:rPr>
+        <w:t>now</w:t>
+      </w:r>
+      <w:r>
+        <w:rPr/>
+        <w:t xml:space="preserve"> line, so you can always tell a line drawn from collected minutes</w:t>
+        <w:br/>
+        <w:t>from one that is projected.</w:t>
       </w:r>
     </w:p>
     <w:p>
@@ -9395,22 +9434,109 @@
     </w:p>
     <w:p>
       <w:r>
-        <w:rPr/>
-        <w:t xml:space="preserve">The forward projection band on the Gamma heat map is drawn in </w:t>
-      </w:r>
-      <w:r>
-        <w:rPr>
-          <w:b/>
-        </w:rPr>
-        <w:t>Net</w:t>
-      </w:r>
-      <w:r>
-        <w:rPr/>
-        <w:t xml:space="preserve"> only, and not</w:t>
-        <w:br/>
-        <w:t>in Share of column. It is a net figure in dollars, so the other values and the</w:t>
-        <w:br/>
-        <w:t>percentage scale leave it out.</w:t>
+        <w:rPr>
+          <w:b/>
+        </w:rPr>
+        <w:t>From the open, the heat map shows the whole session.</w:t>
+      </w:r>
+      <w:r>
+        <w:rPr/>
+        <w:t xml:space="preserve"> On Gamma, Charm, Delta and</w:t>
+        <w:br/>
+        <w:t>Vanna the time axis runs from 08:30 to the close, one column a minute. Left of the</w:t>
+        <w:br/>
+        <w:t xml:space="preserve">dashed </w:t>
+      </w:r>
+      <w:r>
+        <w:rPr>
+          <w:b/>
+        </w:rPr>
+        <w:t>now</w:t>
+      </w:r>
+      <w:r>
+        <w:rPr/>
+        <w:t xml:space="preserve"> line are the minutes collected so far; right of it the afternoon is</w:t>
+        <w:br/>
+      </w:r>
+      <w:r>
+        <w:rPr>
+          <w:b/>
+        </w:rPr>
+        <w:t>projected</w:t>
+      </w:r>
+      <w:r>
+        <w:rPr/>
+        <w:t>: today's open interest priced with less and less time left, holding</w:t>
+        <w:br/>
+        <w:t>price, open interest and volatility where they are now. The price line carries on</w:t>
+        <w:br/>
+        <w:t xml:space="preserve">flat past </w:t>
+      </w:r>
+      <w:r>
+        <w:rPr>
+          <w:b/>
+        </w:rPr>
+        <w:t>now</w:t>
+      </w:r>
+      <w:r>
+        <w:rPr/>
+        <w:t>, and the green and red dashed lines fanning out from it are the</w:t>
+        <w:br/>
+        <w:t>expected move. As the day goes on the collected part grows and the projected part</w:t>
+        <w:br/>
+        <w:t>shrinks; after the close the chart is all collected minutes.</w:t>
+      </w:r>
+    </w:p>
+    <w:p>
+      <w:r>
+        <w:rPr/>
+        <w:t xml:space="preserve">Read the projected part as a baseline, not a forecast. It answers </w:t>
+      </w:r>
+      <w:r>
+        <w:rPr>
+          <w:i/>
+        </w:rPr>
+        <w:t>"if nothing else</w:t>
+        <w:br/>
+        <w:t>changes, where does the positioning build by the close?"</w:t>
+      </w:r>
+      <w:r>
+        <w:rPr/>
+        <w:t xml:space="preserve"> Any real move rewrites it,</w:t>
+        <w:br/>
+        <w:t>which is why it is recomputed every minute. Every Value, Show, Scale, Frame and Smooth</w:t>
+        <w:br/>
+        <w:t xml:space="preserve">setting applies to it, and in </w:t>
+      </w:r>
+      <w:r>
+        <w:rPr>
+          <w:b/>
+        </w:rPr>
+        <w:t>Adaptive</w:t>
+      </w:r>
+      <w:r>
+        <w:rPr/>
+        <w:t xml:space="preserve"> the projected cells count toward the</w:t>
+        <w:br/>
+        <w:t>colours: early in the day, when most of the chart is projected, the large cells near</w:t>
+        <w:br/>
+        <w:t>the price late in the afternoon set the scale and the collected morning reads</w:t>
+        <w:br/>
+        <w:t>fainter. It is not drawn before the open, after the close, or on a day the market is</w:t>
+        <w:br/>
+        <w:t xml:space="preserve">shut, and Settings → Configuration → Dealer Positioning heatmap → </w:t>
+      </w:r>
+      <w:r>
+        <w:rPr>
+          <w:b/>
+        </w:rPr>
+        <w:t>Projected</w:t>
+        <w:br/>
+        <w:t>afternoon</w:t>
+      </w:r>
+      <w:r>
+        <w:rPr/>
+        <w:t xml:space="preserve"> can turn it off.</w:t>
       </w:r>
     </w:p>
     <w:p>

</xml_diff>

<commit_message>
docs(trade): sector and industry now name Yahoo Finance as their source
The listed-stocks file's Sector/Industry were the Nasdaq screener's,
derived from the SEC SIC code (CRWV read "Computer Software: Prepackaged
Software"). They are re-verified against Yahoo Finance's assetProfile
(Morningstar's taxonomy) for all 5,920 symbols; the old values move to
Nasdaq_Sector / Nasdaq_Industry. The tooltip, User Guide and Technical
Reference say where each of the three fields comes from.

Co-Authored-By: Claude Opus 5.5 <noreply@anthropic.com>
</commit_message>
<xml_diff>
--- a/docs/manuals/user-guide/user-guide.docx
+++ b/docs/manuals/user-guide/user-guide.docx
@@ -32,7 +32,7 @@
           <w:color w:val="5B6678"/>
           <w:sz w:val="18"/>
         </w:rPr>
-        <w:t>NeuralStrike · Generated 2026-10-23</w:t>
+        <w:t>NeuralStrike · Generated 2026-10-24</w:t>
       </w:r>
     </w:p>
     <w:p/>
@@ -29712,9 +29712,13 @@
         <w:br/>
         <w:t>server. A dash in any of them means the list has nothing for that symbol, which is</w:t>
         <w:br/>
-        <w:t>normal for a fund or an index. The industry and the sub-industry come from two</w:t>
-        <w:br/>
-        <w:t>different classification systems, so one is not always a finer cut of the other.</w:t>
+        <w:t>normal for a fund or an index. The sector and the industry are Yahoo Finance's</w:t>
+        <w:br/>
+        <w:t>(Morningstar's classification, for example Technology and Software - Infrastructure).</w:t>
+        <w:br/>
+        <w:t>The sub-industry is the company's SEC filing code, a different and older system, so</w:t>
+        <w:br/>
+        <w:t>it is not always a finer cut of the industry.</w:t>
         <w:br/>
         <w:t>Clearing the box and leaving it reverts to the last good symbol rather than blanking</w:t>
         <w:br/>

</xml_diff>

<commit_message>
feat(strategy-tools): Expected Move joins Calculator and Simulator, on the app and the site
The app: /options/expected-move moves from the Options strip to the Strategy
Tools group (route unchanged) and shares the Calculator/Simulator position
through shared_position.merge_view: it opens drawing their strikes, and a new
symbol, a new expiry or a picked strike is what they open with next, without
losing quantities, prices, share legs or a calendar's far leg.

The public site: a nineteenth screen, /expected-move (em_live), on the
existing cmd:tools_public stream (new "em" kind, one Schwab call - the price
history - with the IV read off the held public chain). The three public tools
carry one tab strip, and the site's Tools menu names them as one item,
Strategy Tools.

Co-Authored-By: Claude Opus 5.5 <noreply@anthropic.com>
</commit_message>
<xml_diff>
--- a/docs/manuals/user-guide/user-guide.docx
+++ b/docs/manuals/user-guide/user-guide.docx
@@ -1558,7 +1558,7 @@
     <w:p>
       <w:r>
         <w:rPr/>
-        <w:t xml:space="preserve">Eighteen of the app's screens are also published </w:t>
+        <w:t xml:space="preserve">Nineteen of the app's screens are also published </w:t>
       </w:r>
       <w:r>
         <w:rPr>
@@ -1651,6 +1651,16 @@
       </w:r>
       <w:r>
         <w:rPr/>
+        <w:t xml:space="preserve">, the </w:t>
+      </w:r>
+      <w:r>
+        <w:rPr>
+          <w:b/>
+        </w:rPr>
+        <w:t>Expected Move</w:t>
+      </w:r>
+      <w:r>
+        <w:rPr/>
         <w:t xml:space="preserve"> and </w:t>
       </w:r>
       <w:r>
@@ -2139,7 +2149,79 @@
     <w:p>
       <w:r>
         <w:rPr/>
-        <w:t>Both run their chain loads, extra expirations, ratings and Simulator snapshots</w:t>
+        <w:t xml:space="preserve">The public </w:t>
+      </w:r>
+      <w:r>
+        <w:rPr>
+          <w:b/>
+        </w:rPr>
+        <w:t>Expected Move</w:t>
+      </w:r>
+      <w:r>
+        <w:rPr/>
+        <w:t xml:space="preserve"> is the fifth: your Expected Move chart. A visitor</w:t>
+        <w:br/>
+        <w:t>loads a symbol, picks an expiration and sees its cone over the price history,</w:t>
+        <w:br/>
+        <w:t>with a strike line of their own; a position the Calculator handed over in the</w:t>
+        <w:br/>
+        <w:t>same tab opens drawn. Its cone costs one Schwab call (the price history): the</w:t>
+        <w:br/>
+        <w:t>implied volatility comes off the symbol's public chain, the one the Calculator</w:t>
+        <w:br/>
+        <w:t>loads, and the cone starts at today's price without drawing today's bar. The</w:t>
+        <w:br/>
+        <w:t xml:space="preserve">three — </w:t>
+      </w:r>
+      <w:r>
+        <w:rPr>
+          <w:b/>
+        </w:rPr>
+        <w:t>Calculator</w:t>
+      </w:r>
+      <w:r>
+        <w:rPr/>
+        <w:t xml:space="preserve">, </w:t>
+      </w:r>
+      <w:r>
+        <w:rPr>
+          <w:b/>
+        </w:rPr>
+        <w:t>Simulator</w:t>
+      </w:r>
+      <w:r>
+        <w:rPr/>
+        <w:t xml:space="preserve">, </w:t>
+      </w:r>
+      <w:r>
+        <w:rPr>
+          <w:b/>
+        </w:rPr>
+        <w:t>Expected Move</w:t>
+      </w:r>
+      <w:r>
+        <w:rPr/>
+        <w:t xml:space="preserve"> — carry one tab strip</w:t>
+        <w:br/>
+        <w:t xml:space="preserve">across the top, and the site names them as one item, </w:t>
+      </w:r>
+      <w:r>
+        <w:rPr>
+          <w:b/>
+        </w:rPr>
+        <w:t>Strategy Tools</w:t>
+      </w:r>
+      <w:r>
+        <w:rPr/>
+        <w:t>.</w:t>
+      </w:r>
+    </w:p>
+    <w:p>
+      <w:r>
+        <w:rPr/>
+        <w:t>All three run their chain loads, extra expirations, ratings, Simulator</w:t>
+        <w:br/>
+        <w:t>snapshots and expected-move cones</w:t>
         <w:br/>
         <w:t>08:40–15:00 CT on trading days, inside the shared daily budget above, and each</w:t>
         <w:br/>
@@ -2195,7 +2277,19 @@
       </w:r>
       <w:r>
         <w:rPr/>
-        <w:t xml:space="preserve"> menu links the four screens a visitor can act on, and Market News.</w:t>
+        <w:t xml:space="preserve"> menu links Option Signals, the Strategy Finder, Rescue, </w:t>
+      </w:r>
+      <w:r>
+        <w:rPr>
+          <w:b/>
+        </w:rPr>
+        <w:t>Strategy</w:t>
+        <w:br/>
+        <w:t>Tools</w:t>
+      </w:r>
+      <w:r>
+        <w:rPr/>
+        <w:t xml:space="preserve"> (it opens the Calculator) and Market News.</w:t>
       </w:r>
     </w:p>
     <w:p>
@@ -3350,7 +3444,7 @@
             <w:r/>
             <w:r>
               <w:rPr/>
-              <w:t>Calculator · Simulator</w:t>
+              <w:t>Calculator · Simulator · Expected Move</w:t>
             </w:r>
           </w:p>
         </w:tc>
@@ -3384,7 +3478,7 @@
             <w:r/>
             <w:r>
               <w:rPr/>
-              <w:t>Market Scanner · Income · Expected Move · Captured Signals · Paper Ledger · Paper Account · Shares · Rescue</w:t>
+              <w:t>Market Scanner · Income · Captured Signals · Paper Ledger · Paper Account · Shares · Rescue</w:t>
             </w:r>
           </w:p>
         </w:tc>
@@ -3713,10 +3807,12 @@
         <w:rPr>
           <w:b/>
         </w:rPr>
-        <w:t>Calculator and Simulator are their own group.</w:t>
-      </w:r>
-      <w:r>
-        <w:t xml:space="preserve"> They model legs </w:t>
+        <w:t>Calculator, Simulator and Expected Move are their own group.</w:t>
+      </w:r>
+      <w:r>
+        <w:t xml:space="preserve"> They model</w:t>
+        <w:br/>
+        <w:t xml:space="preserve">  legs </w:t>
       </w:r>
       <w:r>
         <w:rPr>
@@ -3725,9 +3821,7 @@
         <w:t>you</w:t>
       </w:r>
       <w:r>
-        <w:t xml:space="preserve"> bring,</w:t>
-        <w:br/>
-        <w:t xml:space="preserve">  whereas the Options tabs work on signals the app </w:t>
+        <w:t xml:space="preserve"> bring, whereas the Options tabs work on signals the app </w:t>
       </w:r>
       <w:r>
         <w:rPr>
@@ -3736,9 +3830,9 @@
         <w:t>finds</w:t>
       </w:r>
       <w:r>
-        <w:t>. They share a leg</w:t>
-        <w:br/>
-        <w:t xml:space="preserve">  editor and copy trades to each other, so they belong side by side.</w:t>
+        <w:t>. They</w:t>
+        <w:br/>
+        <w:t xml:space="preserve">  work on one shared position, so they belong side by side.</w:t>
       </w:r>
     </w:p>
     <w:p>
@@ -16136,7 +16230,7 @@
         <w:rPr/>
         <w:t xml:space="preserve"> from a signal table, the form is</w:t>
         <w:br/>
-        <w:t xml:space="preserve">pre-filled and priced once the chain loads. The Calculator and the Simulator work on </w:t>
+        <w:t xml:space="preserve">pre-filled and priced once the chain loads. The Calculator, the Simulator and the Expected Move work on </w:t>
       </w:r>
       <w:r>
         <w:rPr>
@@ -16146,7 +16240,17 @@
       </w:r>
       <w:r>
         <w:rPr/>
-        <w:t xml:space="preserve"> — the same symbol, strategy, legs and selected expiration. Whichever page you edited last is what the other one opens with, so there is nothing to copy between them.</w:t>
+        <w:t xml:space="preserve"> — the same symbol, strategy, legs and selected expiration. Whichever page you edited last is what the others open with, so there is nothing to copy between them. The Expected Move shares the symbol, the expiration and the strikes (see </w:t>
+      </w:r>
+      <w:r>
+        <w:rPr>
+          <w:color w:val="5D5294"/>
+        </w:rPr>
+        <w:t>Expected Move</w:t>
+      </w:r>
+      <w:r>
+        <w:rPr/>
+        <w:t>).</w:t>
         <w:br/>
         <w:t>Open the Simulator after building a trade here and it is already loaded; change it</w:t>
         <w:br/>
@@ -16854,7 +16958,7 @@
       </w:pPr>
       <w:r>
         <w:rPr/>
-        <w:t>Market Scanner</w:t>
+        <w:t>Expected Move</w:t>
       </w:r>
     </w:p>
     <w:p>
@@ -16873,11 +16977,356 @@
               <a:graphicData uri="http://schemas.openxmlformats.org/drawingml/2006/picture">
                 <pic:pic>
                   <pic:nvPicPr>
+                    <pic:cNvPr id="0" name="expected-move.png"/>
+                    <pic:cNvPicPr/>
+                  </pic:nvPicPr>
+                  <pic:blipFill>
+                    <a:blip r:embed="rId13"/>
+                    <a:stretch>
+                      <a:fillRect/>
+                    </a:stretch>
+                  </pic:blipFill>
+                  <pic:spPr>
+                    <a:xfrm>
+                      <a:off x="0" y="0"/>
+                      <a:ext cx="5760720" cy="3558826"/>
+                    </a:xfrm>
+                    <a:prstGeom prst="rect"/>
+                  </pic:spPr>
+                </pic:pic>
+              </a:graphicData>
+            </a:graphic>
+          </wp:inline>
+        </w:drawing>
+      </w:r>
+    </w:p>
+    <w:p>
+      <w:pPr>
+        <w:jc w:val="center"/>
+      </w:pPr>
+      <w:r>
+        <w:rPr>
+          <w:i/>
+          <w:color w:val="5B6678"/>
+          <w:sz w:val="17"/>
+        </w:rPr>
+        <w:t>The Expected Move page.</w:t>
+      </w:r>
+    </w:p>
+    <w:p>
+      <w:r>
+        <w:rPr>
+          <w:b/>
+        </w:rPr>
+        <w:t>Route:</w:t>
+      </w:r>
+      <w:r>
+        <w:rPr/>
+        <w:t xml:space="preserve"> </w:t>
+      </w:r>
+      <w:r>
+        <w:rPr>
+          <w:rFonts w:ascii="Consolas" w:hAnsi="Consolas"/>
+          <w:color w:val="334455"/>
+          <w:sz w:val="19"/>
+        </w:rPr>
+        <w:t>/options/expected-move</w:t>
+      </w:r>
+      <w:r>
+        <w:rPr/>
+        <w:t xml:space="preserve"> — the third </w:t>
+      </w:r>
+      <w:r>
+        <w:rPr>
+          <w:b/>
+        </w:rPr>
+        <w:t>Strategy Tools</w:t>
+      </w:r>
+      <w:r>
+        <w:rPr/>
+        <w:t xml:space="preserve"> tab, beside the</w:t>
+        <w:br/>
+        <w:t>Calculator and the Simulator.</w:t>
+      </w:r>
+    </w:p>
+    <w:p>
+      <w:r>
+        <w:rPr/>
+        <w:t xml:space="preserve">Charts a symbol's recent price action with a forward </w:t>
+      </w:r>
+      <w:r>
+        <w:rPr>
+          <w:b/>
+        </w:rPr>
+        <w:t>expected-move cone</w:t>
+      </w:r>
+      <w:r>
+        <w:rPr/>
+        <w:t xml:space="preserve"> out to</w:t>
+        <w:br/>
+        <w:t>an option's expiration.</w:t>
+      </w:r>
+    </w:p>
+    <w:p>
+      <w:r>
+        <w:rPr>
+          <w:b/>
+        </w:rPr>
+        <w:t>Inputs:</w:t>
+      </w:r>
+      <w:r>
+        <w:rPr/>
+        <w:t xml:space="preserve"> </w:t>
+      </w:r>
+      <w:r>
+        <w:rPr>
+          <w:b/>
+        </w:rPr>
+        <w:t>Symbol</w:t>
+      </w:r>
+      <w:r>
+        <w:rPr/>
+        <w:t xml:space="preserve">, </w:t>
+      </w:r>
+      <w:r>
+        <w:rPr>
+          <w:b/>
+        </w:rPr>
+        <w:t>Expiry</w:t>
+      </w:r>
+      <w:r>
+        <w:rPr/>
+        <w:t xml:space="preserve"> (a dropdown of the symbol's listed expirations,</w:t>
+        <w:br/>
+        <w:t xml:space="preserve">each with its days to expiry), an optional </w:t>
+      </w:r>
+      <w:r>
+        <w:rPr>
+          <w:b/>
+        </w:rPr>
+        <w:t>Strike</w:t>
+      </w:r>
+      <w:r>
+        <w:rPr/>
+        <w:t xml:space="preserve"> with a put/call toggle, and a</w:t>
+        <w:br/>
+      </w:r>
+      <w:r>
+        <w:rPr>
+          <w:b/>
+        </w:rPr>
+        <w:t>Look-back</w:t>
+      </w:r>
+      <w:r>
+        <w:rPr/>
+        <w:t xml:space="preserve"> dropdown (Auto ≈ 3× DTE, or 1mo / 3mo / 6mo / 1y). Picking an expiry</w:t>
+        <w:br/>
+        <w:t xml:space="preserve">draws the chart; </w:t>
+      </w:r>
+      <w:r>
+        <w:rPr>
+          <w:b/>
+        </w:rPr>
+        <w:t>Draw</w:t>
+      </w:r>
+      <w:r>
+        <w:rPr/>
+        <w:t xml:space="preserve"> draws it again.</w:t>
+      </w:r>
+    </w:p>
+    <w:p>
+      <w:r>
+        <w:rPr>
+          <w:b/>
+        </w:rPr>
+        <w:t>The chart</w:t>
+      </w:r>
+      <w:r>
+        <w:rPr/>
+        <w:t xml:space="preserve"> is a daily candlestick with:</w:t>
+      </w:r>
+    </w:p>
+    <w:p>
+      <w:pPr>
+        <w:pStyle w:val="ListBullet"/>
+      </w:pPr>
+      <w:r>
+        <w:rPr>
+          <w:b/>
+        </w:rPr>
+        <w:t>Upper/lower expected-move</w:t>
+      </w:r>
+      <w:r>
+        <w:t xml:space="preserve"> lines (green above, red below) fanning out to</w:t>
+        <w:br/>
+        <w:t xml:space="preserve">  expiration.</w:t>
+      </w:r>
+    </w:p>
+    <w:p>
+      <w:pPr>
+        <w:pStyle w:val="ListBullet"/>
+      </w:pPr>
+      <w:r>
+        <w:rPr>
+          <w:b/>
+        </w:rPr>
+        <w:t>Leg strike lines</w:t>
+      </w:r>
+      <w:r>
+        <w:t xml:space="preserve"> if you provided strikes (short = solid, long = dashed;</w:t>
+        <w:br/>
+        <w:t xml:space="preserve">  put = red, call = blue), each labeled.</w:t>
+      </w:r>
+    </w:p>
+    <w:p>
+      <w:pPr>
+        <w:pStyle w:val="ListBullet"/>
+      </w:pPr>
+      <w:r>
+        <w:t>A price crosshair and a date-aware tooltip. Non-trading days are collapsed so</w:t>
+        <w:br/>
+        <w:t xml:space="preserve">  there are no blank weekend gaps.</w:t>
+      </w:r>
+    </w:p>
+    <w:p>
+      <w:r>
+        <w:rPr>
+          <w:b/>
+        </w:rPr>
+        <w:t>It shares the Calculator's position.</w:t>
+      </w:r>
+      <w:r>
+        <w:rPr/>
+        <w:t xml:space="preserve"> The page opens on the symbol,</w:t>
+        <w:br/>
+        <w:t>expiration and strikes the Calculator and the Simulator were last showing, and</w:t>
+        <w:br/>
+        <w:t>draws every leg's strike. What you change here is what they open with next:</w:t>
+      </w:r>
+    </w:p>
+    <w:p>
+      <w:pPr>
+        <w:pStyle w:val="ListBullet"/>
+      </w:pPr>
+      <w:r>
+        <w:t xml:space="preserve">a new </w:t>
+      </w:r>
+      <w:r>
+        <w:rPr>
+          <w:b/>
+        </w:rPr>
+        <w:t>symbol</w:t>
+      </w:r>
+      <w:r>
+        <w:t xml:space="preserve"> — they open on it with their own template's strikes, keeping</w:t>
+        <w:br/>
+        <w:t xml:space="preserve">  the strategy;</w:t>
+      </w:r>
+    </w:p>
+    <w:p>
+      <w:pPr>
+        <w:pStyle w:val="ListBullet"/>
+      </w:pPr>
+      <w:r>
+        <w:t xml:space="preserve">a new </w:t>
+      </w:r>
+      <w:r>
+        <w:rPr>
+          <w:b/>
+        </w:rPr>
+        <w:t>expiry</w:t>
+      </w:r>
+      <w:r>
+        <w:t xml:space="preserve"> — the legs move to it, and the Calculator re-prices them from</w:t>
+        <w:br/>
+        <w:t xml:space="preserve">  that expiration's chain (a calendar's far leg and any share legs stay put);</w:t>
+      </w:r>
+    </w:p>
+    <w:p>
+      <w:pPr>
+        <w:pStyle w:val="ListBullet"/>
+      </w:pPr>
+      <w:r>
+        <w:t xml:space="preserve">a </w:t>
+      </w:r>
+      <w:r>
+        <w:rPr>
+          <w:b/>
+        </w:rPr>
+        <w:t>strike</w:t>
+      </w:r>
+      <w:r>
+        <w:t xml:space="preserve"> you pick — becomes a one-leg position, a short put or short call</w:t>
+        <w:br/>
+        <w:t xml:space="preserve">  at that strike, priced from the chain.</w:t>
+      </w:r>
+    </w:p>
+    <w:p>
+      <w:r>
+        <w:rPr/>
+        <w:t>The strike the page pre-selects nearest the price is a convenience and is not</w:t>
+        <w:br/>
+        <w:t xml:space="preserve">shared, and the </w:t>
+      </w:r>
+      <w:r>
+        <w:rPr>
+          <w:b/>
+        </w:rPr>
+        <w:t>Look-back</w:t>
+      </w:r>
+      <w:r>
+        <w:rPr/>
+        <w:t xml:space="preserve"> is this page's own.</w:t>
+      </w:r>
+    </w:p>
+    <w:p>
+      <w:r>
+        <w:rPr/>
+        <w:t xml:space="preserve">The </w:t>
+      </w:r>
+      <w:r>
+        <w:rPr>
+          <w:b/>
+        </w:rPr>
+        <w:t>Expected Move</w:t>
+      </w:r>
+      <w:r>
+        <w:rPr/>
+        <w:t xml:space="preserve"> button on a signal row opens it in a new browser tab,</w:t>
+        <w:br/>
+        <w:t>pre-filled and drawn, and that trade becomes the shared position too.</w:t>
+      </w:r>
+    </w:p>
+    <w:p>
+      <w:pPr>
+        <w:pStyle w:val="Heading2"/>
+      </w:pPr>
+      <w:r>
+        <w:rPr/>
+        <w:t>Market Scanner</w:t>
+      </w:r>
+    </w:p>
+    <w:p>
+      <w:pPr>
+        <w:jc w:val="center"/>
+      </w:pPr>
+      <w:r>
+        <w:drawing>
+          <wp:inline xmlns:a="http://schemas.openxmlformats.org/drawingml/2006/main" xmlns:pic="http://schemas.openxmlformats.org/drawingml/2006/picture">
+            <wp:extent cx="5760720" cy="3558826"/>
+            <wp:docPr id="6" name="Picture 6"/>
+            <wp:cNvGraphicFramePr>
+              <a:graphicFrameLocks noChangeAspect="1"/>
+            </wp:cNvGraphicFramePr>
+            <a:graphic>
+              <a:graphicData uri="http://schemas.openxmlformats.org/drawingml/2006/picture">
+                <pic:pic>
+                  <pic:nvPicPr>
                     <pic:cNvPr id="0" name="scanner.png"/>
                     <pic:cNvPicPr/>
                   </pic:nvPicPr>
                   <pic:blipFill>
-                    <a:blip r:embed="rId13"/>
+                    <a:blip r:embed="rId14"/>
                     <a:stretch>
                       <a:fillRect/>
                     </a:stretch>
@@ -19989,248 +20438,6 @@
         <w:t>morning; the number you see is what ranked the row, and the number you get is what</w:t>
         <w:br/>
         <w:t>the contract is worth when you press the button.</w:t>
-      </w:r>
-    </w:p>
-    <w:p>
-      <w:pPr>
-        <w:pStyle w:val="Heading2"/>
-      </w:pPr>
-      <w:r>
-        <w:rPr/>
-        <w:t>Expected Move</w:t>
-      </w:r>
-    </w:p>
-    <w:p>
-      <w:pPr>
-        <w:jc w:val="center"/>
-      </w:pPr>
-      <w:r>
-        <w:drawing>
-          <wp:inline xmlns:a="http://schemas.openxmlformats.org/drawingml/2006/main" xmlns:pic="http://schemas.openxmlformats.org/drawingml/2006/picture">
-            <wp:extent cx="5760720" cy="3558826"/>
-            <wp:docPr id="6" name="Picture 6"/>
-            <wp:cNvGraphicFramePr>
-              <a:graphicFrameLocks noChangeAspect="1"/>
-            </wp:cNvGraphicFramePr>
-            <a:graphic>
-              <a:graphicData uri="http://schemas.openxmlformats.org/drawingml/2006/picture">
-                <pic:pic>
-                  <pic:nvPicPr>
-                    <pic:cNvPr id="0" name="expected-move.png"/>
-                    <pic:cNvPicPr/>
-                  </pic:nvPicPr>
-                  <pic:blipFill>
-                    <a:blip r:embed="rId14"/>
-                    <a:stretch>
-                      <a:fillRect/>
-                    </a:stretch>
-                  </pic:blipFill>
-                  <pic:spPr>
-                    <a:xfrm>
-                      <a:off x="0" y="0"/>
-                      <a:ext cx="5760720" cy="3558826"/>
-                    </a:xfrm>
-                    <a:prstGeom prst="rect"/>
-                  </pic:spPr>
-                </pic:pic>
-              </a:graphicData>
-            </a:graphic>
-          </wp:inline>
-        </w:drawing>
-      </w:r>
-    </w:p>
-    <w:p>
-      <w:pPr>
-        <w:jc w:val="center"/>
-      </w:pPr>
-      <w:r>
-        <w:rPr>
-          <w:i/>
-          <w:color w:val="5B6678"/>
-          <w:sz w:val="17"/>
-        </w:rPr>
-        <w:t>The Expected Move page.</w:t>
-      </w:r>
-    </w:p>
-    <w:p>
-      <w:r>
-        <w:rPr>
-          <w:b/>
-        </w:rPr>
-        <w:t>Route:</w:t>
-      </w:r>
-      <w:r>
-        <w:rPr/>
-        <w:t xml:space="preserve"> </w:t>
-      </w:r>
-      <w:r>
-        <w:rPr>
-          <w:rFonts w:ascii="Consolas" w:hAnsi="Consolas"/>
-          <w:color w:val="334455"/>
-          <w:sz w:val="19"/>
-        </w:rPr>
-        <w:t>/options/expected-move</w:t>
-      </w:r>
-      <w:r>
-        <w:rPr/>
-        <w:t>.</w:t>
-      </w:r>
-    </w:p>
-    <w:p>
-      <w:r>
-        <w:rPr/>
-        <w:t xml:space="preserve">Charts a symbol's recent price action with a forward </w:t>
-      </w:r>
-      <w:r>
-        <w:rPr>
-          <w:b/>
-        </w:rPr>
-        <w:t>expected-move cone</w:t>
-      </w:r>
-      <w:r>
-        <w:rPr/>
-        <w:t xml:space="preserve"> out to</w:t>
-        <w:br/>
-        <w:t>an option's expiration.</w:t>
-      </w:r>
-    </w:p>
-    <w:p>
-      <w:r>
-        <w:rPr>
-          <w:b/>
-        </w:rPr>
-        <w:t>Inputs:</w:t>
-      </w:r>
-      <w:r>
-        <w:rPr/>
-        <w:t xml:space="preserve"> </w:t>
-      </w:r>
-      <w:r>
-        <w:rPr>
-          <w:b/>
-        </w:rPr>
-        <w:t>Symbol</w:t>
-      </w:r>
-      <w:r>
-        <w:rPr/>
-        <w:t xml:space="preserve">, </w:t>
-      </w:r>
-      <w:r>
-        <w:rPr>
-          <w:b/>
-        </w:rPr>
-        <w:t>Expiry</w:t>
-      </w:r>
-      <w:r>
-        <w:rPr/>
-        <w:t xml:space="preserve"> (YYYY-MM-DD), an optional </w:t>
-      </w:r>
-      <w:r>
-        <w:rPr>
-          <w:b/>
-        </w:rPr>
-        <w:t>Strike</w:t>
-      </w:r>
-      <w:r>
-        <w:rPr/>
-        <w:t xml:space="preserve"> with a</w:t>
-        <w:br/>
-        <w:t xml:space="preserve">put/call toggle, and a </w:t>
-      </w:r>
-      <w:r>
-        <w:rPr>
-          <w:b/>
-        </w:rPr>
-        <w:t>Look-back</w:t>
-      </w:r>
-      <w:r>
-        <w:rPr/>
-        <w:t xml:space="preserve"> dropdown (Auto ≈ 3× DTE, or 1mo / 3mo / 6mo /</w:t>
-        <w:br/>
-        <w:t xml:space="preserve">1y). Press </w:t>
-      </w:r>
-      <w:r>
-        <w:rPr>
-          <w:b/>
-        </w:rPr>
-        <w:t>Draw</w:t>
-      </w:r>
-      <w:r>
-        <w:rPr/>
-        <w:t>.</w:t>
-      </w:r>
-    </w:p>
-    <w:p>
-      <w:r>
-        <w:rPr>
-          <w:b/>
-        </w:rPr>
-        <w:t>The chart</w:t>
-      </w:r>
-      <w:r>
-        <w:rPr/>
-        <w:t xml:space="preserve"> is a daily candlestick with:</w:t>
-      </w:r>
-    </w:p>
-    <w:p>
-      <w:pPr>
-        <w:pStyle w:val="ListBullet"/>
-      </w:pPr>
-      <w:r>
-        <w:t xml:space="preserve">Dashed </w:t>
-      </w:r>
-      <w:r>
-        <w:rPr>
-          <w:b/>
-        </w:rPr>
-        <w:t>upper/lower expected-move</w:t>
-      </w:r>
-      <w:r>
-        <w:t xml:space="preserve"> bands fanning out to expiration.</w:t>
-      </w:r>
-    </w:p>
-    <w:p>
-      <w:pPr>
-        <w:pStyle w:val="ListBullet"/>
-      </w:pPr>
-      <w:r>
-        <w:rPr>
-          <w:b/>
-        </w:rPr>
-        <w:t>Leg strike lines</w:t>
-      </w:r>
-      <w:r>
-        <w:t xml:space="preserve"> if you provided strikes (short = solid, long = dashed;</w:t>
-        <w:br/>
-        <w:t xml:space="preserve">  put = red, call = blue), each labeled.</w:t>
-      </w:r>
-    </w:p>
-    <w:p>
-      <w:pPr>
-        <w:pStyle w:val="ListBullet"/>
-      </w:pPr>
-      <w:r>
-        <w:t>A price crosshair and a date-aware tooltip. Non-trading days are collapsed so</w:t>
-        <w:br/>
-        <w:t xml:space="preserve">  there are no blank weekend gaps.</w:t>
-      </w:r>
-    </w:p>
-    <w:p>
-      <w:r>
-        <w:rPr/>
-        <w:t xml:space="preserve">You usually reach this page through the </w:t>
-      </w:r>
-      <w:r>
-        <w:rPr>
-          <w:b/>
-        </w:rPr>
-        <w:t>Expected Move</w:t>
-      </w:r>
-      <w:r>
-        <w:rPr/>
-        <w:t xml:space="preserve"> button on a signal row</w:t>
-        <w:br/>
-        <w:t>(it opens in a new browser tab, pre-filled and drawn).</w:t>
       </w:r>
     </w:p>
     <w:p>

</xml_diff>

<commit_message>
fix(eod): drop the Credit collected column from the period table
It summed entry_credit_total by entry date, and the Ledger stores a debit
as a negative credit, so the Trade ideas book (all debit ideas this month)
showed -$15.7k MTD: premium paid that read as a loss. On a mixed book it
netted credits against debits, and on Captured signals it summed
one-contract trades nobody took. Realized P&L is the performance figure,
and nothing else read the field.

normalize_trades no longer carries credit; period_buckets no longer returns
it. TRADE_IDEAS_NOTE, the User Guide, the Reference Guide and the routes doc
are updated; a new test drives a debit idea through the summary.

Co-Authored-By: Claude Opus 5.5 <noreply@anthropic.com>
</commit_message>
<xml_diff>
--- a/docs/manuals/user-guide/user-guide.docx
+++ b/docs/manuals/user-guide/user-guide.docx
@@ -32,7 +32,7 @@
           <w:color w:val="5B6678"/>
           <w:sz w:val="18"/>
         </w:rPr>
-        <w:t>NeuralStrike · Generated 2026-10-24</w:t>
+        <w:t>NeuralStrike · Generated 2026-10-27</w:t>
       </w:r>
     </w:p>
     <w:p/>
@@ -11038,7 +11038,19 @@
         <w:br/>
         <w:t>of contracts still open, and it is only published once a day, which is why this</w:t>
         <w:br/>
-        <w:t>reading arrives the morning after.</w:t>
+        <w:t xml:space="preserve">reading arrives the morning after. The panel starts </w:t>
+      </w:r>
+      <w:r>
+        <w:rPr>
+          <w:b/>
+        </w:rPr>
+        <w:t>folded</w:t>
+      </w:r>
+      <w:r>
+        <w:rPr/>
+        <w:t>: click its heading to</w:t>
+        <w:br/>
+        <w:t>open it, and it stays open until you close it or reload the page.</w:t>
       </w:r>
     </w:p>
     <w:tbl>
@@ -31857,9 +31869,8 @@
       </w:r>
       <w:r>
         <w:rPr/>
-        <w:t xml:space="preserve"> date, while opened trades and credit</w:t>
-        <w:br/>
-        <w:t xml:space="preserve">collected are bucketed by </w:t>
+        <w:t xml:space="preserve"> date, while opened trades are bucketed by</w:t>
+        <w:br/>
       </w:r>
       <w:r>
         <w:rPr>
@@ -31869,13 +31880,11 @@
       </w:r>
       <w:r>
         <w:rPr/>
-        <w:t xml:space="preserve"> date. They answer different questions and will</w:t>
-        <w:br/>
-        <w:t>not reconcile to each other — that is correct, not a bug. That includes open</w:t>
-        <w:br/>
-        <w:t>trades: realized profit and the closed count only ever include closed trades, but</w:t>
-        <w:br/>
-        <w:t xml:space="preserve">the </w:t>
+        <w:t xml:space="preserve"> date. They answer different questions and will not reconcile to each</w:t>
+        <w:br/>
+        <w:t>other — that is correct, not a bug. That includes open trades: realized profit and</w:t>
+        <w:br/>
+        <w:t xml:space="preserve">the closed count only ever include closed trades, but the </w:t>
       </w:r>
       <w:r>
         <w:rPr>
@@ -31885,19 +31894,9 @@
       </w:r>
       <w:r>
         <w:rPr/>
-        <w:t xml:space="preserve"> and </w:t>
-      </w:r>
-      <w:r>
-        <w:rPr>
-          <w:b/>
-        </w:rPr>
-        <w:t>Credit collected</w:t>
-      </w:r>
-      <w:r>
-        <w:rPr/>
-        <w:t xml:space="preserve"> columns count every trade by its entry day,</w:t>
-        <w:br/>
-        <w:t>open ones too.</w:t>
+        <w:t xml:space="preserve"> column counts</w:t>
+        <w:br/>
+        <w:t>every trade by its entry day, open ones too.</w:t>
       </w:r>
     </w:p>
     <w:p>

</xml_diff>

<commit_message>
feat(gamma): heat map colours are two a side, maroon and purple
The Dealer Positioning colours drop from eight to four: put, put low,
call, call low. The peak and middle grades go; each side grades from its
low colour next to zero to its main colour. Both Appearance rows now run
main colour then low. Shipped: put #800000 / #bf5454, call #800080 /
#bf54bf. The wash is mixed from the low colours for every palette, and
the Flow tabs follow call, put and the two lows (ice is their own again).

Co-Authored-By: Claude Opus 5.5 <noreply@anthropic.com>
</commit_message>
<xml_diff>
--- a/docs/manuals/user-guide/user-guide.docx
+++ b/docs/manuals/user-guide/user-guide.docx
@@ -32,7 +32,7 @@
           <w:color w:val="5B6678"/>
           <w:sz w:val="18"/>
         </w:rPr>
-        <w:t>NeuralStrike · Generated 2026-10-27</w:t>
+        <w:t>NeuralStrike · Generated 2026-10-28</w:t>
       </w:r>
     </w:p>
     <w:p/>
@@ -8126,9 +8126,9 @@
       <w:r>
         <w:t xml:space="preserve"> of strike × time. Call-heavy (positive)</w:t>
         <w:br/>
-        <w:t xml:space="preserve">  strikes run deep blue → cyan; put-heavy (negative) run aubergine → magenta; near</w:t>
-        <w:br/>
-        <w:t xml:space="preserve">  zero fades to transparent so quiet strikes read as empty. Those are the shipped</w:t>
+        <w:t xml:space="preserve">  strikes grade from a light purple to purple; put-heavy (negative) from a light</w:t>
+        <w:br/>
+        <w:t xml:space="preserve">  maroon to maroon; near zero fades to transparent so quiet strikes read as empty. Those are the shipped</w:t>
         <w:br/>
         <w:t xml:space="preserve">  colours: you can choose your own in </w:t>
       </w:r>

</xml_diff>

<commit_message>
feat(gamma): strike bars wear the low colours; one restart reaches both web processes
The by-strike bars take each side's low colour (BAR_POS_COLOR /
BAR_NEG_COLOR) in every Value and Show, glow and border included. The
walls, hedge panel, well, ridge and contours keep the main pair.

On prod the app and the public Dealer Positioning screen showed different
colours: the theme was saved at 07:10, the live screens were restarted
after it and the app was not, and each reads the theme once at start.
The web-app restart (Appearance's Restart now, and Configuration's) is
now one systemctl --user --no-block restart of webgui_live and webgui.

Co-Authored-By: Claude Opus 5.5 <noreply@anthropic.com>
</commit_message>
<xml_diff>
--- a/docs/manuals/user-guide/user-guide.docx
+++ b/docs/manuals/user-guide/user-guide.docx
@@ -35118,7 +35118,7 @@
       <w:r>
         <w:t xml:space="preserve"> group. The top row is the put side and the</w:t>
         <w:br/>
-        <w:t xml:space="preserve">  bottom row the call side. </w:t>
+        <w:t xml:space="preserve">  bottom row the call side, and both rows run the same way. </w:t>
       </w:r>
       <w:r>
         <w:rPr>
@@ -35127,53 +35127,59 @@
         <w:t>Put</w:t>
       </w:r>
       <w:r>
+        <w:t xml:space="preserve"> and</w:t>
+        <w:br/>
+        <w:t xml:space="preserve">  </w:t>
+      </w:r>
+      <w:r>
+        <w:rPr>
+          <w:b/>
+        </w:rPr>
+        <w:t>Call</w:t>
+      </w:r>
+      <w:r>
+        <w:t xml:space="preserve"> are the main colours: the heat map's largest values, and the walls,</w:t>
+        <w:br/>
+        <w:t xml:space="preserve">  the hedge panel, the gravity well, the ridge plot and the contour lines.</w:t>
+        <w:br/>
+        <w:t xml:space="preserve">  </w:t>
+      </w:r>
+      <w:r>
+        <w:rPr>
+          <w:b/>
+        </w:rPr>
+        <w:t>Put low</w:t>
+      </w:r>
+      <w:r>
         <w:t xml:space="preserve"> and </w:t>
       </w:r>
       <w:r>
         <w:rPr>
           <w:b/>
         </w:rPr>
-        <w:t>Call</w:t>
-      </w:r>
-      <w:r>
-        <w:t xml:space="preserve"> are the two main colours: the</w:t>
-        <w:br/>
-        <w:t xml:space="preserve">  bars, the walls, the gravity well, the ridge plot and the contour lines use</w:t>
-        <w:br/>
-        <w:t xml:space="preserve">  them. </w:t>
-      </w:r>
-      <w:r>
-        <w:rPr>
-          <w:b/>
-        </w:rPr>
-        <w:t>Peak</w:t>
-      </w:r>
-      <w:r>
-        <w:t xml:space="preserve">, </w:t>
-      </w:r>
-      <w:r>
-        <w:rPr>
-          <w:b/>
-        </w:rPr>
-        <w:t>Mid</w:t>
-      </w:r>
-      <w:r>
-        <w:t xml:space="preserve"> and </w:t>
-      </w:r>
-      <w:r>
-        <w:rPr>
-          <w:b/>
-        </w:rPr>
-        <w:t>Low</w:t>
-      </w:r>
-      <w:r>
-        <w:t xml:space="preserve"> are the grading: the shade the heat map</w:t>
-        <w:br/>
-        <w:t xml:space="preserve">  shows for the largest, middling and smallest values on that side. Click a</w:t>
-        <w:br/>
-        <w:t xml:space="preserve">  tile to pick a colour; the strip in the preview shows the whole scale, largest</w:t>
-        <w:br/>
-        <w:t xml:space="preserve">  put on the left to largest call on the right, before you save. The Flow and</w:t>
+        <w:t>Call low</w:t>
+      </w:r>
+      <w:r>
+        <w:t xml:space="preserve"> are the smallest values, and the strike bars.</w:t>
+        <w:br/>
+        <w:t xml:space="preserve">  The heat map grades from the low colour next to zero to the main colour.</w:t>
+        <w:br/>
+        <w:t xml:space="preserve">  Click a tile to pick a colour; the strip in the preview shows the whole</w:t>
+        <w:br/>
+        <w:t xml:space="preserve">  scale, largest put on the left to largest call on the right, before you</w:t>
+        <w:br/>
+        <w:t xml:space="preserve">  save. </w:t>
+      </w:r>
+      <w:r>
+        <w:rPr>
+          <w:b/>
+        </w:rPr>
+        <w:t>Restart now</w:t>
+      </w:r>
+      <w:r>
+        <w:t xml:space="preserve"> restarts both the app and the public live screens, so</w:t>
+        <w:br/>
+        <w:t xml:space="preserve">  the two show the same colours. The Flow and</w:t>
         <w:br/>
         <w:t xml:space="preserve">  Net Prem tabs follow the same colours: their call and put lines, the strike</w:t>
         <w:br/>

</xml_diff>

<commit_message>
feat(detail): Copy ThinkorSwim order for a vertical in the Trade detail panel
The contract card gains a button that copies a "1st triggers OCO" bracket
in ThinkorSwim's paste format: the opening limit at the panel's price, then
a profit target and a stop as percentages of the fill. Debit verticals
target +100% and stop at -50%; credit verticals mirror it (-50% target,
+100% stop). Size and percentages live in config/tos_order.toml and the
Settings catalogue. Verticals only; not on the public origin.

Co-Authored-By: Claude Opus 5.5 <noreply@anthropic.com>
</commit_message>
<xml_diff>
--- a/docs/manuals/user-guide/user-guide.docx
+++ b/docs/manuals/user-guide/user-guide.docx
@@ -17733,6 +17733,254 @@
         <w:t>(credit, max loss, DTE, delta, theta, IV rank, and more) — with the full</w:t>
         <w:br/>
         <w:t>checklist at the top.</w:t>
+      </w:r>
+    </w:p>
+    <w:p>
+      <w:pPr>
+        <w:pStyle w:val="Heading3"/>
+      </w:pPr>
+      <w:r>
+        <w:rPr/>
+        <w:t>Copying a trade to ThinkorSwim</w:t>
+      </w:r>
+    </w:p>
+    <w:p>
+      <w:r>
+        <w:rPr/>
+        <w:t xml:space="preserve">For a </w:t>
+      </w:r>
+      <w:r>
+        <w:rPr>
+          <w:b/>
+        </w:rPr>
+        <w:t>vertical spread</w:t>
+      </w:r>
+      <w:r>
+        <w:rPr/>
+        <w:t>, the contract card at the top of the detail panel has</w:t>
+        <w:br/>
+        <w:t xml:space="preserve">a </w:t>
+      </w:r>
+      <w:r>
+        <w:rPr>
+          <w:b/>
+        </w:rPr>
+        <w:t>Copy ThinkorSwim order</w:t>
+      </w:r>
+      <w:r>
+        <w:rPr/>
+        <w:t xml:space="preserve"> button — on every page that shows the panel, such</w:t>
+        <w:br/>
+        <w:t>as the Market Scanner, Captured Signals and the Paper Ledger.</w:t>
+        <w:br/>
+        <w:t xml:space="preserve">It puts a </w:t>
+      </w:r>
+      <w:r>
+        <w:rPr>
+          <w:i/>
+        </w:rPr>
+        <w:t>first triggers OCO</w:t>
+      </w:r>
+      <w:r>
+        <w:rPr/>
+        <w:t xml:space="preserve"> bracket on the clipboard:</w:t>
+      </w:r>
+    </w:p>
+    <w:p>
+      <w:pPr>
+        <w:spacing w:before="80" w:after="160"/>
+        <w:ind w:left="216"/>
+        <w:shd w:val="clear" w:color="auto" w:fill="F4F6FA"/>
+      </w:pPr>
+      <w:r>
+        <w:rPr>
+          <w:rFonts w:ascii="Consolas" w:hAnsi="Consolas"/>
+          <w:color w:val="223344"/>
+          <w:sz w:val="18"/>
+        </w:rPr>
+        <w:t>BUY +1 VERTICAL SPX 100 (Weeklys) 30 OCT 26 5800/5810 CALL @1.50 LMT [TO OPEN/TO OPEN]</w:t>
+      </w:r>
+      <w:r>
+        <w:br/>
+      </w:r>
+      <w:r>
+        <w:rPr>
+          <w:rFonts w:ascii="Consolas" w:hAnsi="Consolas"/>
+          <w:color w:val="223344"/>
+          <w:sz w:val="18"/>
+        </w:rPr>
+        <w:t>SELL -1 VERTICAL SPX 100 (Weeklys) 30 OCT 26 5800/5810 CALL @TRG+100.00% LMT TRG BY #1 OCO [TO CLOSE/TO CLOSE]</w:t>
+      </w:r>
+      <w:r>
+        <w:br/>
+      </w:r>
+      <w:r>
+        <w:rPr>
+          <w:rFonts w:ascii="Consolas" w:hAnsi="Consolas"/>
+          <w:color w:val="223344"/>
+          <w:sz w:val="18"/>
+        </w:rPr>
+        <w:t>SELL -1 VERTICAL SPX 100 (Weeklys) 30 OCT 26 5800/5810 CALL STP TRG-50.00% MARK TRG BY #1 OCO [TO CLOSE/TO CLOSE]</w:t>
+      </w:r>
+    </w:p>
+    <w:p>
+      <w:r>
+        <w:rPr/>
+        <w:t xml:space="preserve">In ThinkorSwim, open </w:t>
+      </w:r>
+      <w:r>
+        <w:rPr>
+          <w:b/>
+        </w:rPr>
+        <w:t>Trade → Order Entry Tools → Paste order from clipboard</w:t>
+      </w:r>
+      <w:r>
+        <w:rPr/>
+        <w:t>,</w:t>
+        <w:br/>
+        <w:t>check the ticket, and send it there. The app never places an order.</w:t>
+      </w:r>
+    </w:p>
+    <w:p>
+      <w:pPr>
+        <w:pStyle w:val="ListBullet"/>
+      </w:pPr>
+      <w:r>
+        <w:rPr>
+          <w:b/>
+        </w:rPr>
+        <w:t>The opening order</w:t>
+      </w:r>
+      <w:r>
+        <w:t xml:space="preserve"> is a limit at the price the panel shows (the debit paid</w:t>
+        <w:br/>
+        <w:t xml:space="preserve">  or the credit received, per share).</w:t>
+      </w:r>
+    </w:p>
+    <w:p>
+      <w:pPr>
+        <w:pStyle w:val="ListBullet"/>
+      </w:pPr>
+      <w:r>
+        <w:rPr>
+          <w:b/>
+        </w:rPr>
+        <w:t>The two exits</w:t>
+      </w:r>
+      <w:r>
+        <w:t xml:space="preserve"> are percentages of the fill, so ThinkorSwim prices them from</w:t>
+        <w:br/>
+        <w:t xml:space="preserve">  what you actually paid. A </w:t>
+      </w:r>
+      <w:r>
+        <w:rPr>
+          <w:b/>
+        </w:rPr>
+        <w:t>debit</w:t>
+      </w:r>
+      <w:r>
+        <w:t xml:space="preserve"> spread takes profit at </w:t>
+      </w:r>
+      <w:r>
+        <w:rPr>
+          <w:b/>
+        </w:rPr>
+        <w:t>+100%</w:t>
+      </w:r>
+      <w:r>
+        <w:t xml:space="preserve"> (double</w:t>
+        <w:br/>
+        <w:t xml:space="preserve">  the debit) and stops at </w:t>
+      </w:r>
+      <w:r>
+        <w:rPr>
+          <w:b/>
+        </w:rPr>
+        <w:t>−50%</w:t>
+      </w:r>
+      <w:r>
+        <w:t xml:space="preserve">. A </w:t>
+      </w:r>
+      <w:r>
+        <w:rPr>
+          <w:b/>
+        </w:rPr>
+        <w:t>credit</w:t>
+      </w:r>
+      <w:r>
+        <w:t xml:space="preserve"> spread is the mirror: it buys</w:t>
+        <w:br/>
+        <w:t xml:space="preserve">  back at </w:t>
+      </w:r>
+      <w:r>
+        <w:rPr>
+          <w:b/>
+        </w:rPr>
+        <w:t>half the credit</w:t>
+      </w:r>
+      <w:r>
+        <w:t xml:space="preserve"> (−50%) and stops when the spread costs </w:t>
+      </w:r>
+      <w:r>
+        <w:rPr>
+          <w:b/>
+        </w:rPr>
+        <w:t>double the</w:t>
+        <w:br/>
+        <w:t xml:space="preserve">  credit</w:t>
+      </w:r>
+      <w:r>
+        <w:t xml:space="preserve"> (+100%). Change them, and the default size of 1, under </w:t>
+      </w:r>
+      <w:r>
+        <w:rPr>
+          <w:b/>
+        </w:rPr>
+        <w:t>Settings →</w:t>
+        <w:br/>
+        <w:t xml:space="preserve">  Configuration → ThinkorSwim order</w:t>
+      </w:r>
+      <w:r>
+        <w:t>; a change applies on the next click.</w:t>
+      </w:r>
+    </w:p>
+    <w:p>
+      <w:pPr>
+        <w:pStyle w:val="ListBullet"/>
+      </w:pPr>
+      <w:r>
+        <w:t>An expiration that is not the monthly (third-Friday) one is tagged</w:t>
+        <w:br/>
+        <w:t xml:space="preserve">  </w:t>
+      </w:r>
+      <w:r>
+        <w:rPr>
+          <w:b/>
+        </w:rPr>
+        <w:t>(Weeklys)</w:t>
+      </w:r>
+      <w:r>
+        <w:t>, as ThinkorSwim names it. The order is only as good as what the</w:t>
+        <w:br/>
+        <w:t xml:space="preserve">  panel shows: check the price, the expiration and the strikes in the ticket</w:t>
+        <w:br/>
+        <w:t xml:space="preserve">  before sending. A price may need rounding to the option's tick size.</w:t>
+      </w:r>
+    </w:p>
+    <w:p>
+      <w:pPr>
+        <w:pStyle w:val="ListBullet"/>
+      </w:pPr>
+      <w:r>
+        <w:rPr>
+          <w:b/>
+        </w:rPr>
+        <w:t>Condors, butterflies, calendars, single options and positions with shares</w:t>
+        <w:br/>
+        <w:t xml:space="preserve">  get no button.</w:t>
+      </w:r>
+      <w:r>
+        <w:t xml:space="preserve"> The button is not on the public site.</w:t>
       </w:r>
     </w:p>
     <w:p>

</xml_diff>

<commit_message>
feat(detail): Copy ThinkorSwim order for every option structure
The button now names the position from its legs: single options,
VERTICAL, STRADDLE, STRANGLE, CALENDAR, DIAGONAL, BUTTERFLY, CONDOR,
IRON CONDOR (iron butterflies included), COVERED (opening order only),
and CUSTOM for any other all-option mix. One rule orders every named
spread: +1 is long the first-listed leg of each pair, far expiry first.
The user pasted one of each of fifteen structures into ThinkorSwim and
all loaded; those lines are the tests' expected strings. A protective
put or a collar still gets no button.

Co-Authored-By: Claude Opus 5.5 <noreply@anthropic.com>
</commit_message>
<xml_diff>
--- a/docs/manuals/user-guide/user-guide.docx
+++ b/docs/manuals/user-guide/user-guide.docx
@@ -17747,33 +17747,21 @@
     <w:p>
       <w:r>
         <w:rPr/>
-        <w:t xml:space="preserve">For a </w:t>
-      </w:r>
-      <w:r>
-        <w:rPr>
-          <w:b/>
-        </w:rPr>
-        <w:t>vertical spread</w:t>
-      </w:r>
-      <w:r>
-        <w:rPr/>
-        <w:t>, the contract card at the top of the detail panel has</w:t>
-        <w:br/>
-        <w:t xml:space="preserve">a </w:t>
-      </w:r>
-      <w:r>
-        <w:rPr>
-          <w:b/>
-        </w:rPr>
-        <w:t>Copy ThinkorSwim order</w:t>
-      </w:r>
-      <w:r>
-        <w:rPr/>
-        <w:t xml:space="preserve"> button — on every page that shows the panel, such</w:t>
-        <w:br/>
-        <w:t>as the Market Scanner, Captured Signals and the Paper Ledger.</w:t>
-        <w:br/>
-        <w:t xml:space="preserve">It puts a </w:t>
+        <w:t xml:space="preserve">The contract card at the top of the detail panel has a </w:t>
+      </w:r>
+      <w:r>
+        <w:rPr>
+          <w:b/>
+        </w:rPr>
+        <w:t>Copy ThinkorSwim</w:t>
+        <w:br/>
+        <w:t>order</w:t>
+      </w:r>
+      <w:r>
+        <w:rPr/>
+        <w:t xml:space="preserve"> button — on every page that shows the panel, such as the Market Scanner,</w:t>
+        <w:br/>
+        <w:t xml:space="preserve">Captured Signals and the Paper Ledger. It puts a </w:t>
       </w:r>
       <w:r>
         <w:rPr>
@@ -17783,7 +17771,9 @@
       </w:r>
       <w:r>
         <w:rPr/>
-        <w:t xml:space="preserve"> bracket on the clipboard:</w:t>
+        <w:t xml:space="preserve"> bracket on</w:t>
+        <w:br/>
+        <w:t>the clipboard; for a debit vertical:</w:t>
       </w:r>
     </w:p>
     <w:p>
@@ -17870,7 +17860,7 @@
       <w:r>
         <w:t xml:space="preserve"> are percentages of the fill, so ThinkorSwim prices them from</w:t>
         <w:br/>
-        <w:t xml:space="preserve">  what you actually paid. A </w:t>
+        <w:t xml:space="preserve">  what you actually paid. A trade bought for a </w:t>
       </w:r>
       <w:r>
         <w:rPr>
@@ -17879,7 +17869,9 @@
         <w:t>debit</w:t>
       </w:r>
       <w:r>
-        <w:t xml:space="preserve"> spread takes profit at </w:t>
+        <w:t xml:space="preserve"> takes profit at</w:t>
+        <w:br/>
+        <w:t xml:space="preserve">  </w:t>
       </w:r>
       <w:r>
         <w:rPr>
@@ -17888,9 +17880,7 @@
         <w:t>+100%</w:t>
       </w:r>
       <w:r>
-        <w:t xml:space="preserve"> (double</w:t>
-        <w:br/>
-        <w:t xml:space="preserve">  the debit) and stops at </w:t>
+        <w:t xml:space="preserve"> (double the debit) and stops at </w:t>
       </w:r>
       <w:r>
         <w:rPr>
@@ -17899,7 +17889,9 @@
         <w:t>−50%</w:t>
       </w:r>
       <w:r>
-        <w:t xml:space="preserve">. A </w:t>
+        <w:t>. A trade sold for a</w:t>
+        <w:br/>
+        <w:t xml:space="preserve">  </w:t>
       </w:r>
       <w:r>
         <w:rPr>
@@ -17908,9 +17900,7 @@
         <w:t>credit</w:t>
       </w:r>
       <w:r>
-        <w:t xml:space="preserve"> spread is the mirror: it buys</w:t>
-        <w:br/>
-        <w:t xml:space="preserve">  back at </w:t>
+        <w:t xml:space="preserve"> is the mirror: it buys back at </w:t>
       </w:r>
       <w:r>
         <w:rPr>
@@ -17919,29 +17909,31 @@
         <w:t>half the credit</w:t>
       </w:r>
       <w:r>
-        <w:t xml:space="preserve"> (−50%) and stops when the spread costs </w:t>
-      </w:r>
-      <w:r>
-        <w:rPr>
-          <w:b/>
-        </w:rPr>
-        <w:t>double the</w:t>
-        <w:br/>
-        <w:t xml:space="preserve">  credit</w:t>
-      </w:r>
-      <w:r>
-        <w:t xml:space="preserve"> (+100%). Change them, and the default size of 1, under </w:t>
-      </w:r>
-      <w:r>
-        <w:rPr>
-          <w:b/>
-        </w:rPr>
-        <w:t>Settings →</w:t>
-        <w:br/>
-        <w:t xml:space="preserve">  Configuration → ThinkorSwim order</w:t>
-      </w:r>
-      <w:r>
-        <w:t>; a change applies on the next click.</w:t>
+        <w:t xml:space="preserve"> (−50%) and stops</w:t>
+        <w:br/>
+        <w:t xml:space="preserve">  when it costs </w:t>
+      </w:r>
+      <w:r>
+        <w:rPr>
+          <w:b/>
+        </w:rPr>
+        <w:t>double the credit</w:t>
+      </w:r>
+      <w:r>
+        <w:t xml:space="preserve"> (+100%). Change them, and the default size</w:t>
+        <w:br/>
+        <w:t xml:space="preserve">  of 1, under </w:t>
+      </w:r>
+      <w:r>
+        <w:rPr>
+          <w:b/>
+        </w:rPr>
+        <w:t>Settings → Configuration → ThinkorSwim order</w:t>
+      </w:r>
+      <w:r>
+        <w:t>; a change applies</w:t>
+        <w:br/>
+        <w:t xml:space="preserve">  on the next click.</w:t>
       </w:r>
     </w:p>
     <w:p>
@@ -17949,6 +17941,99 @@
         <w:pStyle w:val="ListBullet"/>
       </w:pPr>
       <w:r>
+        <w:rPr>
+          <w:b/>
+        </w:rPr>
+        <w:t>Every option structure gets the button</w:t>
+      </w:r>
+      <w:r>
+        <w:t>: a single call or put, verticals,</w:t>
+        <w:br/>
+        <w:t xml:space="preserve">  straddles, strangles, calendars, diagonals (far month listed first),</w:t>
+        <w:br/>
+        <w:t xml:space="preserve">  butterflies, condors, iron condors and iron butterflies (which ThinkorSwim</w:t>
+        <w:br/>
+        <w:t xml:space="preserve">  takes as an IRON CONDOR with equal short strikes). Anything else that is all</w:t>
+        <w:br/>
+        <w:t xml:space="preserve">  options — a ratio, a backspread, a broken-wing butterfly — is written as a</w:t>
+        <w:br/>
+        <w:t xml:space="preserve">  ThinkorSwim </w:t>
+      </w:r>
+      <w:r>
+        <w:rPr>
+          <w:b/>
+        </w:rPr>
+        <w:t>CUSTOM</w:t>
+      </w:r>
+      <w:r>
+        <w:t xml:space="preserve"> order (</w:t>
+      </w:r>
+      <w:r>
+        <w:rPr>
+          <w:rFonts w:ascii="Consolas" w:hAnsi="Consolas"/>
+          <w:color w:val="334455"/>
+          <w:sz w:val="19"/>
+        </w:rPr>
+        <w:t>BUY +1 -1/2 CUSTOM …</w:t>
+      </w:r>
+      <w:r>
+        <w:t>). Each of these pasted</w:t>
+        <w:br/>
+        <w:t xml:space="preserve">  correctly into ThinkorSwim on 2026-10-28.</w:t>
+      </w:r>
+    </w:p>
+    <w:p>
+      <w:pPr>
+        <w:pStyle w:val="ListBullet"/>
+      </w:pPr>
+      <w:r>
+        <w:rPr>
+          <w:b/>
+        </w:rPr>
+        <w:t>A covered call</w:t>
+      </w:r>
+      <w:r>
+        <w:t xml:space="preserve"> copies the opening order only (</w:t>
+      </w:r>
+      <w:r>
+        <w:rPr>
+          <w:rFonts w:ascii="Consolas" w:hAnsi="Consolas"/>
+          <w:color w:val="334455"/>
+          <w:sz w:val="19"/>
+        </w:rPr>
+        <w:t>BUY +100 COVERED …</w:t>
+      </w:r>
+      <w:r>
+        <w:t>): a</w:t>
+        <w:br/>
+        <w:t xml:space="preserve">  percentage of a price that is mostly the shares is no target or stop. A</w:t>
+        <w:br/>
+        <w:t xml:space="preserve">  </w:t>
+      </w:r>
+      <w:r>
+        <w:rPr>
+          <w:b/>
+        </w:rPr>
+        <w:t>protective put</w:t>
+      </w:r>
+      <w:r>
+        <w:t xml:space="preserve"> or a </w:t>
+      </w:r>
+      <w:r>
+        <w:rPr>
+          <w:b/>
+        </w:rPr>
+        <w:t>collar</w:t>
+      </w:r>
+      <w:r>
+        <w:t xml:space="preserve"> gets no button.</w:t>
+      </w:r>
+    </w:p>
+    <w:p>
+      <w:pPr>
+        <w:pStyle w:val="ListBullet"/>
+      </w:pPr>
+      <w:r>
         <w:t>An expiration that is not the monthly (third-Friday) one is tagged</w:t>
         <w:br/>
         <w:t xml:space="preserve">  </w:t>
@@ -17972,15 +18057,7 @@
         <w:pStyle w:val="ListBullet"/>
       </w:pPr>
       <w:r>
-        <w:rPr>
-          <w:b/>
-        </w:rPr>
-        <w:t>Condors, butterflies, calendars, single options and positions with shares</w:t>
-        <w:br/>
-        <w:t xml:space="preserve">  get no button.</w:t>
-      </w:r>
-      <w:r>
-        <w:t xml:space="preserve"> The button is not on the public site.</w:t>
+        <w:t>The button is not on the public site.</w:t>
       </w:r>
     </w:p>
     <w:p>

</xml_diff>

<commit_message>
docs(paper): the daily SPY condor in the manuals, the Ledger guide and the CHANGELOG
User Guide (Paper Ledger), a Technical Reference section with the pick and
stop arithmetic, the Ledger's hover guide, and the loop test's stub list
gains run_daily_condor (its guard test caught the new branch).

Co-Authored-By: Claude Opus 5.5 <noreply@anthropic.com>
</commit_message>
<xml_diff>
--- a/docs/manuals/user-guide/user-guide.docx
+++ b/docs/manuals/user-guide/user-guide.docx
@@ -2266,30 +2266,39 @@
       </w:r>
       <w:r>
         <w:rPr/>
-        <w:t xml:space="preserve"> is a thumbnail menu of them, and the site's</w:t>
-        <w:br/>
-      </w:r>
-      <w:r>
-        <w:rPr>
-          <w:b/>
-        </w:rPr>
+        <w:t xml:space="preserve"> is the </w:t>
+      </w:r>
+      <w:r>
+        <w:rPr>
+          <w:b/>
+        </w:rPr>
+        <w:t>Live Desk</w:t>
+      </w:r>
+      <w:r>
+        <w:rPr/>
+        <w:t>: the twelve screens'</w:t>
+        <w:br/>
+        <w:t>thumbnails on a slowly turning wall. Drag it, or use the arrow buttons or keys.</w:t>
+        <w:br/>
+        <w:t>Click a side screen to bring it to the front and the front one to open it. The</w:t>
+        <w:br/>
+        <w:t>group chips turn it to Market regime, Dealer positioning or Sector rotation. A</w:t>
+        <w:br/>
+        <w:t xml:space="preserve">row under the wall links Option Signals, the Strategy Finder, Rescue, </w:t>
+      </w:r>
+      <w:r>
+        <w:rPr>
+          <w:b/>
+        </w:rPr>
+        <w:t>Strategy</w:t>
+        <w:br/>
         <w:t>Tools</w:t>
       </w:r>
       <w:r>
         <w:rPr/>
-        <w:t xml:space="preserve"> menu links Option Signals, the Strategy Finder, Rescue, </w:t>
-      </w:r>
-      <w:r>
-        <w:rPr>
-          <w:b/>
-        </w:rPr>
-        <w:t>Strategy</w:t>
-        <w:br/>
-        <w:t>Tools</w:t>
-      </w:r>
-      <w:r>
-        <w:rPr/>
-        <w:t xml:space="preserve"> (it opens the Calculator) and Market News.</w:t>
+        <w:t xml:space="preserve"> (it opens the Calculator) and Market News. With JavaScript off the same</w:t>
+        <w:br/>
+        <w:t>page is a plain grid of the thumbnails.</w:t>
       </w:r>
     </w:p>
     <w:p>
@@ -23190,6 +23199,267 @@
       <w:r>
         <w:br/>
         <w:t xml:space="preserve">  tile. The Symbol dossier does not list an open idea as a position you hold.</w:t>
+      </w:r>
+    </w:p>
+    <w:p>
+      <w:r>
+        <w:rPr>
+          <w:b/>
+        </w:rPr>
+        <w:t>The daily SPY condor.</w:t>
+      </w:r>
+      <w:r>
+        <w:rPr/>
+        <w:t xml:space="preserve"> Every trading morning at </w:t>
+      </w:r>
+      <w:r>
+        <w:rPr>
+          <w:b/>
+        </w:rPr>
+        <w:t>08:45 CT</w:t>
+      </w:r>
+      <w:r>
+        <w:rPr/>
+        <w:t xml:space="preserve"> the app books one</w:t>
+        <w:br/>
+        <w:t xml:space="preserve">0-DTE iron condor on SPY into this ledger, tagged </w:t>
+      </w:r>
+      <w:r>
+        <w:rPr>
+          <w:b/>
+        </w:rPr>
+        <w:t>SPY condor</w:t>
+      </w:r>
+      <w:r>
+        <w:rPr/>
+        <w:t>, so one fixed,</w:t>
+        <w:br/>
+        <w:t>mechanical trade is measured day after day. It is set under Settings →</w:t>
+        <w:br/>
+        <w:t xml:space="preserve">Configuration → </w:t>
+      </w:r>
+      <w:r>
+        <w:rPr>
+          <w:i/>
+        </w:rPr>
+        <w:t>Daily SPY condor in the Paper Ledger</w:t>
+      </w:r>
+      <w:r>
+        <w:rPr/>
+        <w:t xml:space="preserve"> (it ships on), and its time</w:t>
+        <w:br/>
+        <w:t xml:space="preserve">under </w:t>
+      </w:r>
+      <w:r>
+        <w:rPr>
+          <w:i/>
+        </w:rPr>
+        <w:t>Daily SPY condor</w:t>
+      </w:r>
+      <w:r>
+        <w:rPr/>
+        <w:t xml:space="preserve"> in the schedule.</w:t>
+      </w:r>
+    </w:p>
+    <w:p>
+      <w:pPr>
+        <w:pStyle w:val="ListBullet"/>
+      </w:pPr>
+      <w:r>
+        <w:rPr>
+          <w:b/>
+        </w:rPr>
+        <w:t>The trade.</w:t>
+      </w:r>
+      <w:r>
+        <w:t xml:space="preserve"> On today's expiry: sell the put whose delta is nearest </w:t>
+      </w:r>
+      <w:r>
+        <w:rPr>
+          <w:b/>
+        </w:rPr>
+        <w:t>0.15</w:t>
+      </w:r>
+      <w:r>
+        <w:t xml:space="preserve"> and</w:t>
+        <w:br/>
+        <w:t xml:space="preserve">  buy the put </w:t>
+      </w:r>
+      <w:r>
+        <w:rPr>
+          <w:b/>
+        </w:rPr>
+        <w:t>$5</w:t>
+      </w:r>
+      <w:r>
+        <w:t xml:space="preserve"> below it; sell the call whose delta is nearest 0.15 and buy the</w:t>
+        <w:br/>
+        <w:t xml:space="preserve">  call $5 above it. One condor (</w:t>
+      </w:r>
+      <w:r>
+        <w:rPr>
+          <w:i/>
+        </w:rPr>
+        <w:t>Condors per day</w:t>
+      </w:r>
+      <w:r>
+        <w:t>). The price is a realistic fill</w:t>
+        <w:br/>
+        <w:t xml:space="preserve">  from a chain fetched at 08:45 (a little worse than the midpoint), and the</w:t>
+        <w:br/>
+        <w:t xml:space="preserve">  commission for opening and closing is taken at entry.</w:t>
+      </w:r>
+    </w:p>
+    <w:p>
+      <w:pPr>
+        <w:pStyle w:val="ListBullet"/>
+      </w:pPr>
+      <w:r>
+        <w:rPr>
+          <w:b/>
+        </w:rPr>
+        <w:t>The stop.</w:t>
+      </w:r>
+      <w:r>
+        <w:t xml:space="preserve"> It closes when its loss reaches </w:t>
+      </w:r>
+      <w:r>
+        <w:rPr>
+          <w:b/>
+        </w:rPr>
+        <w:t>2x the credit</w:t>
+      </w:r>
+      <w:r>
+        <w:t xml:space="preserve"> (</w:t>
+      </w:r>
+      <w:r>
+        <w:rPr>
+          <w:i/>
+        </w:rPr>
+        <w:t>Stop at a loss</w:t>
+        <w:br/>
+        <w:t xml:space="preserve">  of</w:t>
+      </w:r>
+      <w:r>
+        <w:t>): with $1.00 taken in, when buying it back costs $3.00. It is checked with the</w:t>
+        <w:br/>
+        <w:t xml:space="preserve">  trade ideas, </w:t>
+      </w:r>
+      <w:r>
+        <w:rPr>
+          <w:b/>
+        </w:rPr>
+        <w:t>every 5 minutes</w:t>
+      </w:r>
+      <w:r>
+        <w:t>, and closes at that check's price, which can be</w:t>
+        <w:br/>
+        <w:t xml:space="preserve">  past $3.00 if SPY jumped between checks. There is no profit target.</w:t>
+      </w:r>
+    </w:p>
+    <w:p>
+      <w:pPr>
+        <w:pStyle w:val="ListBullet"/>
+      </w:pPr>
+      <w:r>
+        <w:rPr>
+          <w:b/>
+        </w:rPr>
+        <w:t>Otherwise held to the close</w:t>
+      </w:r>
+      <w:r>
+        <w:t xml:space="preserve"> and settled at intrinsic value in the 15:05 CT</w:t>
+        <w:br/>
+        <w:t xml:space="preserve">  pass.</w:t>
+      </w:r>
+    </w:p>
+    <w:p>
+      <w:pPr>
+        <w:pStyle w:val="ListBullet"/>
+      </w:pPr>
+      <w:r>
+        <w:rPr>
+          <w:b/>
+        </w:rPr>
+        <w:t>No trade that day</w:t>
+      </w:r>
+      <w:r>
+        <w:t xml:space="preserve"> on weekends and market holidays, when a condor is already</w:t>
+        <w:br/>
+        <w:t xml:space="preserve">  booked today, when the service starts after 08:55, or when the chain cannot price</w:t>
+        <w:br/>
+        <w:t xml:space="preserve">  it (no usable delta within 0.05 of the target, </w:t>
+      </w:r>
+      <w:r>
+        <w:rPr>
+          <w:i/>
+        </w:rPr>
+        <w:t>Largest delta miss</w:t>
+      </w:r>
+      <w:r>
+        <w:t>; no strike</w:t>
+        <w:br/>
+        <w:t xml:space="preserve">  exactly $5 out; a leg with no quote). The reason is in the service log; the day is</w:t>
+        <w:br/>
+        <w:t xml:space="preserve">  not retried. The row's note records the two deltas the shorts were picked at.</w:t>
+      </w:r>
+    </w:p>
+    <w:p>
+      <w:pPr>
+        <w:pStyle w:val="ListBullet"/>
+      </w:pPr>
+      <w:r>
+        <w:rPr>
+          <w:b/>
+        </w:rPr>
+        <w:t>Like an idea row, but not an idea.</w:t>
+      </w:r>
+      <w:r>
+        <w:t xml:space="preserve"> It is not held to the risk limits, the</w:t>
+        <w:br/>
+        <w:t xml:space="preserve">  automatic exit rules or the expiry pass above, and </w:t>
+      </w:r>
+      <w:r>
+        <w:rPr>
+          <w:b/>
+        </w:rPr>
+        <w:t>Delete all closed</w:t>
+      </w:r>
+      <w:r>
+        <w:t xml:space="preserve"> keeps it</w:t>
+        <w:br/>
+        <w:t xml:space="preserve">  on file. It shows under </w:t>
+      </w:r>
+      <w:r>
+        <w:rPr>
+          <w:b/>
+        </w:rPr>
+        <w:t>All</w:t>
+      </w:r>
+      <w:r>
+        <w:t xml:space="preserve"> only, not </w:t>
+      </w:r>
+      <w:r>
+        <w:rPr>
+          <w:b/>
+        </w:rPr>
+        <w:t>My trades</w:t>
+      </w:r>
+      <w:r>
+        <w:t xml:space="preserve"> or </w:t>
+      </w:r>
+      <w:r>
+        <w:rPr>
+          <w:b/>
+        </w:rPr>
+        <w:t>Trade ideas</w:t>
+      </w:r>
+      <w:r>
+        <w:t>; the</w:t>
+        <w:br/>
+        <w:t xml:space="preserve">  weekly idea review never rates it, and the EOD Report and the Symbol dossier do</w:t>
+        <w:br/>
+        <w:t xml:space="preserve">  not count it as yours.</w:t>
       </w:r>
     </w:p>
     <w:p>

</xml_diff>

<commit_message>
feat(scalp): a running icon for every call since the open; colour and icons in the glance
The glance's 08:36 call column becomes "Calls since the open": one icon per
call, oldest first (arrow, dash for no signal, ringed arrow for a measured
edge), with the time and words in its tooltip. Every slot was already in the
view, so the service is unchanged.

Headers are one word and the widest cells narrower: the chance's fit line, the
edge and caution words and the full wall clause move behind icons as tooltips.
Direction, the trade's lean and the room are coloured. The chance's arrow is
coloured against the usual rate, its number only when the weights beat that
rate on unseen days. The Today's calls directions are coloured and the morning
inputs' verdicts carry an icon.

Co-Authored-By: Claude Opus 5.5 <noreply@anthropic.com>
</commit_message>
<xml_diff>
--- a/docs/manuals/user-guide/user-guide.docx
+++ b/docs/manuals/user-guide/user-guide.docx
@@ -32,7 +32,7 @@
           <w:color w:val="5B6678"/>
           <w:sz w:val="18"/>
         </w:rPr>
-        <w:t>NeuralStrike · Generated 2026-10-29</w:t>
+        <w:t>NeuralStrike · Generated 2026-10-30</w:t>
       </w:r>
     </w:p>
     <w:p/>
@@ -24840,21 +24840,88 @@
       </w:r>
       <w:r>
         <w:rPr/>
-        <w:t xml:space="preserve"> (↑ Up, ↓ Down or no direction, and which call that is),</w:t>
-        <w:br/>
-        <w:t xml:space="preserve">the </w:t>
-      </w:r>
-      <w:r>
-        <w:rPr>
-          <w:b/>
-        </w:rPr>
-        <w:t>trade with the call</w:t>
-      </w:r>
-      <w:r>
-        <w:rPr/>
-        <w:t xml:space="preserve"> (the trade with a measured edge instead, when there is one),</w:t>
-        <w:br/>
-        <w:t xml:space="preserve">its </w:t>
+        <w:t xml:space="preserve"> (up, down or no direction, and which call that is), the</w:t>
+        <w:br/>
+      </w:r>
+      <w:r>
+        <w:rPr>
+          <w:b/>
+        </w:rPr>
+        <w:t>Trade</w:t>
+      </w:r>
+      <w:r>
+        <w:rPr/>
+        <w:t xml:space="preserve"> with the call (the trade with a measured edge instead, when there is one), its</w:t>
+        <w:br/>
+      </w:r>
+      <w:r>
+        <w:rPr>
+          <w:b/>
+        </w:rPr>
+        <w:t>Chance</w:t>
+      </w:r>
+      <w:r>
+        <w:rPr/>
+        <w:t xml:space="preserve"> of target, how often it </w:t>
+      </w:r>
+      <w:r>
+        <w:rPr>
+          <w:b/>
+        </w:rPr>
+        <w:t>usually</w:t>
+      </w:r>
+      <w:r>
+        <w:rPr/>
+        <w:t xml:space="preserve"> wins, the </w:t>
+      </w:r>
+      <w:r>
+        <w:rPr>
+          <w:b/>
+        </w:rPr>
+        <w:t>Room</w:t>
+      </w:r>
+      <w:r>
+        <w:rPr/>
+        <w:t xml:space="preserve"> to the wall, and</w:t>
+        <w:br/>
+      </w:r>
+      <w:r>
+        <w:rPr>
+          <w:b/>
+        </w:rPr>
+        <w:t>Calls since the open</w:t>
+      </w:r>
+      <w:r>
+        <w:rPr/>
+        <w:t>: one icon per call, oldest on the left, starting with the 08:36</w:t>
+        <w:br/>
+        <w:t>call. An up arrow is up, a down arrow is down, a dash is no signal, and an arrow in a ring</w:t>
+        <w:br/>
+        <w:t>is a call that had a measured edge; hover an icon for its time and what it said. The row</w:t>
+        <w:br/>
+        <w:t>reads the latest 15-minute call once the first one is out (08:51) and the 08:36 call</w:t>
+        <w:br/>
+        <w:t>before that.</w:t>
+      </w:r>
+    </w:p>
+    <w:p>
+      <w:r>
+        <w:rPr/>
+        <w:t>Green leans up and red leans down, for the direction and for the trade (a long call and a</w:t>
+        <w:br/>
+        <w:t>put credit spread lean up). Room is green when the target is short of the wall and red</w:t>
+        <w:br/>
+        <w:t>when the wall is inside the target or already passed. Beside the chance, a small arrow</w:t>
+        <w:br/>
+        <w:t>says which side of the usual rate it is on (none within one point) and an icon says</w:t>
+        <w:br/>
+        <w:t>whether it beat that rate on unseen days: a tick for yes, a question mark for no, an</w:t>
+        <w:br/>
+        <w:t>hourglass when not fitted yet. Only a proven figure is itself coloured. A call that is no</w:t>
+        <w:br/>
+        <w:t>longer current keeps its words and loses its colour; earlier calls today keep theirs, as</w:t>
+        <w:br/>
+        <w:t xml:space="preserve">the day's record. </w:t>
       </w:r>
       <w:r>
         <w:rPr>
@@ -24864,29 +24931,991 @@
       </w:r>
       <w:r>
         <w:rPr/>
-        <w:t xml:space="preserve">, how often it </w:t>
-      </w:r>
-      <w:r>
-        <w:rPr>
-          <w:b/>
-        </w:rPr>
-        <w:t>usually wins</w:t>
-      </w:r>
-      <w:r>
-        <w:rPr/>
-        <w:t xml:space="preserve">, the </w:t>
-      </w:r>
-      <w:r>
-        <w:rPr>
-          <w:b/>
-        </w:rPr>
-        <w:t>room to the wall</w:t>
-      </w:r>
-      <w:r>
-        <w:rPr/>
-        <w:t>, and</w:t>
-        <w:br/>
-        <w:t xml:space="preserve">the </w:t>
+        <w:t xml:space="preserve"> is explained under </w:t>
+      </w:r>
+      <w:r>
+        <w:rPr>
+          <w:i/>
+        </w:rPr>
+        <w:t>The chance of target</w:t>
+      </w:r>
+      <w:r>
+        <w:rPr/>
+        <w:t>, below;</w:t>
+        <w:br/>
+        <w:t>read it beside the usual rate, never instead of it.</w:t>
+      </w:r>
+    </w:p>
+    <w:p>
+      <w:r>
+        <w:rPr>
+          <w:b/>
+        </w:rPr>
+        <w:t>Everything else is below it, in closed sections:</w:t>
+      </w:r>
+      <w:r>
+        <w:rPr/>
+        <w:t xml:space="preserve"> one per symbol (its 15-minute</w:t>
+        <w:br/>
+        <w:t xml:space="preserve">call, </w:t>
+      </w:r>
+      <w:r>
+        <w:rPr>
+          <w:b/>
+        </w:rPr>
+        <w:t>what moved its chance</w:t>
+      </w:r>
+      <w:r>
+        <w:rPr/>
+        <w:t xml:space="preserve"> and its 08:36 call), then </w:t>
+      </w:r>
+      <w:r>
+        <w:rPr>
+          <w:b/>
+        </w:rPr>
+        <w:t>Today's calls</w:t>
+      </w:r>
+      <w:r>
+        <w:rPr/>
+        <w:t>, the</w:t>
+        <w:br/>
+      </w:r>
+      <w:r>
+        <w:rPr>
+          <w:b/>
+        </w:rPr>
+        <w:t>Context</w:t>
+      </w:r>
+      <w:r>
+        <w:rPr/>
+        <w:t xml:space="preserve"> (headlines, flow alerts and the report) and the </w:t>
+      </w:r>
+      <w:r>
+        <w:rPr>
+          <w:b/>
+        </w:rPr>
+        <w:t>Scorecard</w:t>
+      </w:r>
+      <w:r>
+        <w:rPr/>
+        <w:t>. Click a</w:t>
+        <w:br/>
+        <w:t>heading to open it; a section you opened stays open when a new call arrives.</w:t>
+      </w:r>
+    </w:p>
+    <w:p>
+      <w:pPr>
+        <w:pStyle w:val="ListBullet"/>
+      </w:pPr>
+      <w:r>
+        <w:rPr>
+          <w:b/>
+        </w:rPr>
+        <w:t>Most mornings the answer is "No measured edge".</w:t>
+      </w:r>
+      <w:r>
+        <w:t xml:space="preserve"> That is normal, not an error: the</w:t>
+        <w:br/>
+        <w:t xml:space="preserve">  page then shows each trade's </w:t>
+      </w:r>
+      <w:r>
+        <w:rPr>
+          <w:b/>
+        </w:rPr>
+        <w:t>usual win rate</w:t>
+      </w:r>
+      <w:r>
+        <w:t xml:space="preserve"> and nothing more. Treat it as "nothing</w:t>
+        <w:br/>
+        <w:t xml:space="preserve">  here beats chance today".</w:t>
+      </w:r>
+    </w:p>
+    <w:p>
+      <w:pPr>
+        <w:pStyle w:val="ListBullet"/>
+      </w:pPr>
+      <w:r>
+        <w:t xml:space="preserve">The four trades are named by that morning's contract (an up open: </w:t>
+      </w:r>
+      <w:r>
+        <w:rPr>
+          <w:b/>
+        </w:rPr>
+        <w:t>Long call</w:t>
+      </w:r>
+      <w:r>
+        <w:t xml:space="preserve">, </w:t>
+      </w:r>
+      <w:r>
+        <w:rPr>
+          <w:b/>
+        </w:rPr>
+        <w:t>Long</w:t>
+        <w:br/>
+        <w:t xml:space="preserve">  put</w:t>
+      </w:r>
+      <w:r>
+        <w:t xml:space="preserve">, </w:t>
+      </w:r>
+      <w:r>
+        <w:rPr>
+          <w:b/>
+        </w:rPr>
+        <w:t>Put credit spread</w:t>
+      </w:r>
+      <w:r>
+        <w:t xml:space="preserve">, </w:t>
+      </w:r>
+      <w:r>
+        <w:rPr>
+          <w:b/>
+        </w:rPr>
+        <w:t>Call credit spread</w:t>
+      </w:r>
+      <w:r>
+        <w:t>; a down open mirrors it), each</w:t>
+        <w:br/>
+        <w:t xml:space="preserve">  marked as </w:t>
+      </w:r>
+      <w:r>
+        <w:rPr>
+          <w:i/>
+        </w:rPr>
+        <w:t>with</w:t>
+      </w:r>
+      <w:r>
+        <w:t xml:space="preserve"> or </w:t>
+      </w:r>
+      <w:r>
+        <w:rPr>
+          <w:i/>
+        </w:rPr>
+        <w:t>against</w:t>
+      </w:r>
+      <w:r>
+        <w:t xml:space="preserve"> the opening move. A </w:t>
+      </w:r>
+      <w:r>
+        <w:rPr>
+          <w:b/>
+        </w:rPr>
+        <w:t>win</w:t>
+      </w:r>
+      <w:r>
+        <w:t xml:space="preserve"> means +50% before −50% within</w:t>
+        <w:br/>
+        <w:t xml:space="preserve">  60 minutes. The win rates are always </w:t>
+      </w:r>
+      <w:r>
+        <w:rPr>
+          <w:b/>
+        </w:rPr>
+        <w:t>modelled</w:t>
+      </w:r>
+      <w:r>
+        <w:t xml:space="preserve"> (priced from the volatility index);</w:t>
+        <w:br/>
+        <w:t xml:space="preserve">  the </w:t>
+      </w:r>
+      <w:r>
+        <w:rPr>
+          <w:b/>
+        </w:rPr>
+        <w:t>Entry</w:t>
+      </w:r>
+      <w:r>
+        <w:t xml:space="preserve"> column shows the live 08:36 quote where the chain had the strike and says</w:t>
+        <w:br/>
+        <w:t xml:space="preserve">  </w:t>
+      </w:r>
+      <w:r>
+        <w:rPr>
+          <w:b/>
+        </w:rPr>
+        <w:t>modelled</w:t>
+      </w:r>
+      <w:r>
+        <w:t xml:space="preserve"> where it did not, and the </w:t>
+      </w:r>
+      <w:r>
+        <w:rPr>
+          <w:b/>
+        </w:rPr>
+        <w:t>Underlying move</w:t>
+      </w:r>
+      <w:r>
+        <w:t xml:space="preserve"> distances use the chain's</w:t>
+        <w:br/>
+        <w:t xml:space="preserve">  volatility when there is one.</w:t>
+      </w:r>
+    </w:p>
+    <w:p>
+      <w:pPr>
+        <w:pStyle w:val="ListBullet"/>
+      </w:pPr>
+      <w:r>
+        <w:rPr>
+          <w:b/>
+        </w:rPr>
+        <w:t>Measured edge</w:t>
+      </w:r>
+      <w:r>
+        <w:t xml:space="preserve"> marks the single trade whose bucket rate is reliably better than</w:t>
+        <w:br/>
+        <w:t xml:space="preserve">  usual (rare). </w:t>
+      </w:r>
+      <w:r>
+        <w:rPr>
+          <w:b/>
+        </w:rPr>
+        <w:t>Caution: measured to lose more often than usual</w:t>
+      </w:r>
+      <w:r>
+        <w:t xml:space="preserve"> marks a bucket that</w:t>
+        <w:br/>
+        <w:t xml:space="preserve">  is reliably worse — a reason to stay out, not to take the other side.</w:t>
+      </w:r>
+    </w:p>
+    <w:p>
+      <w:pPr>
+        <w:pStyle w:val="ListBullet"/>
+      </w:pPr>
+      <w:r>
+        <w:rPr>
+          <w:b/>
+        </w:rPr>
+        <w:t>Morning inputs</w:t>
+      </w:r>
+      <w:r>
+        <w:t xml:space="preserve"> lists each premarket reading and whether it </w:t>
+      </w:r>
+      <w:r>
+        <w:rPr>
+          <w:b/>
+        </w:rPr>
+        <w:t>agrees</w:t>
+      </w:r>
+      <w:r>
+        <w:t>,</w:t>
+        <w:br/>
+        <w:t xml:space="preserve">  </w:t>
+      </w:r>
+      <w:r>
+        <w:rPr>
+          <w:b/>
+        </w:rPr>
+        <w:t>disagrees</w:t>
+      </w:r>
+      <w:r>
+        <w:t xml:space="preserve">, sits in the </w:t>
+      </w:r>
+      <w:r>
+        <w:rPr>
+          <w:b/>
+        </w:rPr>
+        <w:t>dead zone</w:t>
+      </w:r>
+      <w:r>
+        <w:t xml:space="preserve">, or is </w:t>
+      </w:r>
+      <w:r>
+        <w:rPr>
+          <w:b/>
+        </w:rPr>
+        <w:t>absent</w:t>
+      </w:r>
+      <w:r>
+        <w:t>. An absent input is never a</w:t>
+        <w:br/>
+        <w:t xml:space="preserve">  disagreement.</w:t>
+      </w:r>
+    </w:p>
+    <w:p>
+      <w:pPr>
+        <w:pStyle w:val="ListBullet"/>
+      </w:pPr>
+      <w:r>
+        <w:rPr>
+          <w:b/>
+        </w:rPr>
+        <w:t>Refresh</w:t>
+      </w:r>
+      <w:r>
+        <w:t xml:space="preserve"> asks the service to rebuild the call. A call already shown today stays as</w:t>
+        <w:br/>
+        <w:t xml:space="preserve">  published; Refresh only fills in a symbol that has none yet, and no new call is built</w:t>
+        <w:br/>
+        <w:t xml:space="preserve">  after </w:t>
+      </w:r>
+      <w:r>
+        <w:rPr>
+          <w:b/>
+        </w:rPr>
+        <w:t>09:35 CT</w:t>
+      </w:r>
+      <w:r>
+        <w:t>, an hour after the 08:35 entry, because the trade it would describe</w:t>
+        <w:br/>
+        <w:t xml:space="preserve">  is over by then. A symbol whose morning had a direction but was never called reads</w:t>
+        <w:br/>
+        <w:t xml:space="preserve">  </w:t>
+      </w:r>
+      <w:r>
+        <w:rPr>
+          <w:b/>
+        </w:rPr>
+        <w:t>missed the call window</w:t>
+      </w:r>
+      <w:r>
+        <w:t>; one that opened flat or had no opening bar still says so,</w:t>
+        <w:br/>
+        <w:t xml:space="preserve">  with its inputs. (The 15-minute calls below follow their own rule for Refresh.)</w:t>
+      </w:r>
+    </w:p>
+    <w:p>
+      <w:pPr>
+        <w:pStyle w:val="ListBullet"/>
+      </w:pPr>
+      <w:r>
+        <w:t>Before 08:36 (a Refresh pressed at 08:35 waits for the 08:36 call too), on a closed</w:t>
+        <w:br/>
+        <w:t xml:space="preserve">  day, or after a failed refresh the page shows the </w:t>
+      </w:r>
+      <w:r>
+        <w:rPr>
+          <w:b/>
+        </w:rPr>
+        <w:t>last call</w:t>
+      </w:r>
+      <w:r>
+        <w:t>, labelled with its</w:t>
+        <w:br/>
+        <w:t xml:space="preserve">  day, under a line saying when the next call is due.</w:t>
+      </w:r>
+    </w:p>
+    <w:p>
+      <w:pPr>
+        <w:pStyle w:val="ListBullet"/>
+      </w:pPr>
+      <w:r>
+        <w:rPr>
+          <w:b/>
+        </w:rPr>
+        <w:t>Context: headlines, flow alerts and the report</w:t>
+      </w:r>
+      <w:r>
+        <w:t xml:space="preserve"> is context only. The flow-alert</w:t>
+        <w:br/>
+        <w:t xml:space="preserve">  list is shown, not fed in: the chance of target reads its own count of bullish and</w:t>
+        <w:br/>
+        <w:t xml:space="preserve">  bearish flow in the window before the call. The headlines and the report link are in</w:t>
+        <w:br/>
+        <w:t xml:space="preserve">  neither the usual win rates nor the chance.</w:t>
+      </w:r>
+    </w:p>
+    <w:p>
+      <w:pPr>
+        <w:pStyle w:val="ListBullet"/>
+      </w:pPr>
+      <w:r>
+        <w:rPr>
+          <w:b/>
+        </w:rPr>
+        <w:t>Scorecard</w:t>
+      </w:r>
+      <w:r>
+        <w:t xml:space="preserve"> (the last section) is the record of how the published calls actually did.</w:t>
+        <w:br/>
+        <w:t xml:space="preserve">  Each evening, once the day's bars are in, the app </w:t>
+      </w:r>
+      <w:r>
+        <w:rPr>
+          <w:b/>
+        </w:rPr>
+        <w:t>grades</w:t>
+      </w:r>
+      <w:r>
+        <w:t xml:space="preserve"> every trade it showed that</w:t>
+        <w:br/>
+        <w:t xml:space="preserve">  morning, from the call as published (never from a later rebuild), under the target,</w:t>
+        <w:br/>
+        <w:t xml:space="preserve">  stop and time stop that call was made with (a setting changed later does not regrade</w:t>
+        <w:br/>
+        <w:t xml:space="preserve">  it), and the scorecard shows that evening's grades straight away. Per symbol, over the</w:t>
+        <w:br/>
+        <w:t xml:space="preserve">  last 20 graded days, it shows: </w:t>
+      </w:r>
+      <w:r>
+        <w:rPr>
+          <w:b/>
+        </w:rPr>
+        <w:t>Edge calls</w:t>
+      </w:r>
+      <w:r>
+        <w:t>, how often the one highlighted trade won</w:t>
+        <w:br/>
+        <w:t xml:space="preserve">  beside the rate it usually wins (most symbols have none, and the line says so);</w:t>
+        <w:br/>
+        <w:t xml:space="preserve">  </w:t>
+      </w:r>
+      <w:r>
+        <w:rPr>
+          <w:b/>
+        </w:rPr>
+        <w:t>Cautions</w:t>
+      </w:r>
+      <w:r>
+        <w:t>, how often a trade marked to avoid still won, beside its usual rate (the</w:t>
+        <w:br/>
+        <w:t xml:space="preserve">  caution is working when that is the lower number); and a table of all four trades with</w:t>
+        <w:br/>
+        <w:t xml:space="preserve">  their won / lost / timed-out counts and win rate. Two win rates sit side by side: the</w:t>
+        <w:br/>
+        <w:t xml:space="preserve">  </w:t>
+      </w:r>
+      <w:r>
+        <w:rPr>
+          <w:b/>
+        </w:rPr>
+        <w:t>model's</w:t>
+      </w:r>
+      <w:r>
+        <w:t xml:space="preserve"> (priced from the volatility index, the one the study uses) and the</w:t>
+        <w:br/>
+        <w:t xml:space="preserve">  </w:t>
+      </w:r>
+      <w:r>
+        <w:rPr>
+          <w:b/>
+        </w:rPr>
+        <w:t>live chain's</w:t>
+      </w:r>
+      <w:r>
+        <w:t xml:space="preserve"> (the same walk at the volatility the 08:36 chain implied; a dash when</w:t>
+        <w:br/>
+        <w:t xml:space="preserve">  no chain was captured that morning). A day whose bars are not all in yet is graded the</w:t>
+        <w:br/>
+        <w:t xml:space="preserve">  next evening. A call made on a shortened session (a half day) is not graded, because the</w:t>
+        <w:br/>
+        <w:t xml:space="preserve">  model's settlement time would be wrong. A grade is written once and never recomputed. A</w:t>
+        <w:br/>
+        <w:t xml:space="preserve">  handful of days says very little; read it as a record, not a verdict.</w:t>
+      </w:r>
+    </w:p>
+    <w:p>
+      <w:pPr>
+        <w:pStyle w:val="Heading3"/>
+      </w:pPr>
+      <w:r>
+        <w:rPr/>
+        <w:t>Calls every 15 minutes</w:t>
+      </w:r>
+    </w:p>
+    <w:p>
+      <w:r>
+        <w:rPr/>
+        <w:t xml:space="preserve">After the 08:36 call the page makes </w:t>
+      </w:r>
+      <w:r>
+        <w:rPr>
+          <w:b/>
+        </w:rPr>
+        <w:t>a new call every 15 minutes, from 08:51 to</w:t>
+        <w:br/>
+        <w:t>13:51 CT</w:t>
+      </w:r>
+      <w:r>
+        <w:rPr/>
+        <w:t xml:space="preserve"> (21 a day), for the same three symbols. Each is a scalp you would enter </w:t>
+      </w:r>
+      <w:r>
+        <w:rPr>
+          <w:i/>
+        </w:rPr>
+        <w:t>at</w:t>
+        <w:br/>
+        <w:t>that moment</w:t>
+      </w:r>
+      <w:r>
+        <w:rPr/>
+        <w:t>, with the same trade rules (+50% before −50% of the price paid, closed</w:t>
+        <w:br/>
+        <w:t>after 60 minutes at the latest). A call is frozen the moment it is shown: the next one</w:t>
+        <w:br/>
+        <w:t>is a new call, not an edit of the last.</w:t>
+      </w:r>
+    </w:p>
+    <w:p>
+      <w:pPr>
+        <w:pStyle w:val="ListBullet"/>
+      </w:pPr>
+      <w:r>
+        <w:rPr>
+          <w:b/>
+        </w:rPr>
+        <w:t>Latest call.</w:t>
+      </w:r>
+      <w:r>
+        <w:t xml:space="preserve"> The </w:t>
+      </w:r>
+      <w:r>
+        <w:rPr>
+          <w:b/>
+        </w:rPr>
+        <w:t>15-minute call</w:t>
+      </w:r>
+      <w:r>
+        <w:t xml:space="preserve"> card in each symbol's section. It says which way the symbol moved over the</w:t>
+        <w:br/>
+        <w:t xml:space="preserve">  </w:t>
+      </w:r>
+      <w:r>
+        <w:rPr>
+          <w:b/>
+        </w:rPr>
+        <w:t>last 15 minutes</w:t>
+      </w:r>
+      <w:r>
+        <w:t xml:space="preserve"> (up, down, or flat; a flat or missing tape gets no call), names</w:t>
+        <w:br/>
+        <w:t xml:space="preserve">  the four trades by that move's contract, and shows the same columns as the morning</w:t>
+        <w:br/>
+        <w:t xml:space="preserve">  card. The one difference is the sample: it counts </w:t>
+      </w:r>
+      <w:r>
+        <w:rPr>
+          <w:b/>
+        </w:rPr>
+        <w:t>days</w:t>
+      </w:r>
+      <w:r>
+        <w:t>, not calls. Several</w:t>
+        <w:br/>
+        <w:t xml:space="preserve">  calls are made on one day from the same tape, so "5 days" means five different days,</w:t>
+        <w:br/>
+        <w:t xml:space="preserve">  however many calls fell on them.</w:t>
+      </w:r>
+    </w:p>
+    <w:p>
+      <w:pPr>
+        <w:pStyle w:val="ListBullet"/>
+      </w:pPr>
+      <w:r>
+        <w:rPr>
+          <w:b/>
+        </w:rPr>
+        <w:t>"No measured edge" is still the usual answer.</w:t>
+      </w:r>
+      <w:r>
+        <w:t xml:space="preserve"> The rates are how often a trade</w:t>
+        <w:br/>
+        <w:t xml:space="preserve">  has won over </w:t>
+      </w:r>
+      <w:r>
+        <w:rPr>
+          <w:b/>
+        </w:rPr>
+        <w:t>every</w:t>
+      </w:r>
+      <w:r>
+        <w:t xml:space="preserve"> stored day with a setup like this one at this time of day (the</w:t>
+        <w:br/>
+        <w:t xml:space="preserve">  day is split into a </w:t>
+      </w:r>
+      <w:r>
+        <w:rPr>
+          <w:b/>
+        </w:rPr>
+        <w:t>morning</w:t>
+      </w:r>
+      <w:r>
+        <w:t xml:space="preserve">, </w:t>
+      </w:r>
+      <w:r>
+        <w:rPr>
+          <w:b/>
+        </w:rPr>
+        <w:t>midday</w:t>
+      </w:r>
+      <w:r>
+        <w:t xml:space="preserve"> and </w:t>
+      </w:r>
+      <w:r>
+        <w:rPr>
+          <w:b/>
+        </w:rPr>
+        <w:t>afternoon</w:t>
+      </w:r>
+      <w:r>
+        <w:t xml:space="preserve"> block). Whether a bucket</w:t>
+        <w:br/>
+        <w:t xml:space="preserve">  beats its usual rate is </w:t>
+      </w:r>
+      <w:r>
+        <w:rPr>
+          <w:b/>
+        </w:rPr>
+        <w:t>walk-forward tested</w:t>
+      </w:r>
+      <w:r>
+        <w:t>, and it must beat it by a clear</w:t>
+        <w:br/>
+        <w:t xml:space="preserve">  margin, not a hair, before the card says </w:t>
+      </w:r>
+      <w:r>
+        <w:rPr>
+          <w:b/>
+        </w:rPr>
+        <w:t>Measured edge</w:t>
+      </w:r>
+      <w:r>
+        <w:t>.</w:t>
+      </w:r>
+    </w:p>
+    <w:p>
+      <w:pPr>
+        <w:pStyle w:val="ListBullet"/>
+      </w:pPr>
+      <w:r>
+        <w:rPr>
+          <w:b/>
+        </w:rPr>
+        <w:t>The confirmation word is gone from the page.</w:t>
+      </w:r>
+      <w:r>
+        <w:t xml:space="preserve"> Each call used to carry</w:t>
+        <w:br/>
+        <w:t xml:space="preserve">  a word (Confirms, Mixed or Contradicts, with "3 of 4 sources") for whether options</w:t>
+        <w:br/>
+        <w:t xml:space="preserve">  flow, net premium, the dealer read and market sentiment agreed with the move. Those</w:t>
+        <w:br/>
+        <w:t xml:space="preserve">  four sources are now </w:t>
+      </w:r>
+      <w:r>
+        <w:rPr>
+          <w:b/>
+        </w:rPr>
+        <w:t>factors in the chance of target</w:t>
+      </w:r>
+      <w:r>
+        <w:t xml:space="preserve"> (below), each as its own</w:t>
+        <w:br/>
+        <w:t xml:space="preserve">  number, so the page no longer shows the word or its count of sources. The app </w:t>
+      </w:r>
+      <w:r>
+        <w:rPr>
+          <w:b/>
+        </w:rPr>
+        <w:t>still</w:t>
+        <w:br/>
+        <w:t xml:space="preserve">  records it</w:t>
+      </w:r>
+      <w:r>
+        <w:t xml:space="preserve"> at every slot, and the Scorecard still splits the win rate by it; it is</w:t>
+        <w:br/>
+        <w:t xml:space="preserve">  not in the chance.</w:t>
+      </w:r>
+    </w:p>
+    <w:p>
+      <w:pPr>
+        <w:pStyle w:val="ListBullet"/>
+      </w:pPr>
+      <w:r>
+        <w:rPr>
+          <w:b/>
+        </w:rPr>
+        <w:t>The dealer read, in plain words.</w:t>
+      </w:r>
+      <w:r>
+        <w:t xml:space="preserve"> It asks: </w:t>
+      </w:r>
+      <w:r>
+        <w:rPr>
+          <w:i/>
+        </w:rPr>
+        <w:t>is there room for this trade to work</w:t>
+        <w:br/>
+        <w:t xml:space="preserve">  before it hits the wall dealers are hedged around?</w:t>
+      </w:r>
+      <w:r>
+        <w:t xml:space="preserve"> For an up call it looks at the</w:t>
+        <w:br/>
+        <w:t xml:space="preserve">  </w:t>
+      </w:r>
+      <w:r>
+        <w:rPr>
+          <w:b/>
+        </w:rPr>
+        <w:t>call wall</w:t>
+      </w:r>
+      <w:r>
+        <w:t xml:space="preserve"> above the price, for a down call the </w:t>
+      </w:r>
+      <w:r>
+        <w:rPr>
+          <w:b/>
+        </w:rPr>
+        <w:t>put wall</w:t>
+      </w:r>
+      <w:r>
+        <w:t xml:space="preserve"> below it, and compares</w:t>
+        <w:br/>
+        <w:t xml:space="preserve">  the distance from the call's own entry price (not a price read a few minutes later)</w:t>
+        <w:br/>
+        <w:t xml:space="preserve">  with how far the underlying must move to reach the trade's target. The</w:t>
+        <w:br/>
+        <w:t xml:space="preserve">  line reads, for example, "Room up to the call wall at 5,850 (0.4%); 7 of 10 big names</w:t>
+        <w:br/>
+        <w:t xml:space="preserve">  have room", or says the wall is inside the target. The </w:t>
+      </w:r>
+      <w:r>
+        <w:rPr>
+          <w:b/>
+        </w:rPr>
+        <w:t>breadth</w:t>
+      </w:r>
+      <w:r>
+        <w:t xml:space="preserve"> part counts how</w:t>
+        <w:br/>
+        <w:t xml:space="preserve">  many of the ten big names have the same room, in percent of their own price. If the</w:t>
+        <w:br/>
+        <w:t xml:space="preserve">  data has no gamma reading (Schwab sometimes sends none), the walls are not trusted</w:t>
+        <w:br/>
+        <w:t xml:space="preserve">  and the line says "No usable call wall for SPY (no gamma reading)" (or put wall, for a down call) instead of guessing.</w:t>
+      </w:r>
+    </w:p>
+    <w:p>
+      <w:pPr>
+        <w:pStyle w:val="ListBullet"/>
+      </w:pPr>
+      <w:r>
+        <w:rPr>
+          <w:b/>
+        </w:rPr>
+        <w:t>Under each trade</w:t>
+      </w:r>
+      <w:r>
+        <w:t xml:space="preserve"> the card names any wall that sits between the entry and its</w:t>
+        <w:br/>
+        <w:t xml:space="preserve">  target or stop ("Target is beyond the call wall at 5,850").</w:t>
+      </w:r>
+    </w:p>
+    <w:p>
+      <w:pPr>
+        <w:pStyle w:val="ListBullet"/>
+      </w:pPr>
+      <w:r>
+        <w:rPr>
+          <w:b/>
+        </w:rPr>
+        <w:t>Today's calls</w:t>
+      </w:r>
+      <w:r>
+        <w:t xml:space="preserve"> lists every slot made today: the time, per symbol the direction, the</w:t>
+        <w:br/>
+        <w:t xml:space="preserve">  highlighted trade (or a dash), the </w:t>
+      </w:r>
+      <w:r>
+        <w:rPr>
+          <w:b/>
+        </w:rPr>
+        <w:t>chance of target</w:t>
+      </w:r>
+      <w:r>
+        <w:t xml:space="preserve"> for the trade the call names</w:t>
+        <w:br/>
+        <w:t xml:space="preserve">  ("Chance 47.12%") and any note. A call built without fresh bars for some input says</w:t>
+        <w:br/>
+        <w:t xml:space="preserve">  which.</w:t>
+      </w:r>
+    </w:p>
+    <w:p>
+      <w:pPr>
+        <w:pStyle w:val="ListBullet"/>
+      </w:pPr>
+      <w:r>
+        <w:rPr>
+          <w:b/>
+        </w:rPr>
+        <w:t>When a call stops being current.</w:t>
+      </w:r>
+      <w:r>
+        <w:t xml:space="preserve"> A call is current until the next slot or until</w:t>
+        <w:br/>
+        <w:t xml:space="preserve">  its own hour is up, whichever comes first. After that it reads </w:t>
+      </w:r>
+      <w:r>
+        <w:rPr>
+          <w:b/>
+        </w:rPr>
+        <w:t>Last call ... past</w:t>
+      </w:r>
+      <w:r>
+        <w:br/>
+        <w:t xml:space="preserve">  (the next slot is overdue) or </w:t>
+      </w:r>
+      <w:r>
+        <w:rPr>
+          <w:b/>
+        </w:rPr>
+        <w:t>Last call ... over</w:t>
+      </w:r>
+      <w:r>
+        <w:t xml:space="preserve"> (its hour is up), and is drawn</w:t>
+        <w:br/>
+        <w:t xml:space="preserve">  muted. The 13:51 call says it is the </w:t>
+      </w:r>
+      <w:r>
+        <w:rPr>
+          <w:b/>
+        </w:rPr>
+        <w:t>final call of the day</w:t>
+      </w:r>
+      <w:r>
+        <w:t xml:space="preserve"> and names the next</w:t>
+        <w:br/>
+        <w:t xml:space="preserve">  session's first call. A last slot where every symbol was flat (no trade) still reads</w:t>
+        <w:br/>
+        <w:t xml:space="preserve">  over once its own hour is up. The page rechecks the clock every 30 seconds, so an open</w:t>
+        <w:br/>
+        <w:t xml:space="preserve">  tab never keeps showing a stale call as current. A list from an earlier day says whose</w:t>
+        <w:br/>
+        <w:t xml:space="preserve">  day it is, is not today's, and draws its highlighted trades without the green.</w:t>
+      </w:r>
+    </w:p>
+    <w:p>
+      <w:pPr>
+        <w:pStyle w:val="ListBullet"/>
+      </w:pPr>
+      <w:r>
+        <w:rPr>
+          <w:b/>
+        </w:rPr>
+        <w:t>Half days.</w:t>
+      </w:r>
+      <w:r>
+        <w:t xml:space="preserve"> On a day the market closes early (the day after Thanksgiving and</w:t>
+        <w:br/>
+        <w:t xml:space="preserve">  Christmas Eve, at 12:00 CT; the dates are in Settings → Configuration → Opening Scalp)</w:t>
+        <w:br/>
+        <w:t xml:space="preserve">  no call is made whose hour would run past the close: the last call is 10:51, and a</w:t>
+        <w:br/>
+        <w:t xml:space="preserve">  later slot says "The market closes early today". Add next year's half days there.</w:t>
+      </w:r>
+    </w:p>
+    <w:p>
+      <w:pPr>
+        <w:pStyle w:val="ListBullet"/>
+      </w:pPr>
+      <w:r>
+        <w:rPr>
+          <w:b/>
+        </w:rPr>
+        <w:t>Refresh and the 15-minute calls.</w:t>
+      </w:r>
+      <w:r>
+        <w:t xml:space="preserve"> Refresh never makes an off-slot call. Inside a</w:t>
+        <w:br/>
+        <w:t xml:space="preserve">  slot's five-minute window it fills in any symbol that slot has not published yet;</w:t>
+        <w:br/>
+        <w:t xml:space="preserve">  outside a window it only puts today's published calls back on screen. A slot missed by</w:t>
+        <w:br/>
+        <w:t xml:space="preserve">  more than five minutes is skipped, not made up later.</w:t>
+      </w:r>
+    </w:p>
+    <w:p>
+      <w:pPr>
+        <w:pStyle w:val="ListBullet"/>
+      </w:pPr>
+      <w:r>
+        <w:rPr>
+          <w:b/>
+        </w:rPr>
+        <w:t>Scorecard, intraday part.</w:t>
+      </w:r>
+      <w:r>
+        <w:t xml:space="preserve"> Each evening every intraday call is graded the same way as</w:t>
+        <w:br/>
+        <w:t xml:space="preserve">  the morning ones. The scorecard then shows, per symbol and per block, </w:t>
+      </w:r>
+      <w:r>
+        <w:rPr>
+          <w:b/>
+        </w:rPr>
+        <w:t>Edge calls</w:t>
+      </w:r>
+      <w:r>
+        <w:br/>
+        <w:t xml:space="preserve">  and </w:t>
+      </w:r>
+      <w:r>
+        <w:rPr>
+          <w:b/>
+        </w:rPr>
+        <w:t>Cautions</w:t>
+      </w:r>
+      <w:r>
+        <w:t xml:space="preserve"> as above, and the long-with-the-move trade's win rate split by the</w:t>
+        <w:br/>
+        <w:t xml:space="preserve">  recorded confirmation word, each beside the </w:t>
+      </w:r>
+      <w:r>
+        <w:rPr>
+          <w:b/>
+        </w:rPr>
+        <w:t>days</w:t>
+      </w:r>
+      <w:r>
+        <w:t xml:space="preserve"> it rests on. That split is the</w:t>
+        <w:br/>
+        <w:t xml:space="preserve">  first, informal look at whether the word helps; with a few weeks of data it says almost</w:t>
+        <w:br/>
+        <w:t xml:space="preserve">  nothing. The chance of target is not graded here: the weekly check described below is</w:t>
+        <w:br/>
+        <w:t xml:space="preserve">  its test.</w:t>
+      </w:r>
+    </w:p>
+    <w:p>
+      <w:pPr>
+        <w:pStyle w:val="Heading3"/>
+      </w:pPr>
+      <w:r>
+        <w:rPr/>
+        <w:t>The chance of target</w:t>
+      </w:r>
+    </w:p>
+    <w:p>
+      <w:r>
+        <w:rPr/>
+        <w:t xml:space="preserve">Every call carries one figure for each of its four trades: </w:t>
+      </w:r>
+      <w:r>
+        <w:rPr>
+          <w:b/>
+        </w:rPr>
+        <w:t>the chance that the trade</w:t>
+        <w:br/>
+        <w:t>wins</w:t>
+      </w:r>
+      <w:r>
+        <w:rPr/>
+        <w:t>, counted the way the usual win rate counts a win (+50% before −50% of the price</w:t>
+        <w:br/>
+        <w:t>paid, inside 60 minutes; for a credit spread, keeping half the credit). The 08:36 call</w:t>
+        <w:br/>
+        <w:t>carries it too, worked from the premarket inputs. The top table shows it for the trade</w:t>
+        <w:br/>
+        <w:t xml:space="preserve">the row names; the </w:t>
+      </w:r>
+      <w:r>
+        <w:rPr>
+          <w:b/>
+        </w:rPr>
+        <w:t>15-minute call</w:t>
+      </w:r>
+      <w:r>
+        <w:rPr/>
+        <w:t xml:space="preserve"> and </w:t>
       </w:r>
       <w:r>
         <w:rPr>
@@ -24896,11 +25925,8 @@
       </w:r>
       <w:r>
         <w:rPr/>
-        <w:t>'s direction. The row reads the latest 15-minute call once the</w:t>
-        <w:br/>
-        <w:t>first one is out (08:51) and the 08:36 call before that. A call that is no longer</w:t>
-        <w:br/>
-        <w:t xml:space="preserve">current keeps its words and loses its colour. </w:t>
+        <w:t xml:space="preserve"> cards show all four, in a</w:t>
+        <w:br/>
       </w:r>
       <w:r>
         <w:rPr>
@@ -24910,85 +25936,7 @@
       </w:r>
       <w:r>
         <w:rPr/>
-        <w:t xml:space="preserve"> is explained under</w:t>
-        <w:br/>
-      </w:r>
-      <w:r>
-        <w:rPr>
-          <w:i/>
-        </w:rPr>
-        <w:t>The chance of target</w:t>
-      </w:r>
-      <w:r>
-        <w:rPr/>
-        <w:t xml:space="preserve">, below; read it beside </w:t>
-      </w:r>
-      <w:r>
-        <w:rPr>
-          <w:b/>
-        </w:rPr>
-        <w:t>Usually wins</w:t>
-      </w:r>
-      <w:r>
-        <w:rPr/>
-        <w:t>, never instead of it.</w:t>
-      </w:r>
-    </w:p>
-    <w:p>
-      <w:r>
-        <w:rPr>
-          <w:b/>
-        </w:rPr>
-        <w:t>Everything else is below it, in closed sections:</w:t>
-      </w:r>
-      <w:r>
-        <w:rPr/>
-        <w:t xml:space="preserve"> one per symbol (its 15-minute</w:t>
-        <w:br/>
-        <w:t xml:space="preserve">call, </w:t>
-      </w:r>
-      <w:r>
-        <w:rPr>
-          <w:b/>
-        </w:rPr>
-        <w:t>what moved its chance</w:t>
-      </w:r>
-      <w:r>
-        <w:rPr/>
-        <w:t xml:space="preserve"> and its 08:36 call), then </w:t>
-      </w:r>
-      <w:r>
-        <w:rPr>
-          <w:b/>
-        </w:rPr>
-        <w:t>Today's calls</w:t>
-      </w:r>
-      <w:r>
-        <w:rPr/>
-        <w:t>, the</w:t>
-        <w:br/>
-      </w:r>
-      <w:r>
-        <w:rPr>
-          <w:b/>
-        </w:rPr>
-        <w:t>Context</w:t>
-      </w:r>
-      <w:r>
-        <w:rPr/>
-        <w:t xml:space="preserve"> (headlines, flow alerts and the report) and the </w:t>
-      </w:r>
-      <w:r>
-        <w:rPr>
-          <w:b/>
-        </w:rPr>
-        <w:t>Scorecard</w:t>
-      </w:r>
-      <w:r>
-        <w:rPr/>
-        <w:t>. Click a</w:t>
-        <w:br/>
-        <w:t>heading to open it; a section you opened stays open when a new call arrives.</w:t>
+        <w:t xml:space="preserve"> column beside the usual win rate.</w:t>
       </w:r>
     </w:p>
     <w:p>
@@ -24999,23 +25947,105 @@
         <w:rPr>
           <w:b/>
         </w:rPr>
-        <w:t>Most mornings the answer is "No measured edge".</w:t>
-      </w:r>
-      <w:r>
-        <w:t xml:space="preserve"> That is normal, not an error: the</w:t>
-        <w:br/>
-        <w:t xml:space="preserve">  page then shows each trade's </w:t>
-      </w:r>
-      <w:r>
-        <w:rPr>
-          <w:b/>
-        </w:rPr>
-        <w:t>usual win rate</w:t>
-      </w:r>
-      <w:r>
-        <w:t xml:space="preserve"> and nothing more. Treat it as "nothing</w:t>
-        <w:br/>
-        <w:t xml:space="preserve">  here beats chance today".</w:t>
+        <w:t>What goes into it.</w:t>
+      </w:r>
+      <w:r>
+        <w:t xml:space="preserve"> Every factor is read for the direction of the call, so a positive</w:t>
+        <w:br/>
+        <w:t xml:space="preserve">  reading means "agrees with the call": the price reading you already see (the move since</w:t>
+        <w:br/>
+        <w:t xml:space="preserve">  the open, the side of VWAP, futures, the volatility index, the sector funds, the big ten's</w:t>
+        <w:br/>
+        <w:t xml:space="preserve">  breadth); the </w:t>
+      </w:r>
+      <w:r>
+        <w:rPr>
+          <w:b/>
+        </w:rPr>
+        <w:t>slope of the 20-bar moving average</w:t>
+      </w:r>
+      <w:r>
+        <w:t xml:space="preserve"> and </w:t>
+      </w:r>
+      <w:r>
+        <w:rPr>
+          <w:b/>
+        </w:rPr>
+        <w:t>momentum (RSI)</w:t>
+      </w:r>
+      <w:r>
+        <w:t>, each on the</w:t>
+        <w:br/>
+        <w:t xml:space="preserve">  </w:t>
+      </w:r>
+      <w:r>
+        <w:rPr>
+          <w:b/>
+        </w:rPr>
+        <w:t>5-minute</w:t>
+      </w:r>
+      <w:r>
+        <w:t xml:space="preserve"> chart (counts most), the </w:t>
+      </w:r>
+      <w:r>
+        <w:rPr>
+          <w:b/>
+        </w:rPr>
+        <w:t>15-minute</w:t>
+      </w:r>
+      <w:r>
+        <w:t xml:space="preserve"> chart and the </w:t>
+      </w:r>
+      <w:r>
+        <w:rPr>
+          <w:b/>
+        </w:rPr>
+        <w:t>hourly</w:t>
+      </w:r>
+      <w:r>
+        <w:t xml:space="preserve"> chart; the</w:t>
+        <w:br/>
+        <w:t xml:space="preserve">  </w:t>
+      </w:r>
+      <w:r>
+        <w:rPr>
+          <w:b/>
+        </w:rPr>
+        <w:t>dealer read</w:t>
+      </w:r>
+      <w:r>
+        <w:t xml:space="preserve"> (room to the wall, the big names' room, and which side of the gamma flip</w:t>
+        <w:br/>
+        <w:t xml:space="preserve">  the price is on); </w:t>
+      </w:r>
+      <w:r>
+        <w:rPr>
+          <w:b/>
+        </w:rPr>
+        <w:t>net premium</w:t>
+      </w:r>
+      <w:r>
+        <w:t xml:space="preserve">; </w:t>
+      </w:r>
+      <w:r>
+        <w:rPr>
+          <w:b/>
+        </w:rPr>
+        <w:t>options flow</w:t>
+      </w:r>
+      <w:r>
+        <w:t xml:space="preserve">; </w:t>
+      </w:r>
+      <w:r>
+        <w:rPr>
+          <w:b/>
+        </w:rPr>
+        <w:t>market sentiment</w:t>
+      </w:r>
+      <w:r>
+        <w:t>; and, for the</w:t>
+        <w:br/>
+        <w:t xml:space="preserve">  15-minute calls, the part of the day (morning, midday or afternoon).</w:t>
       </w:r>
     </w:p>
     <w:p>
@@ -25023,96 +26053,32 @@
         <w:pStyle w:val="ListBullet"/>
       </w:pPr>
       <w:r>
-        <w:t xml:space="preserve">The four trades are named by that morning's contract (an up open: </w:t>
-      </w:r>
-      <w:r>
-        <w:rPr>
-          <w:b/>
-        </w:rPr>
-        <w:t>Long call</w:t>
-      </w:r>
-      <w:r>
-        <w:t xml:space="preserve">, </w:t>
-      </w:r>
-      <w:r>
-        <w:rPr>
-          <w:b/>
-        </w:rPr>
-        <w:t>Long</w:t>
-        <w:br/>
-        <w:t xml:space="preserve">  put</w:t>
-      </w:r>
-      <w:r>
-        <w:t xml:space="preserve">, </w:t>
-      </w:r>
-      <w:r>
-        <w:rPr>
-          <w:b/>
-        </w:rPr>
-        <w:t>Put credit spread</w:t>
-      </w:r>
-      <w:r>
-        <w:t xml:space="preserve">, </w:t>
-      </w:r>
-      <w:r>
-        <w:rPr>
-          <w:b/>
-        </w:rPr>
-        <w:t>Call credit spread</w:t>
-      </w:r>
-      <w:r>
-        <w:t>; a down open mirrors it), each</w:t>
-        <w:br/>
-        <w:t xml:space="preserve">  marked as </w:t>
-      </w:r>
-      <w:r>
-        <w:rPr>
-          <w:i/>
-        </w:rPr>
-        <w:t>with</w:t>
-      </w:r>
-      <w:r>
-        <w:t xml:space="preserve"> or </w:t>
-      </w:r>
-      <w:r>
-        <w:rPr>
-          <w:i/>
-        </w:rPr>
-        <w:t>against</w:t>
-      </w:r>
-      <w:r>
-        <w:t xml:space="preserve"> the opening move. A </w:t>
-      </w:r>
-      <w:r>
-        <w:rPr>
-          <w:b/>
-        </w:rPr>
-        <w:t>win</w:t>
-      </w:r>
-      <w:r>
-        <w:t xml:space="preserve"> means +50% before −50% within</w:t>
-        <w:br/>
-        <w:t xml:space="preserve">  60 minutes. The win rates are always </w:t>
-      </w:r>
-      <w:r>
-        <w:rPr>
-          <w:b/>
-        </w:rPr>
-        <w:t>modelled</w:t>
-      </w:r>
-      <w:r>
-        <w:t xml:space="preserve"> (priced from the volatility index);</w:t>
-        <w:br/>
-        <w:t xml:space="preserve">  the </w:t>
-      </w:r>
-      <w:r>
-        <w:rPr>
-          <w:b/>
-        </w:rPr>
-        <w:t>Entry</w:t>
-      </w:r>
-      <w:r>
-        <w:t xml:space="preserve"> column shows the live 08:36 quote where the chain had the strike and says</w:t>
+        <w:rPr>
+          <w:b/>
+        </w:rPr>
+        <w:t>Each factor has a weight, and the weights are learned, not set by hand.</w:t>
+      </w:r>
+      <w:r>
+        <w:t xml:space="preserve"> The app</w:t>
+        <w:br/>
+        <w:t xml:space="preserve">  starts every weight at an </w:t>
+      </w:r>
+      <w:r>
+        <w:rPr>
+          <w:b/>
+        </w:rPr>
+        <w:t>assumed</w:t>
+      </w:r>
+      <w:r>
+        <w:t xml:space="preserve"> value (a small push the right way for a factor</w:t>
+        <w:br/>
+        <w:t xml:space="preserve">  that usually helps) and then lets the stored days move it. A factor with months of</w:t>
+        <w:br/>
+        <w:t xml:space="preserve">  history, such as the price reading, the moving-average slope and momentum, is moved a long way</w:t>
+        <w:br/>
+        <w:t xml:space="preserve">  by its own days. A factor with only a few days (flow, sentiment, net premium and the</w:t>
+        <w:br/>
+        <w:t xml:space="preserve">  dealer read are recent) stays close to its assumption until it has more. The weights are</w:t>
         <w:br/>
         <w:t xml:space="preserve">  </w:t>
       </w:r>
@@ -25120,21 +26086,12 @@
         <w:rPr>
           <w:b/>
         </w:rPr>
-        <w:t>modelled</w:t>
-      </w:r>
-      <w:r>
-        <w:t xml:space="preserve"> where it did not, and the </w:t>
-      </w:r>
-      <w:r>
-        <w:rPr>
-          <w:b/>
-        </w:rPr>
-        <w:t>Underlying move</w:t>
-      </w:r>
-      <w:r>
-        <w:t xml:space="preserve"> distances use the chain's</w:t>
-        <w:br/>
-        <w:t xml:space="preserve">  volatility when there is one.</w:t>
+        <w:t>refitted every Saturday morning at 08:00 CT</w:t>
+      </w:r>
+      <w:r>
+        <w:t>, after the week has been graded, and a</w:t>
+        <w:br/>
+        <w:t xml:space="preserve">  refit never changes a call already shown: a call keeps the chance it was made with.</w:t>
       </w:r>
     </w:p>
     <w:p>
@@ -25145,23 +26102,14 @@
         <w:rPr>
           <w:b/>
         </w:rPr>
-        <w:t>Measured edge</w:t>
-      </w:r>
-      <w:r>
-        <w:t xml:space="preserve"> marks the single trade whose bucket rate is reliably better than</w:t>
-        <w:br/>
-        <w:t xml:space="preserve">  usual (rare). </w:t>
-      </w:r>
-      <w:r>
-        <w:rPr>
-          <w:b/>
-        </w:rPr>
-        <w:t>Caution: measured to lose more often than usual</w:t>
-      </w:r>
-      <w:r>
-        <w:t xml:space="preserve"> marks a bucket that</w:t>
-        <w:br/>
-        <w:t xml:space="preserve">  is reliably worse — a reason to stay out, not to take the other side.</w:t>
+        <w:t>A missing reading never counts against a call.</w:t>
+      </w:r>
+      <w:r>
+        <w:t xml:space="preserve"> When a factor cannot be read (Schwab</w:t>
+        <w:br/>
+        <w:t xml:space="preserve">  sent no gamma reading so there is no wall, there is no flow list, a bar is missing), it</w:t>
+        <w:br/>
+        <w:t xml:space="preserve">  adds nothing either way.</w:t>
       </w:r>
     </w:p>
     <w:p>
@@ -25172,19 +26120,32 @@
         <w:rPr>
           <w:b/>
         </w:rPr>
-        <w:t>Morning inputs</w:t>
-      </w:r>
-      <w:r>
-        <w:t xml:space="preserve"> lists each premarket reading and whether it </w:t>
-      </w:r>
-      <w:r>
-        <w:rPr>
-          <w:b/>
-        </w:rPr>
-        <w:t>agrees</w:t>
-      </w:r>
-      <w:r>
-        <w:t>,</w:t>
+        <w:t>What moved the chance.</w:t>
+      </w:r>
+      <w:r>
+        <w:t xml:space="preserve"> Open a symbol's section. Under its 15-minute call (and its</w:t>
+        <w:br/>
+        <w:t xml:space="preserve">  08:36 call) a table lists every factor, the largest push first: its </w:t>
+      </w:r>
+      <w:r>
+        <w:rPr>
+          <w:b/>
+        </w:rPr>
+        <w:t>reading</w:t>
+      </w:r>
+      <w:r>
+        <w:t xml:space="preserve"> for the</w:t>
+        <w:br/>
+        <w:t xml:space="preserve">  call, how many </w:t>
+      </w:r>
+      <w:r>
+        <w:rPr>
+          <w:b/>
+        </w:rPr>
+        <w:t>percentage points</w:t>
+      </w:r>
+      <w:r>
+        <w:t xml:space="preserve"> it moved the chance for the trade with the call, the</w:t>
         <w:br/>
         <w:t xml:space="preserve">  </w:t>
       </w:r>
@@ -25192,30 +26153,36 @@
         <w:rPr>
           <w:b/>
         </w:rPr>
-        <w:t>disagrees</w:t>
-      </w:r>
-      <w:r>
-        <w:t xml:space="preserve">, sits in the </w:t>
-      </w:r>
-      <w:r>
-        <w:rPr>
-          <w:b/>
-        </w:rPr>
-        <w:t>dead zone</w:t>
-      </w:r>
-      <w:r>
-        <w:t xml:space="preserve">, or is </w:t>
-      </w:r>
-      <w:r>
-        <w:rPr>
-          <w:b/>
-        </w:rPr>
-        <w:t>absent</w:t>
-      </w:r>
-      <w:r>
-        <w:t>. An absent input is never a</w:t>
-        <w:br/>
-        <w:t xml:space="preserve">  disagreement.</w:t>
+        <w:t>days of history</w:t>
+      </w:r>
+      <w:r>
+        <w:t xml:space="preserve"> its weight rests on, and </w:t>
+      </w:r>
+      <w:r>
+        <w:rPr>
+          <w:b/>
+        </w:rPr>
+        <w:t>assumed</w:t>
+      </w:r>
+      <w:r>
+        <w:t xml:space="preserve"> where its weight still rests</w:t>
+        <w:br/>
+        <w:t xml:space="preserve">  mostly on the starting assumption (less than half of it learned from data): the push is</w:t>
+        <w:br/>
+        <w:t xml:space="preserve">  still the starting guess, not a measurement. Flow, sentiment, net premium and the dealer</w:t>
+        <w:br/>
+        <w:t xml:space="preserve">  read are held close to their assumption, so they can stay assumed after many days. Read a big push on an</w:t>
+        <w:br/>
+        <w:t xml:space="preserve">  </w:t>
+      </w:r>
+      <w:r>
+        <w:rPr>
+          <w:b/>
+        </w:rPr>
+        <w:t>assumed</w:t>
+      </w:r>
+      <w:r>
+        <w:t xml:space="preserve"> factor with caution: nothing has tested it yet.</w:t>
       </w:r>
     </w:p>
     <w:p>
@@ -25226,962 +26193,10 @@
         <w:rPr>
           <w:b/>
         </w:rPr>
-        <w:t>Refresh</w:t>
-      </w:r>
-      <w:r>
-        <w:t xml:space="preserve"> asks the service to rebuild the call. A call already shown today stays as</w:t>
-        <w:br/>
-        <w:t xml:space="preserve">  published; Refresh only fills in a symbol that has none yet, and no new call is built</w:t>
-        <w:br/>
-        <w:t xml:space="preserve">  after </w:t>
-      </w:r>
-      <w:r>
-        <w:rPr>
-          <w:b/>
-        </w:rPr>
-        <w:t>09:35 CT</w:t>
-      </w:r>
-      <w:r>
-        <w:t>, an hour after the 08:35 entry, because the trade it would describe</w:t>
-        <w:br/>
-        <w:t xml:space="preserve">  is over by then. A symbol whose morning had a direction but was never called reads</w:t>
-        <w:br/>
-        <w:t xml:space="preserve">  </w:t>
-      </w:r>
-      <w:r>
-        <w:rPr>
-          <w:b/>
-        </w:rPr>
-        <w:t>missed the call window</w:t>
-      </w:r>
-      <w:r>
-        <w:t>; one that opened flat or had no opening bar still says so,</w:t>
-        <w:br/>
-        <w:t xml:space="preserve">  with its inputs. (The 15-minute calls below follow their own rule for Refresh.)</w:t>
-      </w:r>
-    </w:p>
-    <w:p>
-      <w:pPr>
-        <w:pStyle w:val="ListBullet"/>
-      </w:pPr>
-      <w:r>
-        <w:t>Before 08:36 (a Refresh pressed at 08:35 waits for the 08:36 call too), on a closed</w:t>
-        <w:br/>
-        <w:t xml:space="preserve">  day, or after a failed refresh the page shows the </w:t>
-      </w:r>
-      <w:r>
-        <w:rPr>
-          <w:b/>
-        </w:rPr>
-        <w:t>last call</w:t>
-      </w:r>
-      <w:r>
-        <w:t>, labelled with its</w:t>
-        <w:br/>
-        <w:t xml:space="preserve">  day, under a line saying when the next call is due.</w:t>
-      </w:r>
-    </w:p>
-    <w:p>
-      <w:pPr>
-        <w:pStyle w:val="ListBullet"/>
-      </w:pPr>
-      <w:r>
-        <w:rPr>
-          <w:b/>
-        </w:rPr>
-        <w:t>Context: headlines, flow alerts and the report</w:t>
-      </w:r>
-      <w:r>
-        <w:t xml:space="preserve"> is context only. The flow-alert</w:t>
-        <w:br/>
-        <w:t xml:space="preserve">  list is shown, not fed in: the chance of target reads its own count of bullish and</w:t>
-        <w:br/>
-        <w:t xml:space="preserve">  bearish flow in the window before the call. The headlines and the report link are in</w:t>
-        <w:br/>
-        <w:t xml:space="preserve">  neither the usual win rates nor the chance.</w:t>
-      </w:r>
-    </w:p>
-    <w:p>
-      <w:pPr>
-        <w:pStyle w:val="ListBullet"/>
-      </w:pPr>
-      <w:r>
-        <w:rPr>
-          <w:b/>
-        </w:rPr>
-        <w:t>Scorecard</w:t>
-      </w:r>
-      <w:r>
-        <w:t xml:space="preserve"> (the last section) is the record of how the published calls actually did.</w:t>
-        <w:br/>
-        <w:t xml:space="preserve">  Each evening, once the day's bars are in, the app </w:t>
-      </w:r>
-      <w:r>
-        <w:rPr>
-          <w:b/>
-        </w:rPr>
-        <w:t>grades</w:t>
-      </w:r>
-      <w:r>
-        <w:t xml:space="preserve"> every trade it showed that</w:t>
-        <w:br/>
-        <w:t xml:space="preserve">  morning, from the call as published (never from a later rebuild), under the target,</w:t>
-        <w:br/>
-        <w:t xml:space="preserve">  stop and time stop that call was made with (a setting changed later does not regrade</w:t>
-        <w:br/>
-        <w:t xml:space="preserve">  it), and the scorecard shows that evening's grades straight away. Per symbol, over the</w:t>
-        <w:br/>
-        <w:t xml:space="preserve">  last 20 graded days, it shows: </w:t>
-      </w:r>
-      <w:r>
-        <w:rPr>
-          <w:b/>
-        </w:rPr>
-        <w:t>Edge calls</w:t>
-      </w:r>
-      <w:r>
-        <w:t>, how often the one highlighted trade won</w:t>
-        <w:br/>
-        <w:t xml:space="preserve">  beside the rate it usually wins (most symbols have none, and the line says so);</w:t>
-        <w:br/>
-        <w:t xml:space="preserve">  </w:t>
-      </w:r>
-      <w:r>
-        <w:rPr>
-          <w:b/>
-        </w:rPr>
-        <w:t>Cautions</w:t>
-      </w:r>
-      <w:r>
-        <w:t>, how often a trade marked to avoid still won, beside its usual rate (the</w:t>
-        <w:br/>
-        <w:t xml:space="preserve">  caution is working when that is the lower number); and a table of all four trades with</w:t>
-        <w:br/>
-        <w:t xml:space="preserve">  their won / lost / timed-out counts and win rate. Two win rates sit side by side: the</w:t>
-        <w:br/>
-        <w:t xml:space="preserve">  </w:t>
-      </w:r>
-      <w:r>
-        <w:rPr>
-          <w:b/>
-        </w:rPr>
-        <w:t>model's</w:t>
-      </w:r>
-      <w:r>
-        <w:t xml:space="preserve"> (priced from the volatility index, the one the study uses) and the</w:t>
-        <w:br/>
-        <w:t xml:space="preserve">  </w:t>
-      </w:r>
-      <w:r>
-        <w:rPr>
-          <w:b/>
-        </w:rPr>
-        <w:t>live chain's</w:t>
-      </w:r>
-      <w:r>
-        <w:t xml:space="preserve"> (the same walk at the volatility the 08:36 chain implied; a dash when</w:t>
-        <w:br/>
-        <w:t xml:space="preserve">  no chain was captured that morning). A day whose bars are not all in yet is graded the</w:t>
-        <w:br/>
-        <w:t xml:space="preserve">  next evening. A call made on a shortened session (a half day) is not graded, because the</w:t>
-        <w:br/>
-        <w:t xml:space="preserve">  model's settlement time would be wrong. A grade is written once and never recomputed. A</w:t>
-        <w:br/>
-        <w:t xml:space="preserve">  handful of days says very little; read it as a record, not a verdict.</w:t>
-      </w:r>
-    </w:p>
-    <w:p>
-      <w:pPr>
-        <w:pStyle w:val="Heading3"/>
-      </w:pPr>
-      <w:r>
-        <w:rPr/>
-        <w:t>Calls every 15 minutes</w:t>
-      </w:r>
-    </w:p>
-    <w:p>
-      <w:r>
-        <w:rPr/>
-        <w:t xml:space="preserve">After the 08:36 call the page makes </w:t>
-      </w:r>
-      <w:r>
-        <w:rPr>
-          <w:b/>
-        </w:rPr>
-        <w:t>a new call every 15 minutes, from 08:51 to</w:t>
-        <w:br/>
-        <w:t>13:51 CT</w:t>
-      </w:r>
-      <w:r>
-        <w:rPr/>
-        <w:t xml:space="preserve"> (21 a day), for the same three symbols. Each is a scalp you would enter </w:t>
-      </w:r>
-      <w:r>
-        <w:rPr>
-          <w:i/>
-        </w:rPr>
-        <w:t>at</w:t>
-        <w:br/>
-        <w:t>that moment</w:t>
-      </w:r>
-      <w:r>
-        <w:rPr/>
-        <w:t>, with the same trade rules (+50% before −50% of the price paid, closed</w:t>
-        <w:br/>
-        <w:t>after 60 minutes at the latest). A call is frozen the moment it is shown: the next one</w:t>
-        <w:br/>
-        <w:t>is a new call, not an edit of the last.</w:t>
-      </w:r>
-    </w:p>
-    <w:p>
-      <w:pPr>
-        <w:pStyle w:val="ListBullet"/>
-      </w:pPr>
-      <w:r>
-        <w:rPr>
-          <w:b/>
-        </w:rPr>
-        <w:t>Latest call.</w:t>
-      </w:r>
-      <w:r>
-        <w:t xml:space="preserve"> The </w:t>
-      </w:r>
-      <w:r>
-        <w:rPr>
-          <w:b/>
-        </w:rPr>
-        <w:t>15-minute call</w:t>
-      </w:r>
-      <w:r>
-        <w:t xml:space="preserve"> card in each symbol's section. It says which way the symbol moved over the</w:t>
-        <w:br/>
-        <w:t xml:space="preserve">  </w:t>
-      </w:r>
-      <w:r>
-        <w:rPr>
-          <w:b/>
-        </w:rPr>
-        <w:t>last 15 minutes</w:t>
-      </w:r>
-      <w:r>
-        <w:t xml:space="preserve"> (up, down, or flat; a flat or missing tape gets no call), names</w:t>
-        <w:br/>
-        <w:t xml:space="preserve">  the four trades by that move's contract, and shows the same columns as the morning</w:t>
-        <w:br/>
-        <w:t xml:space="preserve">  card. The one difference is the sample: it counts </w:t>
-      </w:r>
-      <w:r>
-        <w:rPr>
-          <w:b/>
-        </w:rPr>
-        <w:t>days</w:t>
-      </w:r>
-      <w:r>
-        <w:t>, not calls. Several</w:t>
-        <w:br/>
-        <w:t xml:space="preserve">  calls are made on one day from the same tape, so "5 days" means five different days,</w:t>
-        <w:br/>
-        <w:t xml:space="preserve">  however many calls fell on them.</w:t>
-      </w:r>
-    </w:p>
-    <w:p>
-      <w:pPr>
-        <w:pStyle w:val="ListBullet"/>
-      </w:pPr>
-      <w:r>
-        <w:rPr>
-          <w:b/>
-        </w:rPr>
-        <w:t>"No measured edge" is still the usual answer.</w:t>
-      </w:r>
-      <w:r>
-        <w:t xml:space="preserve"> The rates are how often a trade</w:t>
-        <w:br/>
-        <w:t xml:space="preserve">  has won over </w:t>
-      </w:r>
-      <w:r>
-        <w:rPr>
-          <w:b/>
-        </w:rPr>
-        <w:t>every</w:t>
-      </w:r>
-      <w:r>
-        <w:t xml:space="preserve"> stored day with a setup like this one at this time of day (the</w:t>
-        <w:br/>
-        <w:t xml:space="preserve">  day is split into a </w:t>
-      </w:r>
-      <w:r>
-        <w:rPr>
-          <w:b/>
-        </w:rPr>
-        <w:t>morning</w:t>
-      </w:r>
-      <w:r>
-        <w:t xml:space="preserve">, </w:t>
-      </w:r>
-      <w:r>
-        <w:rPr>
-          <w:b/>
-        </w:rPr>
-        <w:t>midday</w:t>
-      </w:r>
-      <w:r>
-        <w:t xml:space="preserve"> and </w:t>
-      </w:r>
-      <w:r>
-        <w:rPr>
-          <w:b/>
-        </w:rPr>
-        <w:t>afternoon</w:t>
-      </w:r>
-      <w:r>
-        <w:t xml:space="preserve"> block). Whether a bucket</w:t>
-        <w:br/>
-        <w:t xml:space="preserve">  beats its usual rate is </w:t>
-      </w:r>
-      <w:r>
-        <w:rPr>
-          <w:b/>
-        </w:rPr>
-        <w:t>walk-forward tested</w:t>
-      </w:r>
-      <w:r>
-        <w:t>, and it must beat it by a clear</w:t>
-        <w:br/>
-        <w:t xml:space="preserve">  margin, not a hair, before the card says </w:t>
-      </w:r>
-      <w:r>
-        <w:rPr>
-          <w:b/>
-        </w:rPr>
-        <w:t>Measured edge</w:t>
-      </w:r>
-      <w:r>
-        <w:t>.</w:t>
-      </w:r>
-    </w:p>
-    <w:p>
-      <w:pPr>
-        <w:pStyle w:val="ListBullet"/>
-      </w:pPr>
-      <w:r>
-        <w:rPr>
-          <w:b/>
-        </w:rPr>
-        <w:t>The confirmation word is gone from the page.</w:t>
-      </w:r>
-      <w:r>
-        <w:t xml:space="preserve"> Each call used to carry</w:t>
-        <w:br/>
-        <w:t xml:space="preserve">  a word (Confirms, Mixed or Contradicts, with "3 of 4 sources") for whether options</w:t>
-        <w:br/>
-        <w:t xml:space="preserve">  flow, net premium, the dealer read and market sentiment agreed with the move. Those</w:t>
-        <w:br/>
-        <w:t xml:space="preserve">  four sources are now </w:t>
-      </w:r>
-      <w:r>
-        <w:rPr>
-          <w:b/>
-        </w:rPr>
-        <w:t>factors in the chance of target</w:t>
-      </w:r>
-      <w:r>
-        <w:t xml:space="preserve"> (below), each as its own</w:t>
-        <w:br/>
-        <w:t xml:space="preserve">  number, so the page no longer shows the word or its count of sources. The app </w:t>
-      </w:r>
-      <w:r>
-        <w:rPr>
-          <w:b/>
-        </w:rPr>
-        <w:t>still</w:t>
-        <w:br/>
-        <w:t xml:space="preserve">  records it</w:t>
-      </w:r>
-      <w:r>
-        <w:t xml:space="preserve"> at every slot, and the Scorecard still splits the win rate by it; it is</w:t>
-        <w:br/>
-        <w:t xml:space="preserve">  not in the chance.</w:t>
-      </w:r>
-    </w:p>
-    <w:p>
-      <w:pPr>
-        <w:pStyle w:val="ListBullet"/>
-      </w:pPr>
-      <w:r>
-        <w:rPr>
-          <w:b/>
-        </w:rPr>
-        <w:t>The dealer read, in plain words.</w:t>
-      </w:r>
-      <w:r>
-        <w:t xml:space="preserve"> It asks: </w:t>
-      </w:r>
-      <w:r>
-        <w:rPr>
-          <w:i/>
-        </w:rPr>
-        <w:t>is there room for this trade to work</w:t>
-        <w:br/>
-        <w:t xml:space="preserve">  before it hits the wall dealers are hedged around?</w:t>
-      </w:r>
-      <w:r>
-        <w:t xml:space="preserve"> For an up call it looks at the</w:t>
-        <w:br/>
-        <w:t xml:space="preserve">  </w:t>
-      </w:r>
-      <w:r>
-        <w:rPr>
-          <w:b/>
-        </w:rPr>
-        <w:t>call wall</w:t>
-      </w:r>
-      <w:r>
-        <w:t xml:space="preserve"> above the price, for a down call the </w:t>
-      </w:r>
-      <w:r>
-        <w:rPr>
-          <w:b/>
-        </w:rPr>
-        <w:t>put wall</w:t>
-      </w:r>
-      <w:r>
-        <w:t xml:space="preserve"> below it, and compares</w:t>
-        <w:br/>
-        <w:t xml:space="preserve">  the distance from the call's own entry price (not a price read a few minutes later)</w:t>
-        <w:br/>
-        <w:t xml:space="preserve">  with how far the underlying must move to reach the trade's target. The</w:t>
-        <w:br/>
-        <w:t xml:space="preserve">  line reads, for example, "Room up to the call wall at 5,850 (0.4%); 7 of 10 big names</w:t>
-        <w:br/>
-        <w:t xml:space="preserve">  have room", or says the wall is inside the target. The </w:t>
-      </w:r>
-      <w:r>
-        <w:rPr>
-          <w:b/>
-        </w:rPr>
-        <w:t>breadth</w:t>
-      </w:r>
-      <w:r>
-        <w:t xml:space="preserve"> part counts how</w:t>
-        <w:br/>
-        <w:t xml:space="preserve">  many of the ten big names have the same room, in percent of their own price. If the</w:t>
-        <w:br/>
-        <w:t xml:space="preserve">  data has no gamma reading (Schwab sometimes sends none), the walls are not trusted</w:t>
-        <w:br/>
-        <w:t xml:space="preserve">  and the line says "No usable call wall for SPY (no gamma reading)" (or put wall, for a down call) instead of guessing.</w:t>
-      </w:r>
-    </w:p>
-    <w:p>
-      <w:pPr>
-        <w:pStyle w:val="ListBullet"/>
-      </w:pPr>
-      <w:r>
-        <w:rPr>
-          <w:b/>
-        </w:rPr>
-        <w:t>Under each trade</w:t>
-      </w:r>
-      <w:r>
-        <w:t xml:space="preserve"> the card names any wall that sits between the entry and its</w:t>
-        <w:br/>
-        <w:t xml:space="preserve">  target or stop ("Target is beyond the call wall at 5,850").</w:t>
-      </w:r>
-    </w:p>
-    <w:p>
-      <w:pPr>
-        <w:pStyle w:val="ListBullet"/>
-      </w:pPr>
-      <w:r>
-        <w:rPr>
-          <w:b/>
-        </w:rPr>
-        <w:t>Today's calls</w:t>
-      </w:r>
-      <w:r>
-        <w:t xml:space="preserve"> lists every slot made today: the time, per symbol the direction, the</w:t>
-        <w:br/>
-        <w:t xml:space="preserve">  highlighted trade (or a dash), the </w:t>
-      </w:r>
-      <w:r>
-        <w:rPr>
-          <w:b/>
-        </w:rPr>
-        <w:t>chance of target</w:t>
-      </w:r>
-      <w:r>
-        <w:t xml:space="preserve"> for the trade the call names</w:t>
-        <w:br/>
-        <w:t xml:space="preserve">  ("Chance 47.12%") and any note. A call built without fresh bars for some input says</w:t>
-        <w:br/>
-        <w:t xml:space="preserve">  which.</w:t>
-      </w:r>
-    </w:p>
-    <w:p>
-      <w:pPr>
-        <w:pStyle w:val="ListBullet"/>
-      </w:pPr>
-      <w:r>
-        <w:rPr>
-          <w:b/>
-        </w:rPr>
-        <w:t>When a call stops being current.</w:t>
-      </w:r>
-      <w:r>
-        <w:t xml:space="preserve"> A call is current until the next slot or until</w:t>
-        <w:br/>
-        <w:t xml:space="preserve">  its own hour is up, whichever comes first. After that it reads </w:t>
-      </w:r>
-      <w:r>
-        <w:rPr>
-          <w:b/>
-        </w:rPr>
-        <w:t>Last call ... past</w:t>
-      </w:r>
-      <w:r>
-        <w:br/>
-        <w:t xml:space="preserve">  (the next slot is overdue) or </w:t>
-      </w:r>
-      <w:r>
-        <w:rPr>
-          <w:b/>
-        </w:rPr>
-        <w:t>Last call ... over</w:t>
-      </w:r>
-      <w:r>
-        <w:t xml:space="preserve"> (its hour is up), and is drawn</w:t>
-        <w:br/>
-        <w:t xml:space="preserve">  muted. The 13:51 call says it is the </w:t>
-      </w:r>
-      <w:r>
-        <w:rPr>
-          <w:b/>
-        </w:rPr>
-        <w:t>final call of the day</w:t>
-      </w:r>
-      <w:r>
-        <w:t xml:space="preserve"> and names the next</w:t>
-        <w:br/>
-        <w:t xml:space="preserve">  session's first call. A last slot where every symbol was flat (no trade) still reads</w:t>
-        <w:br/>
-        <w:t xml:space="preserve">  over once its own hour is up. The page rechecks the clock every 30 seconds, so an open</w:t>
-        <w:br/>
-        <w:t xml:space="preserve">  tab never keeps showing a stale call as current. A list from an earlier day says whose</w:t>
-        <w:br/>
-        <w:t xml:space="preserve">  day it is, is not today's, and draws its highlighted trades without the green.</w:t>
-      </w:r>
-    </w:p>
-    <w:p>
-      <w:pPr>
-        <w:pStyle w:val="ListBullet"/>
-      </w:pPr>
-      <w:r>
-        <w:rPr>
-          <w:b/>
-        </w:rPr>
-        <w:t>Half days.</w:t>
-      </w:r>
-      <w:r>
-        <w:t xml:space="preserve"> On a day the market closes early (the day after Thanksgiving and</w:t>
-        <w:br/>
-        <w:t xml:space="preserve">  Christmas Eve, at 12:00 CT; the dates are in Settings → Configuration → Opening Scalp)</w:t>
-        <w:br/>
-        <w:t xml:space="preserve">  no call is made whose hour would run past the close: the last call is 10:51, and a</w:t>
-        <w:br/>
-        <w:t xml:space="preserve">  later slot says "The market closes early today". Add next year's half days there.</w:t>
-      </w:r>
-    </w:p>
-    <w:p>
-      <w:pPr>
-        <w:pStyle w:val="ListBullet"/>
-      </w:pPr>
-      <w:r>
-        <w:rPr>
-          <w:b/>
-        </w:rPr>
-        <w:t>Refresh and the 15-minute calls.</w:t>
-      </w:r>
-      <w:r>
-        <w:t xml:space="preserve"> Refresh never makes an off-slot call. Inside a</w:t>
-        <w:br/>
-        <w:t xml:space="preserve">  slot's five-minute window it fills in any symbol that slot has not published yet;</w:t>
-        <w:br/>
-        <w:t xml:space="preserve">  outside a window it only puts today's published calls back on screen. A slot missed by</w:t>
-        <w:br/>
-        <w:t xml:space="preserve">  more than five minutes is skipped, not made up later.</w:t>
-      </w:r>
-    </w:p>
-    <w:p>
-      <w:pPr>
-        <w:pStyle w:val="ListBullet"/>
-      </w:pPr>
-      <w:r>
-        <w:rPr>
-          <w:b/>
-        </w:rPr>
-        <w:t>Scorecard, intraday part.</w:t>
-      </w:r>
-      <w:r>
-        <w:t xml:space="preserve"> Each evening every intraday call is graded the same way as</w:t>
-        <w:br/>
-        <w:t xml:space="preserve">  the morning ones. The scorecard then shows, per symbol and per block, </w:t>
-      </w:r>
-      <w:r>
-        <w:rPr>
-          <w:b/>
-        </w:rPr>
-        <w:t>Edge calls</w:t>
-      </w:r>
-      <w:r>
-        <w:br/>
-        <w:t xml:space="preserve">  and </w:t>
-      </w:r>
-      <w:r>
-        <w:rPr>
-          <w:b/>
-        </w:rPr>
-        <w:t>Cautions</w:t>
-      </w:r>
-      <w:r>
-        <w:t xml:space="preserve"> as above, and the long-with-the-move trade's win rate split by the</w:t>
-        <w:br/>
-        <w:t xml:space="preserve">  recorded confirmation word, each beside the </w:t>
-      </w:r>
-      <w:r>
-        <w:rPr>
-          <w:b/>
-        </w:rPr>
-        <w:t>days</w:t>
-      </w:r>
-      <w:r>
-        <w:t xml:space="preserve"> it rests on. That split is the</w:t>
-        <w:br/>
-        <w:t xml:space="preserve">  first, informal look at whether the word helps; with a few weeks of data it says almost</w:t>
-        <w:br/>
-        <w:t xml:space="preserve">  nothing. The chance of target is not graded here: the weekly check described below is</w:t>
-        <w:br/>
-        <w:t xml:space="preserve">  its test.</w:t>
-      </w:r>
-    </w:p>
-    <w:p>
-      <w:pPr>
-        <w:pStyle w:val="Heading3"/>
-      </w:pPr>
-      <w:r>
-        <w:rPr/>
-        <w:t>The chance of target</w:t>
-      </w:r>
-    </w:p>
-    <w:p>
-      <w:r>
-        <w:rPr/>
-        <w:t xml:space="preserve">Every call carries one figure for each of its four trades: </w:t>
-      </w:r>
-      <w:r>
-        <w:rPr>
-          <w:b/>
-        </w:rPr>
-        <w:t>the chance that the trade</w:t>
-        <w:br/>
-        <w:t>wins</w:t>
-      </w:r>
-      <w:r>
-        <w:rPr/>
-        <w:t>, counted the way the usual win rate counts a win (+50% before −50% of the price</w:t>
-        <w:br/>
-        <w:t>paid, inside 60 minutes; for a credit spread, keeping half the credit). The 08:36 call</w:t>
-        <w:br/>
-        <w:t>carries it too, worked from the premarket inputs. The top table shows it for the trade</w:t>
-        <w:br/>
-        <w:t xml:space="preserve">the row names; the </w:t>
-      </w:r>
-      <w:r>
-        <w:rPr>
-          <w:b/>
-        </w:rPr>
-        <w:t>15-minute call</w:t>
-      </w:r>
-      <w:r>
-        <w:rPr/>
-        <w:t xml:space="preserve"> and </w:t>
-      </w:r>
-      <w:r>
-        <w:rPr>
-          <w:b/>
-        </w:rPr>
-        <w:t>08:36 call</w:t>
-      </w:r>
-      <w:r>
-        <w:rPr/>
-        <w:t xml:space="preserve"> cards show all four, in a</w:t>
-        <w:br/>
-      </w:r>
-      <w:r>
-        <w:rPr>
-          <w:b/>
-        </w:rPr>
-        <w:t>Chance of target</w:t>
-      </w:r>
-      <w:r>
-        <w:rPr/>
-        <w:t xml:space="preserve"> column beside the usual win rate.</w:t>
-      </w:r>
-    </w:p>
-    <w:p>
-      <w:pPr>
-        <w:pStyle w:val="ListBullet"/>
-      </w:pPr>
-      <w:r>
-        <w:rPr>
-          <w:b/>
-        </w:rPr>
-        <w:t>What goes into it.</w:t>
-      </w:r>
-      <w:r>
-        <w:t xml:space="preserve"> Every factor is read for the direction of the call, so a positive</w:t>
-        <w:br/>
-        <w:t xml:space="preserve">  reading means "agrees with the call": the price reading you already see (the move since</w:t>
-        <w:br/>
-        <w:t xml:space="preserve">  the open, the side of VWAP, futures, the volatility index, the sector funds, the big ten's</w:t>
-        <w:br/>
-        <w:t xml:space="preserve">  breadth); the </w:t>
-      </w:r>
-      <w:r>
-        <w:rPr>
-          <w:b/>
-        </w:rPr>
-        <w:t>slope of the 20-bar moving average</w:t>
-      </w:r>
-      <w:r>
-        <w:t xml:space="preserve"> and </w:t>
-      </w:r>
-      <w:r>
-        <w:rPr>
-          <w:b/>
-        </w:rPr>
-        <w:t>momentum (RSI)</w:t>
-      </w:r>
-      <w:r>
-        <w:t>, each on the</w:t>
-        <w:br/>
-        <w:t xml:space="preserve">  </w:t>
-      </w:r>
-      <w:r>
-        <w:rPr>
-          <w:b/>
-        </w:rPr>
-        <w:t>5-minute</w:t>
-      </w:r>
-      <w:r>
-        <w:t xml:space="preserve"> chart (counts most), the </w:t>
-      </w:r>
-      <w:r>
-        <w:rPr>
-          <w:b/>
-        </w:rPr>
-        <w:t>15-minute</w:t>
-      </w:r>
-      <w:r>
-        <w:t xml:space="preserve"> chart and the </w:t>
-      </w:r>
-      <w:r>
-        <w:rPr>
-          <w:b/>
-        </w:rPr>
-        <w:t>hourly</w:t>
-      </w:r>
-      <w:r>
-        <w:t xml:space="preserve"> chart; the</w:t>
-        <w:br/>
-        <w:t xml:space="preserve">  </w:t>
-      </w:r>
-      <w:r>
-        <w:rPr>
-          <w:b/>
-        </w:rPr>
-        <w:t>dealer read</w:t>
-      </w:r>
-      <w:r>
-        <w:t xml:space="preserve"> (room to the wall, the big names' room, and which side of the gamma flip</w:t>
-        <w:br/>
-        <w:t xml:space="preserve">  the price is on); </w:t>
-      </w:r>
-      <w:r>
-        <w:rPr>
-          <w:b/>
-        </w:rPr>
-        <w:t>net premium</w:t>
-      </w:r>
-      <w:r>
-        <w:t xml:space="preserve">; </w:t>
-      </w:r>
-      <w:r>
-        <w:rPr>
-          <w:b/>
-        </w:rPr>
-        <w:t>options flow</w:t>
-      </w:r>
-      <w:r>
-        <w:t xml:space="preserve">; </w:t>
-      </w:r>
-      <w:r>
-        <w:rPr>
-          <w:b/>
-        </w:rPr>
-        <w:t>market sentiment</w:t>
-      </w:r>
-      <w:r>
-        <w:t>; and, for the</w:t>
-        <w:br/>
-        <w:t xml:space="preserve">  15-minute calls, the part of the day (morning, midday or afternoon).</w:t>
-      </w:r>
-    </w:p>
-    <w:p>
-      <w:pPr>
-        <w:pStyle w:val="ListBullet"/>
-      </w:pPr>
-      <w:r>
-        <w:rPr>
-          <w:b/>
-        </w:rPr>
-        <w:t>Each factor has a weight, and the weights are learned, not set by hand.</w:t>
-      </w:r>
-      <w:r>
-        <w:t xml:space="preserve"> The app</w:t>
-        <w:br/>
-        <w:t xml:space="preserve">  starts every weight at an </w:t>
-      </w:r>
-      <w:r>
-        <w:rPr>
-          <w:b/>
-        </w:rPr>
-        <w:t>assumed</w:t>
-      </w:r>
-      <w:r>
-        <w:t xml:space="preserve"> value (a small push the right way for a factor</w:t>
-        <w:br/>
-        <w:t xml:space="preserve">  that usually helps) and then lets the stored days move it. A factor with months of</w:t>
-        <w:br/>
-        <w:t xml:space="preserve">  history, such as the price reading, the moving-average slope and momentum, is moved a long way</w:t>
-        <w:br/>
-        <w:t xml:space="preserve">  by its own days. A factor with only a few days (flow, sentiment, net premium and the</w:t>
-        <w:br/>
-        <w:t xml:space="preserve">  dealer read are recent) stays close to its assumption until it has more. The weights are</w:t>
-        <w:br/>
-        <w:t xml:space="preserve">  </w:t>
-      </w:r>
-      <w:r>
-        <w:rPr>
-          <w:b/>
-        </w:rPr>
-        <w:t>refitted every Saturday morning at 08:00 CT</w:t>
-      </w:r>
-      <w:r>
-        <w:t>, after the week has been graded, and a</w:t>
-        <w:br/>
-        <w:t xml:space="preserve">  refit never changes a call already shown: a call keeps the chance it was made with.</w:t>
-      </w:r>
-    </w:p>
-    <w:p>
-      <w:pPr>
-        <w:pStyle w:val="ListBullet"/>
-      </w:pPr>
-      <w:r>
-        <w:rPr>
-          <w:b/>
-        </w:rPr>
-        <w:t>A missing reading never counts against a call.</w:t>
-      </w:r>
-      <w:r>
-        <w:t xml:space="preserve"> When a factor cannot be read (Schwab</w:t>
-        <w:br/>
-        <w:t xml:space="preserve">  sent no gamma reading so there is no wall, there is no flow list, a bar is missing), it</w:t>
-        <w:br/>
-        <w:t xml:space="preserve">  adds nothing either way.</w:t>
-      </w:r>
-    </w:p>
-    <w:p>
-      <w:pPr>
-        <w:pStyle w:val="ListBullet"/>
-      </w:pPr>
-      <w:r>
-        <w:rPr>
-          <w:b/>
-        </w:rPr>
-        <w:t>What moved the chance.</w:t>
-      </w:r>
-      <w:r>
-        <w:t xml:space="preserve"> Open a symbol's section. Under its 15-minute call (and its</w:t>
-        <w:br/>
-        <w:t xml:space="preserve">  08:36 call) a table lists every factor, the largest push first: its </w:t>
-      </w:r>
-      <w:r>
-        <w:rPr>
-          <w:b/>
-        </w:rPr>
-        <w:t>reading</w:t>
-      </w:r>
-      <w:r>
-        <w:t xml:space="preserve"> for the</w:t>
-        <w:br/>
-        <w:t xml:space="preserve">  call, how many </w:t>
-      </w:r>
-      <w:r>
-        <w:rPr>
-          <w:b/>
-        </w:rPr>
-        <w:t>percentage points</w:t>
-      </w:r>
-      <w:r>
-        <w:t xml:space="preserve"> it moved the chance for the trade with the call, the</w:t>
-        <w:br/>
-        <w:t xml:space="preserve">  </w:t>
-      </w:r>
-      <w:r>
-        <w:rPr>
-          <w:b/>
-        </w:rPr>
-        <w:t>days of history</w:t>
-      </w:r>
-      <w:r>
-        <w:t xml:space="preserve"> its weight rests on, and </w:t>
-      </w:r>
-      <w:r>
-        <w:rPr>
-          <w:b/>
-        </w:rPr>
-        <w:t>assumed</w:t>
-      </w:r>
-      <w:r>
-        <w:t xml:space="preserve"> where its weight still rests</w:t>
-        <w:br/>
-        <w:t xml:space="preserve">  mostly on the starting assumption (less than half of it learned from data): the push is</w:t>
-        <w:br/>
-        <w:t xml:space="preserve">  still the starting guess, not a measurement. Flow, sentiment, net premium and the dealer</w:t>
-        <w:br/>
-        <w:t xml:space="preserve">  read are held close to their assumption, so they can stay assumed after many days. Read a big push on an</w:t>
-        <w:br/>
-        <w:t xml:space="preserve">  </w:t>
-      </w:r>
-      <w:r>
-        <w:rPr>
-          <w:b/>
-        </w:rPr>
-        <w:t>assumed</w:t>
-      </w:r>
-      <w:r>
-        <w:t xml:space="preserve"> factor with caution: nothing has tested it yet.</w:t>
-      </w:r>
-    </w:p>
-    <w:p>
-      <w:pPr>
-        <w:pStyle w:val="ListBullet"/>
-      </w:pPr>
-      <w:r>
-        <w:rPr>
-          <w:b/>
-        </w:rPr>
-        <w:t>The line under the figure.</w:t>
+        <w:t>The line behind the icon.</w:t>
+      </w:r>
+      <w:r>
+        <w:t xml:space="preserve"> Hover the icon beside the figure: </w:t>
       </w:r>
       <w:r>
         <w:rPr>

</xml_diff>